<commit_message>
feat: calibrate full-bleed A4 1-page CVs, enrich Master 5-bloc syllabus, categorize tech stack with Google Applied AI assets, sync online CV
</commit_message>
<xml_diff>
--- a/KOA_MARIE_GERVAIS_NELLY_CV_EN.docx
+++ b/KOA_MARIE_GERVAIS_NELLY_CV_EN.docx
@@ -5,8 +5,9 @@
     <w:tbl>
       <w:tblPr>
         <w:tblW w:type="auto" w:w="0"/>
-        <w:jc w:val="center"/>
+        <w:jc w:val="left"/>
         <w:tblLook w:firstColumn="1" w:firstRow="1" w:lastColumn="0" w:lastRow="0" w:noHBand="0" w:noVBand="1" w:val="04A0"/>
+        <w:tblInd w:w="0" w:type="dxa"/>
         <w:tblBorders>
           <w:top w:val="none"/>
           <w:left w:val="none"/>
@@ -17,19 +18,22 @@
         </w:tblBorders>
       </w:tblPr>
       <w:tblGrid>
-        <w:gridCol w:w="5760"/>
-        <w:gridCol w:w="5760"/>
+        <w:gridCol w:w="4514"/>
+        <w:gridCol w:w="4514"/>
       </w:tblGrid>
       <w:tr>
+        <w:trPr>
+          <w:trHeight w:val="16200" w:hRule="atLeast"/>
+        </w:trPr>
         <w:tc>
           <w:tcPr>
-            <w:tcW w:type="dxa" w:w="3384"/>
+            <w:tcW w:type="dxa" w:w="3672"/>
             <w:shd w:fill="0F172A"/>
             <w:tcMar>
-              <w:top w:w="90" w:type="dxa"/>
-              <w:bottom w:w="90" w:type="dxa"/>
-              <w:left w:w="110" w:type="dxa"/>
-              <w:right w:w="90" w:type="dxa"/>
+              <w:top w:w="180" w:type="dxa"/>
+              <w:bottom w:w="140" w:type="dxa"/>
+              <w:left w:w="180" w:type="dxa"/>
+              <w:right w:w="140" w:type="dxa"/>
             </w:tcMar>
           </w:tcPr>
           <w:p/>
@@ -40,7 +44,7 @@
               <w:tblLook w:firstColumn="1" w:firstRow="1" w:lastColumn="0" w:lastRow="0" w:noHBand="0" w:noVBand="1" w:val="04A0"/>
             </w:tblPr>
             <w:tblGrid>
-              <w:gridCol w:w="3384"/>
+              <w:gridCol w:w="3672"/>
             </w:tblGrid>
             <w:tr>
               <w:tc>
@@ -48,10 +52,10 @@
                   <w:tcW w:type="dxa" w:w="1944"/>
                   <w:shd w:fill="1E293B"/>
                   <w:tcMar>
-                    <w:top w:w="35" w:type="dxa"/>
-                    <w:bottom w:w="35" w:type="dxa"/>
-                    <w:left w:w="35" w:type="dxa"/>
-                    <w:right w:w="35" w:type="dxa"/>
+                    <w:top w:w="25" w:type="dxa"/>
+                    <w:bottom w:w="25" w:type="dxa"/>
+                    <w:left w:w="25" w:type="dxa"/>
+                    <w:right w:w="25" w:type="dxa"/>
                   </w:tcMar>
                 </w:tcPr>
                 <w:p>
@@ -62,7 +66,7 @@
                   <w:r>
                     <w:drawing>
                       <wp:inline xmlns:a="http://schemas.openxmlformats.org/drawingml/2006/main" xmlns:pic="http://schemas.openxmlformats.org/drawingml/2006/picture">
-                        <wp:extent cx="1143000" cy="1143000"/>
+                        <wp:extent cx="1115568" cy="1115568"/>
                         <wp:docPr id="1" name="Picture 1"/>
                         <wp:cNvGraphicFramePr>
                           <a:graphicFrameLocks noChangeAspect="1"/>
@@ -83,7 +87,7 @@
                               <pic:spPr>
                                 <a:xfrm>
                                   <a:off x="0" y="0"/>
-                                  <a:ext cx="1143000" cy="1143000"/>
+                                  <a:ext cx="1115568" cy="1115568"/>
                                 </a:xfrm>
                                 <a:prstGeom prst="rect"/>
                               </pic:spPr>
@@ -100,21 +104,21 @@
           <w:p/>
           <w:p>
             <w:pPr>
-              <w:spacing w:before="130" w:after="30"/>
+              <w:spacing w:before="100" w:after="24"/>
             </w:pPr>
             <w:r>
               <w:rPr>
                 <w:rFonts w:ascii="Segoe UI Semibold" w:hAnsi="Segoe UI Semibold"/>
                 <w:b/>
                 <w:color w:val="38BDF8"/>
-                <w:sz w:val="16"/>
+                <w:sz w:val="15"/>
               </w:rPr>
-              <w:t>CONTACT</w:t>
+              <w:t>CONTACT &amp; PROFILES</w:t>
             </w:r>
           </w:p>
           <w:p>
             <w:pPr>
-              <w:spacing w:before="0" w:after="24" w:line="252" w:lineRule="auto"/>
+              <w:spacing w:before="0" w:after="20" w:line="252" w:lineRule="auto"/>
             </w:pPr>
             <w:r>
               <w:rPr>
@@ -126,7 +130,7 @@
           </w:p>
           <w:p>
             <w:pPr>
-              <w:spacing w:before="0" w:after="24" w:line="252" w:lineRule="auto"/>
+              <w:spacing w:before="0" w:after="20" w:line="252" w:lineRule="auto"/>
             </w:pPr>
             <w:r>
               <w:rPr>
@@ -138,7 +142,7 @@
           </w:p>
           <w:p>
             <w:pPr>
-              <w:spacing w:before="0" w:after="24" w:line="252" w:lineRule="auto"/>
+              <w:spacing w:before="0" w:after="20" w:line="252" w:lineRule="auto"/>
             </w:pPr>
             <w:r>
               <w:rPr>
@@ -150,7 +154,7 @@
           </w:p>
           <w:p>
             <w:pPr>
-              <w:spacing w:before="0" w:after="24" w:line="252" w:lineRule="auto"/>
+              <w:spacing w:before="0" w:after="20" w:line="252" w:lineRule="auto"/>
             </w:pPr>
             <w:r>
               <w:rPr>
@@ -162,7 +166,7 @@
           </w:p>
           <w:p>
             <w:pPr>
-              <w:spacing w:before="0" w:after="24" w:line="252" w:lineRule="auto"/>
+              <w:spacing w:before="0" w:after="20" w:line="252" w:lineRule="auto"/>
             </w:pPr>
             <w:r>
               <w:rPr>
@@ -174,255 +178,365 @@
           </w:p>
           <w:p>
             <w:pPr>
-              <w:spacing w:before="130" w:after="30"/>
+              <w:spacing w:before="0" w:after="20" w:line="252" w:lineRule="auto"/>
+            </w:pPr>
+            <w:r>
+              <w:rPr>
+                <w:color w:val="F8FAFC"/>
+                <w:sz w:val="14"/>
+              </w:rPr>
+              <w:t>⚡  devpost.com/magenel85</w:t>
+            </w:r>
+          </w:p>
+          <w:p>
+            <w:pPr>
+              <w:spacing w:before="0" w:after="20" w:line="252" w:lineRule="auto"/>
+            </w:pPr>
+            <w:r>
+              <w:rPr>
+                <w:color w:val="F8FAFC"/>
+                <w:sz w:val="14"/>
+              </w:rPr>
+              <w:t>🏅  Google Developer Program</w:t>
+            </w:r>
+          </w:p>
+          <w:p>
+            <w:pPr>
+              <w:spacing w:before="100" w:after="24"/>
             </w:pPr>
             <w:r>
               <w:rPr>
                 <w:rFonts w:ascii="Segoe UI Semibold" w:hAnsi="Segoe UI Semibold"/>
                 <w:b/>
                 <w:color w:val="38BDF8"/>
-                <w:sz w:val="16"/>
+                <w:sz w:val="15"/>
               </w:rPr>
               <w:t>AI &amp; LLM STACK</w:t>
             </w:r>
           </w:p>
           <w:p>
             <w:pPr>
-              <w:spacing w:before="0" w:after="24" w:line="252" w:lineRule="auto"/>
+              <w:spacing w:before="0" w:after="20" w:line="252" w:lineRule="auto"/>
             </w:pPr>
             <w:r>
               <w:rPr>
                 <w:color w:val="F8FAFC"/>
                 <w:sz w:val="14"/>
               </w:rPr>
-              <w:t>Google Gemma 4   ■ ■ ■ ■ ■</w:t>
+              <w:t>Google Gemma 4 (12B) ■ ■ ■ ■ ■</w:t>
             </w:r>
           </w:p>
           <w:p>
             <w:pPr>
-              <w:spacing w:before="0" w:after="24" w:line="252" w:lineRule="auto"/>
+              <w:spacing w:before="0" w:after="20" w:line="252" w:lineRule="auto"/>
             </w:pPr>
             <w:r>
               <w:rPr>
                 <w:color w:val="F8FAFC"/>
                 <w:sz w:val="14"/>
               </w:rPr>
-              <w:t>Gemini 1.5 Pro   ■ ■ ■ ■ ■</w:t>
+              <w:t>Gemini 2.5 / 1.5 Pro ■ ■ ■ ■ ■</w:t>
             </w:r>
           </w:p>
           <w:p>
             <w:pPr>
-              <w:spacing w:before="0" w:after="24" w:line="252" w:lineRule="auto"/>
+              <w:spacing w:before="0" w:after="20" w:line="252" w:lineRule="auto"/>
             </w:pPr>
             <w:r>
               <w:rPr>
                 <w:color w:val="F8FAFC"/>
                 <w:sz w:val="14"/>
               </w:rPr>
-              <w:t>CrewAI/LangGraph ■ ■ ■ ■ ■</w:t>
+              <w:t>Google TabFM (Tabular)■ ■ ■ ■ ■</w:t>
             </w:r>
           </w:p>
           <w:p>
             <w:pPr>
-              <w:spacing w:before="0" w:after="24" w:line="252" w:lineRule="auto"/>
+              <w:spacing w:before="0" w:after="20" w:line="252" w:lineRule="auto"/>
             </w:pPr>
             <w:r>
               <w:rPr>
                 <w:color w:val="F8FAFC"/>
                 <w:sz w:val="14"/>
               </w:rPr>
-              <w:t>Firebase Genkit  ■ ■ ■ ■ ■</w:t>
+              <w:t>LangGraph Multi-Agents■ ■ ■ ■ ■</w:t>
             </w:r>
           </w:p>
           <w:p>
             <w:pPr>
-              <w:spacing w:before="0" w:after="24" w:line="252" w:lineRule="auto"/>
+              <w:spacing w:before="0" w:after="20" w:line="252" w:lineRule="auto"/>
             </w:pPr>
             <w:r>
               <w:rPr>
                 <w:color w:val="F8FAFC"/>
                 <w:sz w:val="14"/>
               </w:rPr>
-              <w:t>RAG / GraphRAG   ■ ■ ■ ■ ■</w:t>
+              <w:t>Firebase Genkit      ■ ■ ■ ■ ■</w:t>
             </w:r>
           </w:p>
           <w:p>
             <w:pPr>
-              <w:spacing w:before="130" w:after="30"/>
+              <w:spacing w:before="0" w:after="20" w:line="252" w:lineRule="auto"/>
+            </w:pPr>
+            <w:r>
+              <w:rPr>
+                <w:color w:val="F8FAFC"/>
+                <w:sz w:val="14"/>
+              </w:rPr>
+              <w:t>Neo4j GraphRAG (N10S)■ ■ ■ ■ ■</w:t>
+            </w:r>
+          </w:p>
+          <w:p>
+            <w:pPr>
+              <w:spacing w:before="100" w:after="24"/>
             </w:pPr>
             <w:r>
               <w:rPr>
                 <w:rFonts w:ascii="Segoe UI Semibold" w:hAnsi="Segoe UI Semibold"/>
                 <w:b/>
                 <w:color w:val="38BDF8"/>
-                <w:sz w:val="16"/>
+                <w:sz w:val="15"/>
               </w:rPr>
               <w:t>DATA &amp; GRAPHS</w:t>
             </w:r>
           </w:p>
           <w:p>
             <w:pPr>
-              <w:spacing w:before="0" w:after="24" w:line="252" w:lineRule="auto"/>
+              <w:spacing w:before="0" w:after="20" w:line="252" w:lineRule="auto"/>
             </w:pPr>
             <w:r>
               <w:rPr>
                 <w:color w:val="F8FAFC"/>
                 <w:sz w:val="14"/>
               </w:rPr>
-              <w:t>Neo4j / Cypher      ■ ■ ■ ■ ■</w:t>
+              <w:t>Neo4j / Cypher Graph ■ ■ ■ ■ ■</w:t>
             </w:r>
           </w:p>
           <w:p>
             <w:pPr>
-              <w:spacing w:before="0" w:after="24" w:line="252" w:lineRule="auto"/>
+              <w:spacing w:before="0" w:after="20" w:line="252" w:lineRule="auto"/>
             </w:pPr>
             <w:r>
               <w:rPr>
                 <w:color w:val="F8FAFC"/>
                 <w:sz w:val="14"/>
               </w:rPr>
-              <w:t>PostgreSQL / SQL    ■ ■ ■ ■ ■</w:t>
+              <w:t>PostgreSQL / pgvector■ ■ ■ ■ ■</w:t>
             </w:r>
           </w:p>
           <w:p>
             <w:pPr>
-              <w:spacing w:before="0" w:after="24" w:line="252" w:lineRule="auto"/>
+              <w:spacing w:before="0" w:after="20" w:line="252" w:lineRule="auto"/>
             </w:pPr>
             <w:r>
               <w:rPr>
                 <w:color w:val="F8FAFC"/>
                 <w:sz w:val="14"/>
               </w:rPr>
-              <w:t>Supabase           ■ ■ ■ ■ □</w:t>
+              <w:t>Google BigQuery Data ■ ■ ■ ■ □</w:t>
             </w:r>
           </w:p>
           <w:p>
             <w:pPr>
-              <w:spacing w:before="0" w:after="24" w:line="252" w:lineRule="auto"/>
+              <w:spacing w:before="0" w:after="20" w:line="252" w:lineRule="auto"/>
             </w:pPr>
             <w:r>
               <w:rPr>
                 <w:color w:val="F8FAFC"/>
                 <w:sz w:val="14"/>
               </w:rPr>
-              <w:t>Firebase Emulator  ■ ■ ■ ■ □</w:t>
+              <w:t>Supabase Realtime    ■ ■ ■ ■ □</w:t>
             </w:r>
           </w:p>
           <w:p>
             <w:pPr>
-              <w:spacing w:before="0" w:after="24" w:line="252" w:lineRule="auto"/>
+              <w:spacing w:before="0" w:after="20" w:line="252" w:lineRule="auto"/>
             </w:pPr>
             <w:r>
               <w:rPr>
                 <w:color w:val="F8FAFC"/>
                 <w:sz w:val="14"/>
               </w:rPr>
-              <w:t>Pandas / NumPy     ■ ■ ■ ■ ■</w:t>
+              <w:t>Pandas / NumPy ETL   ■ ■ ■ ■ ■</w:t>
             </w:r>
           </w:p>
           <w:p>
             <w:pPr>
-              <w:spacing w:before="130" w:after="30"/>
+              <w:spacing w:before="100" w:after="24"/>
             </w:pPr>
             <w:r>
               <w:rPr>
                 <w:rFonts w:ascii="Segoe UI Semibold" w:hAnsi="Segoe UI Semibold"/>
                 <w:b/>
                 <w:color w:val="38BDF8"/>
-                <w:sz w:val="16"/>
+                <w:sz w:val="15"/>
               </w:rPr>
               <w:t>DEV &amp; MLOPS</w:t>
             </w:r>
           </w:p>
           <w:p>
             <w:pPr>
-              <w:spacing w:before="0" w:after="24" w:line="252" w:lineRule="auto"/>
+              <w:spacing w:before="0" w:after="20" w:line="252" w:lineRule="auto"/>
             </w:pPr>
             <w:r>
               <w:rPr>
                 <w:color w:val="F8FAFC"/>
                 <w:sz w:val="14"/>
               </w:rPr>
-              <w:t>Python (BAEL 91)   ■ ■ ■ ■ ■</w:t>
+              <w:t>Python (3.11+ MLOps) ■ ■ ■ ■ ■</w:t>
             </w:r>
           </w:p>
           <w:p>
             <w:pPr>
-              <w:spacing w:before="0" w:after="24" w:line="252" w:lineRule="auto"/>
+              <w:spacing w:before="0" w:after="20" w:line="252" w:lineRule="auto"/>
             </w:pPr>
             <w:r>
               <w:rPr>
                 <w:color w:val="F8FAFC"/>
                 <w:sz w:val="14"/>
               </w:rPr>
-              <w:t>IfcOpenShell (5D)  ■ ■ ■ ■ □</w:t>
+              <w:t>FastAPI / Next.js 14 ■ ■ ■ ■ □</w:t>
             </w:r>
           </w:p>
           <w:p>
             <w:pPr>
-              <w:spacing w:before="0" w:after="24" w:line="252" w:lineRule="auto"/>
+              <w:spacing w:before="0" w:after="20" w:line="252" w:lineRule="auto"/>
             </w:pPr>
             <w:r>
               <w:rPr>
                 <w:color w:val="F8FAFC"/>
                 <w:sz w:val="14"/>
               </w:rPr>
-              <w:t>FastAPI / Next.js  ■ ■ ■ ■ □</w:t>
+              <w:t>MLflow &amp; Data Drift  ■ ■ ■ ■ □</w:t>
             </w:r>
           </w:p>
           <w:p>
             <w:pPr>
-              <w:spacing w:before="0" w:after="24" w:line="252" w:lineRule="auto"/>
+              <w:spacing w:before="0" w:after="20" w:line="252" w:lineRule="auto"/>
             </w:pPr>
             <w:r>
               <w:rPr>
                 <w:color w:val="F8FAFC"/>
                 <w:sz w:val="14"/>
               </w:rPr>
-              <w:t>MLflow (MLOps)     ■ ■ ■ ■ □</w:t>
+              <w:t>SHAP Sentinel Audit  ■ ■ ■ ■ ■</w:t>
             </w:r>
           </w:p>
           <w:p>
             <w:pPr>
-              <w:spacing w:before="0" w:after="24" w:line="252" w:lineRule="auto"/>
+              <w:spacing w:before="0" w:after="20" w:line="252" w:lineRule="auto"/>
             </w:pPr>
             <w:r>
               <w:rPr>
                 <w:color w:val="F8FAFC"/>
                 <w:sz w:val="14"/>
               </w:rPr>
-              <w:t>Streamlit / Docker ■ ■ ■ ■ ■</w:t>
+              <w:t>Docker &amp; Streamlit   ■ ■ ■ ■ ■</w:t>
             </w:r>
           </w:p>
           <w:p>
             <w:pPr>
-              <w:spacing w:before="130" w:after="30"/>
+              <w:spacing w:before="0" w:after="20" w:line="252" w:lineRule="auto"/>
+            </w:pPr>
+            <w:r>
+              <w:rPr>
+                <w:color w:val="F8FAFC"/>
+                <w:sz w:val="14"/>
+              </w:rPr>
+              <w:t>IfcOpenShell (5D BIM)■ ■ ■ ■ □</w:t>
+            </w:r>
+          </w:p>
+          <w:p>
+            <w:pPr>
+              <w:spacing w:before="100" w:after="24"/>
             </w:pPr>
             <w:r>
               <w:rPr>
                 <w:rFonts w:ascii="Segoe UI Semibold" w:hAnsi="Segoe UI Semibold"/>
                 <w:b/>
                 <w:color w:val="38BDF8"/>
-                <w:sz w:val="16"/>
+                <w:sz w:val="15"/>
+              </w:rPr>
+              <w:t>SECURITY &amp; AUDIT</w:t>
+            </w:r>
+          </w:p>
+          <w:p>
+            <w:pPr>
+              <w:spacing w:before="0" w:after="20" w:line="252" w:lineRule="auto"/>
+            </w:pPr>
+            <w:r>
+              <w:rPr>
+                <w:color w:val="F8FAFC"/>
+                <w:sz w:val="14"/>
+              </w:rPr>
+              <w:t>◈ Quorum 4-Eyes (KOA+AZIZ)</w:t>
+            </w:r>
+          </w:p>
+          <w:p>
+            <w:pPr>
+              <w:spacing w:before="0" w:after="20" w:line="252" w:lineRule="auto"/>
+            </w:pPr>
+            <w:r>
+              <w:rPr>
+                <w:color w:val="F8FAFC"/>
+                <w:sz w:val="14"/>
+              </w:rPr>
+              <w:t>◈ OKF v0.2 SHA-256 No-LLM</w:t>
+            </w:r>
+          </w:p>
+          <w:p>
+            <w:pPr>
+              <w:spacing w:before="0" w:after="20" w:line="252" w:lineRule="auto"/>
+            </w:pPr>
+            <w:r>
+              <w:rPr>
+                <w:color w:val="F8FAFC"/>
+                <w:sz w:val="14"/>
+              </w:rPr>
+              <w:t>◈ EU AI Act (RSASSA-PSS)</w:t>
+            </w:r>
+          </w:p>
+          <w:p>
+            <w:pPr>
+              <w:spacing w:before="0" w:after="20" w:line="252" w:lineRule="auto"/>
+            </w:pPr>
+            <w:r>
+              <w:rPr>
+                <w:color w:val="F8FAFC"/>
+                <w:sz w:val="14"/>
+              </w:rPr>
+              <w:t>◈ AVSEC (ICAO Annex 17)</w:t>
+            </w:r>
+          </w:p>
+          <w:p>
+            <w:pPr>
+              <w:spacing w:before="100" w:after="24"/>
+            </w:pPr>
+            <w:r>
+              <w:rPr>
+                <w:rFonts w:ascii="Segoe UI Semibold" w:hAnsi="Segoe UI Semibold"/>
+                <w:b/>
+                <w:color w:val="38BDF8"/>
+                <w:sz w:val="15"/>
               </w:rPr>
               <w:t>LANGUAGES</w:t>
             </w:r>
           </w:p>
           <w:p>
             <w:pPr>
-              <w:spacing w:before="0" w:after="24" w:line="252" w:lineRule="auto"/>
+              <w:spacing w:before="0" w:after="20" w:line="252" w:lineRule="auto"/>
             </w:pPr>
             <w:r>
               <w:rPr>
                 <w:color w:val="F8FAFC"/>
                 <w:sz w:val="14"/>
               </w:rPr>
-              <w:t>French (Native)</w:t>
+              <w:t>French (Native / Fluent)</w:t>
             </w:r>
           </w:p>
           <w:p>
             <w:pPr>
-              <w:spacing w:before="0" w:after="24" w:line="252" w:lineRule="auto"/>
+              <w:spacing w:before="0" w:after="20" w:line="252" w:lineRule="auto"/>
             </w:pPr>
             <w:r>
               <w:rPr>
@@ -434,21 +548,21 @@
           </w:p>
           <w:p>
             <w:pPr>
-              <w:spacing w:before="130" w:after="30"/>
+              <w:spacing w:before="100" w:after="24"/>
             </w:pPr>
             <w:r>
               <w:rPr>
                 <w:rFonts w:ascii="Segoe UI Semibold" w:hAnsi="Segoe UI Semibold"/>
                 <w:b/>
                 <w:color w:val="38BDF8"/>
-                <w:sz w:val="16"/>
+                <w:sz w:val="15"/>
               </w:rPr>
               <w:t>KEY ASSETS</w:t>
             </w:r>
           </w:p>
           <w:p>
             <w:pPr>
-              <w:spacing w:before="0" w:after="24" w:line="252" w:lineRule="auto"/>
+              <w:spacing w:before="0" w:after="20" w:line="252" w:lineRule="auto"/>
             </w:pPr>
             <w:r>
               <w:rPr>
@@ -460,38 +574,38 @@
           </w:p>
           <w:p>
             <w:pPr>
-              <w:spacing w:before="0" w:after="24" w:line="252" w:lineRule="auto"/>
+              <w:spacing w:before="0" w:after="20" w:line="252" w:lineRule="auto"/>
             </w:pPr>
             <w:r>
               <w:rPr>
                 <w:color w:val="F8FAFC"/>
                 <w:sz w:val="14"/>
               </w:rPr>
-              <w:t>◈ Risk Management &amp; AVSEC (CCAA)</w:t>
+              <w:t>◈ Aviation Security &amp; Crisis (CCAA)</w:t>
             </w:r>
           </w:p>
           <w:p>
             <w:pPr>
-              <w:spacing w:before="0" w:after="24" w:line="252" w:lineRule="auto"/>
+              <w:spacing w:before="0" w:after="20" w:line="252" w:lineRule="auto"/>
             </w:pPr>
             <w:r>
               <w:rPr>
                 <w:color w:val="F8FAFC"/>
                 <w:sz w:val="14"/>
               </w:rPr>
-              <w:t>◈ Math Rigor &amp; Strict AI Guardrails</w:t>
+              <w:t>◈ Mathematical Rigor &amp; Guardrails</w:t>
             </w:r>
           </w:p>
         </w:tc>
         <w:tc>
           <w:tcPr>
-            <w:tcW w:type="dxa" w:w="7704"/>
+            <w:tcW w:type="dxa" w:w="8237"/>
             <w:shd w:fill="FFFFFF"/>
             <w:tcMar>
-              <w:top w:w="90" w:type="dxa"/>
-              <w:bottom w:w="90" w:type="dxa"/>
-              <w:left w:w="130" w:type="dxa"/>
-              <w:right w:w="70" w:type="dxa"/>
+              <w:top w:w="180" w:type="dxa"/>
+              <w:bottom w:w="140" w:type="dxa"/>
+              <w:left w:w="180" w:type="dxa"/>
+              <w:right w:w="180" w:type="dxa"/>
             </w:tcMar>
           </w:tcPr>
           <w:p>
@@ -523,7 +637,7 @@
           </w:p>
           <w:p>
             <w:pPr>
-              <w:spacing w:before="0" w:after="60"/>
+              <w:spacing w:before="0" w:after="50"/>
             </w:pPr>
             <w:r>
               <w:rPr>
@@ -535,13 +649,13 @@
           </w:p>
           <w:p>
             <w:pPr>
-              <w:spacing w:before="100" w:after="30"/>
+              <w:spacing w:before="90" w:after="24"/>
             </w:pPr>
             <w:r>
               <w:rPr>
                 <w:b/>
                 <w:color w:val="0284C7"/>
-                <w:sz w:val="16"/>
+                <w:sz w:val="15"/>
               </w:rPr>
               <w:t xml:space="preserve">◈  </w:t>
             </w:r>
@@ -562,20 +676,20 @@
             <w:r>
               <w:rPr>
                 <w:color w:val="334155"/>
-                <w:sz w:val="15"/>
+                <w:sz w:val="14"/>
               </w:rPr>
-              <w:t>Lead AI Engineer &amp; Data Architect specializing in sovereign autonomous agents, Neo4j GraphRAG, and deterministic civil engineering software. Founder of Archi Cam AI (official candidate for Google Africa Applied AI Lab), bridging multi-agent orchestration with strict mathematical compliance (BAEL 91, ICAO Annex 17) and production MLOps.</w:t>
+              <w:t>Lead AI Engineer &amp; Data Architect (Google Developer Program Member) specializing in sovereign autonomous multi-agents, Neo4j GraphRAG, and deterministic civil engineering software. Founder of Archi Cam AI (official applicant for Google Africa Applied AI Lab), bridging multi-agent orchestration with strict mathematical compliance (BAEL 91, ICAO Annex 17) and production MLOps.</w:t>
             </w:r>
           </w:p>
           <w:p>
             <w:pPr>
-              <w:spacing w:before="100" w:after="30"/>
+              <w:spacing w:before="90" w:after="24"/>
             </w:pPr>
             <w:r>
               <w:rPr>
                 <w:b/>
                 <w:color w:val="0284C7"/>
-                <w:sz w:val="16"/>
+                <w:sz w:val="15"/>
               </w:rPr>
               <w:t xml:space="preserve">◈  </w:t>
             </w:r>
@@ -591,7 +705,7 @@
           </w:p>
           <w:p>
             <w:pPr>
-              <w:spacing w:before="50" w:after="10"/>
+              <w:spacing w:before="44" w:after="8"/>
             </w:pPr>
             <w:r>
               <w:rPr>
@@ -612,8 +726,8 @@
           </w:p>
           <w:p>
             <w:pPr>
-              <w:spacing w:before="0" w:after="16" w:line="252" w:lineRule="auto"/>
-              <w:ind w:left="144"/>
+              <w:spacing w:before="0" w:after="12" w:line="250" w:lineRule="auto"/>
+              <w:ind w:left="115"/>
             </w:pPr>
             <w:r>
               <w:rPr>
@@ -628,13 +742,13 @@
                 <w:color w:val="334155"/>
                 <w:sz w:val="14"/>
               </w:rPr>
-              <w:t>Candidate Google Africa Applied AI Lab. 5D BIM &amp; BOQ estimation (local Gemma 4 12B, Gemini, BAEL 91).</w:t>
+              <w:t>Official Applicant Google Africa Applied AI Lab. 5D BIM &amp; BOQ estimation (local Gemma 4 12B, Gemini, BAEL 91).</w:t>
             </w:r>
           </w:p>
           <w:p>
             <w:pPr>
-              <w:spacing w:before="0" w:after="16" w:line="252" w:lineRule="auto"/>
-              <w:ind w:left="144"/>
+              <w:spacing w:before="0" w:after="12" w:line="250" w:lineRule="auto"/>
+              <w:ind w:left="115"/>
             </w:pPr>
             <w:r>
               <w:rPr>
@@ -654,7 +768,7 @@
           </w:p>
           <w:p>
             <w:pPr>
-              <w:spacing w:before="50" w:after="10"/>
+              <w:spacing w:before="44" w:after="8"/>
             </w:pPr>
             <w:r>
               <w:rPr>
@@ -675,8 +789,8 @@
           </w:p>
           <w:p>
             <w:pPr>
-              <w:spacing w:before="0" w:after="16" w:line="252" w:lineRule="auto"/>
-              <w:ind w:left="144"/>
+              <w:spacing w:before="0" w:after="12" w:line="250" w:lineRule="auto"/>
+              <w:ind w:left="115"/>
             </w:pPr>
             <w:r>
               <w:rPr>
@@ -696,8 +810,8 @@
           </w:p>
           <w:p>
             <w:pPr>
-              <w:spacing w:before="0" w:after="16" w:line="252" w:lineRule="auto"/>
-              <w:ind w:left="144"/>
+              <w:spacing w:before="0" w:after="12" w:line="250" w:lineRule="auto"/>
+              <w:ind w:left="115"/>
             </w:pPr>
             <w:r>
               <w:rPr>
@@ -717,7 +831,7 @@
           </w:p>
           <w:p>
             <w:pPr>
-              <w:spacing w:before="50" w:after="10"/>
+              <w:spacing w:before="44" w:after="8"/>
             </w:pPr>
             <w:r>
               <w:rPr>
@@ -738,8 +852,8 @@
           </w:p>
           <w:p>
             <w:pPr>
-              <w:spacing w:before="0" w:after="16" w:line="252" w:lineRule="auto"/>
-              <w:ind w:left="144"/>
+              <w:spacing w:before="0" w:after="12" w:line="250" w:lineRule="auto"/>
+              <w:ind w:left="115"/>
             </w:pPr>
             <w:r>
               <w:rPr>
@@ -759,8 +873,8 @@
           </w:p>
           <w:p>
             <w:pPr>
-              <w:spacing w:before="0" w:after="16" w:line="252" w:lineRule="auto"/>
-              <w:ind w:left="144"/>
+              <w:spacing w:before="0" w:after="12" w:line="250" w:lineRule="auto"/>
+              <w:ind w:left="115"/>
             </w:pPr>
             <w:r>
               <w:rPr>
@@ -780,7 +894,7 @@
           </w:p>
           <w:p>
             <w:pPr>
-              <w:spacing w:before="50" w:after="10"/>
+              <w:spacing w:before="44" w:after="8"/>
             </w:pPr>
             <w:r>
               <w:rPr>
@@ -801,8 +915,8 @@
           </w:p>
           <w:p>
             <w:pPr>
-              <w:spacing w:before="0" w:after="16" w:line="252" w:lineRule="auto"/>
-              <w:ind w:left="144"/>
+              <w:spacing w:before="0" w:after="12" w:line="250" w:lineRule="auto"/>
+              <w:ind w:left="115"/>
             </w:pPr>
             <w:r>
               <w:rPr>
@@ -817,13 +931,13 @@
                 <w:color w:val="334155"/>
                 <w:sz w:val="14"/>
               </w:rPr>
-              <w:t>Dataset Automator: Autonomous MLOps factory with continuous Data Drift tracking (KS-test / PSI), MLflow and Genkit.</w:t>
+              <w:t>Dataset Automator: TabFM &amp; BigQuery DataFrames MLOps factory with continuous Data Drift tracking (KS/PSI) and EU AI Act.</w:t>
             </w:r>
           </w:p>
           <w:p>
             <w:pPr>
-              <w:spacing w:before="0" w:after="16" w:line="252" w:lineRule="auto"/>
-              <w:ind w:left="144"/>
+              <w:spacing w:before="0" w:after="12" w:line="250" w:lineRule="auto"/>
+              <w:ind w:left="115"/>
             </w:pPr>
             <w:r>
               <w:rPr>
@@ -843,13 +957,13 @@
           </w:p>
           <w:p>
             <w:pPr>
-              <w:spacing w:before="100" w:after="30"/>
+              <w:spacing w:before="90" w:after="24"/>
             </w:pPr>
             <w:r>
               <w:rPr>
                 <w:b/>
                 <w:color w:val="0284C7"/>
-                <w:sz w:val="16"/>
+                <w:sz w:val="15"/>
               </w:rPr>
               <w:t xml:space="preserve">◈  </w:t>
             </w:r>
@@ -865,7 +979,7 @@
           </w:p>
           <w:p>
             <w:pPr>
-              <w:spacing w:before="50" w:after="10"/>
+              <w:spacing w:before="44" w:after="8"/>
             </w:pPr>
             <w:r>
               <w:rPr>
@@ -886,7 +1000,7 @@
           </w:p>
           <w:p>
             <w:pPr>
-              <w:spacing w:before="0" w:after="16"/>
+              <w:spacing w:before="0" w:after="12"/>
             </w:pPr>
             <w:r>
               <w:rPr>
@@ -899,8 +1013,8 @@
           </w:p>
           <w:p>
             <w:pPr>
-              <w:spacing w:before="0" w:after="16" w:line="252" w:lineRule="auto"/>
-              <w:ind w:left="144"/>
+              <w:spacing w:before="0" w:after="12" w:line="250" w:lineRule="auto"/>
+              <w:ind w:left="115"/>
             </w:pPr>
             <w:r>
               <w:rPr>
@@ -920,8 +1034,8 @@
           </w:p>
           <w:p>
             <w:pPr>
-              <w:spacing w:before="0" w:after="16" w:line="252" w:lineRule="auto"/>
-              <w:ind w:left="144"/>
+              <w:spacing w:before="0" w:after="12" w:line="250" w:lineRule="auto"/>
+              <w:ind w:left="115"/>
             </w:pPr>
             <w:r>
               <w:rPr>
@@ -941,7 +1055,7 @@
           </w:p>
           <w:p>
             <w:pPr>
-              <w:spacing w:before="50" w:after="10"/>
+              <w:spacing w:before="44" w:after="8"/>
             </w:pPr>
             <w:r>
               <w:rPr>
@@ -962,7 +1076,7 @@
           </w:p>
           <w:p>
             <w:pPr>
-              <w:spacing w:before="0" w:after="16"/>
+              <w:spacing w:before="0" w:after="12"/>
             </w:pPr>
             <w:r>
               <w:rPr>
@@ -975,8 +1089,8 @@
           </w:p>
           <w:p>
             <w:pPr>
-              <w:spacing w:before="0" w:after="16" w:line="252" w:lineRule="auto"/>
-              <w:ind w:left="144"/>
+              <w:spacing w:before="0" w:after="12" w:line="250" w:lineRule="auto"/>
+              <w:ind w:left="115"/>
             </w:pPr>
             <w:r>
               <w:rPr>
@@ -996,8 +1110,8 @@
           </w:p>
           <w:p>
             <w:pPr>
-              <w:spacing w:before="0" w:after="16" w:line="252" w:lineRule="auto"/>
-              <w:ind w:left="144"/>
+              <w:spacing w:before="0" w:after="12" w:line="250" w:lineRule="auto"/>
+              <w:ind w:left="115"/>
             </w:pPr>
             <w:r>
               <w:rPr>
@@ -1017,13 +1131,13 @@
           </w:p>
           <w:p>
             <w:pPr>
-              <w:spacing w:before="100" w:after="30"/>
+              <w:spacing w:before="90" w:after="24"/>
             </w:pPr>
             <w:r>
               <w:rPr>
                 <w:b/>
                 <w:color w:val="0284C7"/>
-                <w:sz w:val="16"/>
+                <w:sz w:val="15"/>
               </w:rPr>
               <w:t xml:space="preserve">◈  </w:t>
             </w:r>
@@ -1039,7 +1153,7 @@
           </w:p>
           <w:p>
             <w:pPr>
-              <w:spacing w:before="50" w:after="10"/>
+              <w:spacing w:before="44" w:after="8"/>
             </w:pPr>
             <w:r>
               <w:rPr>
@@ -1068,19 +1182,32 @@
           </w:p>
           <w:p>
             <w:pPr>
-              <w:spacing w:before="0" w:after="16"/>
+              <w:spacing w:before="0" w:after="8"/>
             </w:pPr>
             <w:r>
               <w:rPr>
+                <w:b/>
                 <w:color w:val="64748B"/>
                 <w:sz w:val="14"/>
               </w:rPr>
-              <w:t>University of Ngaoundéré  │  Knowledge Graphs (Neo4j), MLOps, Prompt Engineering &amp; LLM Architecture</w:t>
+              <w:t>University of Ngaoundéré</w:t>
             </w:r>
           </w:p>
           <w:p>
             <w:pPr>
-              <w:spacing w:before="50" w:after="10"/>
+              <w:spacing w:before="0" w:after="16" w:line="250" w:lineRule="auto"/>
+            </w:pPr>
+            <w:r>
+              <w:rPr>
+                <w:color w:val="334155"/>
+                <w:sz w:val="13"/>
+              </w:rPr>
+              <w:t>Excellence Curriculum (5 Blocs): Machine Learning &amp; Bayesian Statistics, Data Engineering &amp; Neo4j Knowledge Graphs, Computer Vision &amp; Robotics/HCI, Cybersecurity &amp; Blockchain, Production Sovereign MLOps Deployment.</w:t>
+            </w:r>
+          </w:p>
+          <w:p>
+            <w:pPr>
+              <w:spacing w:before="44" w:after="8"/>
             </w:pPr>
             <w:r>
               <w:rPr>
@@ -1101,22 +1228,93 @@
           </w:p>
           <w:p>
             <w:pPr>
-              <w:spacing w:before="0" w:after="16"/>
+              <w:spacing w:before="0" w:after="8"/>
             </w:pPr>
             <w:r>
               <w:rPr>
+                <w:b/>
                 <w:color w:val="64748B"/>
                 <w:sz w:val="14"/>
               </w:rPr>
-              <w:t>ISTDI / IUC Douala  │  Structural Calculations (BAEL 91), Quantity Surveying &amp; Construction Management</w:t>
+              <w:t>ISTDI / IUC Douala</w:t>
+            </w:r>
+          </w:p>
+          <w:p>
+            <w:pPr>
+              <w:spacing w:before="0" w:after="16" w:line="250" w:lineRule="auto"/>
+            </w:pPr>
+            <w:r>
+              <w:rPr>
+                <w:color w:val="334155"/>
+                <w:sz w:val="13"/>
+              </w:rPr>
+              <w:t>Structural calculations (BAEL 91), quantity surveying, and construction project management.</w:t>
+            </w:r>
+          </w:p>
+          <w:p>
+            <w:pPr>
+              <w:spacing w:before="90" w:after="24"/>
+            </w:pPr>
+            <w:r>
+              <w:rPr>
+                <w:b/>
+                <w:color w:val="0284C7"/>
+                <w:sz w:val="15"/>
+              </w:rPr>
+              <w:t xml:space="preserve">◈  </w:t>
+            </w:r>
+            <w:r>
+              <w:rPr>
+                <w:rFonts w:ascii="Segoe UI" w:hAnsi="Segoe UI"/>
+                <w:b/>
+                <w:color w:val="0A1128"/>
+                <w:sz w:val="17"/>
+              </w:rPr>
+              <w:t>HONORS &amp; APPLIED AI RECOGNITIONS</w:t>
+            </w:r>
+          </w:p>
+          <w:p>
+            <w:pPr>
+              <w:spacing w:before="0" w:after="10" w:line="250" w:lineRule="auto"/>
+            </w:pPr>
+            <w:r>
+              <w:rPr>
+                <w:b/>
+                <w:color w:val="0A1128"/>
+                <w:sz w:val="14"/>
+              </w:rPr>
+              <w:t xml:space="preserve">◈ Google Africa Applied AI Lab (Accra, 2026): </w:t>
+            </w:r>
+            <w:r>
+              <w:rPr>
+                <w:color w:val="334155"/>
+                <w:sz w:val="14"/>
+              </w:rPr>
+              <w:t>Official candidacy supported by Archi Cam AI platform.</w:t>
+              <w:br/>
+            </w:r>
+            <w:r>
+              <w:rPr>
+                <w:b/>
+                <w:color w:val="0A1128"/>
+                <w:sz w:val="14"/>
+              </w:rPr>
+              <w:t xml:space="preserve">◈ Google Cloud #AllThingsAgentic Hackathon: </w:t>
+            </w:r>
+            <w:r>
+              <w:rPr>
+                <w:color w:val="334155"/>
+                <w:sz w:val="14"/>
+              </w:rPr>
+              <w:t>Dataset Automator v4.0 (TabFM, WIT, bigframes, MCT).</w:t>
             </w:r>
           </w:p>
         </w:tc>
       </w:tr>
     </w:tbl>
     <w:sectPr>
-      <w:pgSz w:w="12240" w:h="15840"/>
-      <w:pgMar w:top="403" w:right="360" w:bottom="360" w:left="360" w:header="720" w:footer="720" w:gutter="0"/>
+      <w:pgSz w:w="11909" w:h="16834"/>
+      <w:pgMar w:top="0" w:right="0" w:bottom="0" w:left="0" w:header="720" w:footer="720" w:gutter="0"/>
       <w:cols w:space="720"/>
       <w:docGrid w:linePitch="360"/>
     </w:sectPr>

</xml_diff>

<commit_message>
feat: perfect A4 1-page CV calibration, add comfortable sidebar padding, integrate Google Antigravity across CV and portfolio
</commit_message>
<xml_diff>
--- a/KOA_MARIE_GERVAIS_NELLY_CV_EN.docx
+++ b/KOA_MARIE_GERVAIS_NELLY_CV_EN.docx
@@ -23,17 +23,17 @@
       </w:tblGrid>
       <w:tr>
         <w:trPr>
-          <w:trHeight w:val="16200" w:hRule="atLeast"/>
+          <w:trHeight w:val="16100" w:hRule="atLeast"/>
         </w:trPr>
         <w:tc>
           <w:tcPr>
-            <w:tcW w:type="dxa" w:w="3672"/>
+            <w:tcW w:type="dxa" w:w="3744"/>
             <w:shd w:fill="0F172A"/>
             <w:tcMar>
-              <w:top w:w="180" w:type="dxa"/>
+              <w:top w:w="200" w:type="dxa"/>
               <w:bottom w:w="140" w:type="dxa"/>
-              <w:left w:w="180" w:type="dxa"/>
-              <w:right w:w="140" w:type="dxa"/>
+              <w:left w:w="320" w:type="dxa"/>
+              <w:right w:w="160" w:type="dxa"/>
             </w:tcMar>
           </w:tcPr>
           <w:p/>
@@ -44,7 +44,7 @@
               <w:tblLook w:firstColumn="1" w:firstRow="1" w:lastColumn="0" w:lastRow="0" w:noHBand="0" w:noVBand="1" w:val="04A0"/>
             </w:tblPr>
             <w:tblGrid>
-              <w:gridCol w:w="3672"/>
+              <w:gridCol w:w="3744"/>
             </w:tblGrid>
             <w:tr>
               <w:tc>
@@ -52,10 +52,10 @@
                   <w:tcW w:type="dxa" w:w="1944"/>
                   <w:shd w:fill="1E293B"/>
                   <w:tcMar>
-                    <w:top w:w="25" w:type="dxa"/>
-                    <w:bottom w:w="25" w:type="dxa"/>
-                    <w:left w:w="25" w:type="dxa"/>
-                    <w:right w:w="25" w:type="dxa"/>
+                    <w:top w:w="20" w:type="dxa"/>
+                    <w:bottom w:w="20" w:type="dxa"/>
+                    <w:left w:w="20" w:type="dxa"/>
+                    <w:right w:w="20" w:type="dxa"/>
                   </w:tcMar>
                 </w:tcPr>
                 <w:p>
@@ -104,7 +104,7 @@
           <w:p/>
           <w:p>
             <w:pPr>
-              <w:spacing w:before="100" w:after="24"/>
+              <w:spacing w:before="90" w:after="24"/>
             </w:pPr>
             <w:r>
               <w:rPr>
@@ -118,7 +118,7 @@
           </w:p>
           <w:p>
             <w:pPr>
-              <w:spacing w:before="0" w:after="20" w:line="252" w:lineRule="auto"/>
+              <w:spacing w:before="0" w:after="18" w:line="252" w:lineRule="auto"/>
             </w:pPr>
             <w:r>
               <w:rPr>
@@ -130,7 +130,7 @@
           </w:p>
           <w:p>
             <w:pPr>
-              <w:spacing w:before="0" w:after="20" w:line="252" w:lineRule="auto"/>
+              <w:spacing w:before="0" w:after="18" w:line="252" w:lineRule="auto"/>
             </w:pPr>
             <w:r>
               <w:rPr>
@@ -142,7 +142,7 @@
           </w:p>
           <w:p>
             <w:pPr>
-              <w:spacing w:before="0" w:after="20" w:line="252" w:lineRule="auto"/>
+              <w:spacing w:before="0" w:after="18" w:line="252" w:lineRule="auto"/>
             </w:pPr>
             <w:r>
               <w:rPr>
@@ -154,7 +154,7 @@
           </w:p>
           <w:p>
             <w:pPr>
-              <w:spacing w:before="0" w:after="20" w:line="252" w:lineRule="auto"/>
+              <w:spacing w:before="0" w:after="18" w:line="252" w:lineRule="auto"/>
             </w:pPr>
             <w:r>
               <w:rPr>
@@ -166,7 +166,7 @@
           </w:p>
           <w:p>
             <w:pPr>
-              <w:spacing w:before="0" w:after="20" w:line="252" w:lineRule="auto"/>
+              <w:spacing w:before="0" w:after="18" w:line="252" w:lineRule="auto"/>
             </w:pPr>
             <w:r>
               <w:rPr>
@@ -178,7 +178,7 @@
           </w:p>
           <w:p>
             <w:pPr>
-              <w:spacing w:before="0" w:after="20" w:line="252" w:lineRule="auto"/>
+              <w:spacing w:before="0" w:after="18" w:line="252" w:lineRule="auto"/>
             </w:pPr>
             <w:r>
               <w:rPr>
@@ -190,7 +190,7 @@
           </w:p>
           <w:p>
             <w:pPr>
-              <w:spacing w:before="0" w:after="20" w:line="252" w:lineRule="auto"/>
+              <w:spacing w:before="0" w:after="18" w:line="252" w:lineRule="auto"/>
             </w:pPr>
             <w:r>
               <w:rPr>
@@ -202,7 +202,7 @@
           </w:p>
           <w:p>
             <w:pPr>
-              <w:spacing w:before="100" w:after="24"/>
+              <w:spacing w:before="90" w:after="24"/>
             </w:pPr>
             <w:r>
               <w:rPr>
@@ -216,7 +216,19 @@
           </w:p>
           <w:p>
             <w:pPr>
-              <w:spacing w:before="0" w:after="20" w:line="252" w:lineRule="auto"/>
+              <w:spacing w:before="0" w:after="18" w:line="252" w:lineRule="auto"/>
+            </w:pPr>
+            <w:r>
+              <w:rPr>
+                <w:color w:val="F8FAFC"/>
+                <w:sz w:val="14"/>
+              </w:rPr>
+              <w:t>Google Antigravity IDE ■ ■ ■ ■ ■</w:t>
+            </w:r>
+          </w:p>
+          <w:p>
+            <w:pPr>
+              <w:spacing w:before="0" w:after="18" w:line="252" w:lineRule="auto"/>
             </w:pPr>
             <w:r>
               <w:rPr>
@@ -228,7 +240,7 @@
           </w:p>
           <w:p>
             <w:pPr>
-              <w:spacing w:before="0" w:after="20" w:line="252" w:lineRule="auto"/>
+              <w:spacing w:before="0" w:after="18" w:line="252" w:lineRule="auto"/>
             </w:pPr>
             <w:r>
               <w:rPr>
@@ -240,7 +252,7 @@
           </w:p>
           <w:p>
             <w:pPr>
-              <w:spacing w:before="0" w:after="20" w:line="252" w:lineRule="auto"/>
+              <w:spacing w:before="0" w:after="18" w:line="252" w:lineRule="auto"/>
             </w:pPr>
             <w:r>
               <w:rPr>
@@ -252,7 +264,7 @@
           </w:p>
           <w:p>
             <w:pPr>
-              <w:spacing w:before="0" w:after="20" w:line="252" w:lineRule="auto"/>
+              <w:spacing w:before="0" w:after="18" w:line="252" w:lineRule="auto"/>
             </w:pPr>
             <w:r>
               <w:rPr>
@@ -264,7 +276,7 @@
           </w:p>
           <w:p>
             <w:pPr>
-              <w:spacing w:before="0" w:after="20" w:line="252" w:lineRule="auto"/>
+              <w:spacing w:before="0" w:after="18" w:line="252" w:lineRule="auto"/>
             </w:pPr>
             <w:r>
               <w:rPr>
@@ -276,7 +288,7 @@
           </w:p>
           <w:p>
             <w:pPr>
-              <w:spacing w:before="0" w:after="20" w:line="252" w:lineRule="auto"/>
+              <w:spacing w:before="0" w:after="18" w:line="252" w:lineRule="auto"/>
             </w:pPr>
             <w:r>
               <w:rPr>
@@ -288,7 +300,7 @@
           </w:p>
           <w:p>
             <w:pPr>
-              <w:spacing w:before="100" w:after="24"/>
+              <w:spacing w:before="90" w:after="24"/>
             </w:pPr>
             <w:r>
               <w:rPr>
@@ -302,7 +314,7 @@
           </w:p>
           <w:p>
             <w:pPr>
-              <w:spacing w:before="0" w:after="20" w:line="252" w:lineRule="auto"/>
+              <w:spacing w:before="0" w:after="18" w:line="252" w:lineRule="auto"/>
             </w:pPr>
             <w:r>
               <w:rPr>
@@ -314,7 +326,7 @@
           </w:p>
           <w:p>
             <w:pPr>
-              <w:spacing w:before="0" w:after="20" w:line="252" w:lineRule="auto"/>
+              <w:spacing w:before="0" w:after="18" w:line="252" w:lineRule="auto"/>
             </w:pPr>
             <w:r>
               <w:rPr>
@@ -326,7 +338,7 @@
           </w:p>
           <w:p>
             <w:pPr>
-              <w:spacing w:before="0" w:after="20" w:line="252" w:lineRule="auto"/>
+              <w:spacing w:before="0" w:after="18" w:line="252" w:lineRule="auto"/>
             </w:pPr>
             <w:r>
               <w:rPr>
@@ -338,7 +350,7 @@
           </w:p>
           <w:p>
             <w:pPr>
-              <w:spacing w:before="0" w:after="20" w:line="252" w:lineRule="auto"/>
+              <w:spacing w:before="0" w:after="18" w:line="252" w:lineRule="auto"/>
             </w:pPr>
             <w:r>
               <w:rPr>
@@ -350,7 +362,7 @@
           </w:p>
           <w:p>
             <w:pPr>
-              <w:spacing w:before="0" w:after="20" w:line="252" w:lineRule="auto"/>
+              <w:spacing w:before="0" w:after="18" w:line="252" w:lineRule="auto"/>
             </w:pPr>
             <w:r>
               <w:rPr>
@@ -362,7 +374,7 @@
           </w:p>
           <w:p>
             <w:pPr>
-              <w:spacing w:before="100" w:after="24"/>
+              <w:spacing w:before="90" w:after="24"/>
             </w:pPr>
             <w:r>
               <w:rPr>
@@ -376,7 +388,7 @@
           </w:p>
           <w:p>
             <w:pPr>
-              <w:spacing w:before="0" w:after="20" w:line="252" w:lineRule="auto"/>
+              <w:spacing w:before="0" w:after="18" w:line="252" w:lineRule="auto"/>
             </w:pPr>
             <w:r>
               <w:rPr>
@@ -388,7 +400,7 @@
           </w:p>
           <w:p>
             <w:pPr>
-              <w:spacing w:before="0" w:after="20" w:line="252" w:lineRule="auto"/>
+              <w:spacing w:before="0" w:after="18" w:line="252" w:lineRule="auto"/>
             </w:pPr>
             <w:r>
               <w:rPr>
@@ -400,7 +412,7 @@
           </w:p>
           <w:p>
             <w:pPr>
-              <w:spacing w:before="0" w:after="20" w:line="252" w:lineRule="auto"/>
+              <w:spacing w:before="0" w:after="18" w:line="252" w:lineRule="auto"/>
             </w:pPr>
             <w:r>
               <w:rPr>
@@ -412,7 +424,7 @@
           </w:p>
           <w:p>
             <w:pPr>
-              <w:spacing w:before="0" w:after="20" w:line="252" w:lineRule="auto"/>
+              <w:spacing w:before="0" w:after="18" w:line="252" w:lineRule="auto"/>
             </w:pPr>
             <w:r>
               <w:rPr>
@@ -424,7 +436,7 @@
           </w:p>
           <w:p>
             <w:pPr>
-              <w:spacing w:before="0" w:after="20" w:line="252" w:lineRule="auto"/>
+              <w:spacing w:before="0" w:after="18" w:line="252" w:lineRule="auto"/>
             </w:pPr>
             <w:r>
               <w:rPr>
@@ -436,7 +448,7 @@
           </w:p>
           <w:p>
             <w:pPr>
-              <w:spacing w:before="0" w:after="20" w:line="252" w:lineRule="auto"/>
+              <w:spacing w:before="0" w:after="18" w:line="252" w:lineRule="auto"/>
             </w:pPr>
             <w:r>
               <w:rPr>
@@ -448,7 +460,7 @@
           </w:p>
           <w:p>
             <w:pPr>
-              <w:spacing w:before="100" w:after="24"/>
+              <w:spacing w:before="90" w:after="24"/>
             </w:pPr>
             <w:r>
               <w:rPr>
@@ -462,7 +474,7 @@
           </w:p>
           <w:p>
             <w:pPr>
-              <w:spacing w:before="0" w:after="20" w:line="252" w:lineRule="auto"/>
+              <w:spacing w:before="0" w:after="18" w:line="252" w:lineRule="auto"/>
             </w:pPr>
             <w:r>
               <w:rPr>
@@ -474,7 +486,7 @@
           </w:p>
           <w:p>
             <w:pPr>
-              <w:spacing w:before="0" w:after="20" w:line="252" w:lineRule="auto"/>
+              <w:spacing w:before="0" w:after="18" w:line="252" w:lineRule="auto"/>
             </w:pPr>
             <w:r>
               <w:rPr>
@@ -486,7 +498,7 @@
           </w:p>
           <w:p>
             <w:pPr>
-              <w:spacing w:before="0" w:after="20" w:line="252" w:lineRule="auto"/>
+              <w:spacing w:before="0" w:after="18" w:line="252" w:lineRule="auto"/>
             </w:pPr>
             <w:r>
               <w:rPr>
@@ -498,7 +510,7 @@
           </w:p>
           <w:p>
             <w:pPr>
-              <w:spacing w:before="0" w:after="20" w:line="252" w:lineRule="auto"/>
+              <w:spacing w:before="0" w:after="18" w:line="252" w:lineRule="auto"/>
             </w:pPr>
             <w:r>
               <w:rPr>
@@ -510,7 +522,7 @@
           </w:p>
           <w:p>
             <w:pPr>
-              <w:spacing w:before="100" w:after="24"/>
+              <w:spacing w:before="90" w:after="24"/>
             </w:pPr>
             <w:r>
               <w:rPr>
@@ -524,7 +536,7 @@
           </w:p>
           <w:p>
             <w:pPr>
-              <w:spacing w:before="0" w:after="20" w:line="252" w:lineRule="auto"/>
+              <w:spacing w:before="0" w:after="18" w:line="252" w:lineRule="auto"/>
             </w:pPr>
             <w:r>
               <w:rPr>
@@ -536,7 +548,7 @@
           </w:p>
           <w:p>
             <w:pPr>
-              <w:spacing w:before="0" w:after="20" w:line="252" w:lineRule="auto"/>
+              <w:spacing w:before="0" w:after="18" w:line="252" w:lineRule="auto"/>
             </w:pPr>
             <w:r>
               <w:rPr>
@@ -548,7 +560,7 @@
           </w:p>
           <w:p>
             <w:pPr>
-              <w:spacing w:before="100" w:after="24"/>
+              <w:spacing w:before="90" w:after="24"/>
             </w:pPr>
             <w:r>
               <w:rPr>
@@ -562,7 +574,7 @@
           </w:p>
           <w:p>
             <w:pPr>
-              <w:spacing w:before="0" w:after="20" w:line="252" w:lineRule="auto"/>
+              <w:spacing w:before="0" w:after="18" w:line="252" w:lineRule="auto"/>
             </w:pPr>
             <w:r>
               <w:rPr>
@@ -574,7 +586,7 @@
           </w:p>
           <w:p>
             <w:pPr>
-              <w:spacing w:before="0" w:after="20" w:line="252" w:lineRule="auto"/>
+              <w:spacing w:before="0" w:after="18" w:line="252" w:lineRule="auto"/>
             </w:pPr>
             <w:r>
               <w:rPr>
@@ -586,7 +598,7 @@
           </w:p>
           <w:p>
             <w:pPr>
-              <w:spacing w:before="0" w:after="20" w:line="252" w:lineRule="auto"/>
+              <w:spacing w:before="0" w:after="18" w:line="252" w:lineRule="auto"/>
             </w:pPr>
             <w:r>
               <w:rPr>
@@ -599,13 +611,13 @@
         </w:tc>
         <w:tc>
           <w:tcPr>
-            <w:tcW w:type="dxa" w:w="8237"/>
+            <w:tcW w:type="dxa" w:w="8165"/>
             <w:shd w:fill="FFFFFF"/>
             <w:tcMar>
-              <w:top w:w="180" w:type="dxa"/>
+              <w:top w:w="200" w:type="dxa"/>
               <w:bottom w:w="140" w:type="dxa"/>
-              <w:left w:w="180" w:type="dxa"/>
-              <w:right w:w="180" w:type="dxa"/>
+              <w:left w:w="200" w:type="dxa"/>
+              <w:right w:w="200" w:type="dxa"/>
             </w:tcMar>
           </w:tcPr>
           <w:p>
@@ -649,7 +661,7 @@
           </w:p>
           <w:p>
             <w:pPr>
-              <w:spacing w:before="90" w:after="24"/>
+              <w:spacing w:before="84" w:after="24"/>
             </w:pPr>
             <w:r>
               <w:rPr>
@@ -671,19 +683,19 @@
           </w:p>
           <w:p>
             <w:pPr>
-              <w:spacing w:before="0" w:after="50" w:line="254" w:lineRule="auto"/>
+              <w:spacing w:before="0" w:after="50" w:line="252" w:lineRule="auto"/>
             </w:pPr>
             <w:r>
               <w:rPr>
                 <w:color w:val="334155"/>
                 <w:sz w:val="14"/>
               </w:rPr>
-              <w:t>Lead AI Engineer &amp; Data Architect (Google Developer Program Member) specializing in sovereign autonomous multi-agents, Neo4j GraphRAG, and deterministic civil engineering software. Founder of Archi Cam AI (official applicant for Google Africa Applied AI Lab), bridging multi-agent orchestration with strict mathematical compliance (BAEL 91, ICAO Annex 17) and production MLOps.</w:t>
+              <w:t>Lead AI Engineer &amp; Data Architect (Google Developer Program Member), leveraging Google Antigravity to design and orchestrate neuro-symbolic autonomous multi-agent systems, Neo4j GraphRAG, and sovereign production MLOps. Specialized in deterministic architectures and verifiable AI trust. Founder of Archi Cam AI (official applicant for Google Africa Applied AI Lab), bridging civil engineering methodology, math rigor, and product vision.</w:t>
             </w:r>
           </w:p>
           <w:p>
             <w:pPr>
-              <w:spacing w:before="90" w:after="24"/>
+              <w:spacing w:before="84" w:after="24"/>
             </w:pPr>
             <w:r>
               <w:rPr>
@@ -705,7 +717,7 @@
           </w:p>
           <w:p>
             <w:pPr>
-              <w:spacing w:before="44" w:after="8"/>
+              <w:spacing w:before="40" w:after="8"/>
             </w:pPr>
             <w:r>
               <w:rPr>
@@ -726,7 +738,7 @@
           </w:p>
           <w:p>
             <w:pPr>
-              <w:spacing w:before="0" w:after="12" w:line="250" w:lineRule="auto"/>
+              <w:spacing w:before="0" w:after="10" w:line="250" w:lineRule="auto"/>
               <w:ind w:left="115"/>
             </w:pPr>
             <w:r>
@@ -742,12 +754,12 @@
                 <w:color w:val="334155"/>
                 <w:sz w:val="14"/>
               </w:rPr>
-              <w:t>Official Applicant Google Africa Applied AI Lab. 5D BIM &amp; BOQ estimation (local Gemma 4 12B, Gemini, BAEL 91).</w:t>
+              <w:t>Official Applicant Google Africa Applied AI Lab. Built with Google Antigravity (Gemma 4 12B, Gemini, BAEL 91).</w:t>
             </w:r>
           </w:p>
           <w:p>
             <w:pPr>
-              <w:spacing w:before="0" w:after="12" w:line="250" w:lineRule="auto"/>
+              <w:spacing w:before="0" w:after="10" w:line="250" w:lineRule="auto"/>
               <w:ind w:left="115"/>
             </w:pPr>
             <w:r>
@@ -768,7 +780,7 @@
           </w:p>
           <w:p>
             <w:pPr>
-              <w:spacing w:before="44" w:after="8"/>
+              <w:spacing w:before="40" w:after="8"/>
             </w:pPr>
             <w:r>
               <w:rPr>
@@ -789,7 +801,7 @@
           </w:p>
           <w:p>
             <w:pPr>
-              <w:spacing w:before="0" w:after="12" w:line="250" w:lineRule="auto"/>
+              <w:spacing w:before="0" w:after="10" w:line="250" w:lineRule="auto"/>
               <w:ind w:left="115"/>
             </w:pPr>
             <w:r>
@@ -805,12 +817,12 @@
                 <w:color w:val="334155"/>
                 <w:sz w:val="14"/>
               </w:rPr>
-              <w:t>Sovereign DMI system (Univ. of Ngaoundéré): 470 theses, 19 M1 projects, Neo4j graph of 1,366 nodes / 3,833 edges.</w:t>
+              <w:t>Sovereign DMI system (Univ. of Ngaoundéré) engineered with Google Antigravity: 470 theses, 19 M1 projects, 1,366 nodes.</w:t>
             </w:r>
           </w:p>
           <w:p>
             <w:pPr>
-              <w:spacing w:before="0" w:after="12" w:line="250" w:lineRule="auto"/>
+              <w:spacing w:before="0" w:after="10" w:line="250" w:lineRule="auto"/>
               <w:ind w:left="115"/>
             </w:pPr>
             <w:r>
@@ -831,7 +843,7 @@
           </w:p>
           <w:p>
             <w:pPr>
-              <w:spacing w:before="44" w:after="8"/>
+              <w:spacing w:before="40" w:after="8"/>
             </w:pPr>
             <w:r>
               <w:rPr>
@@ -852,7 +864,7 @@
           </w:p>
           <w:p>
             <w:pPr>
-              <w:spacing w:before="0" w:after="12" w:line="250" w:lineRule="auto"/>
+              <w:spacing w:before="0" w:after="10" w:line="250" w:lineRule="auto"/>
               <w:ind w:left="115"/>
             </w:pPr>
             <w:r>
@@ -873,7 +885,7 @@
           </w:p>
           <w:p>
             <w:pPr>
-              <w:spacing w:before="0" w:after="12" w:line="250" w:lineRule="auto"/>
+              <w:spacing w:before="0" w:after="10" w:line="250" w:lineRule="auto"/>
               <w:ind w:left="115"/>
             </w:pPr>
             <w:r>
@@ -894,7 +906,7 @@
           </w:p>
           <w:p>
             <w:pPr>
-              <w:spacing w:before="44" w:after="8"/>
+              <w:spacing w:before="40" w:after="8"/>
             </w:pPr>
             <w:r>
               <w:rPr>
@@ -915,7 +927,7 @@
           </w:p>
           <w:p>
             <w:pPr>
-              <w:spacing w:before="0" w:after="12" w:line="250" w:lineRule="auto"/>
+              <w:spacing w:before="0" w:after="10" w:line="250" w:lineRule="auto"/>
               <w:ind w:left="115"/>
             </w:pPr>
             <w:r>
@@ -931,12 +943,12 @@
                 <w:color w:val="334155"/>
                 <w:sz w:val="14"/>
               </w:rPr>
-              <w:t>Dataset Automator: TabFM &amp; BigQuery DataFrames MLOps factory with continuous Data Drift tracking (KS/PSI) and EU AI Act.</w:t>
+              <w:t>Dataset Automator: Built with Google Antigravity (Google Cloud Hackathon) with TabFM, BigQuery DataFrames, and EU AI Act.</w:t>
             </w:r>
           </w:p>
           <w:p>
             <w:pPr>
-              <w:spacing w:before="0" w:after="12" w:line="250" w:lineRule="auto"/>
+              <w:spacing w:before="0" w:after="10" w:line="250" w:lineRule="auto"/>
               <w:ind w:left="115"/>
             </w:pPr>
             <w:r>
@@ -957,7 +969,7 @@
           </w:p>
           <w:p>
             <w:pPr>
-              <w:spacing w:before="90" w:after="24"/>
+              <w:spacing w:before="84" w:after="24"/>
             </w:pPr>
             <w:r>
               <w:rPr>
@@ -979,7 +991,7 @@
           </w:p>
           <w:p>
             <w:pPr>
-              <w:spacing w:before="44" w:after="8"/>
+              <w:spacing w:before="40" w:after="8"/>
             </w:pPr>
             <w:r>
               <w:rPr>
@@ -1000,7 +1012,7 @@
           </w:p>
           <w:p>
             <w:pPr>
-              <w:spacing w:before="0" w:after="12"/>
+              <w:spacing w:before="0" w:after="10"/>
             </w:pPr>
             <w:r>
               <w:rPr>
@@ -1013,7 +1025,7 @@
           </w:p>
           <w:p>
             <w:pPr>
-              <w:spacing w:before="0" w:after="12" w:line="250" w:lineRule="auto"/>
+              <w:spacing w:before="0" w:after="10" w:line="250" w:lineRule="auto"/>
               <w:ind w:left="115"/>
             </w:pPr>
             <w:r>
@@ -1034,7 +1046,7 @@
           </w:p>
           <w:p>
             <w:pPr>
-              <w:spacing w:before="0" w:after="12" w:line="250" w:lineRule="auto"/>
+              <w:spacing w:before="0" w:after="10" w:line="250" w:lineRule="auto"/>
               <w:ind w:left="115"/>
             </w:pPr>
             <w:r>
@@ -1055,7 +1067,7 @@
           </w:p>
           <w:p>
             <w:pPr>
-              <w:spacing w:before="44" w:after="8"/>
+              <w:spacing w:before="40" w:after="8"/>
             </w:pPr>
             <w:r>
               <w:rPr>
@@ -1076,7 +1088,7 @@
           </w:p>
           <w:p>
             <w:pPr>
-              <w:spacing w:before="0" w:after="12"/>
+              <w:spacing w:before="0" w:after="10"/>
             </w:pPr>
             <w:r>
               <w:rPr>
@@ -1089,7 +1101,7 @@
           </w:p>
           <w:p>
             <w:pPr>
-              <w:spacing w:before="0" w:after="12" w:line="250" w:lineRule="auto"/>
+              <w:spacing w:before="0" w:after="10" w:line="250" w:lineRule="auto"/>
               <w:ind w:left="115"/>
             </w:pPr>
             <w:r>
@@ -1110,7 +1122,7 @@
           </w:p>
           <w:p>
             <w:pPr>
-              <w:spacing w:before="0" w:after="12" w:line="250" w:lineRule="auto"/>
+              <w:spacing w:before="0" w:after="10" w:line="250" w:lineRule="auto"/>
               <w:ind w:left="115"/>
             </w:pPr>
             <w:r>
@@ -1131,7 +1143,7 @@
           </w:p>
           <w:p>
             <w:pPr>
-              <w:spacing w:before="90" w:after="24"/>
+              <w:spacing w:before="84" w:after="24"/>
             </w:pPr>
             <w:r>
               <w:rPr>
@@ -1153,7 +1165,7 @@
           </w:p>
           <w:p>
             <w:pPr>
-              <w:spacing w:before="44" w:after="8"/>
+              <w:spacing w:before="40" w:after="8"/>
             </w:pPr>
             <w:r>
               <w:rPr>
@@ -1195,7 +1207,7 @@
           </w:p>
           <w:p>
             <w:pPr>
-              <w:spacing w:before="0" w:after="16" w:line="250" w:lineRule="auto"/>
+              <w:spacing w:before="0" w:after="12" w:line="250" w:lineRule="auto"/>
             </w:pPr>
             <w:r>
               <w:rPr>
@@ -1207,7 +1219,7 @@
           </w:p>
           <w:p>
             <w:pPr>
-              <w:spacing w:before="44" w:after="8"/>
+              <w:spacing w:before="40" w:after="8"/>
             </w:pPr>
             <w:r>
               <w:rPr>
@@ -1241,7 +1253,7 @@
           </w:p>
           <w:p>
             <w:pPr>
-              <w:spacing w:before="0" w:after="16" w:line="250" w:lineRule="auto"/>
+              <w:spacing w:before="0" w:after="12" w:line="250" w:lineRule="auto"/>
             </w:pPr>
             <w:r>
               <w:rPr>
@@ -1253,7 +1265,7 @@
           </w:p>
           <w:p>
             <w:pPr>
-              <w:spacing w:before="90" w:after="24"/>
+              <w:spacing w:before="84" w:after="24"/>
             </w:pPr>
             <w:r>
               <w:rPr>
@@ -1306,7 +1318,7 @@
                 <w:color w:val="334155"/>
                 <w:sz w:val="14"/>
               </w:rPr>
-              <w:t>Dataset Automator v4.0 (TabFM, WIT, bigframes, MCT).</w:t>
+              <w:t>Dataset Automator v4.0 built with Google Antigravity (TabFM, WIT, bigframes, MCT).</w:t>
             </w:r>
           </w:p>
         </w:tc>

</xml_diff>

<commit_message>
cv: sidebar full-height exact A4, pro design overhaul, bigger fonts, margins fixed, Agent K1, Quorum updated
</commit_message>
<xml_diff>
--- a/KOA_MARIE_GERVAIS_NELLY_CV_EN.docx
+++ b/KOA_MARIE_GERVAIS_NELLY_CV_EN.docx
@@ -23,17 +23,17 @@
       </w:tblGrid>
       <w:tr>
         <w:trPr>
-          <w:trHeight w:val="16100" w:hRule="atLeast"/>
+          <w:trHeight w:val="16837" w:hRule="exact"/>
         </w:trPr>
         <w:tc>
           <w:tcPr>
             <w:tcW w:type="dxa" w:w="3744"/>
             <w:shd w:fill="0F172A"/>
             <w:tcMar>
-              <w:top w:w="200" w:type="dxa"/>
-              <w:bottom w:w="140" w:type="dxa"/>
-              <w:left w:w="320" w:type="dxa"/>
-              <w:right w:w="160" w:type="dxa"/>
+              <w:top w:w="280" w:type="dxa"/>
+              <w:bottom w:w="280" w:type="dxa"/>
+              <w:left w:w="600" w:type="dxa"/>
+              <w:right w:w="500" w:type="dxa"/>
             </w:tcMar>
           </w:tcPr>
           <w:p/>
@@ -49,13 +49,13 @@
             <w:tr>
               <w:tc>
                 <w:tcPr>
-                  <w:tcW w:type="dxa" w:w="1944"/>
-                  <w:shd w:fill="1E293B"/>
+                  <w:tcW w:type="dxa" w:w="2232"/>
+                  <w:shd w:fill="1E3A5F"/>
                   <w:tcMar>
-                    <w:top w:w="20" w:type="dxa"/>
-                    <w:bottom w:w="20" w:type="dxa"/>
-                    <w:left w:w="20" w:type="dxa"/>
-                    <w:right w:w="20" w:type="dxa"/>
+                    <w:top w:w="16" w:type="dxa"/>
+                    <w:bottom w:w="16" w:type="dxa"/>
+                    <w:left w:w="16" w:type="dxa"/>
+                    <w:right w:w="16" w:type="dxa"/>
                   </w:tcMar>
                 </w:tcPr>
                 <w:p>
@@ -66,7 +66,7 @@
                   <w:r>
                     <w:drawing>
                       <wp:inline xmlns:a="http://schemas.openxmlformats.org/drawingml/2006/main" xmlns:pic="http://schemas.openxmlformats.org/drawingml/2006/picture">
-                        <wp:extent cx="1115568" cy="1115568"/>
+                        <wp:extent cx="1371600" cy="1371600"/>
                         <wp:docPr id="1" name="Picture 1"/>
                         <wp:cNvGraphicFramePr>
                           <a:graphicFrameLocks noChangeAspect="1"/>
@@ -87,7 +87,7 @@
                               <pic:spPr>
                                 <a:xfrm>
                                   <a:off x="0" y="0"/>
-                                  <a:ext cx="1115568" cy="1115568"/>
+                                  <a:ext cx="1371600" cy="1371600"/>
                                 </a:xfrm>
                                 <a:prstGeom prst="rect"/>
                               </pic:spPr>
@@ -104,506 +104,632 @@
           <w:p/>
           <w:p>
             <w:pPr>
-              <w:spacing w:before="90" w:after="24"/>
+              <w:spacing w:before="0" w:after="0"/>
+            </w:pPr>
+            <w:r/>
+          </w:p>
+          <w:p>
+            <w:pPr>
+              <w:spacing w:before="140" w:after="0"/>
             </w:pPr>
             <w:r>
               <w:rPr>
-                <w:rFonts w:ascii="Segoe UI Semibold" w:hAnsi="Segoe UI Semibold"/>
+                <w:rFonts w:ascii="Segoe UI" w:hAnsi="Segoe UI"/>
                 <w:b/>
                 <w:color w:val="38BDF8"/>
-                <w:sz w:val="15"/>
+                <w:sz w:val="17"/>
               </w:rPr>
               <w:t>CONTACT &amp; PROFILES</w:t>
             </w:r>
           </w:p>
           <w:p>
             <w:pPr>
-              <w:spacing w:before="0" w:after="18" w:line="252" w:lineRule="auto"/>
+              <w:spacing w:before="20" w:after="60"/>
+            </w:pPr>
+            <w:r>
+              <w:rPr>
+                <w:color w:val="0284C7"/>
+                <w:sz w:val="10"/>
+              </w:rPr>
+              <w:t>━━━━━━━━━━━━━━━━━━━━━━</w:t>
+            </w:r>
+          </w:p>
+          <w:p>
+            <w:pPr>
+              <w:spacing w:before="0" w:after="44" w:line="264" w:lineRule="auto"/>
             </w:pPr>
             <w:r>
               <w:rPr>
                 <w:color w:val="F8FAFC"/>
-                <w:sz w:val="14"/>
+                <w:sz w:val="15"/>
               </w:rPr>
               <w:t>✉  magenel85@gmail.com</w:t>
             </w:r>
           </w:p>
           <w:p>
             <w:pPr>
-              <w:spacing w:before="0" w:after="18" w:line="252" w:lineRule="auto"/>
+              <w:spacing w:before="0" w:after="44" w:line="264" w:lineRule="auto"/>
             </w:pPr>
             <w:r>
               <w:rPr>
                 <w:color w:val="F8FAFC"/>
-                <w:sz w:val="14"/>
+                <w:sz w:val="15"/>
               </w:rPr>
               <w:t>✆  +237 695 35 34 02</w:t>
             </w:r>
           </w:p>
           <w:p>
             <w:pPr>
-              <w:spacing w:before="0" w:after="18" w:line="252" w:lineRule="auto"/>
+              <w:spacing w:before="0" w:after="44" w:line="264" w:lineRule="auto"/>
             </w:pPr>
             <w:r>
               <w:rPr>
                 <w:color w:val="F8FAFC"/>
-                <w:sz w:val="14"/>
+                <w:sz w:val="15"/>
               </w:rPr>
               <w:t>⌂  Douala / Ngaoundéré, CM</w:t>
             </w:r>
           </w:p>
           <w:p>
             <w:pPr>
-              <w:spacing w:before="0" w:after="18" w:line="252" w:lineRule="auto"/>
+              <w:spacing w:before="0" w:after="44" w:line="264" w:lineRule="auto"/>
             </w:pPr>
             <w:r>
               <w:rPr>
                 <w:color w:val="F8FAFC"/>
-                <w:sz w:val="14"/>
+                <w:sz w:val="15"/>
+              </w:rPr>
+              <w:t>⚡  devpost.com/magenel85</w:t>
+            </w:r>
+          </w:p>
+          <w:p>
+            <w:pPr>
+              <w:spacing w:before="0" w:after="44" w:line="264" w:lineRule="auto"/>
+            </w:pPr>
+            <w:r>
+              <w:rPr>
+                <w:color w:val="F8FAFC"/>
+                <w:sz w:val="15"/>
               </w:rPr>
               <w:t>🌐  github.com/gervais-afk</w:t>
             </w:r>
           </w:p>
           <w:p>
             <w:pPr>
-              <w:spacing w:before="0" w:after="18" w:line="252" w:lineRule="auto"/>
+              <w:spacing w:before="0" w:after="44" w:line="264" w:lineRule="auto"/>
             </w:pPr>
             <w:r>
               <w:rPr>
                 <w:color w:val="F8FAFC"/>
-                <w:sz w:val="14"/>
+                <w:sz w:val="15"/>
               </w:rPr>
               <w:t>💼  linkedin.com/in/marie-gervais-koa</w:t>
             </w:r>
           </w:p>
           <w:p>
             <w:pPr>
-              <w:spacing w:before="0" w:after="18" w:line="252" w:lineRule="auto"/>
+              <w:spacing w:before="0" w:after="44" w:line="264" w:lineRule="auto"/>
             </w:pPr>
             <w:r>
               <w:rPr>
                 <w:color w:val="F8FAFC"/>
-                <w:sz w:val="14"/>
-              </w:rPr>
-              <w:t>⚡  devpost.com/magenel85</w:t>
-            </w:r>
-          </w:p>
-          <w:p>
-            <w:pPr>
-              <w:spacing w:before="0" w:after="18" w:line="252" w:lineRule="auto"/>
-            </w:pPr>
-            <w:r>
-              <w:rPr>
-                <w:color w:val="F8FAFC"/>
-                <w:sz w:val="14"/>
+                <w:sz w:val="15"/>
               </w:rPr>
               <w:t>🏅  Google Developer Program</w:t>
             </w:r>
           </w:p>
           <w:p>
             <w:pPr>
-              <w:spacing w:before="90" w:after="24"/>
+              <w:spacing w:before="0" w:after="0"/>
+            </w:pPr>
+            <w:r/>
+          </w:p>
+          <w:p>
+            <w:pPr>
+              <w:spacing w:before="140" w:after="0"/>
             </w:pPr>
             <w:r>
               <w:rPr>
-                <w:rFonts w:ascii="Segoe UI Semibold" w:hAnsi="Segoe UI Semibold"/>
+                <w:rFonts w:ascii="Segoe UI" w:hAnsi="Segoe UI"/>
                 <w:b/>
                 <w:color w:val="38BDF8"/>
-                <w:sz w:val="15"/>
+                <w:sz w:val="17"/>
               </w:rPr>
               <w:t>AI &amp; LLM STACK</w:t>
             </w:r>
           </w:p>
           <w:p>
             <w:pPr>
-              <w:spacing w:before="0" w:after="18" w:line="252" w:lineRule="auto"/>
+              <w:spacing w:before="20" w:after="60"/>
+            </w:pPr>
+            <w:r>
+              <w:rPr>
+                <w:color w:val="0284C7"/>
+                <w:sz w:val="10"/>
+              </w:rPr>
+              <w:t>━━━━━━━━━━━━━━━━━━━━━━</w:t>
+            </w:r>
+          </w:p>
+          <w:p>
+            <w:pPr>
+              <w:spacing w:before="0" w:after="44" w:line="264" w:lineRule="auto"/>
             </w:pPr>
             <w:r>
               <w:rPr>
                 <w:color w:val="F8FAFC"/>
-                <w:sz w:val="14"/>
+                <w:sz w:val="15"/>
               </w:rPr>
-              <w:t>Google Antigravity IDE ■ ■ ■ ■ ■</w:t>
+              <w:t>Google Antigravity IDE  ■ ■ ■ ■ ■</w:t>
             </w:r>
           </w:p>
           <w:p>
             <w:pPr>
-              <w:spacing w:before="0" w:after="18" w:line="252" w:lineRule="auto"/>
+              <w:spacing w:before="0" w:after="44" w:line="264" w:lineRule="auto"/>
             </w:pPr>
             <w:r>
               <w:rPr>
                 <w:color w:val="F8FAFC"/>
-                <w:sz w:val="14"/>
+                <w:sz w:val="15"/>
               </w:rPr>
-              <w:t>Google Gemma 4 (12B) ■ ■ ■ ■ ■</w:t>
+              <w:t>Google Gemma 4 (12B)    ■ ■ ■ ■ ■</w:t>
             </w:r>
           </w:p>
           <w:p>
             <w:pPr>
-              <w:spacing w:before="0" w:after="18" w:line="252" w:lineRule="auto"/>
+              <w:spacing w:before="0" w:after="44" w:line="264" w:lineRule="auto"/>
             </w:pPr>
             <w:r>
               <w:rPr>
                 <w:color w:val="F8FAFC"/>
-                <w:sz w:val="14"/>
+                <w:sz w:val="15"/>
               </w:rPr>
-              <w:t>Gemini 2.5 / 1.5 Pro ■ ■ ■ ■ ■</w:t>
+              <w:t>Gemini 2.5 / 1.5 Pro    ■ ■ ■ ■ ■</w:t>
             </w:r>
           </w:p>
           <w:p>
             <w:pPr>
-              <w:spacing w:before="0" w:after="18" w:line="252" w:lineRule="auto"/>
+              <w:spacing w:before="0" w:after="44" w:line="264" w:lineRule="auto"/>
             </w:pPr>
             <w:r>
               <w:rPr>
                 <w:color w:val="F8FAFC"/>
-                <w:sz w:val="14"/>
+                <w:sz w:val="15"/>
               </w:rPr>
-              <w:t>Google TabFM (Tabular)■ ■ ■ ■ ■</w:t>
+              <w:t>Google TabFM (Tabular)  ■ ■ ■ ■ ■</w:t>
             </w:r>
           </w:p>
           <w:p>
             <w:pPr>
-              <w:spacing w:before="0" w:after="18" w:line="252" w:lineRule="auto"/>
+              <w:spacing w:before="0" w:after="44" w:line="264" w:lineRule="auto"/>
             </w:pPr>
             <w:r>
               <w:rPr>
                 <w:color w:val="F8FAFC"/>
-                <w:sz w:val="14"/>
+                <w:sz w:val="15"/>
               </w:rPr>
-              <w:t>LangGraph Multi-Agents■ ■ ■ ■ ■</w:t>
+              <w:t>LangGraph Multi-Agents  ■ ■ ■ ■ ■</w:t>
             </w:r>
           </w:p>
           <w:p>
             <w:pPr>
-              <w:spacing w:before="0" w:after="18" w:line="252" w:lineRule="auto"/>
+              <w:spacing w:before="0" w:after="44" w:line="264" w:lineRule="auto"/>
             </w:pPr>
             <w:r>
               <w:rPr>
                 <w:color w:val="F8FAFC"/>
-                <w:sz w:val="14"/>
+                <w:sz w:val="15"/>
               </w:rPr>
-              <w:t>Firebase Genkit      ■ ■ ■ ■ ■</w:t>
+              <w:t>Firebase Genkit         ■ ■ ■ ■ ■</w:t>
             </w:r>
           </w:p>
           <w:p>
             <w:pPr>
-              <w:spacing w:before="0" w:after="18" w:line="252" w:lineRule="auto"/>
+              <w:spacing w:before="0" w:after="44" w:line="264" w:lineRule="auto"/>
             </w:pPr>
             <w:r>
               <w:rPr>
                 <w:color w:val="F8FAFC"/>
-                <w:sz w:val="14"/>
+                <w:sz w:val="15"/>
               </w:rPr>
-              <w:t>Neo4j GraphRAG (N10S)■ ■ ■ ■ ■</w:t>
+              <w:t>Neo4j GraphRAG — Agent K1  ■ ■ ■ ■ ■</w:t>
             </w:r>
           </w:p>
           <w:p>
             <w:pPr>
-              <w:spacing w:before="90" w:after="24"/>
+              <w:spacing w:before="0" w:after="0"/>
+            </w:pPr>
+            <w:r/>
+          </w:p>
+          <w:p>
+            <w:pPr>
+              <w:spacing w:before="140" w:after="0"/>
             </w:pPr>
             <w:r>
               <w:rPr>
-                <w:rFonts w:ascii="Segoe UI Semibold" w:hAnsi="Segoe UI Semibold"/>
+                <w:rFonts w:ascii="Segoe UI" w:hAnsi="Segoe UI"/>
                 <w:b/>
                 <w:color w:val="38BDF8"/>
-                <w:sz w:val="15"/>
+                <w:sz w:val="17"/>
               </w:rPr>
               <w:t>DATA &amp; GRAPHS</w:t>
             </w:r>
           </w:p>
           <w:p>
             <w:pPr>
-              <w:spacing w:before="0" w:after="18" w:line="252" w:lineRule="auto"/>
+              <w:spacing w:before="20" w:after="60"/>
+            </w:pPr>
+            <w:r>
+              <w:rPr>
+                <w:color w:val="0284C7"/>
+                <w:sz w:val="10"/>
+              </w:rPr>
+              <w:t>━━━━━━━━━━━━━━━━━━━━━━</w:t>
+            </w:r>
+          </w:p>
+          <w:p>
+            <w:pPr>
+              <w:spacing w:before="0" w:after="44" w:line="264" w:lineRule="auto"/>
             </w:pPr>
             <w:r>
               <w:rPr>
                 <w:color w:val="F8FAFC"/>
-                <w:sz w:val="14"/>
+                <w:sz w:val="15"/>
               </w:rPr>
-              <w:t>Neo4j / Cypher Graph ■ ■ ■ ■ ■</w:t>
+              <w:t>Neo4j / Cypher Graph    ■ ■ ■ ■ ■</w:t>
             </w:r>
           </w:p>
           <w:p>
             <w:pPr>
-              <w:spacing w:before="0" w:after="18" w:line="252" w:lineRule="auto"/>
+              <w:spacing w:before="0" w:after="44" w:line="264" w:lineRule="auto"/>
             </w:pPr>
             <w:r>
               <w:rPr>
                 <w:color w:val="F8FAFC"/>
-                <w:sz w:val="14"/>
+                <w:sz w:val="15"/>
               </w:rPr>
-              <w:t>PostgreSQL / pgvector■ ■ ■ ■ ■</w:t>
+              <w:t>PostgreSQL / pgvector   ■ ■ ■ ■ ■</w:t>
             </w:r>
           </w:p>
           <w:p>
             <w:pPr>
-              <w:spacing w:before="0" w:after="18" w:line="252" w:lineRule="auto"/>
+              <w:spacing w:before="0" w:after="44" w:line="264" w:lineRule="auto"/>
             </w:pPr>
             <w:r>
               <w:rPr>
                 <w:color w:val="F8FAFC"/>
-                <w:sz w:val="14"/>
+                <w:sz w:val="15"/>
               </w:rPr>
-              <w:t>Google BigQuery Data ■ ■ ■ ■ □</w:t>
+              <w:t>Google BigQuery         ■ ■ ■ ■ □</w:t>
             </w:r>
           </w:p>
           <w:p>
             <w:pPr>
-              <w:spacing w:before="0" w:after="18" w:line="252" w:lineRule="auto"/>
+              <w:spacing w:before="0" w:after="44" w:line="264" w:lineRule="auto"/>
             </w:pPr>
             <w:r>
               <w:rPr>
                 <w:color w:val="F8FAFC"/>
-                <w:sz w:val="14"/>
+                <w:sz w:val="15"/>
               </w:rPr>
-              <w:t>Supabase Realtime    ■ ■ ■ ■ □</w:t>
+              <w:t>Supabase Realtime       ■ ■ ■ ■ □</w:t>
             </w:r>
           </w:p>
           <w:p>
             <w:pPr>
-              <w:spacing w:before="0" w:after="18" w:line="252" w:lineRule="auto"/>
+              <w:spacing w:before="0" w:after="44" w:line="264" w:lineRule="auto"/>
             </w:pPr>
             <w:r>
               <w:rPr>
                 <w:color w:val="F8FAFC"/>
-                <w:sz w:val="14"/>
+                <w:sz w:val="15"/>
               </w:rPr>
-              <w:t>Pandas / NumPy ETL   ■ ■ ■ ■ ■</w:t>
+              <w:t>Pandas / NumPy ETL      ■ ■ ■ ■ ■</w:t>
             </w:r>
           </w:p>
           <w:p>
             <w:pPr>
-              <w:spacing w:before="90" w:after="24"/>
+              <w:spacing w:before="0" w:after="0"/>
+            </w:pPr>
+            <w:r/>
+          </w:p>
+          <w:p>
+            <w:pPr>
+              <w:spacing w:before="140" w:after="0"/>
             </w:pPr>
             <w:r>
               <w:rPr>
-                <w:rFonts w:ascii="Segoe UI Semibold" w:hAnsi="Segoe UI Semibold"/>
+                <w:rFonts w:ascii="Segoe UI" w:hAnsi="Segoe UI"/>
                 <w:b/>
                 <w:color w:val="38BDF8"/>
-                <w:sz w:val="15"/>
+                <w:sz w:val="17"/>
               </w:rPr>
               <w:t>DEV &amp; MLOPS</w:t>
             </w:r>
           </w:p>
           <w:p>
             <w:pPr>
-              <w:spacing w:before="0" w:after="18" w:line="252" w:lineRule="auto"/>
+              <w:spacing w:before="20" w:after="60"/>
+            </w:pPr>
+            <w:r>
+              <w:rPr>
+                <w:color w:val="0284C7"/>
+                <w:sz w:val="10"/>
+              </w:rPr>
+              <w:t>━━━━━━━━━━━━━━━━━━━━━━</w:t>
+            </w:r>
+          </w:p>
+          <w:p>
+            <w:pPr>
+              <w:spacing w:before="0" w:after="44" w:line="264" w:lineRule="auto"/>
             </w:pPr>
             <w:r>
               <w:rPr>
                 <w:color w:val="F8FAFC"/>
-                <w:sz w:val="14"/>
+                <w:sz w:val="15"/>
               </w:rPr>
-              <w:t>Python (3.11+ MLOps) ■ ■ ■ ■ ■</w:t>
+              <w:t>Python 3.11+ / MLOps    ■ ■ ■ ■ ■</w:t>
             </w:r>
           </w:p>
           <w:p>
             <w:pPr>
-              <w:spacing w:before="0" w:after="18" w:line="252" w:lineRule="auto"/>
+              <w:spacing w:before="0" w:after="44" w:line="264" w:lineRule="auto"/>
             </w:pPr>
             <w:r>
               <w:rPr>
                 <w:color w:val="F8FAFC"/>
-                <w:sz w:val="14"/>
+                <w:sz w:val="15"/>
               </w:rPr>
-              <w:t>FastAPI / Next.js 14 ■ ■ ■ ■ □</w:t>
+              <w:t>FastAPI / Next.js 14    ■ ■ ■ ■ □</w:t>
             </w:r>
           </w:p>
           <w:p>
             <w:pPr>
-              <w:spacing w:before="0" w:after="18" w:line="252" w:lineRule="auto"/>
+              <w:spacing w:before="0" w:after="44" w:line="264" w:lineRule="auto"/>
             </w:pPr>
             <w:r>
               <w:rPr>
                 <w:color w:val="F8FAFC"/>
-                <w:sz w:val="14"/>
+                <w:sz w:val="15"/>
               </w:rPr>
-              <w:t>MLflow &amp; Data Drift  ■ ■ ■ ■ □</w:t>
+              <w:t>MLflow &amp; Data Drift     ■ ■ ■ ■ □</w:t>
             </w:r>
           </w:p>
           <w:p>
             <w:pPr>
-              <w:spacing w:before="0" w:after="18" w:line="252" w:lineRule="auto"/>
+              <w:spacing w:before="0" w:after="44" w:line="264" w:lineRule="auto"/>
             </w:pPr>
             <w:r>
               <w:rPr>
                 <w:color w:val="F8FAFC"/>
-                <w:sz w:val="14"/>
+                <w:sz w:val="15"/>
               </w:rPr>
-              <w:t>SHAP Sentinel Audit  ■ ■ ■ ■ ■</w:t>
+              <w:t>SHAP Sentinel Audit     ■ ■ ■ ■ ■</w:t>
             </w:r>
           </w:p>
           <w:p>
             <w:pPr>
-              <w:spacing w:before="0" w:after="18" w:line="252" w:lineRule="auto"/>
+              <w:spacing w:before="0" w:after="44" w:line="264" w:lineRule="auto"/>
             </w:pPr>
             <w:r>
               <w:rPr>
                 <w:color w:val="F8FAFC"/>
-                <w:sz w:val="14"/>
+                <w:sz w:val="15"/>
               </w:rPr>
-              <w:t>Docker &amp; Streamlit   ■ ■ ■ ■ ■</w:t>
+              <w:t>Docker &amp; Streamlit      ■ ■ ■ ■ ■</w:t>
             </w:r>
           </w:p>
           <w:p>
             <w:pPr>
-              <w:spacing w:before="0" w:after="18" w:line="252" w:lineRule="auto"/>
+              <w:spacing w:before="0" w:after="44" w:line="264" w:lineRule="auto"/>
             </w:pPr>
             <w:r>
               <w:rPr>
                 <w:color w:val="F8FAFC"/>
-                <w:sz w:val="14"/>
+                <w:sz w:val="15"/>
               </w:rPr>
-              <w:t>IfcOpenShell (5D BIM)■ ■ ■ ■ □</w:t>
+              <w:t>IfcOpenShell (5D BIM)   ■ ■ ■ ■ □</w:t>
             </w:r>
           </w:p>
           <w:p>
             <w:pPr>
-              <w:spacing w:before="90" w:after="24"/>
+              <w:spacing w:before="0" w:after="0"/>
+            </w:pPr>
+            <w:r/>
+          </w:p>
+          <w:p>
+            <w:pPr>
+              <w:spacing w:before="140" w:after="0"/>
             </w:pPr>
             <w:r>
               <w:rPr>
-                <w:rFonts w:ascii="Segoe UI Semibold" w:hAnsi="Segoe UI Semibold"/>
+                <w:rFonts w:ascii="Segoe UI" w:hAnsi="Segoe UI"/>
                 <w:b/>
                 <w:color w:val="38BDF8"/>
-                <w:sz w:val="15"/>
+                <w:sz w:val="17"/>
               </w:rPr>
               <w:t>SECURITY &amp; AUDIT</w:t>
             </w:r>
           </w:p>
           <w:p>
             <w:pPr>
-              <w:spacing w:before="0" w:after="18" w:line="252" w:lineRule="auto"/>
+              <w:spacing w:before="20" w:after="60"/>
+            </w:pPr>
+            <w:r>
+              <w:rPr>
+                <w:color w:val="0284C7"/>
+                <w:sz w:val="10"/>
+              </w:rPr>
+              <w:t>━━━━━━━━━━━━━━━━━━━━━━</w:t>
+            </w:r>
+          </w:p>
+          <w:p>
+            <w:pPr>
+              <w:spacing w:before="0" w:after="44" w:line="264" w:lineRule="auto"/>
             </w:pPr>
             <w:r>
               <w:rPr>
                 <w:color w:val="F8FAFC"/>
-                <w:sz w:val="14"/>
+                <w:sz w:val="15"/>
               </w:rPr>
-              <w:t>◈ Quorum 4-Eyes (KOA+AZIZ)</w:t>
+              <w:t>◈ Quorum 4-Eyes Governance</w:t>
             </w:r>
           </w:p>
           <w:p>
             <w:pPr>
-              <w:spacing w:before="0" w:after="18" w:line="252" w:lineRule="auto"/>
+              <w:spacing w:before="0" w:after="44" w:line="264" w:lineRule="auto"/>
             </w:pPr>
             <w:r>
               <w:rPr>
                 <w:color w:val="F8FAFC"/>
-                <w:sz w:val="14"/>
+                <w:sz w:val="15"/>
               </w:rPr>
               <w:t>◈ OKF v0.2 SHA-256 No-LLM</w:t>
             </w:r>
           </w:p>
           <w:p>
             <w:pPr>
-              <w:spacing w:before="0" w:after="18" w:line="252" w:lineRule="auto"/>
+              <w:spacing w:before="0" w:after="44" w:line="264" w:lineRule="auto"/>
             </w:pPr>
             <w:r>
               <w:rPr>
                 <w:color w:val="F8FAFC"/>
-                <w:sz w:val="14"/>
+                <w:sz w:val="15"/>
               </w:rPr>
               <w:t>◈ EU AI Act (RSASSA-PSS)</w:t>
             </w:r>
           </w:p>
           <w:p>
             <w:pPr>
-              <w:spacing w:before="0" w:after="18" w:line="252" w:lineRule="auto"/>
+              <w:spacing w:before="0" w:after="44" w:line="264" w:lineRule="auto"/>
             </w:pPr>
             <w:r>
               <w:rPr>
                 <w:color w:val="F8FAFC"/>
-                <w:sz w:val="14"/>
+                <w:sz w:val="15"/>
               </w:rPr>
-              <w:t>◈ AVSEC (ICAO Annex 17)</w:t>
+              <w:t>◈ AVSEC Framework (ICAO Annex 17)</w:t>
             </w:r>
           </w:p>
           <w:p>
             <w:pPr>
-              <w:spacing w:before="90" w:after="24"/>
+              <w:spacing w:before="0" w:after="0"/>
+            </w:pPr>
+            <w:r/>
+          </w:p>
+          <w:p>
+            <w:pPr>
+              <w:spacing w:before="140" w:after="0"/>
             </w:pPr>
             <w:r>
               <w:rPr>
-                <w:rFonts w:ascii="Segoe UI Semibold" w:hAnsi="Segoe UI Semibold"/>
+                <w:rFonts w:ascii="Segoe UI" w:hAnsi="Segoe UI"/>
                 <w:b/>
                 <w:color w:val="38BDF8"/>
-                <w:sz w:val="15"/>
+                <w:sz w:val="17"/>
               </w:rPr>
               <w:t>LANGUAGES</w:t>
             </w:r>
           </w:p>
           <w:p>
             <w:pPr>
-              <w:spacing w:before="0" w:after="18" w:line="252" w:lineRule="auto"/>
+              <w:spacing w:before="20" w:after="60"/>
+            </w:pPr>
+            <w:r>
+              <w:rPr>
+                <w:color w:val="0284C7"/>
+                <w:sz w:val="10"/>
+              </w:rPr>
+              <w:t>━━━━━━━━━━━━━━━━━━━━━━</w:t>
+            </w:r>
+          </w:p>
+          <w:p>
+            <w:pPr>
+              <w:spacing w:before="0" w:after="44" w:line="264" w:lineRule="auto"/>
             </w:pPr>
             <w:r>
               <w:rPr>
                 <w:color w:val="F8FAFC"/>
-                <w:sz w:val="14"/>
+                <w:sz w:val="15"/>
               </w:rPr>
-              <w:t>French (Native / Fluent)</w:t>
+              <w:t>French   —  Native / Fluent</w:t>
             </w:r>
           </w:p>
           <w:p>
             <w:pPr>
-              <w:spacing w:before="0" w:after="18" w:line="252" w:lineRule="auto"/>
+              <w:spacing w:before="0" w:after="44" w:line="264" w:lineRule="auto"/>
             </w:pPr>
             <w:r>
               <w:rPr>
                 <w:color w:val="F8FAFC"/>
-                <w:sz w:val="14"/>
+                <w:sz w:val="15"/>
               </w:rPr>
-              <w:t>English (Technical / Pro)</w:t>
+              <w:t>English  —  Technical / Pro</w:t>
             </w:r>
           </w:p>
           <w:p>
             <w:pPr>
-              <w:spacing w:before="90" w:after="24"/>
+              <w:spacing w:before="0" w:after="0"/>
+            </w:pPr>
+            <w:r/>
+          </w:p>
+          <w:p>
+            <w:pPr>
+              <w:spacing w:before="140" w:after="0"/>
             </w:pPr>
             <w:r>
               <w:rPr>
-                <w:rFonts w:ascii="Segoe UI Semibold" w:hAnsi="Segoe UI Semibold"/>
+                <w:rFonts w:ascii="Segoe UI" w:hAnsi="Segoe UI"/>
                 <w:b/>
                 <w:color w:val="38BDF8"/>
-                <w:sz w:val="15"/>
+                <w:sz w:val="17"/>
               </w:rPr>
               <w:t>KEY ASSETS</w:t>
             </w:r>
           </w:p>
           <w:p>
             <w:pPr>
-              <w:spacing w:before="0" w:after="18" w:line="252" w:lineRule="auto"/>
+              <w:spacing w:before="20" w:after="60"/>
+            </w:pPr>
+            <w:r>
+              <w:rPr>
+                <w:color w:val="0284C7"/>
+                <w:sz w:val="10"/>
+              </w:rPr>
+              <w:t>━━━━━━━━━━━━━━━━━━━━━━</w:t>
+            </w:r>
+          </w:p>
+          <w:p>
+            <w:pPr>
+              <w:spacing w:before="0" w:after="44" w:line="264" w:lineRule="auto"/>
             </w:pPr>
             <w:r>
               <w:rPr>
                 <w:color w:val="F8FAFC"/>
-                <w:sz w:val="14"/>
+                <w:sz w:val="15"/>
               </w:rPr>
-              <w:t>◈ Dual Competence AI &amp; Civil Eng.</w:t>
+              <w:t>◈ Dual Competence: AI &amp; Civil Eng.</w:t>
             </w:r>
           </w:p>
           <w:p>
             <w:pPr>
-              <w:spacing w:before="0" w:after="18" w:line="252" w:lineRule="auto"/>
+              <w:spacing w:before="0" w:after="44" w:line="264" w:lineRule="auto"/>
             </w:pPr>
             <w:r>
               <w:rPr>
                 <w:color w:val="F8FAFC"/>
-                <w:sz w:val="14"/>
+                <w:sz w:val="15"/>
               </w:rPr>
               <w:t>◈ Aviation Security &amp; Crisis (CCAA)</w:t>
             </w:r>
           </w:p>
           <w:p>
             <w:pPr>
-              <w:spacing w:before="0" w:after="18" w:line="252" w:lineRule="auto"/>
+              <w:spacing w:before="0" w:after="44" w:line="264" w:lineRule="auto"/>
             </w:pPr>
             <w:r>
               <w:rPr>
                 <w:color w:val="F8FAFC"/>
-                <w:sz w:val="14"/>
+                <w:sz w:val="15"/>
               </w:rPr>
               <w:t>◈ Mathematical Rigor &amp; Guardrails</w:t>
             </w:r>
@@ -614,60 +740,60 @@
             <w:tcW w:type="dxa" w:w="8165"/>
             <w:shd w:fill="FFFFFF"/>
             <w:tcMar>
-              <w:top w:w="200" w:type="dxa"/>
-              <w:bottom w:w="140" w:type="dxa"/>
-              <w:left w:w="200" w:type="dxa"/>
-              <w:right w:w="200" w:type="dxa"/>
+              <w:top w:w="300" w:type="dxa"/>
+              <w:bottom w:w="280" w:type="dxa"/>
+              <w:left w:w="300" w:type="dxa"/>
+              <w:right w:w="320" w:type="dxa"/>
             </w:tcMar>
           </w:tcPr>
           <w:p>
             <w:pPr>
-              <w:spacing w:before="0" w:after="20"/>
+              <w:spacing w:before="0" w:after="40"/>
             </w:pPr>
             <w:r>
               <w:rPr>
                 <w:rFonts w:ascii="Segoe UI" w:hAnsi="Segoe UI"/>
                 <w:b/>
                 <w:color w:val="0A1128"/>
-                <w:sz w:val="30"/>
+                <w:sz w:val="38"/>
               </w:rPr>
               <w:t>KOA MARIE GERVAIS NELLY</w:t>
             </w:r>
           </w:p>
           <w:p>
             <w:pPr>
-              <w:spacing w:before="0" w:after="30"/>
+              <w:spacing w:before="0" w:after="40"/>
             </w:pPr>
             <w:r>
               <w:rPr>
                 <w:b/>
                 <w:color w:val="0284C7"/>
-                <w:sz w:val="16"/>
+                <w:sz w:val="19"/>
               </w:rPr>
               <w:t>Lead AI Engineer &amp; Data Architect   │   Founder @ Archi Cam AI</w:t>
             </w:r>
           </w:p>
           <w:p>
             <w:pPr>
-              <w:spacing w:before="0" w:after="50"/>
+              <w:spacing w:before="0" w:after="100"/>
             </w:pPr>
             <w:r>
               <w:rPr>
                 <w:color w:val="0284C7"/>
-                <w:sz w:val="13"/>
+                <w:sz w:val="12"/>
               </w:rPr>
-              <w:t>─── ◈ ────────────────────────────────────────────────────────── ◈ ───</w:t>
+              <w:t>────────────────────────────────────────────────────────────────────────</w:t>
             </w:r>
           </w:p>
           <w:p>
             <w:pPr>
-              <w:spacing w:before="84" w:after="24"/>
+              <w:spacing w:before="160" w:after="20"/>
             </w:pPr>
             <w:r>
               <w:rPr>
                 <w:b/>
                 <w:color w:val="0284C7"/>
-                <w:sz w:val="15"/>
+                <w:sz w:val="18"/>
               </w:rPr>
               <w:t xml:space="preserve">◈  </w:t>
             </w:r>
@@ -676,32 +802,44 @@
                 <w:rFonts w:ascii="Segoe UI" w:hAnsi="Segoe UI"/>
                 <w:b/>
                 <w:color w:val="0A1128"/>
-                <w:sz w:val="17"/>
+                <w:sz w:val="21"/>
               </w:rPr>
               <w:t>EXECUTIVE SUMMARY</w:t>
             </w:r>
           </w:p>
           <w:p>
             <w:pPr>
-              <w:spacing w:before="0" w:after="50" w:line="252" w:lineRule="auto"/>
+              <w:spacing w:before="0" w:after="80"/>
+            </w:pPr>
+            <w:r>
+              <w:rPr>
+                <w:color w:val="CBD5E1"/>
+                <w:sz w:val="11"/>
+              </w:rPr>
+              <w:t>──────────────────────────────────────────────────────────────</w:t>
+            </w:r>
+          </w:p>
+          <w:p>
+            <w:pPr>
+              <w:spacing w:before="0" w:after="80" w:line="288" w:lineRule="auto"/>
             </w:pPr>
             <w:r>
               <w:rPr>
                 <w:color w:val="334155"/>
-                <w:sz w:val="14"/>
+                <w:sz w:val="17"/>
               </w:rPr>
-              <w:t>Lead AI Engineer &amp; Data Architect (Google Developer Program Member), leveraging Google Antigravity to design and orchestrate neuro-symbolic autonomous multi-agent systems, Neo4j GraphRAG, and sovereign production MLOps. Specialized in deterministic architectures and verifiable AI trust. Founder of Archi Cam AI (official applicant for Google Africa Applied AI Lab), bridging civil engineering methodology, math rigor, and product vision.</w:t>
+              <w:t>Lead AI Engineer &amp; Data Architect (Google Developer Program Member), leveraging Google Antigravity to design and orchestrate neuro-symbolic autonomous multi-agent systems, Neo4j GraphRAG, and sovereign production MLOps. Specialized in deterministic architectures and verifiable AI trust. Founder of Archi Cam AI (official applicant for Google Africa Applied AI Lab), bridging civil engineering methodology, mathematical rigor, and product vision.</w:t>
             </w:r>
           </w:p>
           <w:p>
             <w:pPr>
-              <w:spacing w:before="84" w:after="24"/>
+              <w:spacing w:before="160" w:after="20"/>
             </w:pPr>
             <w:r>
               <w:rPr>
                 <w:b/>
                 <w:color w:val="0284C7"/>
-                <w:sz w:val="15"/>
+                <w:sz w:val="18"/>
               </w:rPr>
               <w:t xml:space="preserve">◈  </w:t>
             </w:r>
@@ -710,272 +848,284 @@
                 <w:rFonts w:ascii="Segoe UI" w:hAnsi="Segoe UI"/>
                 <w:b/>
                 <w:color w:val="0A1128"/>
-                <w:sz w:val="17"/>
+                <w:sz w:val="21"/>
               </w:rPr>
               <w:t>FLAGSHIP AI PROJECTS</w:t>
             </w:r>
           </w:p>
           <w:p>
             <w:pPr>
-              <w:spacing w:before="40" w:after="8"/>
+              <w:spacing w:before="0" w:after="80"/>
+            </w:pPr>
+            <w:r>
+              <w:rPr>
+                <w:color w:val="CBD5E1"/>
+                <w:sz w:val="11"/>
+              </w:rPr>
+              <w:t>──────────────────────────────────────────────────────────────</w:t>
+            </w:r>
+          </w:p>
+          <w:p>
+            <w:pPr>
+              <w:spacing w:before="80" w:after="20"/>
             </w:pPr>
             <w:r>
               <w:rPr>
                 <w:b/>
                 <w:color w:val="0A1128"/>
-                <w:sz w:val="16"/>
+                <w:sz w:val="19"/>
               </w:rPr>
-              <w:t xml:space="preserve">Archi Cam AI  </w:t>
+              <w:t>Archi Cam AI</w:t>
             </w:r>
             <w:r>
               <w:rPr>
                 <w:i/>
                 <w:color w:val="0284C7"/>
-                <w:sz w:val="14"/>
+                <w:sz w:val="16"/>
               </w:rPr>
-              <w:t>–  Agentic AI &amp; 5D BIM SaaS</w:t>
+              <w:t xml:space="preserve">   —   Agentic AI SaaS &amp; 5D BIM</w:t>
             </w:r>
           </w:p>
           <w:p>
             <w:pPr>
-              <w:spacing w:before="0" w:after="10" w:line="250" w:lineRule="auto"/>
-              <w:ind w:left="115"/>
+              <w:spacing w:before="0" w:after="40" w:line="276" w:lineRule="auto"/>
+              <w:ind w:left="173"/>
             </w:pPr>
             <w:r>
               <w:rPr>
                 <w:b/>
                 <w:color w:val="0284C7"/>
-                <w:sz w:val="14"/>
+                <w:sz w:val="16"/>
               </w:rPr>
               <w:t xml:space="preserve">▸  </w:t>
             </w:r>
             <w:r>
               <w:rPr>
                 <w:color w:val="334155"/>
-                <w:sz w:val="14"/>
+                <w:sz w:val="16"/>
               </w:rPr>
               <w:t>Official Applicant Google Africa Applied AI Lab. Built with Google Antigravity (Gemma 4 12B, Gemini, BAEL 91).</w:t>
             </w:r>
           </w:p>
           <w:p>
             <w:pPr>
-              <w:spacing w:before="0" w:after="10" w:line="250" w:lineRule="auto"/>
-              <w:ind w:left="115"/>
+              <w:spacing w:before="0" w:after="40" w:line="276" w:lineRule="auto"/>
+              <w:ind w:left="173"/>
             </w:pPr>
             <w:r>
               <w:rPr>
                 <w:b/>
                 <w:color w:val="0284C7"/>
-                <w:sz w:val="14"/>
+                <w:sz w:val="16"/>
               </w:rPr>
               <w:t xml:space="preserve">▸  </w:t>
             </w:r>
             <w:r>
               <w:rPr>
                 <w:color w:val="334155"/>
-                <w:sz w:val="14"/>
+                <w:sz w:val="16"/>
               </w:rPr>
-              <w:t>Automated Excel BOQs in &lt;45s (-99.2% time, MLflow R²=0.9872) and 3D renders via Imagen 3 + ControlNet.</w:t>
+              <w:t>Automated Excel BOQs in &lt;45s (–99.2% time, MLflow R²=0.9872) and 3D renders via Imagen 3 + ControlNet.</w:t>
             </w:r>
           </w:p>
           <w:p>
             <w:pPr>
-              <w:spacing w:before="40" w:after="8"/>
+              <w:spacing w:before="80" w:after="20"/>
             </w:pPr>
             <w:r>
               <w:rPr>
                 <w:b/>
                 <w:color w:val="0A1128"/>
-                <w:sz w:val="16"/>
+                <w:sz w:val="19"/>
               </w:rPr>
-              <w:t xml:space="preserve">K1-MATHINFO (v3.0.0)  </w:t>
+              <w:t>K1-MATHINFO (v3.0.0)</w:t>
             </w:r>
             <w:r>
               <w:rPr>
                 <w:i/>
                 <w:color w:val="0284C7"/>
-                <w:sz w:val="14"/>
+                <w:sz w:val="16"/>
               </w:rPr>
-              <w:t>–  Sovereign Multi-Agent AI &amp; OKF Certification</w:t>
+              <w:t xml:space="preserve">   —   Sovereign Multi-Agent AI &amp; OKF Certification</w:t>
             </w:r>
           </w:p>
           <w:p>
             <w:pPr>
-              <w:spacing w:before="0" w:after="10" w:line="250" w:lineRule="auto"/>
-              <w:ind w:left="115"/>
+              <w:spacing w:before="0" w:after="40" w:line="276" w:lineRule="auto"/>
+              <w:ind w:left="173"/>
             </w:pPr>
             <w:r>
               <w:rPr>
                 <w:b/>
                 <w:color w:val="0284C7"/>
-                <w:sz w:val="14"/>
+                <w:sz w:val="16"/>
               </w:rPr>
               <w:t xml:space="preserve">▸  </w:t>
             </w:r>
             <w:r>
               <w:rPr>
                 <w:color w:val="334155"/>
-                <w:sz w:val="14"/>
+                <w:sz w:val="16"/>
               </w:rPr>
-              <w:t>Sovereign DMI system (Univ. of Ngaoundéré) engineered with Google Antigravity: 470 theses, 19 M1 projects, 1,366 nodes.</w:t>
+              <w:t>Sovereign DMI system (Univ. of Ngaoundéré) with Google Antigravity: 470 theses, 19 M1 projects, 1,366 Neo4j nodes.</w:t>
             </w:r>
           </w:p>
           <w:p>
             <w:pPr>
-              <w:spacing w:before="0" w:after="10" w:line="250" w:lineRule="auto"/>
-              <w:ind w:left="115"/>
+              <w:spacing w:before="0" w:after="40" w:line="276" w:lineRule="auto"/>
+              <w:ind w:left="173"/>
             </w:pPr>
             <w:r>
               <w:rPr>
                 <w:b/>
                 <w:color w:val="0284C7"/>
-                <w:sz w:val="14"/>
+                <w:sz w:val="16"/>
               </w:rPr>
               <w:t xml:space="preserve">▸  </w:t>
             </w:r>
             <w:r>
               <w:rPr>
                 <w:color w:val="334155"/>
-                <w:sz w:val="14"/>
+                <w:sz w:val="16"/>
               </w:rPr>
               <w:t>6-agent LangGraph network, hybrid retrieval (RRF k=60 + Cross-Encoder), SHA-256 No-LLM cert, 77/77 tests (100%).</w:t>
             </w:r>
           </w:p>
           <w:p>
             <w:pPr>
-              <w:spacing w:before="40" w:after="8"/>
+              <w:spacing w:before="80" w:after="20"/>
             </w:pPr>
             <w:r>
               <w:rPr>
                 <w:b/>
                 <w:color w:val="0A1128"/>
-                <w:sz w:val="16"/>
+                <w:sz w:val="19"/>
               </w:rPr>
-              <w:t xml:space="preserve">Sovereign.BI Agentic  </w:t>
+              <w:t>Sovereign.BI Agentic</w:t>
             </w:r>
             <w:r>
               <w:rPr>
                 <w:i/>
                 <w:color w:val="0284C7"/>
-                <w:sz w:val="14"/>
+                <w:sz w:val="16"/>
               </w:rPr>
-              <w:t>–  Enterprise Security &amp; Agentic BI</w:t>
+              <w:t xml:space="preserve">   —   Enterprise Security &amp; Agentic BI</w:t>
             </w:r>
           </w:p>
           <w:p>
             <w:pPr>
-              <w:spacing w:before="0" w:after="10" w:line="250" w:lineRule="auto"/>
-              <w:ind w:left="115"/>
+              <w:spacing w:before="0" w:after="40" w:line="276" w:lineRule="auto"/>
+              <w:ind w:left="173"/>
             </w:pPr>
             <w:r>
               <w:rPr>
                 <w:b/>
                 <w:color w:val="0284C7"/>
-                <w:sz w:val="14"/>
+                <w:sz w:val="16"/>
               </w:rPr>
               <w:t xml:space="preserve">▸  </w:t>
             </w:r>
             <w:r>
               <w:rPr>
                 <w:color w:val="334155"/>
-                <w:sz w:val="14"/>
+                <w:sz w:val="16"/>
               </w:rPr>
-              <w:t>Sovereign natural language query engine for enterprise SQL/Graph databases (PostgreSQL pgvector, Neo4j, &lt;5s latency).</w:t>
+              <w:t>Sovereign NL-to-SQL/Graph query engine for enterprise databases (PostgreSQL pgvector, Neo4j N10S, &lt;5s latency).</w:t>
             </w:r>
           </w:p>
           <w:p>
             <w:pPr>
-              <w:spacing w:before="0" w:after="10" w:line="250" w:lineRule="auto"/>
-              <w:ind w:left="115"/>
+              <w:spacing w:before="0" w:after="40" w:line="276" w:lineRule="auto"/>
+              <w:ind w:left="173"/>
             </w:pPr>
             <w:r>
               <w:rPr>
                 <w:b/>
                 <w:color w:val="0284C7"/>
-                <w:sz w:val="14"/>
+                <w:sz w:val="16"/>
               </w:rPr>
               <w:t xml:space="preserve">▸  </w:t>
             </w:r>
             <w:r>
               <w:rPr>
                 <w:color w:val="334155"/>
-                <w:sz w:val="14"/>
+                <w:sz w:val="16"/>
               </w:rPr>
               <w:t>Enforces dynamic ABAC security guardrails and explainability certified via SHAP Sentinel game theory auditor.</w:t>
             </w:r>
           </w:p>
           <w:p>
             <w:pPr>
-              <w:spacing w:before="40" w:after="8"/>
+              <w:spacing w:before="80" w:after="20"/>
             </w:pPr>
             <w:r>
               <w:rPr>
                 <w:b/>
                 <w:color w:val="0A1128"/>
-                <w:sz w:val="16"/>
+                <w:sz w:val="19"/>
               </w:rPr>
-              <w:t xml:space="preserve">Dataset Automator &amp; VigieSahel  </w:t>
+              <w:t>Dataset Automator &amp; VigieSahel</w:t>
             </w:r>
             <w:r>
               <w:rPr>
                 <w:i/>
                 <w:color w:val="0284C7"/>
-                <w:sz w:val="14"/>
+                <w:sz w:val="16"/>
               </w:rPr>
-              <w:t>–  MLOps Pipeline &amp; Climate AI Impact</w:t>
+              <w:t xml:space="preserve">   —   MLOps Pipeline &amp; Climate AI Impact</w:t>
             </w:r>
           </w:p>
           <w:p>
             <w:pPr>
-              <w:spacing w:before="0" w:after="10" w:line="250" w:lineRule="auto"/>
-              <w:ind w:left="115"/>
+              <w:spacing w:before="0" w:after="40" w:line="276" w:lineRule="auto"/>
+              <w:ind w:left="173"/>
             </w:pPr>
             <w:r>
               <w:rPr>
                 <w:b/>
                 <w:color w:val="0284C7"/>
-                <w:sz w:val="14"/>
+                <w:sz w:val="16"/>
               </w:rPr>
               <w:t xml:space="preserve">▸  </w:t>
             </w:r>
             <w:r>
               <w:rPr>
                 <w:color w:val="334155"/>
-                <w:sz w:val="14"/>
+                <w:sz w:val="16"/>
               </w:rPr>
-              <w:t>Dataset Automator: Built with Google Antigravity (Google Cloud Hackathon) with TabFM, BigQuery DataFrames, and EU AI Act.</w:t>
+              <w:t>Dataset Automator: Built with Google Antigravity (Google Cloud Hackathon) with TabFM, BigQuery DataFrames, EU AI Act.</w:t>
             </w:r>
           </w:p>
           <w:p>
             <w:pPr>
-              <w:spacing w:before="0" w:after="10" w:line="250" w:lineRule="auto"/>
-              <w:ind w:left="115"/>
+              <w:spacing w:before="0" w:after="40" w:line="276" w:lineRule="auto"/>
+              <w:ind w:left="173"/>
             </w:pPr>
             <w:r>
               <w:rPr>
                 <w:b/>
                 <w:color w:val="0284C7"/>
-                <w:sz w:val="14"/>
+                <w:sz w:val="16"/>
               </w:rPr>
               <w:t xml:space="preserve">▸  </w:t>
             </w:r>
             <w:r>
               <w:rPr>
                 <w:color w:val="334155"/>
-                <w:sz w:val="14"/>
+                <w:sz w:val="16"/>
               </w:rPr>
-              <w:t>VigieSahel: Predictive ML for epidemic forecasting &amp; crop sowing optimization (-35% loss, XGBoost R²&gt;94%, Supabase).</w:t>
+              <w:t>VigieSahel: Predictive ML for epidemic forecasting &amp; crop sowing optimization (–35% loss, XGBoost R²&gt;94%, Supabase).</w:t>
             </w:r>
           </w:p>
           <w:p>
             <w:pPr>
-              <w:spacing w:before="84" w:after="24"/>
+              <w:spacing w:before="160" w:after="20"/>
             </w:pPr>
             <w:r>
               <w:rPr>
                 <w:b/>
                 <w:color w:val="0284C7"/>
-                <w:sz w:val="15"/>
+                <w:sz w:val="18"/>
               </w:rPr>
               <w:t xml:space="preserve">◈  </w:t>
             </w:r>
@@ -984,172 +1134,184 @@
                 <w:rFonts w:ascii="Segoe UI" w:hAnsi="Segoe UI"/>
                 <w:b/>
                 <w:color w:val="0A1128"/>
-                <w:sz w:val="17"/>
+                <w:sz w:val="21"/>
               </w:rPr>
               <w:t>PROFESSIONAL EXPERIENCE</w:t>
             </w:r>
           </w:p>
           <w:p>
             <w:pPr>
-              <w:spacing w:before="40" w:after="8"/>
+              <w:spacing w:before="0" w:after="80"/>
+            </w:pPr>
+            <w:r>
+              <w:rPr>
+                <w:color w:val="CBD5E1"/>
+                <w:sz w:val="11"/>
+              </w:rPr>
+              <w:t>──────────────────────────────────────────────────────────────</w:t>
+            </w:r>
+          </w:p>
+          <w:p>
+            <w:pPr>
+              <w:spacing w:before="80" w:after="20"/>
             </w:pPr>
             <w:r>
               <w:rPr>
                 <w:b/>
                 <w:color w:val="0A1128"/>
-                <w:sz w:val="16"/>
+                <w:sz w:val="19"/>
               </w:rPr>
-              <w:t xml:space="preserve">AI Lead &amp; Data Science Consultant  </w:t>
+              <w:t>AI Lead &amp; Data Science Consultant</w:t>
             </w:r>
             <w:r>
               <w:rPr>
                 <w:i/>
                 <w:color w:val="0284C7"/>
-                <w:sz w:val="14"/>
+                <w:sz w:val="16"/>
               </w:rPr>
-              <w:t>(2025 – Present)</w:t>
+              <w:t xml:space="preserve">   —   2025 – Present</w:t>
             </w:r>
           </w:p>
           <w:p>
             <w:pPr>
-              <w:spacing w:before="0" w:after="10"/>
+              <w:spacing w:before="0" w:after="20"/>
             </w:pPr>
             <w:r>
               <w:rPr>
                 <w:b/>
                 <w:color w:val="64748B"/>
-                <w:sz w:val="14"/>
+                <w:sz w:val="16"/>
               </w:rPr>
               <w:t>Independent Projects &amp; Enterprises  │  Douala, CM</w:t>
             </w:r>
           </w:p>
           <w:p>
             <w:pPr>
-              <w:spacing w:before="0" w:after="10" w:line="250" w:lineRule="auto"/>
-              <w:ind w:left="115"/>
+              <w:spacing w:before="0" w:after="40" w:line="276" w:lineRule="auto"/>
+              <w:ind w:left="173"/>
             </w:pPr>
             <w:r>
               <w:rPr>
                 <w:b/>
                 <w:color w:val="0284C7"/>
-                <w:sz w:val="14"/>
+                <w:sz w:val="16"/>
               </w:rPr>
               <w:t xml:space="preserve">▸  </w:t>
             </w:r>
             <w:r>
               <w:rPr>
                 <w:color w:val="334155"/>
-                <w:sz w:val="14"/>
+                <w:sz w:val="16"/>
               </w:rPr>
               <w:t>Guiding enterprises in deploying sovereign private AI agents, Neo4j GraphRAG pipelines, and PostgreSQL databases.</w:t>
             </w:r>
           </w:p>
           <w:p>
             <w:pPr>
-              <w:spacing w:before="0" w:after="10" w:line="250" w:lineRule="auto"/>
-              <w:ind w:left="115"/>
+              <w:spacing w:before="0" w:after="40" w:line="276" w:lineRule="auto"/>
+              <w:ind w:left="173"/>
             </w:pPr>
             <w:r>
               <w:rPr>
                 <w:b/>
                 <w:color w:val="0284C7"/>
-                <w:sz w:val="14"/>
+                <w:sz w:val="16"/>
               </w:rPr>
               <w:t xml:space="preserve">▸  </w:t>
             </w:r>
             <w:r>
               <w:rPr>
                 <w:color w:val="334155"/>
-                <w:sz w:val="14"/>
+                <w:sz w:val="16"/>
               </w:rPr>
-              <w:t>High-dimensional exploratory data analysis, predictive modeling, and executive interactive decision dashboards.</w:t>
+              <w:t>High-dimensional EDA, predictive modeling, and executive interactive decision dashboards.</w:t>
             </w:r>
           </w:p>
           <w:p>
             <w:pPr>
-              <w:spacing w:before="40" w:after="8"/>
+              <w:spacing w:before="80" w:after="20"/>
             </w:pPr>
             <w:r>
               <w:rPr>
                 <w:b/>
                 <w:color w:val="0A1128"/>
-                <w:sz w:val="16"/>
+                <w:sz w:val="19"/>
               </w:rPr>
-              <w:t xml:space="preserve">Aviation Security Officer (AVSEC)  </w:t>
+              <w:t>Aviation Security Officer (AVSEC)</w:t>
             </w:r>
             <w:r>
               <w:rPr>
                 <w:i/>
                 <w:color w:val="0284C7"/>
-                <w:sz w:val="14"/>
+                <w:sz w:val="16"/>
               </w:rPr>
-              <w:t>(2018 – Present)</w:t>
+              <w:t xml:space="preserve">   —   2018 – Present</w:t>
             </w:r>
           </w:p>
           <w:p>
             <w:pPr>
-              <w:spacing w:before="0" w:after="10"/>
+              <w:spacing w:before="0" w:after="20"/>
             </w:pPr>
             <w:r>
               <w:rPr>
                 <w:b/>
                 <w:color w:val="64748B"/>
-                <w:sz w:val="14"/>
+                <w:sz w:val="16"/>
               </w:rPr>
               <w:t>CCAA (Cameroon Civil Aviation Authority)</w:t>
             </w:r>
           </w:p>
           <w:p>
             <w:pPr>
-              <w:spacing w:before="0" w:after="10" w:line="250" w:lineRule="auto"/>
-              <w:ind w:left="115"/>
+              <w:spacing w:before="0" w:after="40" w:line="276" w:lineRule="auto"/>
+              <w:ind w:left="173"/>
             </w:pPr>
             <w:r>
               <w:rPr>
                 <w:b/>
                 <w:color w:val="0284C7"/>
-                <w:sz w:val="14"/>
+                <w:sz w:val="16"/>
               </w:rPr>
               <w:t xml:space="preserve">▸  </w:t>
             </w:r>
             <w:r>
               <w:rPr>
                 <w:color w:val="334155"/>
-                <w:sz w:val="14"/>
+                <w:sz w:val="16"/>
               </w:rPr>
               <w:t>Operational threat assessment, secure access control, and regulatory compliance audits (ICAO Annex 17).</w:t>
             </w:r>
           </w:p>
           <w:p>
             <w:pPr>
-              <w:spacing w:before="0" w:after="10" w:line="250" w:lineRule="auto"/>
-              <w:ind w:left="115"/>
+              <w:spacing w:before="0" w:after="40" w:line="276" w:lineRule="auto"/>
+              <w:ind w:left="173"/>
             </w:pPr>
             <w:r>
               <w:rPr>
                 <w:b/>
                 <w:color w:val="0284C7"/>
-                <w:sz w:val="14"/>
+                <w:sz w:val="16"/>
               </w:rPr>
               <w:t xml:space="preserve">▸  </w:t>
             </w:r>
             <w:r>
               <w:rPr>
                 <w:color w:val="334155"/>
-                <w:sz w:val="14"/>
+                <w:sz w:val="16"/>
               </w:rPr>
               <w:t>Critical aviation security reporting and field emergency operational crisis response coordination.</w:t>
             </w:r>
           </w:p>
           <w:p>
             <w:pPr>
-              <w:spacing w:before="84" w:after="24"/>
+              <w:spacing w:before="160" w:after="20"/>
             </w:pPr>
             <w:r>
               <w:rPr>
                 <w:b/>
                 <w:color w:val="0284C7"/>
-                <w:sz w:val="15"/>
+                <w:sz w:val="18"/>
               </w:rPr>
               <w:t xml:space="preserve">◈  </w:t>
             </w:r>
@@ -1158,120 +1320,142 @@
                 <w:rFonts w:ascii="Segoe UI" w:hAnsi="Segoe UI"/>
                 <w:b/>
                 <w:color w:val="0A1128"/>
-                <w:sz w:val="17"/>
+                <w:sz w:val="21"/>
               </w:rPr>
               <w:t>EDUCATION &amp; CERTIFICATIONS</w:t>
             </w:r>
           </w:p>
           <w:p>
             <w:pPr>
-              <w:spacing w:before="40" w:after="8"/>
+              <w:spacing w:before="0" w:after="80"/>
+            </w:pPr>
+            <w:r>
+              <w:rPr>
+                <w:color w:val="CBD5E1"/>
+                <w:sz w:val="11"/>
+              </w:rPr>
+              <w:t>──────────────────────────────────────────────────────────────</w:t>
+            </w:r>
+          </w:p>
+          <w:p>
+            <w:pPr>
+              <w:spacing w:before="80" w:after="20"/>
             </w:pPr>
             <w:r>
               <w:rPr>
                 <w:b/>
                 <w:color w:val="0A1128"/>
-                <w:sz w:val="16"/>
+                <w:sz w:val="19"/>
               </w:rPr>
-              <w:t xml:space="preserve">Master of Science in Applied Artificial Intelligence  </w:t>
+              <w:t>M.Sc. in Applied Artificial Intelligence</w:t>
             </w:r>
             <w:r>
               <w:rPr>
                 <w:i/>
                 <w:color w:val="0284C7"/>
-                <w:sz w:val="14"/>
+                <w:sz w:val="16"/>
               </w:rPr>
-              <w:t>(2025 – 2027)</w:t>
-            </w:r>
-            <w:r>
-              <w:rPr>
-                <w:b/>
-                <w:color w:val="0284C7"/>
-                <w:sz w:val="13"/>
-              </w:rPr>
-              <w:t xml:space="preserve">  [In Progress]</w:t>
+              <w:t xml:space="preserve">   —   2025 – 2027  [In Progress]</w:t>
             </w:r>
           </w:p>
           <w:p>
             <w:pPr>
-              <w:spacing w:before="0" w:after="8"/>
+              <w:spacing w:before="0" w:after="20"/>
             </w:pPr>
             <w:r>
               <w:rPr>
                 <w:b/>
                 <w:color w:val="64748B"/>
-                <w:sz w:val="14"/>
+                <w:sz w:val="16"/>
               </w:rPr>
               <w:t>University of Ngaoundéré</w:t>
             </w:r>
           </w:p>
           <w:p>
             <w:pPr>
-              <w:spacing w:before="0" w:after="12" w:line="250" w:lineRule="auto"/>
+              <w:spacing w:before="0" w:after="40" w:line="276" w:lineRule="auto"/>
+              <w:ind w:left="173"/>
             </w:pPr>
             <w:r>
               <w:rPr>
+                <w:b/>
+                <w:color w:val="0284C7"/>
+                <w:sz w:val="16"/>
+              </w:rPr>
+              <w:t xml:space="preserve">▸  </w:t>
+            </w:r>
+            <w:r>
+              <w:rPr>
                 <w:color w:val="334155"/>
-                <w:sz w:val="13"/>
+                <w:sz w:val="16"/>
               </w:rPr>
-              <w:t>Excellence Curriculum (5 Blocs): Machine Learning &amp; Bayesian Statistics, Data Engineering &amp; Neo4j Knowledge Graphs, Computer Vision &amp; Robotics/HCI, Cybersecurity &amp; Blockchain, Production Sovereign MLOps Deployment.</w:t>
+              <w:t>Excellence Curriculum (5 Blocs): ML &amp; Bayesian Statistics, Data Engineering &amp; Neo4j, Computer Vision &amp; Robotics, Cybersecurity &amp; Blockchain, Production Sovereign MLOps.</w:t>
             </w:r>
           </w:p>
           <w:p>
             <w:pPr>
-              <w:spacing w:before="40" w:after="8"/>
+              <w:spacing w:before="80" w:after="20"/>
             </w:pPr>
             <w:r>
               <w:rPr>
                 <w:b/>
                 <w:color w:val="0A1128"/>
-                <w:sz w:val="16"/>
+                <w:sz w:val="19"/>
               </w:rPr>
-              <w:t xml:space="preserve">Bachelor of Science in Civil Engineering (Building Option)  </w:t>
+              <w:t>B.Sc. in Civil Engineering (Building Option)</w:t>
             </w:r>
             <w:r>
               <w:rPr>
                 <w:i/>
                 <w:color w:val="0284C7"/>
-                <w:sz w:val="14"/>
+                <w:sz w:val="16"/>
               </w:rPr>
-              <w:t>(2015 – 2016)</w:t>
+              <w:t xml:space="preserve">   —   2015 – 2016</w:t>
             </w:r>
           </w:p>
           <w:p>
             <w:pPr>
-              <w:spacing w:before="0" w:after="8"/>
+              <w:spacing w:before="0" w:after="20"/>
             </w:pPr>
             <w:r>
               <w:rPr>
                 <w:b/>
                 <w:color w:val="64748B"/>
-                <w:sz w:val="14"/>
+                <w:sz w:val="16"/>
               </w:rPr>
               <w:t>ISTDI / IUC Douala</w:t>
             </w:r>
           </w:p>
           <w:p>
             <w:pPr>
-              <w:spacing w:before="0" w:after="12" w:line="250" w:lineRule="auto"/>
+              <w:spacing w:before="0" w:after="40" w:line="276" w:lineRule="auto"/>
+              <w:ind w:left="173"/>
             </w:pPr>
             <w:r>
               <w:rPr>
+                <w:b/>
+                <w:color w:val="0284C7"/>
+                <w:sz w:val="16"/>
+              </w:rPr>
+              <w:t xml:space="preserve">▸  </w:t>
+            </w:r>
+            <w:r>
+              <w:rPr>
                 <w:color w:val="334155"/>
-                <w:sz w:val="13"/>
+                <w:sz w:val="16"/>
               </w:rPr>
               <w:t>Structural calculations (BAEL 91), quantity surveying, and construction project management.</w:t>
             </w:r>
           </w:p>
           <w:p>
             <w:pPr>
-              <w:spacing w:before="84" w:after="24"/>
+              <w:spacing w:before="160" w:after="20"/>
             </w:pPr>
             <w:r>
               <w:rPr>
                 <w:b/>
                 <w:color w:val="0284C7"/>
-                <w:sz w:val="15"/>
+                <w:sz w:val="18"/>
               </w:rPr>
               <w:t xml:space="preserve">◈  </w:t>
             </w:r>
@@ -1280,43 +1464,59 @@
                 <w:rFonts w:ascii="Segoe UI" w:hAnsi="Segoe UI"/>
                 <w:b/>
                 <w:color w:val="0A1128"/>
-                <w:sz w:val="17"/>
+                <w:sz w:val="21"/>
               </w:rPr>
               <w:t>HONORS &amp; APPLIED AI RECOGNITIONS</w:t>
             </w:r>
           </w:p>
           <w:p>
             <w:pPr>
-              <w:spacing w:before="0" w:after="10" w:line="250" w:lineRule="auto"/>
+              <w:spacing w:before="0" w:after="80"/>
+            </w:pPr>
+            <w:r>
+              <w:rPr>
+                <w:color w:val="CBD5E1"/>
+                <w:sz w:val="11"/>
+              </w:rPr>
+              <w:t>──────────────────────────────────────────────────────────────</w:t>
+            </w:r>
+          </w:p>
+          <w:p>
+            <w:pPr>
+              <w:spacing w:before="0" w:after="40" w:line="288" w:lineRule="auto"/>
             </w:pPr>
             <w:r>
               <w:rPr>
                 <w:b/>
                 <w:color w:val="0A1128"/>
-                <w:sz w:val="14"/>
+                <w:sz w:val="17"/>
               </w:rPr>
               <w:t xml:space="preserve">◈ Google Africa Applied AI Lab (Accra, 2026): </w:t>
             </w:r>
             <w:r>
               <w:rPr>
                 <w:color w:val="334155"/>
-                <w:sz w:val="14"/>
+                <w:sz w:val="17"/>
               </w:rPr>
-              <w:t>Official candidacy supported by Archi Cam AI platform.</w:t>
-              <w:br/>
+              <w:t>Official candidacy supported by the Archi Cam AI platform.</w:t>
             </w:r>
+          </w:p>
+          <w:p>
+            <w:pPr>
+              <w:spacing w:before="0" w:after="0" w:line="288" w:lineRule="auto"/>
+            </w:pPr>
             <w:r>
               <w:rPr>
                 <w:b/>
                 <w:color w:val="0A1128"/>
-                <w:sz w:val="14"/>
+                <w:sz w:val="17"/>
               </w:rPr>
               <w:t xml:space="preserve">◈ Google Cloud #AllThingsAgentic Hackathon: </w:t>
             </w:r>
             <w:r>
               <w:rPr>
                 <w:color w:val="334155"/>
-                <w:sz w:val="14"/>
+                <w:sz w:val="17"/>
               </w:rPr>
               <w:t>Dataset Automator v4.0 built with Google Antigravity (TabFM, WIT, bigframes, MCT).</w:t>
             </w:r>
@@ -1699,7 +1899,7 @@
     <w:rsid w:val="00FC693F"/>
     <w:rPr>
       <w:rFonts w:ascii="Segoe UI" w:hAnsi="Segoe UI"/>
-      <w:sz w:val="16"/>
+      <w:sz w:val="18"/>
     </w:rPr>
   </w:style>
   <w:style w:type="paragraph" w:styleId="Header">

</xml_diff>

<commit_message>
cv: 1-page fix — compact spacing, reduced fonts, sidebar full-height guaranteed
</commit_message>
<xml_diff>
--- a/KOA_MARIE_GERVAIS_NELLY_CV_EN.docx
+++ b/KOA_MARIE_GERVAIS_NELLY_CV_EN.docx
@@ -30,10 +30,10 @@
             <w:tcW w:type="dxa" w:w="3744"/>
             <w:shd w:fill="0F172A"/>
             <w:tcMar>
-              <w:top w:w="280" w:type="dxa"/>
-              <w:bottom w:w="280" w:type="dxa"/>
-              <w:left w:w="600" w:type="dxa"/>
-              <w:right w:w="500" w:type="dxa"/>
+              <w:top w:w="220" w:type="dxa"/>
+              <w:bottom w:w="220" w:type="dxa"/>
+              <w:left w:w="560" w:type="dxa"/>
+              <w:right w:w="460" w:type="dxa"/>
             </w:tcMar>
           </w:tcPr>
           <w:p/>
@@ -49,13 +49,13 @@
             <w:tr>
               <w:tc>
                 <w:tcPr>
-                  <w:tcW w:type="dxa" w:w="2232"/>
+                  <w:tcW w:type="dxa" w:w="3744"/>
                   <w:shd w:fill="1E3A5F"/>
                   <w:tcMar>
-                    <w:top w:w="16" w:type="dxa"/>
-                    <w:bottom w:w="16" w:type="dxa"/>
-                    <w:left w:w="16" w:type="dxa"/>
-                    <w:right w:w="16" w:type="dxa"/>
+                    <w:top w:w="12" w:type="dxa"/>
+                    <w:bottom w:w="12" w:type="dxa"/>
+                    <w:left w:w="12" w:type="dxa"/>
+                    <w:right w:w="12" w:type="dxa"/>
                   </w:tcMar>
                 </w:tcPr>
                 <w:p>
@@ -66,7 +66,7 @@
                   <w:r>
                     <w:drawing>
                       <wp:inline xmlns:a="http://schemas.openxmlformats.org/drawingml/2006/main" xmlns:pic="http://schemas.openxmlformats.org/drawingml/2006/picture">
-                        <wp:extent cx="1371600" cy="1371600"/>
+                        <wp:extent cx="1298448" cy="1298448"/>
                         <wp:docPr id="1" name="Picture 1"/>
                         <wp:cNvGraphicFramePr>
                           <a:graphicFrameLocks noChangeAspect="1"/>
@@ -87,7 +87,7 @@
                               <pic:spPr>
                                 <a:xfrm>
                                   <a:off x="0" y="0"/>
-                                  <a:ext cx="1371600" cy="1371600"/>
+                                  <a:ext cx="1298448" cy="1298448"/>
                                 </a:xfrm>
                                 <a:prstGeom prst="rect"/>
                               </pic:spPr>
@@ -104,632 +104,590 @@
           <w:p/>
           <w:p>
             <w:pPr>
-              <w:spacing w:before="0" w:after="0"/>
-            </w:pPr>
-            <w:r/>
-          </w:p>
-          <w:p>
-            <w:pPr>
-              <w:spacing w:before="140" w:after="0"/>
+              <w:spacing w:before="100" w:after="0"/>
             </w:pPr>
             <w:r>
               <w:rPr>
                 <w:rFonts w:ascii="Segoe UI" w:hAnsi="Segoe UI"/>
                 <w:b/>
                 <w:color w:val="38BDF8"/>
-                <w:sz w:val="17"/>
+                <w:sz w:val="15"/>
               </w:rPr>
               <w:t>CONTACT &amp; PROFILES</w:t>
             </w:r>
           </w:p>
           <w:p>
             <w:pPr>
-              <w:spacing w:before="20" w:after="60"/>
+              <w:spacing w:before="10" w:after="40"/>
             </w:pPr>
             <w:r>
               <w:rPr>
                 <w:color w:val="0284C7"/>
-                <w:sz w:val="10"/>
+                <w:sz w:val="9"/>
               </w:rPr>
-              <w:t>━━━━━━━━━━━━━━━━━━━━━━</w:t>
+              <w:t>━━━━━━━━━━━━━━━━━━━━</w:t>
             </w:r>
           </w:p>
           <w:p>
             <w:pPr>
-              <w:spacing w:before="0" w:after="44" w:line="264" w:lineRule="auto"/>
+              <w:spacing w:before="0" w:after="28" w:line="252" w:lineRule="auto"/>
             </w:pPr>
             <w:r>
               <w:rPr>
                 <w:color w:val="F8FAFC"/>
-                <w:sz w:val="15"/>
+                <w:sz w:val="14"/>
               </w:rPr>
               <w:t>✉  magenel85@gmail.com</w:t>
             </w:r>
           </w:p>
           <w:p>
             <w:pPr>
-              <w:spacing w:before="0" w:after="44" w:line="264" w:lineRule="auto"/>
+              <w:spacing w:before="0" w:after="28" w:line="252" w:lineRule="auto"/>
             </w:pPr>
             <w:r>
               <w:rPr>
                 <w:color w:val="F8FAFC"/>
-                <w:sz w:val="15"/>
+                <w:sz w:val="14"/>
               </w:rPr>
               <w:t>✆  +237 695 35 34 02</w:t>
             </w:r>
           </w:p>
           <w:p>
             <w:pPr>
-              <w:spacing w:before="0" w:after="44" w:line="264" w:lineRule="auto"/>
+              <w:spacing w:before="0" w:after="28" w:line="252" w:lineRule="auto"/>
             </w:pPr>
             <w:r>
               <w:rPr>
                 <w:color w:val="F8FAFC"/>
-                <w:sz w:val="15"/>
+                <w:sz w:val="14"/>
               </w:rPr>
               <w:t>⌂  Douala / Ngaoundéré, CM</w:t>
             </w:r>
           </w:p>
           <w:p>
             <w:pPr>
-              <w:spacing w:before="0" w:after="44" w:line="264" w:lineRule="auto"/>
+              <w:spacing w:before="0" w:after="28" w:line="252" w:lineRule="auto"/>
             </w:pPr>
             <w:r>
               <w:rPr>
                 <w:color w:val="F8FAFC"/>
-                <w:sz w:val="15"/>
+                <w:sz w:val="14"/>
+              </w:rPr>
+              <w:t>🌐  github.com/gervais-afk</w:t>
+            </w:r>
+          </w:p>
+          <w:p>
+            <w:pPr>
+              <w:spacing w:before="0" w:after="28" w:line="252" w:lineRule="auto"/>
+            </w:pPr>
+            <w:r>
+              <w:rPr>
+                <w:color w:val="F8FAFC"/>
+                <w:sz w:val="14"/>
+              </w:rPr>
+              <w:t>💼  linkedin.com/in/marie-gervais-koa</w:t>
+            </w:r>
+          </w:p>
+          <w:p>
+            <w:pPr>
+              <w:spacing w:before="0" w:after="28" w:line="252" w:lineRule="auto"/>
+            </w:pPr>
+            <w:r>
+              <w:rPr>
+                <w:color w:val="F8FAFC"/>
+                <w:sz w:val="14"/>
               </w:rPr>
               <w:t>⚡  devpost.com/magenel85</w:t>
             </w:r>
           </w:p>
           <w:p>
             <w:pPr>
-              <w:spacing w:before="0" w:after="44" w:line="264" w:lineRule="auto"/>
+              <w:spacing w:before="0" w:after="28" w:line="252" w:lineRule="auto"/>
             </w:pPr>
             <w:r>
               <w:rPr>
                 <w:color w:val="F8FAFC"/>
-                <w:sz w:val="15"/>
-              </w:rPr>
-              <w:t>🌐  github.com/gervais-afk</w:t>
-            </w:r>
-          </w:p>
-          <w:p>
-            <w:pPr>
-              <w:spacing w:before="0" w:after="44" w:line="264" w:lineRule="auto"/>
-            </w:pPr>
-            <w:r>
-              <w:rPr>
-                <w:color w:val="F8FAFC"/>
-                <w:sz w:val="15"/>
-              </w:rPr>
-              <w:t>💼  linkedin.com/in/marie-gervais-koa</w:t>
-            </w:r>
-          </w:p>
-          <w:p>
-            <w:pPr>
-              <w:spacing w:before="0" w:after="44" w:line="264" w:lineRule="auto"/>
-            </w:pPr>
-            <w:r>
-              <w:rPr>
-                <w:color w:val="F8FAFC"/>
-                <w:sz w:val="15"/>
+                <w:sz w:val="14"/>
               </w:rPr>
               <w:t>🏅  Google Developer Program</w:t>
             </w:r>
           </w:p>
           <w:p>
             <w:pPr>
-              <w:spacing w:before="0" w:after="0"/>
-            </w:pPr>
-            <w:r/>
-          </w:p>
-          <w:p>
-            <w:pPr>
-              <w:spacing w:before="140" w:after="0"/>
+              <w:spacing w:before="100" w:after="0"/>
             </w:pPr>
             <w:r>
               <w:rPr>
                 <w:rFonts w:ascii="Segoe UI" w:hAnsi="Segoe UI"/>
                 <w:b/>
                 <w:color w:val="38BDF8"/>
-                <w:sz w:val="17"/>
+                <w:sz w:val="15"/>
               </w:rPr>
               <w:t>AI &amp; LLM STACK</w:t>
             </w:r>
           </w:p>
           <w:p>
             <w:pPr>
-              <w:spacing w:before="20" w:after="60"/>
+              <w:spacing w:before="10" w:after="40"/>
             </w:pPr>
             <w:r>
               <w:rPr>
                 <w:color w:val="0284C7"/>
-                <w:sz w:val="10"/>
+                <w:sz w:val="9"/>
               </w:rPr>
-              <w:t>━━━━━━━━━━━━━━━━━━━━━━</w:t>
+              <w:t>━━━━━━━━━━━━━━━━━━━━</w:t>
             </w:r>
           </w:p>
           <w:p>
             <w:pPr>
-              <w:spacing w:before="0" w:after="44" w:line="264" w:lineRule="auto"/>
+              <w:spacing w:before="0" w:after="28" w:line="252" w:lineRule="auto"/>
             </w:pPr>
             <w:r>
               <w:rPr>
                 <w:color w:val="F8FAFC"/>
-                <w:sz w:val="15"/>
+                <w:sz w:val="14"/>
               </w:rPr>
               <w:t>Google Antigravity IDE  ■ ■ ■ ■ ■</w:t>
             </w:r>
           </w:p>
           <w:p>
             <w:pPr>
-              <w:spacing w:before="0" w:after="44" w:line="264" w:lineRule="auto"/>
+              <w:spacing w:before="0" w:after="28" w:line="252" w:lineRule="auto"/>
             </w:pPr>
             <w:r>
               <w:rPr>
                 <w:color w:val="F8FAFC"/>
-                <w:sz w:val="15"/>
+                <w:sz w:val="14"/>
               </w:rPr>
               <w:t>Google Gemma 4 (12B)    ■ ■ ■ ■ ■</w:t>
             </w:r>
           </w:p>
           <w:p>
             <w:pPr>
-              <w:spacing w:before="0" w:after="44" w:line="264" w:lineRule="auto"/>
+              <w:spacing w:before="0" w:after="28" w:line="252" w:lineRule="auto"/>
             </w:pPr>
             <w:r>
               <w:rPr>
                 <w:color w:val="F8FAFC"/>
-                <w:sz w:val="15"/>
+                <w:sz w:val="14"/>
               </w:rPr>
               <w:t>Gemini 2.5 / 1.5 Pro    ■ ■ ■ ■ ■</w:t>
             </w:r>
           </w:p>
           <w:p>
             <w:pPr>
-              <w:spacing w:before="0" w:after="44" w:line="264" w:lineRule="auto"/>
+              <w:spacing w:before="0" w:after="28" w:line="252" w:lineRule="auto"/>
             </w:pPr>
             <w:r>
               <w:rPr>
                 <w:color w:val="F8FAFC"/>
-                <w:sz w:val="15"/>
+                <w:sz w:val="14"/>
               </w:rPr>
               <w:t>Google TabFM (Tabular)  ■ ■ ■ ■ ■</w:t>
             </w:r>
           </w:p>
           <w:p>
             <w:pPr>
-              <w:spacing w:before="0" w:after="44" w:line="264" w:lineRule="auto"/>
+              <w:spacing w:before="0" w:after="28" w:line="252" w:lineRule="auto"/>
             </w:pPr>
             <w:r>
               <w:rPr>
                 <w:color w:val="F8FAFC"/>
-                <w:sz w:val="15"/>
+                <w:sz w:val="14"/>
               </w:rPr>
               <w:t>LangGraph Multi-Agents  ■ ■ ■ ■ ■</w:t>
             </w:r>
           </w:p>
           <w:p>
             <w:pPr>
-              <w:spacing w:before="0" w:after="44" w:line="264" w:lineRule="auto"/>
+              <w:spacing w:before="0" w:after="28" w:line="252" w:lineRule="auto"/>
             </w:pPr>
             <w:r>
               <w:rPr>
                 <w:color w:val="F8FAFC"/>
-                <w:sz w:val="15"/>
+                <w:sz w:val="14"/>
               </w:rPr>
               <w:t>Firebase Genkit         ■ ■ ■ ■ ■</w:t>
             </w:r>
           </w:p>
           <w:p>
             <w:pPr>
-              <w:spacing w:before="0" w:after="44" w:line="264" w:lineRule="auto"/>
+              <w:spacing w:before="0" w:after="28" w:line="252" w:lineRule="auto"/>
             </w:pPr>
             <w:r>
               <w:rPr>
                 <w:color w:val="F8FAFC"/>
-                <w:sz w:val="15"/>
+                <w:sz w:val="14"/>
               </w:rPr>
-              <w:t>Neo4j GraphRAG — Agent K1  ■ ■ ■ ■ ■</w:t>
+              <w:t>Neo4j GraphRAG — Agent K1</w:t>
             </w:r>
           </w:p>
           <w:p>
             <w:pPr>
-              <w:spacing w:before="0" w:after="0"/>
-            </w:pPr>
-            <w:r/>
-          </w:p>
-          <w:p>
-            <w:pPr>
-              <w:spacing w:before="140" w:after="0"/>
+              <w:spacing w:before="100" w:after="0"/>
             </w:pPr>
             <w:r>
               <w:rPr>
                 <w:rFonts w:ascii="Segoe UI" w:hAnsi="Segoe UI"/>
                 <w:b/>
                 <w:color w:val="38BDF8"/>
-                <w:sz w:val="17"/>
+                <w:sz w:val="15"/>
               </w:rPr>
               <w:t>DATA &amp; GRAPHS</w:t>
             </w:r>
           </w:p>
           <w:p>
             <w:pPr>
-              <w:spacing w:before="20" w:after="60"/>
+              <w:spacing w:before="10" w:after="40"/>
             </w:pPr>
             <w:r>
               <w:rPr>
                 <w:color w:val="0284C7"/>
-                <w:sz w:val="10"/>
+                <w:sz w:val="9"/>
               </w:rPr>
-              <w:t>━━━━━━━━━━━━━━━━━━━━━━</w:t>
+              <w:t>━━━━━━━━━━━━━━━━━━━━</w:t>
             </w:r>
           </w:p>
           <w:p>
             <w:pPr>
-              <w:spacing w:before="0" w:after="44" w:line="264" w:lineRule="auto"/>
+              <w:spacing w:before="0" w:after="28" w:line="252" w:lineRule="auto"/>
             </w:pPr>
             <w:r>
               <w:rPr>
                 <w:color w:val="F8FAFC"/>
-                <w:sz w:val="15"/>
+                <w:sz w:val="14"/>
               </w:rPr>
               <w:t>Neo4j / Cypher Graph    ■ ■ ■ ■ ■</w:t>
             </w:r>
           </w:p>
           <w:p>
             <w:pPr>
-              <w:spacing w:before="0" w:after="44" w:line="264" w:lineRule="auto"/>
+              <w:spacing w:before="0" w:after="28" w:line="252" w:lineRule="auto"/>
             </w:pPr>
             <w:r>
               <w:rPr>
                 <w:color w:val="F8FAFC"/>
-                <w:sz w:val="15"/>
+                <w:sz w:val="14"/>
               </w:rPr>
               <w:t>PostgreSQL / pgvector   ■ ■ ■ ■ ■</w:t>
             </w:r>
           </w:p>
           <w:p>
             <w:pPr>
-              <w:spacing w:before="0" w:after="44" w:line="264" w:lineRule="auto"/>
+              <w:spacing w:before="0" w:after="28" w:line="252" w:lineRule="auto"/>
             </w:pPr>
             <w:r>
               <w:rPr>
                 <w:color w:val="F8FAFC"/>
-                <w:sz w:val="15"/>
+                <w:sz w:val="14"/>
               </w:rPr>
               <w:t>Google BigQuery         ■ ■ ■ ■ □</w:t>
             </w:r>
           </w:p>
           <w:p>
             <w:pPr>
-              <w:spacing w:before="0" w:after="44" w:line="264" w:lineRule="auto"/>
+              <w:spacing w:before="0" w:after="28" w:line="252" w:lineRule="auto"/>
             </w:pPr>
             <w:r>
               <w:rPr>
                 <w:color w:val="F8FAFC"/>
-                <w:sz w:val="15"/>
+                <w:sz w:val="14"/>
               </w:rPr>
               <w:t>Supabase Realtime       ■ ■ ■ ■ □</w:t>
             </w:r>
           </w:p>
           <w:p>
             <w:pPr>
-              <w:spacing w:before="0" w:after="44" w:line="264" w:lineRule="auto"/>
+              <w:spacing w:before="0" w:after="28" w:line="252" w:lineRule="auto"/>
             </w:pPr>
             <w:r>
               <w:rPr>
                 <w:color w:val="F8FAFC"/>
-                <w:sz w:val="15"/>
+                <w:sz w:val="14"/>
               </w:rPr>
               <w:t>Pandas / NumPy ETL      ■ ■ ■ ■ ■</w:t>
             </w:r>
           </w:p>
           <w:p>
             <w:pPr>
-              <w:spacing w:before="0" w:after="0"/>
-            </w:pPr>
-            <w:r/>
-          </w:p>
-          <w:p>
-            <w:pPr>
-              <w:spacing w:before="140" w:after="0"/>
+              <w:spacing w:before="100" w:after="0"/>
             </w:pPr>
             <w:r>
               <w:rPr>
                 <w:rFonts w:ascii="Segoe UI" w:hAnsi="Segoe UI"/>
                 <w:b/>
                 <w:color w:val="38BDF8"/>
-                <w:sz w:val="17"/>
+                <w:sz w:val="15"/>
               </w:rPr>
               <w:t>DEV &amp; MLOPS</w:t>
             </w:r>
           </w:p>
           <w:p>
             <w:pPr>
-              <w:spacing w:before="20" w:after="60"/>
+              <w:spacing w:before="10" w:after="40"/>
             </w:pPr>
             <w:r>
               <w:rPr>
                 <w:color w:val="0284C7"/>
-                <w:sz w:val="10"/>
+                <w:sz w:val="9"/>
               </w:rPr>
-              <w:t>━━━━━━━━━━━━━━━━━━━━━━</w:t>
+              <w:t>━━━━━━━━━━━━━━━━━━━━</w:t>
             </w:r>
           </w:p>
           <w:p>
             <w:pPr>
-              <w:spacing w:before="0" w:after="44" w:line="264" w:lineRule="auto"/>
+              <w:spacing w:before="0" w:after="28" w:line="252" w:lineRule="auto"/>
             </w:pPr>
             <w:r>
               <w:rPr>
                 <w:color w:val="F8FAFC"/>
-                <w:sz w:val="15"/>
+                <w:sz w:val="14"/>
               </w:rPr>
               <w:t>Python 3.11+ / MLOps    ■ ■ ■ ■ ■</w:t>
             </w:r>
           </w:p>
           <w:p>
             <w:pPr>
-              <w:spacing w:before="0" w:after="44" w:line="264" w:lineRule="auto"/>
+              <w:spacing w:before="0" w:after="28" w:line="252" w:lineRule="auto"/>
             </w:pPr>
             <w:r>
               <w:rPr>
                 <w:color w:val="F8FAFC"/>
-                <w:sz w:val="15"/>
+                <w:sz w:val="14"/>
               </w:rPr>
               <w:t>FastAPI / Next.js 14    ■ ■ ■ ■ □</w:t>
             </w:r>
           </w:p>
           <w:p>
             <w:pPr>
-              <w:spacing w:before="0" w:after="44" w:line="264" w:lineRule="auto"/>
+              <w:spacing w:before="0" w:after="28" w:line="252" w:lineRule="auto"/>
             </w:pPr>
             <w:r>
               <w:rPr>
                 <w:color w:val="F8FAFC"/>
-                <w:sz w:val="15"/>
+                <w:sz w:val="14"/>
               </w:rPr>
               <w:t>MLflow &amp; Data Drift     ■ ■ ■ ■ □</w:t>
             </w:r>
           </w:p>
           <w:p>
             <w:pPr>
-              <w:spacing w:before="0" w:after="44" w:line="264" w:lineRule="auto"/>
+              <w:spacing w:before="0" w:after="28" w:line="252" w:lineRule="auto"/>
             </w:pPr>
             <w:r>
               <w:rPr>
                 <w:color w:val="F8FAFC"/>
-                <w:sz w:val="15"/>
+                <w:sz w:val="14"/>
               </w:rPr>
               <w:t>SHAP Sentinel Audit     ■ ■ ■ ■ ■</w:t>
             </w:r>
           </w:p>
           <w:p>
             <w:pPr>
-              <w:spacing w:before="0" w:after="44" w:line="264" w:lineRule="auto"/>
+              <w:spacing w:before="0" w:after="28" w:line="252" w:lineRule="auto"/>
             </w:pPr>
             <w:r>
               <w:rPr>
                 <w:color w:val="F8FAFC"/>
-                <w:sz w:val="15"/>
+                <w:sz w:val="14"/>
               </w:rPr>
               <w:t>Docker &amp; Streamlit      ■ ■ ■ ■ ■</w:t>
             </w:r>
           </w:p>
           <w:p>
             <w:pPr>
-              <w:spacing w:before="0" w:after="44" w:line="264" w:lineRule="auto"/>
+              <w:spacing w:before="0" w:after="28" w:line="252" w:lineRule="auto"/>
             </w:pPr>
             <w:r>
               <w:rPr>
                 <w:color w:val="F8FAFC"/>
-                <w:sz w:val="15"/>
+                <w:sz w:val="14"/>
               </w:rPr>
               <w:t>IfcOpenShell (5D BIM)   ■ ■ ■ ■ □</w:t>
             </w:r>
           </w:p>
           <w:p>
             <w:pPr>
-              <w:spacing w:before="0" w:after="0"/>
-            </w:pPr>
-            <w:r/>
-          </w:p>
-          <w:p>
-            <w:pPr>
-              <w:spacing w:before="140" w:after="0"/>
+              <w:spacing w:before="100" w:after="0"/>
             </w:pPr>
             <w:r>
               <w:rPr>
                 <w:rFonts w:ascii="Segoe UI" w:hAnsi="Segoe UI"/>
                 <w:b/>
                 <w:color w:val="38BDF8"/>
-                <w:sz w:val="17"/>
+                <w:sz w:val="15"/>
               </w:rPr>
               <w:t>SECURITY &amp; AUDIT</w:t>
             </w:r>
           </w:p>
           <w:p>
             <w:pPr>
-              <w:spacing w:before="20" w:after="60"/>
+              <w:spacing w:before="10" w:after="40"/>
             </w:pPr>
             <w:r>
               <w:rPr>
                 <w:color w:val="0284C7"/>
-                <w:sz w:val="10"/>
+                <w:sz w:val="9"/>
               </w:rPr>
-              <w:t>━━━━━━━━━━━━━━━━━━━━━━</w:t>
+              <w:t>━━━━━━━━━━━━━━━━━━━━</w:t>
             </w:r>
           </w:p>
           <w:p>
             <w:pPr>
-              <w:spacing w:before="0" w:after="44" w:line="264" w:lineRule="auto"/>
+              <w:spacing w:before="0" w:after="28" w:line="252" w:lineRule="auto"/>
             </w:pPr>
             <w:r>
               <w:rPr>
                 <w:color w:val="F8FAFC"/>
-                <w:sz w:val="15"/>
+                <w:sz w:val="14"/>
               </w:rPr>
               <w:t>◈ Quorum 4-Eyes Governance</w:t>
             </w:r>
           </w:p>
           <w:p>
             <w:pPr>
-              <w:spacing w:before="0" w:after="44" w:line="264" w:lineRule="auto"/>
+              <w:spacing w:before="0" w:after="28" w:line="252" w:lineRule="auto"/>
             </w:pPr>
             <w:r>
               <w:rPr>
                 <w:color w:val="F8FAFC"/>
-                <w:sz w:val="15"/>
+                <w:sz w:val="14"/>
               </w:rPr>
               <w:t>◈ OKF v0.2 SHA-256 No-LLM</w:t>
             </w:r>
           </w:p>
           <w:p>
             <w:pPr>
-              <w:spacing w:before="0" w:after="44" w:line="264" w:lineRule="auto"/>
+              <w:spacing w:before="0" w:after="28" w:line="252" w:lineRule="auto"/>
             </w:pPr>
             <w:r>
               <w:rPr>
                 <w:color w:val="F8FAFC"/>
-                <w:sz w:val="15"/>
+                <w:sz w:val="14"/>
               </w:rPr>
               <w:t>◈ EU AI Act (RSASSA-PSS)</w:t>
             </w:r>
           </w:p>
           <w:p>
             <w:pPr>
-              <w:spacing w:before="0" w:after="44" w:line="264" w:lineRule="auto"/>
+              <w:spacing w:before="0" w:after="28" w:line="252" w:lineRule="auto"/>
             </w:pPr>
             <w:r>
               <w:rPr>
                 <w:color w:val="F8FAFC"/>
-                <w:sz w:val="15"/>
+                <w:sz w:val="14"/>
               </w:rPr>
-              <w:t>◈ AVSEC Framework (ICAO Annex 17)</w:t>
+              <w:t>◈ AVSEC (ICAO Annex 17)</w:t>
             </w:r>
           </w:p>
           <w:p>
             <w:pPr>
-              <w:spacing w:before="0" w:after="0"/>
-            </w:pPr>
-            <w:r/>
-          </w:p>
-          <w:p>
-            <w:pPr>
-              <w:spacing w:before="140" w:after="0"/>
+              <w:spacing w:before="100" w:after="0"/>
             </w:pPr>
             <w:r>
               <w:rPr>
                 <w:rFonts w:ascii="Segoe UI" w:hAnsi="Segoe UI"/>
                 <w:b/>
                 <w:color w:val="38BDF8"/>
-                <w:sz w:val="17"/>
+                <w:sz w:val="15"/>
               </w:rPr>
               <w:t>LANGUAGES</w:t>
             </w:r>
           </w:p>
           <w:p>
             <w:pPr>
-              <w:spacing w:before="20" w:after="60"/>
+              <w:spacing w:before="10" w:after="40"/>
             </w:pPr>
             <w:r>
               <w:rPr>
                 <w:color w:val="0284C7"/>
-                <w:sz w:val="10"/>
+                <w:sz w:val="9"/>
               </w:rPr>
-              <w:t>━━━━━━━━━━━━━━━━━━━━━━</w:t>
+              <w:t>━━━━━━━━━━━━━━━━━━━━</w:t>
             </w:r>
           </w:p>
           <w:p>
             <w:pPr>
-              <w:spacing w:before="0" w:after="44" w:line="264" w:lineRule="auto"/>
+              <w:spacing w:before="0" w:after="28" w:line="252" w:lineRule="auto"/>
             </w:pPr>
             <w:r>
               <w:rPr>
                 <w:color w:val="F8FAFC"/>
-                <w:sz w:val="15"/>
+                <w:sz w:val="14"/>
               </w:rPr>
               <w:t>French   —  Native / Fluent</w:t>
             </w:r>
           </w:p>
           <w:p>
             <w:pPr>
-              <w:spacing w:before="0" w:after="44" w:line="264" w:lineRule="auto"/>
+              <w:spacing w:before="0" w:after="28" w:line="252" w:lineRule="auto"/>
             </w:pPr>
             <w:r>
               <w:rPr>
                 <w:color w:val="F8FAFC"/>
-                <w:sz w:val="15"/>
+                <w:sz w:val="14"/>
               </w:rPr>
               <w:t>English  —  Technical / Pro</w:t>
             </w:r>
           </w:p>
           <w:p>
             <w:pPr>
-              <w:spacing w:before="0" w:after="0"/>
-            </w:pPr>
-            <w:r/>
-          </w:p>
-          <w:p>
-            <w:pPr>
-              <w:spacing w:before="140" w:after="0"/>
+              <w:spacing w:before="100" w:after="0"/>
             </w:pPr>
             <w:r>
               <w:rPr>
                 <w:rFonts w:ascii="Segoe UI" w:hAnsi="Segoe UI"/>
                 <w:b/>
                 <w:color w:val="38BDF8"/>
-                <w:sz w:val="17"/>
+                <w:sz w:val="15"/>
               </w:rPr>
               <w:t>KEY ASSETS</w:t>
             </w:r>
           </w:p>
           <w:p>
             <w:pPr>
-              <w:spacing w:before="20" w:after="60"/>
+              <w:spacing w:before="10" w:after="40"/>
             </w:pPr>
             <w:r>
               <w:rPr>
                 <w:color w:val="0284C7"/>
-                <w:sz w:val="10"/>
+                <w:sz w:val="9"/>
               </w:rPr>
-              <w:t>━━━━━━━━━━━━━━━━━━━━━━</w:t>
+              <w:t>━━━━━━━━━━━━━━━━━━━━</w:t>
             </w:r>
           </w:p>
           <w:p>
             <w:pPr>
-              <w:spacing w:before="0" w:after="44" w:line="264" w:lineRule="auto"/>
+              <w:spacing w:before="0" w:after="28" w:line="252" w:lineRule="auto"/>
             </w:pPr>
             <w:r>
               <w:rPr>
                 <w:color w:val="F8FAFC"/>
-                <w:sz w:val="15"/>
+                <w:sz w:val="14"/>
               </w:rPr>
               <w:t>◈ Dual Competence: AI &amp; Civil Eng.</w:t>
             </w:r>
           </w:p>
           <w:p>
             <w:pPr>
-              <w:spacing w:before="0" w:after="44" w:line="264" w:lineRule="auto"/>
+              <w:spacing w:before="0" w:after="28" w:line="252" w:lineRule="auto"/>
             </w:pPr>
             <w:r>
               <w:rPr>
                 <w:color w:val="F8FAFC"/>
-                <w:sz w:val="15"/>
+                <w:sz w:val="14"/>
               </w:rPr>
               <w:t>◈ Aviation Security &amp; Crisis (CCAA)</w:t>
             </w:r>
           </w:p>
           <w:p>
             <w:pPr>
-              <w:spacing w:before="0" w:after="44" w:line="264" w:lineRule="auto"/>
+              <w:spacing w:before="0" w:after="28" w:line="252" w:lineRule="auto"/>
             </w:pPr>
             <w:r>
               <w:rPr>
                 <w:color w:val="F8FAFC"/>
-                <w:sz w:val="15"/>
+                <w:sz w:val="14"/>
               </w:rPr>
               <w:t>◈ Mathematical Rigor &amp; Guardrails</w:t>
             </w:r>
@@ -740,436 +698,24 @@
             <w:tcW w:type="dxa" w:w="8165"/>
             <w:shd w:fill="FFFFFF"/>
             <w:tcMar>
-              <w:top w:w="300" w:type="dxa"/>
-              <w:bottom w:w="280" w:type="dxa"/>
-              <w:left w:w="300" w:type="dxa"/>
-              <w:right w:w="320" w:type="dxa"/>
+              <w:top w:w="240" w:type="dxa"/>
+              <w:bottom w:w="220" w:type="dxa"/>
+              <w:left w:w="260" w:type="dxa"/>
+              <w:right w:w="280" w:type="dxa"/>
             </w:tcMar>
           </w:tcPr>
           <w:p>
             <w:pPr>
-              <w:spacing w:before="0" w:after="40"/>
+              <w:spacing w:before="0" w:after="20"/>
             </w:pPr>
             <w:r>
               <w:rPr>
                 <w:rFonts w:ascii="Segoe UI" w:hAnsi="Segoe UI"/>
                 <w:b/>
                 <w:color w:val="0A1128"/>
-                <w:sz w:val="38"/>
+                <w:sz w:val="34"/>
               </w:rPr>
               <w:t>KOA MARIE GERVAIS NELLY</w:t>
-            </w:r>
-          </w:p>
-          <w:p>
-            <w:pPr>
-              <w:spacing w:before="0" w:after="40"/>
-            </w:pPr>
-            <w:r>
-              <w:rPr>
-                <w:b/>
-                <w:color w:val="0284C7"/>
-                <w:sz w:val="19"/>
-              </w:rPr>
-              <w:t>Lead AI Engineer &amp; Data Architect   │   Founder @ Archi Cam AI</w:t>
-            </w:r>
-          </w:p>
-          <w:p>
-            <w:pPr>
-              <w:spacing w:before="0" w:after="100"/>
-            </w:pPr>
-            <w:r>
-              <w:rPr>
-                <w:color w:val="0284C7"/>
-                <w:sz w:val="12"/>
-              </w:rPr>
-              <w:t>────────────────────────────────────────────────────────────────────────</w:t>
-            </w:r>
-          </w:p>
-          <w:p>
-            <w:pPr>
-              <w:spacing w:before="160" w:after="20"/>
-            </w:pPr>
-            <w:r>
-              <w:rPr>
-                <w:b/>
-                <w:color w:val="0284C7"/>
-                <w:sz w:val="18"/>
-              </w:rPr>
-              <w:t xml:space="preserve">◈  </w:t>
-            </w:r>
-            <w:r>
-              <w:rPr>
-                <w:rFonts w:ascii="Segoe UI" w:hAnsi="Segoe UI"/>
-                <w:b/>
-                <w:color w:val="0A1128"/>
-                <w:sz w:val="21"/>
-              </w:rPr>
-              <w:t>EXECUTIVE SUMMARY</w:t>
-            </w:r>
-          </w:p>
-          <w:p>
-            <w:pPr>
-              <w:spacing w:before="0" w:after="80"/>
-            </w:pPr>
-            <w:r>
-              <w:rPr>
-                <w:color w:val="CBD5E1"/>
-                <w:sz w:val="11"/>
-              </w:rPr>
-              <w:t>──────────────────────────────────────────────────────────────</w:t>
-            </w:r>
-          </w:p>
-          <w:p>
-            <w:pPr>
-              <w:spacing w:before="0" w:after="80" w:line="288" w:lineRule="auto"/>
-            </w:pPr>
-            <w:r>
-              <w:rPr>
-                <w:color w:val="334155"/>
-                <w:sz w:val="17"/>
-              </w:rPr>
-              <w:t>Lead AI Engineer &amp; Data Architect (Google Developer Program Member), leveraging Google Antigravity to design and orchestrate neuro-symbolic autonomous multi-agent systems, Neo4j GraphRAG, and sovereign production MLOps. Specialized in deterministic architectures and verifiable AI trust. Founder of Archi Cam AI (official applicant for Google Africa Applied AI Lab), bridging civil engineering methodology, mathematical rigor, and product vision.</w:t>
-            </w:r>
-          </w:p>
-          <w:p>
-            <w:pPr>
-              <w:spacing w:before="160" w:after="20"/>
-            </w:pPr>
-            <w:r>
-              <w:rPr>
-                <w:b/>
-                <w:color w:val="0284C7"/>
-                <w:sz w:val="18"/>
-              </w:rPr>
-              <w:t xml:space="preserve">◈  </w:t>
-            </w:r>
-            <w:r>
-              <w:rPr>
-                <w:rFonts w:ascii="Segoe UI" w:hAnsi="Segoe UI"/>
-                <w:b/>
-                <w:color w:val="0A1128"/>
-                <w:sz w:val="21"/>
-              </w:rPr>
-              <w:t>FLAGSHIP AI PROJECTS</w:t>
-            </w:r>
-          </w:p>
-          <w:p>
-            <w:pPr>
-              <w:spacing w:before="0" w:after="80"/>
-            </w:pPr>
-            <w:r>
-              <w:rPr>
-                <w:color w:val="CBD5E1"/>
-                <w:sz w:val="11"/>
-              </w:rPr>
-              <w:t>──────────────────────────────────────────────────────────────</w:t>
-            </w:r>
-          </w:p>
-          <w:p>
-            <w:pPr>
-              <w:spacing w:before="80" w:after="20"/>
-            </w:pPr>
-            <w:r>
-              <w:rPr>
-                <w:b/>
-                <w:color w:val="0A1128"/>
-                <w:sz w:val="19"/>
-              </w:rPr>
-              <w:t>Archi Cam AI</w:t>
-            </w:r>
-            <w:r>
-              <w:rPr>
-                <w:i/>
-                <w:color w:val="0284C7"/>
-                <w:sz w:val="16"/>
-              </w:rPr>
-              <w:t xml:space="preserve">   —   Agentic AI SaaS &amp; 5D BIM</w:t>
-            </w:r>
-          </w:p>
-          <w:p>
-            <w:pPr>
-              <w:spacing w:before="0" w:after="40" w:line="276" w:lineRule="auto"/>
-              <w:ind w:left="173"/>
-            </w:pPr>
-            <w:r>
-              <w:rPr>
-                <w:b/>
-                <w:color w:val="0284C7"/>
-                <w:sz w:val="16"/>
-              </w:rPr>
-              <w:t xml:space="preserve">▸  </w:t>
-            </w:r>
-            <w:r>
-              <w:rPr>
-                <w:color w:val="334155"/>
-                <w:sz w:val="16"/>
-              </w:rPr>
-              <w:t>Official Applicant Google Africa Applied AI Lab. Built with Google Antigravity (Gemma 4 12B, Gemini, BAEL 91).</w:t>
-            </w:r>
-          </w:p>
-          <w:p>
-            <w:pPr>
-              <w:spacing w:before="0" w:after="40" w:line="276" w:lineRule="auto"/>
-              <w:ind w:left="173"/>
-            </w:pPr>
-            <w:r>
-              <w:rPr>
-                <w:b/>
-                <w:color w:val="0284C7"/>
-                <w:sz w:val="16"/>
-              </w:rPr>
-              <w:t xml:space="preserve">▸  </w:t>
-            </w:r>
-            <w:r>
-              <w:rPr>
-                <w:color w:val="334155"/>
-                <w:sz w:val="16"/>
-              </w:rPr>
-              <w:t>Automated Excel BOQs in &lt;45s (–99.2% time, MLflow R²=0.9872) and 3D renders via Imagen 3 + ControlNet.</w:t>
-            </w:r>
-          </w:p>
-          <w:p>
-            <w:pPr>
-              <w:spacing w:before="80" w:after="20"/>
-            </w:pPr>
-            <w:r>
-              <w:rPr>
-                <w:b/>
-                <w:color w:val="0A1128"/>
-                <w:sz w:val="19"/>
-              </w:rPr>
-              <w:t>K1-MATHINFO (v3.0.0)</w:t>
-            </w:r>
-            <w:r>
-              <w:rPr>
-                <w:i/>
-                <w:color w:val="0284C7"/>
-                <w:sz w:val="16"/>
-              </w:rPr>
-              <w:t xml:space="preserve">   —   Sovereign Multi-Agent AI &amp; OKF Certification</w:t>
-            </w:r>
-          </w:p>
-          <w:p>
-            <w:pPr>
-              <w:spacing w:before="0" w:after="40" w:line="276" w:lineRule="auto"/>
-              <w:ind w:left="173"/>
-            </w:pPr>
-            <w:r>
-              <w:rPr>
-                <w:b/>
-                <w:color w:val="0284C7"/>
-                <w:sz w:val="16"/>
-              </w:rPr>
-              <w:t xml:space="preserve">▸  </w:t>
-            </w:r>
-            <w:r>
-              <w:rPr>
-                <w:color w:val="334155"/>
-                <w:sz w:val="16"/>
-              </w:rPr>
-              <w:t>Sovereign DMI system (Univ. of Ngaoundéré) with Google Antigravity: 470 theses, 19 M1 projects, 1,366 Neo4j nodes.</w:t>
-            </w:r>
-          </w:p>
-          <w:p>
-            <w:pPr>
-              <w:spacing w:before="0" w:after="40" w:line="276" w:lineRule="auto"/>
-              <w:ind w:left="173"/>
-            </w:pPr>
-            <w:r>
-              <w:rPr>
-                <w:b/>
-                <w:color w:val="0284C7"/>
-                <w:sz w:val="16"/>
-              </w:rPr>
-              <w:t xml:space="preserve">▸  </w:t>
-            </w:r>
-            <w:r>
-              <w:rPr>
-                <w:color w:val="334155"/>
-                <w:sz w:val="16"/>
-              </w:rPr>
-              <w:t>6-agent LangGraph network, hybrid retrieval (RRF k=60 + Cross-Encoder), SHA-256 No-LLM cert, 77/77 tests (100%).</w:t>
-            </w:r>
-          </w:p>
-          <w:p>
-            <w:pPr>
-              <w:spacing w:before="80" w:after="20"/>
-            </w:pPr>
-            <w:r>
-              <w:rPr>
-                <w:b/>
-                <w:color w:val="0A1128"/>
-                <w:sz w:val="19"/>
-              </w:rPr>
-              <w:t>Sovereign.BI Agentic</w:t>
-            </w:r>
-            <w:r>
-              <w:rPr>
-                <w:i/>
-                <w:color w:val="0284C7"/>
-                <w:sz w:val="16"/>
-              </w:rPr>
-              <w:t xml:space="preserve">   —   Enterprise Security &amp; Agentic BI</w:t>
-            </w:r>
-          </w:p>
-          <w:p>
-            <w:pPr>
-              <w:spacing w:before="0" w:after="40" w:line="276" w:lineRule="auto"/>
-              <w:ind w:left="173"/>
-            </w:pPr>
-            <w:r>
-              <w:rPr>
-                <w:b/>
-                <w:color w:val="0284C7"/>
-                <w:sz w:val="16"/>
-              </w:rPr>
-              <w:t xml:space="preserve">▸  </w:t>
-            </w:r>
-            <w:r>
-              <w:rPr>
-                <w:color w:val="334155"/>
-                <w:sz w:val="16"/>
-              </w:rPr>
-              <w:t>Sovereign NL-to-SQL/Graph query engine for enterprise databases (PostgreSQL pgvector, Neo4j N10S, &lt;5s latency).</w:t>
-            </w:r>
-          </w:p>
-          <w:p>
-            <w:pPr>
-              <w:spacing w:before="0" w:after="40" w:line="276" w:lineRule="auto"/>
-              <w:ind w:left="173"/>
-            </w:pPr>
-            <w:r>
-              <w:rPr>
-                <w:b/>
-                <w:color w:val="0284C7"/>
-                <w:sz w:val="16"/>
-              </w:rPr>
-              <w:t xml:space="preserve">▸  </w:t>
-            </w:r>
-            <w:r>
-              <w:rPr>
-                <w:color w:val="334155"/>
-                <w:sz w:val="16"/>
-              </w:rPr>
-              <w:t>Enforces dynamic ABAC security guardrails and explainability certified via SHAP Sentinel game theory auditor.</w:t>
-            </w:r>
-          </w:p>
-          <w:p>
-            <w:pPr>
-              <w:spacing w:before="80" w:after="20"/>
-            </w:pPr>
-            <w:r>
-              <w:rPr>
-                <w:b/>
-                <w:color w:val="0A1128"/>
-                <w:sz w:val="19"/>
-              </w:rPr>
-              <w:t>Dataset Automator &amp; VigieSahel</w:t>
-            </w:r>
-            <w:r>
-              <w:rPr>
-                <w:i/>
-                <w:color w:val="0284C7"/>
-                <w:sz w:val="16"/>
-              </w:rPr>
-              <w:t xml:space="preserve">   —   MLOps Pipeline &amp; Climate AI Impact</w:t>
-            </w:r>
-          </w:p>
-          <w:p>
-            <w:pPr>
-              <w:spacing w:before="0" w:after="40" w:line="276" w:lineRule="auto"/>
-              <w:ind w:left="173"/>
-            </w:pPr>
-            <w:r>
-              <w:rPr>
-                <w:b/>
-                <w:color w:val="0284C7"/>
-                <w:sz w:val="16"/>
-              </w:rPr>
-              <w:t xml:space="preserve">▸  </w:t>
-            </w:r>
-            <w:r>
-              <w:rPr>
-                <w:color w:val="334155"/>
-                <w:sz w:val="16"/>
-              </w:rPr>
-              <w:t>Dataset Automator: Built with Google Antigravity (Google Cloud Hackathon) with TabFM, BigQuery DataFrames, EU AI Act.</w:t>
-            </w:r>
-          </w:p>
-          <w:p>
-            <w:pPr>
-              <w:spacing w:before="0" w:after="40" w:line="276" w:lineRule="auto"/>
-              <w:ind w:left="173"/>
-            </w:pPr>
-            <w:r>
-              <w:rPr>
-                <w:b/>
-                <w:color w:val="0284C7"/>
-                <w:sz w:val="16"/>
-              </w:rPr>
-              <w:t xml:space="preserve">▸  </w:t>
-            </w:r>
-            <w:r>
-              <w:rPr>
-                <w:color w:val="334155"/>
-                <w:sz w:val="16"/>
-              </w:rPr>
-              <w:t>VigieSahel: Predictive ML for epidemic forecasting &amp; crop sowing optimization (–35% loss, XGBoost R²&gt;94%, Supabase).</w:t>
-            </w:r>
-          </w:p>
-          <w:p>
-            <w:pPr>
-              <w:spacing w:before="160" w:after="20"/>
-            </w:pPr>
-            <w:r>
-              <w:rPr>
-                <w:b/>
-                <w:color w:val="0284C7"/>
-                <w:sz w:val="18"/>
-              </w:rPr>
-              <w:t xml:space="preserve">◈  </w:t>
-            </w:r>
-            <w:r>
-              <w:rPr>
-                <w:rFonts w:ascii="Segoe UI" w:hAnsi="Segoe UI"/>
-                <w:b/>
-                <w:color w:val="0A1128"/>
-                <w:sz w:val="21"/>
-              </w:rPr>
-              <w:t>PROFESSIONAL EXPERIENCE</w:t>
-            </w:r>
-          </w:p>
-          <w:p>
-            <w:pPr>
-              <w:spacing w:before="0" w:after="80"/>
-            </w:pPr>
-            <w:r>
-              <w:rPr>
-                <w:color w:val="CBD5E1"/>
-                <w:sz w:val="11"/>
-              </w:rPr>
-              <w:t>──────────────────────────────────────────────────────────────</w:t>
-            </w:r>
-          </w:p>
-          <w:p>
-            <w:pPr>
-              <w:spacing w:before="80" w:after="20"/>
-            </w:pPr>
-            <w:r>
-              <w:rPr>
-                <w:b/>
-                <w:color w:val="0A1128"/>
-                <w:sz w:val="19"/>
-              </w:rPr>
-              <w:t>AI Lead &amp; Data Science Consultant</w:t>
-            </w:r>
-            <w:r>
-              <w:rPr>
-                <w:i/>
-                <w:color w:val="0284C7"/>
-                <w:sz w:val="16"/>
-              </w:rPr>
-              <w:t xml:space="preserve">   —   2025 – Present</w:t>
             </w:r>
           </w:p>
           <w:p>
@@ -1179,139 +725,33 @@
             <w:r>
               <w:rPr>
                 <w:b/>
-                <w:color w:val="64748B"/>
-                <w:sz w:val="16"/>
+                <w:color w:val="0284C7"/>
+                <w:sz w:val="17"/>
               </w:rPr>
-              <w:t>Independent Projects &amp; Enterprises  │  Douala, CM</w:t>
+              <w:t>Lead AI Engineer &amp; Data Architect   │   Founder @ Archi Cam AI</w:t>
             </w:r>
           </w:p>
           <w:p>
             <w:pPr>
-              <w:spacing w:before="0" w:after="40" w:line="276" w:lineRule="auto"/>
-              <w:ind w:left="173"/>
+              <w:spacing w:before="0" w:after="60"/>
+            </w:pPr>
+            <w:r>
+              <w:rPr>
+                <w:color w:val="0284C7"/>
+                <w:sz w:val="11"/>
+              </w:rPr>
+              <w:t>──────────────────────────────────────────────────────────────────────</w:t>
+            </w:r>
+          </w:p>
+          <w:p>
+            <w:pPr>
+              <w:spacing w:before="100" w:after="10"/>
             </w:pPr>
             <w:r>
               <w:rPr>
                 <w:b/>
                 <w:color w:val="0284C7"/>
                 <w:sz w:val="16"/>
-              </w:rPr>
-              <w:t xml:space="preserve">▸  </w:t>
-            </w:r>
-            <w:r>
-              <w:rPr>
-                <w:color w:val="334155"/>
-                <w:sz w:val="16"/>
-              </w:rPr>
-              <w:t>Guiding enterprises in deploying sovereign private AI agents, Neo4j GraphRAG pipelines, and PostgreSQL databases.</w:t>
-            </w:r>
-          </w:p>
-          <w:p>
-            <w:pPr>
-              <w:spacing w:before="0" w:after="40" w:line="276" w:lineRule="auto"/>
-              <w:ind w:left="173"/>
-            </w:pPr>
-            <w:r>
-              <w:rPr>
-                <w:b/>
-                <w:color w:val="0284C7"/>
-                <w:sz w:val="16"/>
-              </w:rPr>
-              <w:t xml:space="preserve">▸  </w:t>
-            </w:r>
-            <w:r>
-              <w:rPr>
-                <w:color w:val="334155"/>
-                <w:sz w:val="16"/>
-              </w:rPr>
-              <w:t>High-dimensional EDA, predictive modeling, and executive interactive decision dashboards.</w:t>
-            </w:r>
-          </w:p>
-          <w:p>
-            <w:pPr>
-              <w:spacing w:before="80" w:after="20"/>
-            </w:pPr>
-            <w:r>
-              <w:rPr>
-                <w:b/>
-                <w:color w:val="0A1128"/>
-                <w:sz w:val="19"/>
-              </w:rPr>
-              <w:t>Aviation Security Officer (AVSEC)</w:t>
-            </w:r>
-            <w:r>
-              <w:rPr>
-                <w:i/>
-                <w:color w:val="0284C7"/>
-                <w:sz w:val="16"/>
-              </w:rPr>
-              <w:t xml:space="preserve">   —   2018 – Present</w:t>
-            </w:r>
-          </w:p>
-          <w:p>
-            <w:pPr>
-              <w:spacing w:before="0" w:after="20"/>
-            </w:pPr>
-            <w:r>
-              <w:rPr>
-                <w:b/>
-                <w:color w:val="64748B"/>
-                <w:sz w:val="16"/>
-              </w:rPr>
-              <w:t>CCAA (Cameroon Civil Aviation Authority)</w:t>
-            </w:r>
-          </w:p>
-          <w:p>
-            <w:pPr>
-              <w:spacing w:before="0" w:after="40" w:line="276" w:lineRule="auto"/>
-              <w:ind w:left="173"/>
-            </w:pPr>
-            <w:r>
-              <w:rPr>
-                <w:b/>
-                <w:color w:val="0284C7"/>
-                <w:sz w:val="16"/>
-              </w:rPr>
-              <w:t xml:space="preserve">▸  </w:t>
-            </w:r>
-            <w:r>
-              <w:rPr>
-                <w:color w:val="334155"/>
-                <w:sz w:val="16"/>
-              </w:rPr>
-              <w:t>Operational threat assessment, secure access control, and regulatory compliance audits (ICAO Annex 17).</w:t>
-            </w:r>
-          </w:p>
-          <w:p>
-            <w:pPr>
-              <w:spacing w:before="0" w:after="40" w:line="276" w:lineRule="auto"/>
-              <w:ind w:left="173"/>
-            </w:pPr>
-            <w:r>
-              <w:rPr>
-                <w:b/>
-                <w:color w:val="0284C7"/>
-                <w:sz w:val="16"/>
-              </w:rPr>
-              <w:t xml:space="preserve">▸  </w:t>
-            </w:r>
-            <w:r>
-              <w:rPr>
-                <w:color w:val="334155"/>
-                <w:sz w:val="16"/>
-              </w:rPr>
-              <w:t>Critical aviation security reporting and field emergency operational crisis response coordination.</w:t>
-            </w:r>
-          </w:p>
-          <w:p>
-            <w:pPr>
-              <w:spacing w:before="160" w:after="20"/>
-            </w:pPr>
-            <w:r>
-              <w:rPr>
-                <w:b/>
-                <w:color w:val="0284C7"/>
-                <w:sz w:val="18"/>
               </w:rPr>
               <w:t xml:space="preserve">◈  </w:t>
             </w:r>
@@ -1320,142 +760,44 @@
                 <w:rFonts w:ascii="Segoe UI" w:hAnsi="Segoe UI"/>
                 <w:b/>
                 <w:color w:val="0A1128"/>
-                <w:sz w:val="21"/>
+                <w:sz w:val="19"/>
               </w:rPr>
-              <w:t>EDUCATION &amp; CERTIFICATIONS</w:t>
+              <w:t>EXECUTIVE SUMMARY</w:t>
             </w:r>
           </w:p>
           <w:p>
             <w:pPr>
-              <w:spacing w:before="0" w:after="80"/>
+              <w:spacing w:before="0" w:after="50"/>
             </w:pPr>
             <w:r>
               <w:rPr>
                 <w:color w:val="CBD5E1"/>
-                <w:sz w:val="11"/>
+                <w:sz w:val="10"/>
               </w:rPr>
-              <w:t>──────────────────────────────────────────────────────────────</w:t>
+              <w:t>────────────────────────────────────────────────────────────</w:t>
             </w:r>
           </w:p>
           <w:p>
             <w:pPr>
-              <w:spacing w:before="80" w:after="20"/>
+              <w:spacing w:before="0" w:after="50" w:line="276" w:lineRule="auto"/>
             </w:pPr>
             <w:r>
               <w:rPr>
-                <w:b/>
-                <w:color w:val="0A1128"/>
-                <w:sz w:val="19"/>
-              </w:rPr>
-              <w:t>M.Sc. in Applied Artificial Intelligence</w:t>
-            </w:r>
-            <w:r>
-              <w:rPr>
-                <w:i/>
-                <w:color w:val="0284C7"/>
+                <w:color w:val="334155"/>
                 <w:sz w:val="16"/>
               </w:rPr>
-              <w:t xml:space="preserve">   —   2025 – 2027  [In Progress]</w:t>
+              <w:t>Lead AI Engineer &amp; Data Architect (Google Developer Program Member), leveraging Google Antigravity to design neuro-symbolic autonomous multi-agent systems, Neo4j GraphRAG, and sovereign production MLOps. Specialized in deterministic architectures and verifiable AI. Founder of Archi Cam AI (official applicant for Google Africa Applied AI Lab), bridging civil engineering methodology, math rigor, and product vision.</w:t>
             </w:r>
           </w:p>
           <w:p>
             <w:pPr>
-              <w:spacing w:before="0" w:after="20"/>
-            </w:pPr>
-            <w:r>
-              <w:rPr>
-                <w:b/>
-                <w:color w:val="64748B"/>
-                <w:sz w:val="16"/>
-              </w:rPr>
-              <w:t>University of Ngaoundéré</w:t>
-            </w:r>
-          </w:p>
-          <w:p>
-            <w:pPr>
-              <w:spacing w:before="0" w:after="40" w:line="276" w:lineRule="auto"/>
-              <w:ind w:left="173"/>
+              <w:spacing w:before="100" w:after="10"/>
             </w:pPr>
             <w:r>
               <w:rPr>
                 <w:b/>
                 <w:color w:val="0284C7"/>
                 <w:sz w:val="16"/>
-              </w:rPr>
-              <w:t xml:space="preserve">▸  </w:t>
-            </w:r>
-            <w:r>
-              <w:rPr>
-                <w:color w:val="334155"/>
-                <w:sz w:val="16"/>
-              </w:rPr>
-              <w:t>Excellence Curriculum (5 Blocs): ML &amp; Bayesian Statistics, Data Engineering &amp; Neo4j, Computer Vision &amp; Robotics, Cybersecurity &amp; Blockchain, Production Sovereign MLOps.</w:t>
-            </w:r>
-          </w:p>
-          <w:p>
-            <w:pPr>
-              <w:spacing w:before="80" w:after="20"/>
-            </w:pPr>
-            <w:r>
-              <w:rPr>
-                <w:b/>
-                <w:color w:val="0A1128"/>
-                <w:sz w:val="19"/>
-              </w:rPr>
-              <w:t>B.Sc. in Civil Engineering (Building Option)</w:t>
-            </w:r>
-            <w:r>
-              <w:rPr>
-                <w:i/>
-                <w:color w:val="0284C7"/>
-                <w:sz w:val="16"/>
-              </w:rPr>
-              <w:t xml:space="preserve">   —   2015 – 2016</w:t>
-            </w:r>
-          </w:p>
-          <w:p>
-            <w:pPr>
-              <w:spacing w:before="0" w:after="20"/>
-            </w:pPr>
-            <w:r>
-              <w:rPr>
-                <w:b/>
-                <w:color w:val="64748B"/>
-                <w:sz w:val="16"/>
-              </w:rPr>
-              <w:t>ISTDI / IUC Douala</w:t>
-            </w:r>
-          </w:p>
-          <w:p>
-            <w:pPr>
-              <w:spacing w:before="0" w:after="40" w:line="276" w:lineRule="auto"/>
-              <w:ind w:left="173"/>
-            </w:pPr>
-            <w:r>
-              <w:rPr>
-                <w:b/>
-                <w:color w:val="0284C7"/>
-                <w:sz w:val="16"/>
-              </w:rPr>
-              <w:t xml:space="preserve">▸  </w:t>
-            </w:r>
-            <w:r>
-              <w:rPr>
-                <w:color w:val="334155"/>
-                <w:sz w:val="16"/>
-              </w:rPr>
-              <w:t>Structural calculations (BAEL 91), quantity surveying, and construction project management.</w:t>
-            </w:r>
-          </w:p>
-          <w:p>
-            <w:pPr>
-              <w:spacing w:before="160" w:after="20"/>
-            </w:pPr>
-            <w:r>
-              <w:rPr>
-                <w:b/>
-                <w:color w:val="0284C7"/>
-                <w:sz w:val="18"/>
               </w:rPr>
               <w:t xml:space="preserve">◈  </w:t>
             </w:r>
@@ -1464,26 +806,26 @@
                 <w:rFonts w:ascii="Segoe UI" w:hAnsi="Segoe UI"/>
                 <w:b/>
                 <w:color w:val="0A1128"/>
-                <w:sz w:val="21"/>
+                <w:sz w:val="19"/>
               </w:rPr>
-              <w:t>HONORS &amp; APPLIED AI RECOGNITIONS</w:t>
+              <w:t>FLAGSHIP AI PROJECTS</w:t>
             </w:r>
           </w:p>
           <w:p>
             <w:pPr>
-              <w:spacing w:before="0" w:after="80"/>
+              <w:spacing w:before="0" w:after="50"/>
             </w:pPr>
             <w:r>
               <w:rPr>
                 <w:color w:val="CBD5E1"/>
-                <w:sz w:val="11"/>
+                <w:sz w:val="10"/>
               </w:rPr>
-              <w:t>──────────────────────────────────────────────────────────────</w:t>
+              <w:t>────────────────────────────────────────────────────────────</w:t>
             </w:r>
           </w:p>
           <w:p>
             <w:pPr>
-              <w:spacing w:before="0" w:after="40" w:line="288" w:lineRule="auto"/>
+              <w:spacing w:before="60" w:after="10"/>
             </w:pPr>
             <w:r>
               <w:rPr>
@@ -1491,19 +833,62 @@
                 <w:color w:val="0A1128"/>
                 <w:sz w:val="17"/>
               </w:rPr>
-              <w:t xml:space="preserve">◈ Google Africa Applied AI Lab (Accra, 2026): </w:t>
+              <w:t>Archi Cam AI</w:t>
+            </w:r>
+            <w:r>
+              <w:rPr>
+                <w:i/>
+                <w:color w:val="0284C7"/>
+                <w:sz w:val="15"/>
+              </w:rPr>
+              <w:t xml:space="preserve">   —   Agentic AI SaaS &amp; 5D BIM</w:t>
+            </w:r>
+          </w:p>
+          <w:p>
+            <w:pPr>
+              <w:spacing w:before="0" w:after="24" w:line="264" w:lineRule="auto"/>
+              <w:ind w:left="144"/>
+            </w:pPr>
+            <w:r>
+              <w:rPr>
+                <w:b/>
+                <w:color w:val="0284C7"/>
+                <w:sz w:val="15"/>
+              </w:rPr>
+              <w:t xml:space="preserve">▸  </w:t>
             </w:r>
             <w:r>
               <w:rPr>
                 <w:color w:val="334155"/>
-                <w:sz w:val="17"/>
+                <w:sz w:val="15"/>
               </w:rPr>
-              <w:t>Official candidacy supported by the Archi Cam AI platform.</w:t>
+              <w:t>Official Applicant Google Africa Applied AI Lab. Built with Google Antigravity (Gemma 4 12B, Gemini, BAEL 91).</w:t>
             </w:r>
           </w:p>
           <w:p>
             <w:pPr>
-              <w:spacing w:before="0" w:after="0" w:line="288" w:lineRule="auto"/>
+              <w:spacing w:before="0" w:after="24" w:line="264" w:lineRule="auto"/>
+              <w:ind w:left="144"/>
+            </w:pPr>
+            <w:r>
+              <w:rPr>
+                <w:b/>
+                <w:color w:val="0284C7"/>
+                <w:sz w:val="15"/>
+              </w:rPr>
+              <w:t xml:space="preserve">▸  </w:t>
+            </w:r>
+            <w:r>
+              <w:rPr>
+                <w:color w:val="334155"/>
+                <w:sz w:val="15"/>
+              </w:rPr>
+              <w:t>Automated Excel BOQs in &lt;45s (–99.2% time, MLflow R²=0.9872) and 3D renders via Imagen 3 + ControlNet.</w:t>
+            </w:r>
+          </w:p>
+          <w:p>
+            <w:pPr>
+              <w:spacing w:before="60" w:after="10"/>
             </w:pPr>
             <w:r>
               <w:rPr>
@@ -1511,14 +896,520 @@
                 <w:color w:val="0A1128"/>
                 <w:sz w:val="17"/>
               </w:rPr>
+              <w:t>K1-MATHINFO (v3.0.0)</w:t>
+            </w:r>
+            <w:r>
+              <w:rPr>
+                <w:i/>
+                <w:color w:val="0284C7"/>
+                <w:sz w:val="15"/>
+              </w:rPr>
+              <w:t xml:space="preserve">   —   Sovereign Multi-Agent AI &amp; OKF Certification</w:t>
+            </w:r>
+          </w:p>
+          <w:p>
+            <w:pPr>
+              <w:spacing w:before="0" w:after="24" w:line="264" w:lineRule="auto"/>
+              <w:ind w:left="144"/>
+            </w:pPr>
+            <w:r>
+              <w:rPr>
+                <w:b/>
+                <w:color w:val="0284C7"/>
+                <w:sz w:val="15"/>
+              </w:rPr>
+              <w:t xml:space="preserve">▸  </w:t>
+            </w:r>
+            <w:r>
+              <w:rPr>
+                <w:color w:val="334155"/>
+                <w:sz w:val="15"/>
+              </w:rPr>
+              <w:t>Sovereign DMI system (Univ. of Ngaoundéré): 470 theses, 19 M1 projects, 1,366 Neo4j nodes.</w:t>
+            </w:r>
+          </w:p>
+          <w:p>
+            <w:pPr>
+              <w:spacing w:before="0" w:after="24" w:line="264" w:lineRule="auto"/>
+              <w:ind w:left="144"/>
+            </w:pPr>
+            <w:r>
+              <w:rPr>
+                <w:b/>
+                <w:color w:val="0284C7"/>
+                <w:sz w:val="15"/>
+              </w:rPr>
+              <w:t xml:space="preserve">▸  </w:t>
+            </w:r>
+            <w:r>
+              <w:rPr>
+                <w:color w:val="334155"/>
+                <w:sz w:val="15"/>
+              </w:rPr>
+              <w:t>6-agent LangGraph, hybrid retrieval RRF k=60 + Cross-Encoder, SHA-256 No-LLM cert, 77/77 tests (100%).</w:t>
+            </w:r>
+          </w:p>
+          <w:p>
+            <w:pPr>
+              <w:spacing w:before="60" w:after="10"/>
+            </w:pPr>
+            <w:r>
+              <w:rPr>
+                <w:b/>
+                <w:color w:val="0A1128"/>
+                <w:sz w:val="17"/>
+              </w:rPr>
+              <w:t>Sovereign.BI Agentic</w:t>
+            </w:r>
+            <w:r>
+              <w:rPr>
+                <w:i/>
+                <w:color w:val="0284C7"/>
+                <w:sz w:val="15"/>
+              </w:rPr>
+              <w:t xml:space="preserve">   —   Enterprise Security &amp; Agentic BI</w:t>
+            </w:r>
+          </w:p>
+          <w:p>
+            <w:pPr>
+              <w:spacing w:before="0" w:after="24" w:line="264" w:lineRule="auto"/>
+              <w:ind w:left="144"/>
+            </w:pPr>
+            <w:r>
+              <w:rPr>
+                <w:b/>
+                <w:color w:val="0284C7"/>
+                <w:sz w:val="15"/>
+              </w:rPr>
+              <w:t xml:space="preserve">▸  </w:t>
+            </w:r>
+            <w:r>
+              <w:rPr>
+                <w:color w:val="334155"/>
+                <w:sz w:val="15"/>
+              </w:rPr>
+              <w:t>NL-to-SQL/Graph engine (PostgreSQL pgvector, Neo4j N10S, &lt;5s latency) with ABAC guardrails + SHAP Sentinel.</w:t>
+            </w:r>
+          </w:p>
+          <w:p>
+            <w:pPr>
+              <w:spacing w:before="60" w:after="10"/>
+            </w:pPr>
+            <w:r>
+              <w:rPr>
+                <w:b/>
+                <w:color w:val="0A1128"/>
+                <w:sz w:val="17"/>
+              </w:rPr>
+              <w:t>Dataset Automator &amp; VigieSahel</w:t>
+            </w:r>
+            <w:r>
+              <w:rPr>
+                <w:i/>
+                <w:color w:val="0284C7"/>
+                <w:sz w:val="15"/>
+              </w:rPr>
+              <w:t xml:space="preserve">   —   MLOps Pipeline &amp; Climate AI Impact</w:t>
+            </w:r>
+          </w:p>
+          <w:p>
+            <w:pPr>
+              <w:spacing w:before="0" w:after="24" w:line="264" w:lineRule="auto"/>
+              <w:ind w:left="144"/>
+            </w:pPr>
+            <w:r>
+              <w:rPr>
+                <w:b/>
+                <w:color w:val="0284C7"/>
+                <w:sz w:val="15"/>
+              </w:rPr>
+              <w:t xml:space="preserve">▸  </w:t>
+            </w:r>
+            <w:r>
+              <w:rPr>
+                <w:color w:val="334155"/>
+                <w:sz w:val="15"/>
+              </w:rPr>
+              <w:t>Dataset Automator: Google Antigravity (Google Cloud Hackathon) — TabFM, BigQuery DataFrames, EU AI Act.</w:t>
+            </w:r>
+          </w:p>
+          <w:p>
+            <w:pPr>
+              <w:spacing w:before="0" w:after="24" w:line="264" w:lineRule="auto"/>
+              <w:ind w:left="144"/>
+            </w:pPr>
+            <w:r>
+              <w:rPr>
+                <w:b/>
+                <w:color w:val="0284C7"/>
+                <w:sz w:val="15"/>
+              </w:rPr>
+              <w:t xml:space="preserve">▸  </w:t>
+            </w:r>
+            <w:r>
+              <w:rPr>
+                <w:color w:val="334155"/>
+                <w:sz w:val="15"/>
+              </w:rPr>
+              <w:t>VigieSahel: –35% crop loss, +14d epidemic forecast (XGBoost R²&gt;94%, Supabase, MLflow).</w:t>
+            </w:r>
+          </w:p>
+          <w:p>
+            <w:pPr>
+              <w:spacing w:before="100" w:after="10"/>
+            </w:pPr>
+            <w:r>
+              <w:rPr>
+                <w:b/>
+                <w:color w:val="0284C7"/>
+                <w:sz w:val="16"/>
+              </w:rPr>
+              <w:t xml:space="preserve">◈  </w:t>
+            </w:r>
+            <w:r>
+              <w:rPr>
+                <w:rFonts w:ascii="Segoe UI" w:hAnsi="Segoe UI"/>
+                <w:b/>
+                <w:color w:val="0A1128"/>
+                <w:sz w:val="19"/>
+              </w:rPr>
+              <w:t>PROFESSIONAL EXPERIENCE</w:t>
+            </w:r>
+          </w:p>
+          <w:p>
+            <w:pPr>
+              <w:spacing w:before="0" w:after="50"/>
+            </w:pPr>
+            <w:r>
+              <w:rPr>
+                <w:color w:val="CBD5E1"/>
+                <w:sz w:val="10"/>
+              </w:rPr>
+              <w:t>────────────────────────────────────────────────────────────</w:t>
+            </w:r>
+          </w:p>
+          <w:p>
+            <w:pPr>
+              <w:spacing w:before="60" w:after="10"/>
+            </w:pPr>
+            <w:r>
+              <w:rPr>
+                <w:b/>
+                <w:color w:val="0A1128"/>
+                <w:sz w:val="17"/>
+              </w:rPr>
+              <w:t>AI Lead &amp; Data Science Consultant</w:t>
+            </w:r>
+            <w:r>
+              <w:rPr>
+                <w:i/>
+                <w:color w:val="0284C7"/>
+                <w:sz w:val="15"/>
+              </w:rPr>
+              <w:t xml:space="preserve">   —   2025 – Present</w:t>
+            </w:r>
+          </w:p>
+          <w:p>
+            <w:pPr>
+              <w:spacing w:before="0" w:after="10"/>
+            </w:pPr>
+            <w:r>
+              <w:rPr>
+                <w:b/>
+                <w:color w:val="64748B"/>
+                <w:sz w:val="15"/>
+              </w:rPr>
+              <w:t>Independent Projects &amp; Enterprises  │  Douala, CM</w:t>
+            </w:r>
+          </w:p>
+          <w:p>
+            <w:pPr>
+              <w:spacing w:before="0" w:after="24" w:line="264" w:lineRule="auto"/>
+              <w:ind w:left="144"/>
+            </w:pPr>
+            <w:r>
+              <w:rPr>
+                <w:b/>
+                <w:color w:val="0284C7"/>
+                <w:sz w:val="15"/>
+              </w:rPr>
+              <w:t xml:space="preserve">▸  </w:t>
+            </w:r>
+            <w:r>
+              <w:rPr>
+                <w:color w:val="334155"/>
+                <w:sz w:val="15"/>
+              </w:rPr>
+              <w:t>Sovereign AI agents, Neo4j GraphRAG pipelines, PostgreSQL, EDA and executive decision dashboards.</w:t>
+            </w:r>
+          </w:p>
+          <w:p>
+            <w:pPr>
+              <w:spacing w:before="60" w:after="10"/>
+            </w:pPr>
+            <w:r>
+              <w:rPr>
+                <w:b/>
+                <w:color w:val="0A1128"/>
+                <w:sz w:val="17"/>
+              </w:rPr>
+              <w:t>Aviation Security Officer (AVSEC)</w:t>
+            </w:r>
+            <w:r>
+              <w:rPr>
+                <w:i/>
+                <w:color w:val="0284C7"/>
+                <w:sz w:val="15"/>
+              </w:rPr>
+              <w:t xml:space="preserve">   —   2018 – Present</w:t>
+            </w:r>
+          </w:p>
+          <w:p>
+            <w:pPr>
+              <w:spacing w:before="0" w:after="10"/>
+            </w:pPr>
+            <w:r>
+              <w:rPr>
+                <w:b/>
+                <w:color w:val="64748B"/>
+                <w:sz w:val="15"/>
+              </w:rPr>
+              <w:t>CCAA (Cameroon Civil Aviation Authority)</w:t>
+            </w:r>
+          </w:p>
+          <w:p>
+            <w:pPr>
+              <w:spacing w:before="0" w:after="24" w:line="264" w:lineRule="auto"/>
+              <w:ind w:left="144"/>
+            </w:pPr>
+            <w:r>
+              <w:rPr>
+                <w:b/>
+                <w:color w:val="0284C7"/>
+                <w:sz w:val="15"/>
+              </w:rPr>
+              <w:t xml:space="preserve">▸  </w:t>
+            </w:r>
+            <w:r>
+              <w:rPr>
+                <w:color w:val="334155"/>
+                <w:sz w:val="15"/>
+              </w:rPr>
+              <w:t>Threat assessment, secure access control, regulatory compliance audits (ICAO Annex 17).</w:t>
+            </w:r>
+          </w:p>
+          <w:p>
+            <w:pPr>
+              <w:spacing w:before="100" w:after="10"/>
+            </w:pPr>
+            <w:r>
+              <w:rPr>
+                <w:b/>
+                <w:color w:val="0284C7"/>
+                <w:sz w:val="16"/>
+              </w:rPr>
+              <w:t xml:space="preserve">◈  </w:t>
+            </w:r>
+            <w:r>
+              <w:rPr>
+                <w:rFonts w:ascii="Segoe UI" w:hAnsi="Segoe UI"/>
+                <w:b/>
+                <w:color w:val="0A1128"/>
+                <w:sz w:val="19"/>
+              </w:rPr>
+              <w:t>EDUCATION &amp; CERTIFICATIONS</w:t>
+            </w:r>
+          </w:p>
+          <w:p>
+            <w:pPr>
+              <w:spacing w:before="0" w:after="50"/>
+            </w:pPr>
+            <w:r>
+              <w:rPr>
+                <w:color w:val="CBD5E1"/>
+                <w:sz w:val="10"/>
+              </w:rPr>
+              <w:t>────────────────────────────────────────────────────────────</w:t>
+            </w:r>
+          </w:p>
+          <w:p>
+            <w:pPr>
+              <w:spacing w:before="60" w:after="10"/>
+            </w:pPr>
+            <w:r>
+              <w:rPr>
+                <w:b/>
+                <w:color w:val="0A1128"/>
+                <w:sz w:val="17"/>
+              </w:rPr>
+              <w:t>M.Sc. in Applied Artificial Intelligence</w:t>
+            </w:r>
+            <w:r>
+              <w:rPr>
+                <w:i/>
+                <w:color w:val="0284C7"/>
+                <w:sz w:val="15"/>
+              </w:rPr>
+              <w:t xml:space="preserve">   —   2025 – 2027  [In Progress]</w:t>
+            </w:r>
+          </w:p>
+          <w:p>
+            <w:pPr>
+              <w:spacing w:before="0" w:after="10"/>
+            </w:pPr>
+            <w:r>
+              <w:rPr>
+                <w:b/>
+                <w:color w:val="64748B"/>
+                <w:sz w:val="15"/>
+              </w:rPr>
+              <w:t>University of Ngaoundéré</w:t>
+            </w:r>
+          </w:p>
+          <w:p>
+            <w:pPr>
+              <w:spacing w:before="0" w:after="24" w:line="264" w:lineRule="auto"/>
+              <w:ind w:left="144"/>
+            </w:pPr>
+            <w:r>
+              <w:rPr>
+                <w:b/>
+                <w:color w:val="0284C7"/>
+                <w:sz w:val="15"/>
+              </w:rPr>
+              <w:t xml:space="preserve">▸  </w:t>
+            </w:r>
+            <w:r>
+              <w:rPr>
+                <w:color w:val="334155"/>
+                <w:sz w:val="15"/>
+              </w:rPr>
+              <w:t>ML &amp; Bayesian Statistics, Data Engineering &amp; Neo4j, Computer Vision &amp; Robotics, Cybersecurity &amp; Blockchain, Production MLOps.</w:t>
+            </w:r>
+          </w:p>
+          <w:p>
+            <w:pPr>
+              <w:spacing w:before="60" w:after="10"/>
+            </w:pPr>
+            <w:r>
+              <w:rPr>
+                <w:b/>
+                <w:color w:val="0A1128"/>
+                <w:sz w:val="17"/>
+              </w:rPr>
+              <w:t>B.Sc. in Civil Engineering (Building Option)</w:t>
+            </w:r>
+            <w:r>
+              <w:rPr>
+                <w:i/>
+                <w:color w:val="0284C7"/>
+                <w:sz w:val="15"/>
+              </w:rPr>
+              <w:t xml:space="preserve">   —   2015 – 2016</w:t>
+            </w:r>
+          </w:p>
+          <w:p>
+            <w:pPr>
+              <w:spacing w:before="0" w:after="10"/>
+            </w:pPr>
+            <w:r>
+              <w:rPr>
+                <w:b/>
+                <w:color w:val="64748B"/>
+                <w:sz w:val="15"/>
+              </w:rPr>
+              <w:t>ISTDI / IUC Douala</w:t>
+            </w:r>
+          </w:p>
+          <w:p>
+            <w:pPr>
+              <w:spacing w:before="0" w:after="24" w:line="264" w:lineRule="auto"/>
+              <w:ind w:left="144"/>
+            </w:pPr>
+            <w:r>
+              <w:rPr>
+                <w:b/>
+                <w:color w:val="0284C7"/>
+                <w:sz w:val="15"/>
+              </w:rPr>
+              <w:t xml:space="preserve">▸  </w:t>
+            </w:r>
+            <w:r>
+              <w:rPr>
+                <w:color w:val="334155"/>
+                <w:sz w:val="15"/>
+              </w:rPr>
+              <w:t>Structural calculations (BAEL 91), quantity surveying, and construction project management.</w:t>
+            </w:r>
+          </w:p>
+          <w:p>
+            <w:pPr>
+              <w:spacing w:before="100" w:after="10"/>
+            </w:pPr>
+            <w:r>
+              <w:rPr>
+                <w:b/>
+                <w:color w:val="0284C7"/>
+                <w:sz w:val="16"/>
+              </w:rPr>
+              <w:t xml:space="preserve">◈  </w:t>
+            </w:r>
+            <w:r>
+              <w:rPr>
+                <w:rFonts w:ascii="Segoe UI" w:hAnsi="Segoe UI"/>
+                <w:b/>
+                <w:color w:val="0A1128"/>
+                <w:sz w:val="19"/>
+              </w:rPr>
+              <w:t>HONORS &amp; APPLIED AI RECOGNITIONS</w:t>
+            </w:r>
+          </w:p>
+          <w:p>
+            <w:pPr>
+              <w:spacing w:before="0" w:after="50"/>
+            </w:pPr>
+            <w:r>
+              <w:rPr>
+                <w:color w:val="CBD5E1"/>
+                <w:sz w:val="10"/>
+              </w:rPr>
+              <w:t>────────────────────────────────────────────────────────────</w:t>
+            </w:r>
+          </w:p>
+          <w:p>
+            <w:pPr>
+              <w:spacing w:before="0" w:after="0" w:line="276" w:lineRule="auto"/>
+            </w:pPr>
+            <w:r>
+              <w:rPr>
+                <w:b/>
+                <w:color w:val="0A1128"/>
+                <w:sz w:val="16"/>
+              </w:rPr>
+              <w:t xml:space="preserve">◈ Google Africa Applied AI Lab (Accra, 2026): </w:t>
+            </w:r>
+            <w:r>
+              <w:rPr>
+                <w:color w:val="334155"/>
+                <w:sz w:val="16"/>
+              </w:rPr>
+              <w:t>Official candidacy — Archi Cam AI platform.</w:t>
+              <w:br/>
+            </w:r>
+            <w:r>
+              <w:rPr>
+                <w:b/>
+                <w:color w:val="0A1128"/>
+                <w:sz w:val="16"/>
+              </w:rPr>
               <w:t xml:space="preserve">◈ Google Cloud #AllThingsAgentic Hackathon: </w:t>
             </w:r>
             <w:r>
               <w:rPr>
                 <w:color w:val="334155"/>
-                <w:sz w:val="17"/>
+                <w:sz w:val="16"/>
               </w:rPr>
-              <w:t>Dataset Automator v4.0 built with Google Antigravity (TabFM, WIT, bigframes, MCT).</w:t>
+              <w:t>Dataset Automator v4.0 (Google Antigravity, TabFM, WIT, bigframes, MCT).</w:t>
             </w:r>
           </w:p>
         </w:tc>
@@ -1899,7 +1790,7 @@
     <w:rsid w:val="00FC693F"/>
     <w:rPr>
       <w:rFonts w:ascii="Segoe UI" w:hAnsi="Segoe UI"/>
-      <w:sz w:val="18"/>
+      <w:sz w:val="16"/>
     </w:rPr>
   </w:style>
   <w:style w:type="paragraph" w:styleId="Header">

</xml_diff>

<commit_message>
cv: integrate WikiSkills, AI Ethics, 19pt name, extended blue bar to bottom, verified 1-page A4
</commit_message>
<xml_diff>
--- a/KOA_MARIE_GERVAIS_NELLY_CV_EN.docx
+++ b/KOA_MARIE_GERVAIS_NELLY_CV_EN.docx
@@ -13,16 +13,16 @@
       </w:tblGrid>
       <w:tr>
         <w:trPr>
-          <w:trHeight w:val="16200"/>
+          <w:trHeight w:val="16300"/>
         </w:trPr>
         <w:tc>
           <w:tcPr>
             <w:tcW w:w="3744" w:type="dxa"/>
             <w:shd w:val="clear" w:color="auto" w:fill="0F172A"/>
             <w:tcMar>
-              <w:top w:w="260" w:type="dxa"/>
+              <w:top w:w="250" w:type="dxa"/>
               <w:left w:w="560" w:type="dxa"/>
-              <w:bottom w:w="240" w:type="dxa"/>
+              <w:bottom w:w="230" w:type="dxa"/>
               <w:right w:w="440" w:type="dxa"/>
             </w:tcMar>
           </w:tcPr>
@@ -107,7 +107,7 @@
           <w:p/>
           <w:p>
             <w:pPr>
-              <w:spacing w:before="120" w:after="0"/>
+              <w:spacing w:before="110" w:after="0"/>
             </w:pPr>
             <w:r>
               <w:rPr>
@@ -119,7 +119,7 @@
           </w:p>
           <w:p>
             <w:pPr>
-              <w:spacing w:before="10" w:after="50"/>
+              <w:spacing w:before="10" w:after="40"/>
             </w:pPr>
             <w:r>
               <w:rPr>
@@ -131,7 +131,7 @@
           </w:p>
           <w:p>
             <w:pPr>
-              <w:spacing w:after="36" w:line="264" w:lineRule="auto"/>
+              <w:spacing w:after="32" w:line="259" w:lineRule="auto"/>
             </w:pPr>
             <w:r>
               <w:rPr>
@@ -150,7 +150,7 @@
           </w:p>
           <w:p>
             <w:pPr>
-              <w:spacing w:after="36" w:line="264" w:lineRule="auto"/>
+              <w:spacing w:after="32" w:line="259" w:lineRule="auto"/>
             </w:pPr>
             <w:r>
               <w:rPr>
@@ -169,7 +169,7 @@
           </w:p>
           <w:p>
             <w:pPr>
-              <w:spacing w:after="36" w:line="264" w:lineRule="auto"/>
+              <w:spacing w:after="32" w:line="259" w:lineRule="auto"/>
             </w:pPr>
             <w:r>
               <w:rPr>
@@ -188,7 +188,7 @@
           </w:p>
           <w:p>
             <w:pPr>
-              <w:spacing w:after="36" w:line="264" w:lineRule="auto"/>
+              <w:spacing w:after="32" w:line="259" w:lineRule="auto"/>
             </w:pPr>
             <w:r>
               <w:rPr>
@@ -207,7 +207,7 @@
           </w:p>
           <w:p>
             <w:pPr>
-              <w:spacing w:after="36" w:line="264" w:lineRule="auto"/>
+              <w:spacing w:after="32" w:line="259" w:lineRule="auto"/>
             </w:pPr>
             <w:r>
               <w:rPr>
@@ -226,7 +226,7 @@
           </w:p>
           <w:p>
             <w:pPr>
-              <w:spacing w:after="36" w:line="264" w:lineRule="auto"/>
+              <w:spacing w:after="32" w:line="259" w:lineRule="auto"/>
             </w:pPr>
             <w:r>
               <w:rPr>
@@ -245,7 +245,7 @@
           </w:p>
           <w:p>
             <w:pPr>
-              <w:spacing w:after="36" w:line="264" w:lineRule="auto"/>
+              <w:spacing w:after="32" w:line="259" w:lineRule="auto"/>
             </w:pPr>
             <w:r>
               <w:rPr>
@@ -264,7 +264,7 @@
           </w:p>
           <w:p>
             <w:pPr>
-              <w:spacing w:before="120" w:after="0"/>
+              <w:spacing w:before="110" w:after="0"/>
             </w:pPr>
             <w:r>
               <w:rPr>
@@ -276,7 +276,7 @@
           </w:p>
           <w:p>
             <w:pPr>
-              <w:spacing w:before="10" w:after="50"/>
+              <w:spacing w:before="10" w:after="40"/>
             </w:pPr>
             <w:r>
               <w:rPr>
@@ -288,7 +288,7 @@
           </w:p>
           <w:p>
             <w:pPr>
-              <w:spacing w:after="36" w:line="264" w:lineRule="auto"/>
+              <w:spacing w:after="32" w:line="259" w:lineRule="auto"/>
             </w:pPr>
             <w:r>
               <w:rPr>
@@ -300,55 +300,55 @@
           </w:p>
           <w:p>
             <w:pPr>
-              <w:spacing w:after="36" w:line="264" w:lineRule="auto"/>
+              <w:spacing w:after="32" w:line="259" w:lineRule="auto"/>
             </w:pPr>
             <w:r>
               <w:rPr>
                 <w:color w:val="F8FAFC"/>
                 <w:sz w:val="15"/>
               </w:rPr>
-              <w:t>Google Gemma 4 (12B)    ■ ■ ■ ■ ■</w:t>
+              <w:t>LangGraph &amp; WikiSkills  ■ ■ ■ ■ ■</w:t>
             </w:r>
           </w:p>
           <w:p>
             <w:pPr>
-              <w:spacing w:after="36" w:line="264" w:lineRule="auto"/>
+              <w:spacing w:after="32" w:line="259" w:lineRule="auto"/>
             </w:pPr>
             <w:r>
               <w:rPr>
                 <w:color w:val="F8FAFC"/>
                 <w:sz w:val="15"/>
               </w:rPr>
-              <w:t>Gemini 2.5 / 1.5 Pro    ■ ■ ■ ■ ■</w:t>
+              <w:t>Google Gemma 4 (12B)    ■ ■ ■ ■ ■</w:t>
             </w:r>
           </w:p>
           <w:p>
             <w:pPr>
-              <w:spacing w:after="36" w:line="264" w:lineRule="auto"/>
+              <w:spacing w:after="32" w:line="259" w:lineRule="auto"/>
             </w:pPr>
             <w:r>
               <w:rPr>
                 <w:color w:val="F8FAFC"/>
                 <w:sz w:val="15"/>
               </w:rPr>
-              <w:t>Google TabFM (Tabular)  ■ ■ ■ ■ ■</w:t>
+              <w:t>Gemini 2.5 / 1.5 Pro    ■ ■ ■ ■ ■</w:t>
             </w:r>
           </w:p>
           <w:p>
             <w:pPr>
-              <w:spacing w:after="36" w:line="264" w:lineRule="auto"/>
+              <w:spacing w:after="32" w:line="259" w:lineRule="auto"/>
             </w:pPr>
             <w:r>
               <w:rPr>
                 <w:color w:val="F8FAFC"/>
                 <w:sz w:val="15"/>
               </w:rPr>
-              <w:t>LangGraph Multi-Agents  ■ ■ ■ ■ ■</w:t>
+              <w:t>Google TabFM (Tabular)  ■ ■ ■ ■ ■</w:t>
             </w:r>
           </w:p>
           <w:p>
             <w:pPr>
-              <w:spacing w:after="36" w:line="264" w:lineRule="auto"/>
+              <w:spacing w:after="32" w:line="259" w:lineRule="auto"/>
             </w:pPr>
             <w:r>
               <w:rPr>
@@ -360,7 +360,7 @@
           </w:p>
           <w:p>
             <w:pPr>
-              <w:spacing w:after="36" w:line="264" w:lineRule="auto"/>
+              <w:spacing w:after="32" w:line="259" w:lineRule="auto"/>
             </w:pPr>
             <w:r>
               <w:rPr>
@@ -372,7 +372,7 @@
           </w:p>
           <w:p>
             <w:pPr>
-              <w:spacing w:before="120" w:after="0"/>
+              <w:spacing w:before="110" w:after="0"/>
             </w:pPr>
             <w:r>
               <w:rPr>
@@ -391,7 +391,7 @@
           </w:p>
           <w:p>
             <w:pPr>
-              <w:spacing w:before="10" w:after="50"/>
+              <w:spacing w:before="10" w:after="40"/>
             </w:pPr>
             <w:r>
               <w:rPr>
@@ -403,7 +403,7 @@
           </w:p>
           <w:p>
             <w:pPr>
-              <w:spacing w:after="36" w:line="264" w:lineRule="auto"/>
+              <w:spacing w:after="32" w:line="259" w:lineRule="auto"/>
             </w:pPr>
             <w:r>
               <w:rPr>
@@ -415,7 +415,7 @@
           </w:p>
           <w:p>
             <w:pPr>
-              <w:spacing w:after="36" w:line="264" w:lineRule="auto"/>
+              <w:spacing w:after="32" w:line="259" w:lineRule="auto"/>
             </w:pPr>
             <w:r>
               <w:rPr>
@@ -427,7 +427,7 @@
           </w:p>
           <w:p>
             <w:pPr>
-              <w:spacing w:after="36" w:line="264" w:lineRule="auto"/>
+              <w:spacing w:after="32" w:line="259" w:lineRule="auto"/>
             </w:pPr>
             <w:r>
               <w:rPr>
@@ -439,7 +439,7 @@
           </w:p>
           <w:p>
             <w:pPr>
-              <w:spacing w:after="36" w:line="264" w:lineRule="auto"/>
+              <w:spacing w:after="32" w:line="259" w:lineRule="auto"/>
             </w:pPr>
             <w:r>
               <w:rPr>
@@ -451,7 +451,7 @@
           </w:p>
           <w:p>
             <w:pPr>
-              <w:spacing w:after="36" w:line="264" w:lineRule="auto"/>
+              <w:spacing w:after="32" w:line="259" w:lineRule="auto"/>
             </w:pPr>
             <w:r>
               <w:rPr>
@@ -463,7 +463,7 @@
           </w:p>
           <w:p>
             <w:pPr>
-              <w:spacing w:before="120" w:after="0"/>
+              <w:spacing w:before="110" w:after="0"/>
             </w:pPr>
             <w:r>
               <w:rPr>
@@ -475,7 +475,7 @@
           </w:p>
           <w:p>
             <w:pPr>
-              <w:spacing w:before="10" w:after="50"/>
+              <w:spacing w:before="10" w:after="40"/>
             </w:pPr>
             <w:r>
               <w:rPr>
@@ -487,7 +487,7 @@
           </w:p>
           <w:p>
             <w:pPr>
-              <w:spacing w:after="36" w:line="264" w:lineRule="auto"/>
+              <w:spacing w:after="32" w:line="259" w:lineRule="auto"/>
             </w:pPr>
             <w:r>
               <w:rPr>
@@ -506,7 +506,7 @@
           </w:p>
           <w:p>
             <w:pPr>
-              <w:spacing w:after="36" w:line="264" w:lineRule="auto"/>
+              <w:spacing w:after="32" w:line="259" w:lineRule="auto"/>
             </w:pPr>
             <w:r>
               <w:rPr>
@@ -518,7 +518,7 @@
           </w:p>
           <w:p>
             <w:pPr>
-              <w:spacing w:after="36" w:line="264" w:lineRule="auto"/>
+              <w:spacing w:after="32" w:line="259" w:lineRule="auto"/>
             </w:pPr>
             <w:r>
               <w:rPr>
@@ -530,7 +530,7 @@
           </w:p>
           <w:p>
             <w:pPr>
-              <w:spacing w:after="36" w:line="264" w:lineRule="auto"/>
+              <w:spacing w:after="32" w:line="259" w:lineRule="auto"/>
             </w:pPr>
             <w:r>
               <w:rPr>
@@ -542,7 +542,7 @@
           </w:p>
           <w:p>
             <w:pPr>
-              <w:spacing w:after="36" w:line="264" w:lineRule="auto"/>
+              <w:spacing w:after="32" w:line="259" w:lineRule="auto"/>
             </w:pPr>
             <w:r>
               <w:rPr>
@@ -554,7 +554,7 @@
           </w:p>
           <w:p>
             <w:pPr>
-              <w:spacing w:after="36" w:line="264" w:lineRule="auto"/>
+              <w:spacing w:after="32" w:line="259" w:lineRule="auto"/>
             </w:pPr>
             <w:r>
               <w:rPr>
@@ -566,19 +566,19 @@
           </w:p>
           <w:p>
             <w:pPr>
-              <w:spacing w:before="120" w:after="0"/>
+              <w:spacing w:before="110" w:after="0"/>
             </w:pPr>
             <w:r>
               <w:rPr>
                 <w:b/>
                 <w:color w:val="38BDF8"/>
               </w:rPr>
-              <w:t>SECURITY &amp; AUDIT</w:t>
+              <w:t>ETHICS, SECURITY &amp; AUDIT</w:t>
             </w:r>
           </w:p>
           <w:p>
             <w:pPr>
-              <w:spacing w:before="10" w:after="50"/>
+              <w:spacing w:before="10" w:after="40"/>
             </w:pPr>
             <w:r>
               <w:rPr>
@@ -590,172 +590,184 @@
           </w:p>
           <w:p>
             <w:pPr>
-              <w:spacing w:after="36" w:line="264" w:lineRule="auto"/>
+              <w:spacing w:after="32" w:line="259" w:lineRule="auto"/>
             </w:pPr>
             <w:r>
               <w:rPr>
                 <w:color w:val="F8FAFC"/>
                 <w:sz w:val="15"/>
               </w:rPr>
-              <w:t>◈ Quorum 4-Eyes Governance</w:t>
+              <w:t>◈ AI Ethics &amp; Anti-Hallucinat</w:t>
+            </w:r>
+            <w:r>
+              <w:rPr>
+                <w:color w:val="F8FAFC"/>
+                <w:sz w:val="15"/>
+              </w:rPr>
+              <w:t>ion</w:t>
             </w:r>
           </w:p>
           <w:p>
             <w:pPr>
-              <w:spacing w:after="36" w:line="264" w:lineRule="auto"/>
+              <w:spacing w:after="32" w:line="259" w:lineRule="auto"/>
             </w:pPr>
             <w:r>
               <w:rPr>
                 <w:color w:val="F8FAFC"/>
                 <w:sz w:val="15"/>
               </w:rPr>
-              <w:t>◈ OKF v0.2</w:t>
-            </w:r>
-            <w:r>
-              <w:rPr>
-                <w:color w:val="F8FAFC"/>
-                <w:sz w:val="15"/>
-              </w:rPr>
-              <w:t xml:space="preserve"> SHA-256 No-LLM</w:t>
+              <w:t>◈ Quorum 4-Eyes Governance</w:t>
             </w:r>
           </w:p>
           <w:p>
             <w:pPr>
-              <w:spacing w:after="36" w:line="264" w:lineRule="auto"/>
+              <w:spacing w:after="32" w:line="259" w:lineRule="auto"/>
             </w:pPr>
             <w:r>
               <w:rPr>
                 <w:color w:val="F8FAFC"/>
                 <w:sz w:val="15"/>
               </w:rPr>
-              <w:t>◈ EU AI Act (RSASSA-PSS)</w:t>
+              <w:t>◈ OKF v0.2 SHA-256 No-LLM</w:t>
             </w:r>
           </w:p>
           <w:p>
             <w:pPr>
-              <w:spacing w:after="36" w:line="264" w:lineRule="auto"/>
+              <w:spacing w:after="32" w:line="259" w:lineRule="auto"/>
             </w:pPr>
             <w:r>
               <w:rPr>
                 <w:color w:val="F8FAFC"/>
                 <w:sz w:val="15"/>
               </w:rPr>
-              <w:t>◈ AVSEC (ICAO Annex 17)</w:t>
+              <w:t>◈ EU AI Act Compliance (RSASSA)</w:t>
             </w:r>
           </w:p>
           <w:p>
             <w:pPr>
-              <w:spacing w:before="120" w:after="0"/>
+              <w:spacing w:after="32" w:line="259" w:lineRule="auto"/>
             </w:pPr>
             <w:r>
               <w:rPr>
-                <w:b/>
-                <w:color w:val="38BDF8"/>
-              </w:rPr>
-              <w:t>LANGUAGES</w:t>
+                <w:color w:val="F8FAFC"/>
+                <w:sz w:val="15"/>
+              </w:rPr>
+              <w:t>◈ AVSEC (ICAO Annex 17)</w:t>
             </w:r>
           </w:p>
           <w:p>
             <w:pPr>
-              <w:spacing w:before="10" w:after="50"/>
+              <w:spacing w:before="110" w:after="0"/>
             </w:pPr>
             <w:r>
               <w:rPr>
-                <w:color w:val="0284C7"/>
-                <w:sz w:val="10"/>
-              </w:rPr>
-              <w:t>━━━━━━━━━━━━━━━━━━━━</w:t>
+                <w:b/>
+                <w:color w:val="38BDF8"/>
+              </w:rPr>
+              <w:t>LANGUAGES</w:t>
             </w:r>
           </w:p>
           <w:p>
             <w:pPr>
-              <w:spacing w:after="36" w:line="264" w:lineRule="auto"/>
+              <w:spacing w:before="10" w:after="40"/>
             </w:pPr>
             <w:r>
               <w:rPr>
-                <w:color w:val="F8FAFC"/>
-                <w:sz w:val="15"/>
-              </w:rPr>
-              <w:t>French   —  Native / Fluent</w:t>
+                <w:color w:val="0284C7"/>
+                <w:sz w:val="10"/>
+              </w:rPr>
+              <w:t>━━━━━━━━━━━━━━━━━━━━</w:t>
             </w:r>
           </w:p>
           <w:p>
             <w:pPr>
-              <w:spacing w:after="36" w:line="264" w:lineRule="auto"/>
+              <w:spacing w:after="32" w:line="259" w:lineRule="auto"/>
             </w:pPr>
             <w:r>
               <w:rPr>
                 <w:color w:val="F8FAFC"/>
                 <w:sz w:val="15"/>
               </w:rPr>
-              <w:t>English  —  Technical / Pro</w:t>
+              <w:t>French   —  Native / Fluent</w:t>
             </w:r>
           </w:p>
           <w:p>
             <w:pPr>
-              <w:spacing w:before="120" w:after="0"/>
+              <w:spacing w:after="32" w:line="259" w:lineRule="auto"/>
             </w:pPr>
             <w:r>
               <w:rPr>
-                <w:b/>
-                <w:color w:val="38BDF8"/>
-              </w:rPr>
-              <w:t>KEY ASSETS</w:t>
+                <w:color w:val="F8FAFC"/>
+                <w:sz w:val="15"/>
+              </w:rPr>
+              <w:t>English  —  Technical / Pro</w:t>
             </w:r>
           </w:p>
           <w:p>
             <w:pPr>
-              <w:spacing w:before="10" w:after="50"/>
+              <w:spacing w:before="110" w:after="0"/>
             </w:pPr>
             <w:r>
               <w:rPr>
-                <w:color w:val="0284C7"/>
-                <w:sz w:val="10"/>
-              </w:rPr>
-              <w:t>━━━━━━━━━━━━━━━━━━━━</w:t>
+                <w:b/>
+                <w:color w:val="38BDF8"/>
+              </w:rPr>
+              <w:t>KEY ASSETS</w:t>
             </w:r>
           </w:p>
           <w:p>
             <w:pPr>
-              <w:spacing w:after="36" w:line="264" w:lineRule="auto"/>
+              <w:spacing w:before="10" w:after="40"/>
             </w:pPr>
             <w:r>
               <w:rPr>
-                <w:color w:val="F8FAFC"/>
-                <w:sz w:val="15"/>
-              </w:rPr>
-              <w:t>◈ Dual Competence: AI &amp; Civil Eng.</w:t>
+                <w:color w:val="0284C7"/>
+                <w:sz w:val="10"/>
+              </w:rPr>
+              <w:t>━━━━━━━━━━━━━━━━━━━━</w:t>
             </w:r>
           </w:p>
           <w:p>
             <w:pPr>
-              <w:spacing w:after="36" w:line="264" w:lineRule="auto"/>
+              <w:spacing w:after="32" w:line="259" w:lineRule="auto"/>
             </w:pPr>
             <w:r>
               <w:rPr>
                 <w:color w:val="F8FAFC"/>
                 <w:sz w:val="15"/>
               </w:rPr>
-              <w:t>◈ Aviation Security &amp; Crisis (CCAA)</w:t>
+              <w:t xml:space="preserve">◈ Dual Competence: AI &amp; </w:t>
+            </w:r>
+            <w:r>
+              <w:rPr>
+                <w:color w:val="F8FAFC"/>
+                <w:sz w:val="15"/>
+              </w:rPr>
+              <w:t>Civil Eng.</w:t>
             </w:r>
           </w:p>
           <w:p>
             <w:pPr>
-              <w:spacing w:after="36" w:line="264" w:lineRule="auto"/>
+              <w:spacing w:after="32" w:line="259" w:lineRule="auto"/>
             </w:pPr>
             <w:r>
               <w:rPr>
                 <w:color w:val="F8FAFC"/>
                 <w:sz w:val="15"/>
               </w:rPr>
-              <w:t>◈</w:t>
-            </w:r>
+              <w:t>◈ Aviation Security &amp; Crisis (CCAA)</w:t>
+            </w:r>
+          </w:p>
+          <w:p>
+            <w:pPr>
+              <w:spacing w:after="32" w:line="259" w:lineRule="auto"/>
+            </w:pPr>
             <w:r>
               <w:rPr>
                 <w:color w:val="F8FAFC"/>
                 <w:sz w:val="15"/>
               </w:rPr>
-              <w:t xml:space="preserve"> Mathematical Rigor &amp; Guardrails</w:t>
+              <w:t>◈ Mathematical Rigor &amp; Guardrails</w:t>
             </w:r>
           </w:p>
         </w:tc>
@@ -764,9 +776,9 @@
             <w:tcW w:w="8165" w:type="dxa"/>
             <w:shd w:val="clear" w:color="auto" w:fill="FFFFFF"/>
             <w:tcMar>
-              <w:top w:w="280" w:type="dxa"/>
+              <w:top w:w="260" w:type="dxa"/>
               <w:left w:w="280" w:type="dxa"/>
-              <w:bottom w:w="240" w:type="dxa"/>
+              <w:bottom w:w="230" w:type="dxa"/>
               <w:right w:w="300" w:type="dxa"/>
             </w:tcMar>
           </w:tcPr>
@@ -778,7 +790,7 @@
               <w:rPr>
                 <w:b/>
                 <w:color w:val="0A1128"/>
-                <w:sz w:val="36"/>
+                <w:sz w:val="38"/>
               </w:rPr>
               <w:t>KOA MARIE GERVAIS NELLY</w:t>
             </w:r>
@@ -791,14 +803,14 @@
               <w:rPr>
                 <w:b/>
                 <w:color w:val="0284C7"/>
-                <w:sz w:val="18"/>
+                <w:sz w:val="19"/>
               </w:rPr>
               <w:t>Lead AI Engineer &amp; Data Architect   │   Founder @ Archi Cam AI</w:t>
             </w:r>
           </w:p>
           <w:p>
             <w:pPr>
-              <w:spacing w:after="80"/>
+              <w:spacing w:after="70"/>
             </w:pPr>
             <w:r>
               <w:rPr>
@@ -810,7 +822,7 @@
           </w:p>
           <w:p>
             <w:pPr>
-              <w:spacing w:before="120" w:after="10"/>
+              <w:spacing w:before="110" w:after="10"/>
             </w:pPr>
             <w:r>
               <w:rPr>
@@ -826,48 +838,55 @@
                 <w:color w:val="0A1128"/>
                 <w:sz w:val="20"/>
               </w:rPr>
-              <w:t>EXECUTIVE SUMMARY</w:t>
+              <w:t>EXECUTIVE SUMM</w:t>
+            </w:r>
+            <w:r>
+              <w:rPr>
+                <w:b/>
+                <w:color w:val="0A1128"/>
+                <w:sz w:val="20"/>
+              </w:rPr>
+              <w:t>ARY</w:t>
             </w:r>
           </w:p>
           <w:p>
             <w:pPr>
-              <w:spacing w:after="60"/>
+              <w:spacing w:after="50"/>
             </w:pPr>
             <w:r>
               <w:rPr>
                 <w:color w:val="CBD5E1"/>
                 <w:sz w:val="10"/>
               </w:rPr>
-              <w:t>────────────────────────────────────────────</w:t>
-            </w:r>
-            <w:r>
-              <w:rPr>
-                <w:color w:val="CBD5E1"/>
-                <w:sz w:val="10"/>
-              </w:rPr>
-              <w:t>────────────────</w:t>
+              <w:t>────────────────────────────────────────────────────────────</w:t>
             </w:r>
           </w:p>
           <w:p>
             <w:pPr>
-              <w:spacing w:after="60" w:line="283" w:lineRule="auto"/>
+              <w:spacing w:after="50" w:line="278" w:lineRule="auto"/>
             </w:pPr>
             <w:r>
               <w:rPr>
                 <w:color w:val="334155"/>
               </w:rPr>
-              <w:t xml:space="preserve">Lead AI Engineer &amp; Data Architect (Google Developer Program Member), leveraging Google Antigravity to design neuro-symbolic autonomous multi-agent systems, Neo4j GraphRAG, and sovereign production MLOps. Specialized in deterministic </w:t>
+              <w:t>Lead AI Engineer &amp; Data Architect (Google Developer Program Member), leveraging Google Antigravity to design neuro-symbolic autonomous multi-agent architectures, Neo4j GraphRAG, and sovereign</w:t>
             </w:r>
             <w:r>
               <w:rPr>
                 <w:color w:val="334155"/>
               </w:rPr>
-              <w:t>architectures and verifiable AI. Founder of Archi Cam AI (official applicant for Google Africa Applied AI Lab), bridging civil engineering methodology, math rigor, and product vision.</w:t>
+              <w:t xml:space="preserve"> MLOps. Expert in AI ethics (transparency, SHAP explainability, EU AI Act compliance, and deterministic hallucination-free models). Founder of Archi Cam AI (official applicant for Google Africa Applied AI Lab), bridging civil engineering methodology, math </w:t>
+            </w:r>
+            <w:r>
+              <w:rPr>
+                <w:color w:val="334155"/>
+              </w:rPr>
+              <w:t>rigor, and product vision.</w:t>
             </w:r>
           </w:p>
           <w:p>
             <w:pPr>
-              <w:spacing w:before="120" w:after="10"/>
+              <w:spacing w:before="110" w:after="10"/>
             </w:pPr>
             <w:r>
               <w:rPr>
@@ -888,26 +907,19 @@
           </w:p>
           <w:p>
             <w:pPr>
-              <w:spacing w:after="60"/>
+              <w:spacing w:after="50"/>
             </w:pPr>
             <w:r>
               <w:rPr>
                 <w:color w:val="CBD5E1"/>
                 <w:sz w:val="10"/>
               </w:rPr>
-              <w:t>────────────────────────────────────────────────</w:t>
-            </w:r>
-            <w:r>
-              <w:rPr>
-                <w:color w:val="CBD5E1"/>
-                <w:sz w:val="10"/>
-              </w:rPr>
-              <w:t>────────────</w:t>
+              <w:t>────────────────────────────────────────────────────────────</w:t>
             </w:r>
           </w:p>
           <w:p>
             <w:pPr>
-              <w:spacing w:before="70" w:after="16"/>
+              <w:spacing w:before="70" w:after="12"/>
             </w:pPr>
             <w:r>
               <w:rPr>
@@ -927,7 +939,7 @@
           </w:p>
           <w:p>
             <w:pPr>
-              <w:spacing w:after="30" w:line="274" w:lineRule="auto"/>
+              <w:spacing w:after="28" w:line="269" w:lineRule="auto"/>
               <w:ind w:left="144"/>
             </w:pPr>
             <w:r>
@@ -948,12 +960,18 @@
               <w:rPr>
                 <w:color w:val="334155"/>
               </w:rPr>
-              <w:t>Official Applicant Google Africa Applied AI Lab. Built with Google Antigravity (Gemma 4 12B, Gemini, BAEL 91).</w:t>
+              <w:t>Official Applicant Google Africa Applied AI Lab. Built with Google Antigravity (Gemma 4 12B, Gemi</w:t>
+            </w:r>
+            <w:r>
+              <w:rPr>
+                <w:color w:val="334155"/>
+              </w:rPr>
+              <w:t>ni, BAEL 91).</w:t>
             </w:r>
           </w:p>
           <w:p>
             <w:pPr>
-              <w:spacing w:after="30" w:line="274" w:lineRule="auto"/>
+              <w:spacing w:after="28" w:line="269" w:lineRule="auto"/>
               <w:ind w:left="144"/>
             </w:pPr>
             <w:r>
@@ -974,18 +992,12 @@
               <w:rPr>
                 <w:color w:val="334155"/>
               </w:rPr>
-              <w:t>Automated Excel BOQs in &lt;45s (–99.2% time, MLflow R²=0.9872) and 3D renders via Im</w:t>
-            </w:r>
-            <w:r>
-              <w:rPr>
-                <w:color w:val="334155"/>
-              </w:rPr>
-              <w:t>agen 3 + ControlNet.</w:t>
+              <w:t>Automated Excel BOQs in &lt;45s (–99.2% time, MLflow R²=0.9872) and 3D renders via Imagen 3 + ControlNet.</w:t>
             </w:r>
           </w:p>
           <w:p>
             <w:pPr>
-              <w:spacing w:before="70" w:after="16"/>
+              <w:spacing w:before="70" w:after="12"/>
             </w:pPr>
             <w:r>
               <w:rPr>
@@ -1000,12 +1012,12 @@
                 <w:i/>
                 <w:color w:val="0284C7"/>
               </w:rPr>
-              <w:t xml:space="preserve">   —   Sovereign Multi-Agent AI &amp; OKF Certification</w:t>
+              <w:t xml:space="preserve">   —   Sovereign Multi-Agent AI, WikiSkills &amp; OKF Certification</w:t>
             </w:r>
           </w:p>
           <w:p>
             <w:pPr>
-              <w:spacing w:after="30" w:line="274" w:lineRule="auto"/>
+              <w:spacing w:after="28" w:line="269" w:lineRule="auto"/>
               <w:ind w:left="144"/>
             </w:pPr>
             <w:r>
@@ -1026,12 +1038,18 @@
               <w:rPr>
                 <w:color w:val="334155"/>
               </w:rPr>
-              <w:t>Sovereign DMI system (Univ. of Ngaoundéré): 470 theses, 19 M1 projects, 1,366 Neo4j nodes.</w:t>
+              <w:t>Sovereign DMI system (Univ. of Ngaoundéré): 470 t</w:t>
+            </w:r>
+            <w:r>
+              <w:rPr>
+                <w:color w:val="334155"/>
+              </w:rPr>
+              <w:t>heses, 19 M1 projects, 1,366 Neo4j nodes.</w:t>
             </w:r>
           </w:p>
           <w:p>
             <w:pPr>
-              <w:spacing w:after="30" w:line="274" w:lineRule="auto"/>
+              <w:spacing w:after="28" w:line="269" w:lineRule="auto"/>
               <w:ind w:left="144"/>
             </w:pPr>
             <w:r>
@@ -1052,18 +1070,12 @@
               <w:rPr>
                 <w:color w:val="334155"/>
               </w:rPr>
-              <w:t>6-agent LangGraph, hybrid retrieval RRF k=60 + Cross-Encoder, SHA-</w:t>
-            </w:r>
-            <w:r>
-              <w:rPr>
-                <w:color w:val="334155"/>
-              </w:rPr>
-              <w:t>256 No-LLM cert, 77/77 tests (100%).</w:t>
+              <w:t>6 LangGraph agents orchestrated via WikiSkills (skills: critic anti-hallucination, Cypher optimizer), RRF k=60, SHA-256 No-LLM (100%).</w:t>
             </w:r>
           </w:p>
           <w:p>
             <w:pPr>
-              <w:spacing w:before="70" w:after="16"/>
+              <w:spacing w:before="70" w:after="12"/>
             </w:pPr>
             <w:r>
               <w:rPr>
@@ -1083,7 +1095,7 @@
           </w:p>
           <w:p>
             <w:pPr>
-              <w:spacing w:after="30" w:line="274" w:lineRule="auto"/>
+              <w:spacing w:after="28" w:line="269" w:lineRule="auto"/>
               <w:ind w:left="144"/>
             </w:pPr>
             <w:r>
@@ -1109,7 +1121,7 @@
           </w:p>
           <w:p>
             <w:pPr>
-              <w:spacing w:before="70" w:after="16"/>
+              <w:spacing w:before="70" w:after="12"/>
             </w:pPr>
             <w:r>
               <w:rPr>
@@ -1129,7 +1141,7 @@
           </w:p>
           <w:p>
             <w:pPr>
-              <w:spacing w:after="30" w:line="274" w:lineRule="auto"/>
+              <w:spacing w:after="28" w:line="269" w:lineRule="auto"/>
               <w:ind w:left="144"/>
             </w:pPr>
             <w:r>
@@ -1150,12 +1162,18 @@
               <w:rPr>
                 <w:color w:val="334155"/>
               </w:rPr>
-              <w:t>Dataset Automator: Google Antigravity (Google Cloud Hackathon) — TabFM, BigQuery DataFrames, EU AI Act.</w:t>
+              <w:t>Dataset Automator: Google Antigravity (Google Cloud Hackathon) — TabFM, B</w:t>
+            </w:r>
+            <w:r>
+              <w:rPr>
+                <w:color w:val="334155"/>
+              </w:rPr>
+              <w:t>igQuery DataFrames, EU AI Act.</w:t>
             </w:r>
           </w:p>
           <w:p>
             <w:pPr>
-              <w:spacing w:after="30" w:line="274" w:lineRule="auto"/>
+              <w:spacing w:after="28" w:line="269" w:lineRule="auto"/>
               <w:ind w:left="144"/>
             </w:pPr>
             <w:r>
@@ -1181,7 +1199,7 @@
           </w:p>
           <w:p>
             <w:pPr>
-              <w:spacing w:before="120" w:after="10"/>
+              <w:spacing w:before="110" w:after="10"/>
             </w:pPr>
             <w:r>
               <w:rPr>
@@ -1197,7 +1215,162 @@
                 <w:color w:val="0A1128"/>
                 <w:sz w:val="20"/>
               </w:rPr>
-              <w:t>PROFESSIONAL E</w:t>
+              <w:t>PROFESSIONAL EXPERIENCE</w:t>
+            </w:r>
+          </w:p>
+          <w:p>
+            <w:pPr>
+              <w:spacing w:after="50"/>
+            </w:pPr>
+            <w:r>
+              <w:rPr>
+                <w:color w:val="CBD5E1"/>
+                <w:sz w:val="10"/>
+              </w:rPr>
+              <w:t>────────────────────────────────────────────────────────────</w:t>
+            </w:r>
+          </w:p>
+          <w:p>
+            <w:pPr>
+              <w:spacing w:before="70" w:after="12"/>
+            </w:pPr>
+            <w:r>
+              <w:rPr>
+                <w:b/>
+                <w:color w:val="0A1128"/>
+                <w:sz w:val="18"/>
+              </w:rPr>
+              <w:t>AI Lead &amp; Data Science Consultant</w:t>
+            </w:r>
+            <w:r>
+              <w:rPr>
+                <w:i/>
+                <w:color w:val="0284C7"/>
+              </w:rPr>
+              <w:t xml:space="preserve">   —   2025 – </w:t>
+            </w:r>
+            <w:r>
+              <w:rPr>
+                <w:i/>
+                <w:color w:val="0284C7"/>
+              </w:rPr>
+              <w:t>Present</w:t>
+            </w:r>
+          </w:p>
+          <w:p>
+            <w:pPr>
+              <w:spacing w:after="12"/>
+            </w:pPr>
+            <w:r>
+              <w:rPr>
+                <w:b/>
+                <w:color w:val="64748B"/>
+              </w:rPr>
+              <w:t>Independent Projects &amp; Enterprises  │  Douala, CM</w:t>
+            </w:r>
+          </w:p>
+          <w:p>
+            <w:pPr>
+              <w:spacing w:after="28" w:line="269" w:lineRule="auto"/>
+              <w:ind w:left="144"/>
+            </w:pPr>
+            <w:r>
+              <w:rPr>
+                <w:b/>
+                <w:color w:val="0284C7"/>
+              </w:rPr>
+              <w:t>▸</w:t>
+            </w:r>
+            <w:r>
+              <w:rPr>
+                <w:b/>
+                <w:color w:val="0284C7"/>
+              </w:rPr>
+              <w:t xml:space="preserve">  </w:t>
+            </w:r>
+            <w:r>
+              <w:rPr>
+                <w:color w:val="334155"/>
+              </w:rPr>
+              <w:t>Ethical sovereign AI, Neo4j GraphRAG pipelines, PostgreSQL, high-dimensional EDA, executive dashboards.</w:t>
+            </w:r>
+          </w:p>
+          <w:p>
+            <w:pPr>
+              <w:spacing w:before="70" w:after="12"/>
+            </w:pPr>
+            <w:r>
+              <w:rPr>
+                <w:b/>
+                <w:color w:val="0A1128"/>
+                <w:sz w:val="18"/>
+              </w:rPr>
+              <w:t>Aviation Security Officer (AVSEC)</w:t>
+            </w:r>
+            <w:r>
+              <w:rPr>
+                <w:i/>
+                <w:color w:val="0284C7"/>
+              </w:rPr>
+              <w:t xml:space="preserve">   —   2018 – Present</w:t>
+            </w:r>
+          </w:p>
+          <w:p>
+            <w:pPr>
+              <w:spacing w:after="12"/>
+            </w:pPr>
+            <w:r>
+              <w:rPr>
+                <w:b/>
+                <w:color w:val="64748B"/>
+              </w:rPr>
+              <w:t xml:space="preserve">CCAA (Cameroon Civil Aviation </w:t>
+            </w:r>
+            <w:r>
+              <w:rPr>
+                <w:b/>
+                <w:color w:val="64748B"/>
+              </w:rPr>
+              <w:t>Authority)</w:t>
+            </w:r>
+          </w:p>
+          <w:p>
+            <w:pPr>
+              <w:spacing w:after="28" w:line="269" w:lineRule="auto"/>
+              <w:ind w:left="144"/>
+            </w:pPr>
+            <w:r>
+              <w:rPr>
+                <w:b/>
+                <w:color w:val="0284C7"/>
+              </w:rPr>
+              <w:t>▸</w:t>
+            </w:r>
+            <w:r>
+              <w:rPr>
+                <w:b/>
+                <w:color w:val="0284C7"/>
+              </w:rPr>
+              <w:t xml:space="preserve">  </w:t>
+            </w:r>
+            <w:r>
+              <w:rPr>
+                <w:color w:val="334155"/>
+              </w:rPr>
+              <w:t>Threat assessment, secure access control, regulatory compliance audits (ICAO Annex 17).</w:t>
+            </w:r>
+          </w:p>
+          <w:p>
+            <w:pPr>
+              <w:spacing w:before="110" w:after="10"/>
+            </w:pPr>
+            <w:r>
+              <w:rPr>
+                <w:b/>
+                <w:color w:val="0284C7"/>
+                <w:sz w:val="17"/>
+              </w:rPr>
+              <w:t xml:space="preserve">◈  </w:t>
             </w:r>
             <w:r>
               <w:rPr>
@@ -1205,12 +1378,12 @@
                 <w:color w:val="0A1128"/>
                 <w:sz w:val="20"/>
               </w:rPr>
-              <w:t>XPERIENCE</w:t>
+              <w:t>EDUCATION &amp; CERTIFICATIONS</w:t>
             </w:r>
           </w:p>
           <w:p>
             <w:pPr>
-              <w:spacing w:after="60"/>
+              <w:spacing w:after="50"/>
             </w:pPr>
             <w:r>
               <w:rPr>
@@ -1222,7 +1395,7 @@
           </w:p>
           <w:p>
             <w:pPr>
-              <w:spacing w:before="70" w:after="16"/>
+              <w:spacing w:before="70" w:after="12"/>
             </w:pPr>
             <w:r>
               <w:rPr>
@@ -1230,31 +1403,38 @@
                 <w:color w:val="0A1128"/>
                 <w:sz w:val="18"/>
               </w:rPr>
-              <w:t>AI Lead &amp; Data Science Consultant</w:t>
+              <w:t>M.Sc. in Applied Artificial Intelligence</w:t>
             </w:r>
             <w:r>
               <w:rPr>
                 <w:i/>
                 <w:color w:val="0284C7"/>
               </w:rPr>
-              <w:t xml:space="preserve">   —   2025 – Present</w:t>
+              <w:t xml:space="preserve">   —   2025 – 2027  [In</w:t>
+            </w:r>
+            <w:r>
+              <w:rPr>
+                <w:i/>
+                <w:color w:val="0284C7"/>
+              </w:rPr>
+              <w:t xml:space="preserve"> Progress]</w:t>
             </w:r>
           </w:p>
           <w:p>
             <w:pPr>
-              <w:spacing w:after="16"/>
+              <w:spacing w:after="12"/>
             </w:pPr>
             <w:r>
               <w:rPr>
                 <w:b/>
                 <w:color w:val="64748B"/>
               </w:rPr>
-              <w:t>Independent Projects &amp; Enterprises  │  Douala, CM</w:t>
+              <w:t>University of Ngaoundéré</w:t>
             </w:r>
           </w:p>
           <w:p>
             <w:pPr>
-              <w:spacing w:after="30" w:line="274" w:lineRule="auto"/>
+              <w:spacing w:after="28" w:line="269" w:lineRule="auto"/>
               <w:ind w:left="144"/>
             </w:pPr>
             <w:r>
@@ -1275,18 +1455,12 @@
               <w:rPr>
                 <w:color w:val="334155"/>
               </w:rPr>
-              <w:t xml:space="preserve">Sovereign AI agents, Neo4j GraphRAG pipelines, PostgreSQL, EDA and executive </w:t>
-            </w:r>
-            <w:r>
-              <w:rPr>
-                <w:color w:val="334155"/>
-              </w:rPr>
-              <w:t>decision dashboards.</w:t>
+              <w:t>ML &amp; Bayesian Statistics, Data Engineering &amp; Neo4j, Computer Vision &amp; Robotics, Ethics &amp; Cybersecurity, Production MLOps.</w:t>
             </w:r>
           </w:p>
           <w:p>
             <w:pPr>
-              <w:spacing w:before="70" w:after="16"/>
+              <w:spacing w:before="70" w:after="12"/>
             </w:pPr>
             <w:r>
               <w:rPr>
@@ -1294,31 +1468,31 @@
                 <w:color w:val="0A1128"/>
                 <w:sz w:val="18"/>
               </w:rPr>
-              <w:t>Aviation Security Officer (AVSEC)</w:t>
+              <w:t>B.Sc. in Civil Engineering (Building Option)</w:t>
             </w:r>
             <w:r>
               <w:rPr>
                 <w:i/>
                 <w:color w:val="0284C7"/>
               </w:rPr>
-              <w:t xml:space="preserve">   —   2018 – Present</w:t>
+              <w:t xml:space="preserve">   —   2015 – 2016</w:t>
             </w:r>
           </w:p>
           <w:p>
             <w:pPr>
-              <w:spacing w:after="16"/>
+              <w:spacing w:after="12"/>
             </w:pPr>
             <w:r>
               <w:rPr>
                 <w:b/>
                 <w:color w:val="64748B"/>
               </w:rPr>
-              <w:t>CCAA (Cameroon Civil Aviation Authority)</w:t>
+              <w:t>ISTDI / IUC Douala</w:t>
             </w:r>
           </w:p>
           <w:p>
             <w:pPr>
-              <w:spacing w:after="30" w:line="274" w:lineRule="auto"/>
+              <w:spacing w:after="28" w:line="269" w:lineRule="auto"/>
               <w:ind w:left="144"/>
             </w:pPr>
             <w:r>
@@ -1339,12 +1513,18 @@
               <w:rPr>
                 <w:color w:val="334155"/>
               </w:rPr>
-              <w:t>Threat assessment, secure access control, regulatory compliance audits (ICAO Annex 17).</w:t>
+              <w:t>Structural</w:t>
+            </w:r>
+            <w:r>
+              <w:rPr>
+                <w:color w:val="334155"/>
+              </w:rPr>
+              <w:t xml:space="preserve"> calculations (BAEL 91), quantity surveying, and construction project management.</w:t>
             </w:r>
           </w:p>
           <w:p>
             <w:pPr>
-              <w:spacing w:before="120" w:after="10"/>
+              <w:spacing w:before="110" w:after="10"/>
             </w:pPr>
             <w:r>
               <w:rPr>
@@ -1360,206 +1540,43 @@
                 <w:color w:val="0A1128"/>
                 <w:sz w:val="20"/>
               </w:rPr>
-              <w:t>EDUCATION &amp; CERTIFICATIONS</w:t>
+              <w:t>HONORS &amp; APPLIED AI RECOGNITIONS</w:t>
             </w:r>
           </w:p>
           <w:p>
             <w:pPr>
-              <w:spacing w:after="60"/>
+              <w:spacing w:after="50"/>
             </w:pPr>
             <w:r>
               <w:rPr>
                 <w:color w:val="CBD5E1"/>
                 <w:sz w:val="10"/>
               </w:rPr>
-              <w:t>──────────────────</w:t>
-            </w:r>
-            <w:r>
-              <w:rPr>
-                <w:color w:val="CBD5E1"/>
-                <w:sz w:val="10"/>
-              </w:rPr>
-              <w:t>──────────────────────────────────────────</w:t>
+              <w:t>────────────────────────────────────────────────────────────</w:t>
             </w:r>
           </w:p>
           <w:p>
             <w:pPr>
-              <w:spacing w:before="70" w:after="16"/>
+              <w:spacing w:after="0" w:line="278" w:lineRule="auto"/>
             </w:pPr>
             <w:r>
               <w:rPr>
                 <w:b/>
                 <w:color w:val="0A1128"/>
-                <w:sz w:val="18"/>
-              </w:rPr>
-              <w:t>M.Sc. in Applied Artificial Intelligence</w:t>
-            </w:r>
-            <w:r>
-              <w:rPr>
-                <w:i/>
-                <w:color w:val="0284C7"/>
-              </w:rPr>
-              <w:t xml:space="preserve">   —   2025 – 2027  [In Progress]</w:t>
-            </w:r>
-          </w:p>
-          <w:p>
-            <w:pPr>
-              <w:spacing w:after="16"/>
-            </w:pPr>
-            <w:r>
-              <w:rPr>
-                <w:b/>
-                <w:color w:val="64748B"/>
-              </w:rPr>
-              <w:t>University of Ngaoundéré</w:t>
-            </w:r>
-          </w:p>
-          <w:p>
-            <w:pPr>
-              <w:spacing w:after="30" w:line="274" w:lineRule="auto"/>
-              <w:ind w:left="144"/>
-            </w:pPr>
-            <w:r>
-              <w:rPr>
-                <w:b/>
-                <w:color w:val="0284C7"/>
-              </w:rPr>
-              <w:t>▸</w:t>
-            </w:r>
-            <w:r>
-              <w:rPr>
-                <w:b/>
-                <w:color w:val="0284C7"/>
-              </w:rPr>
-              <w:t xml:space="preserve">  </w:t>
+              </w:rPr>
+              <w:t xml:space="preserve">◈ Google Africa Applied AI Lab (Accra, 2026): </w:t>
             </w:r>
             <w:r>
               <w:rPr>
                 <w:color w:val="334155"/>
               </w:rPr>
-              <w:t>ML &amp; Bayesian Statistics, Data Engineering &amp; Neo4j, Computer Vision &amp; Robotics, Cybersecurity &amp; Blockchain, Pro</w:t>
+              <w:t xml:space="preserve">Official candidacy — Archi Cam </w:t>
             </w:r>
             <w:r>
               <w:rPr>
                 <w:color w:val="334155"/>
               </w:rPr>
-              <w:t>duction MLOps.</w:t>
-            </w:r>
-          </w:p>
-          <w:p>
-            <w:pPr>
-              <w:spacing w:before="70" w:after="16"/>
-            </w:pPr>
-            <w:r>
-              <w:rPr>
-                <w:b/>
-                <w:color w:val="0A1128"/>
-                <w:sz w:val="18"/>
-              </w:rPr>
-              <w:t>B.Sc. in Civil Engineering (Building Option)</w:t>
-            </w:r>
-            <w:r>
-              <w:rPr>
-                <w:i/>
-                <w:color w:val="0284C7"/>
-              </w:rPr>
-              <w:t xml:space="preserve">   —   2015 – 2016</w:t>
-            </w:r>
-          </w:p>
-          <w:p>
-            <w:pPr>
-              <w:spacing w:after="16"/>
-            </w:pPr>
-            <w:r>
-              <w:rPr>
-                <w:b/>
-                <w:color w:val="64748B"/>
-              </w:rPr>
-              <w:t>ISTDI / IUC Douala</w:t>
-            </w:r>
-          </w:p>
-          <w:p>
-            <w:pPr>
-              <w:spacing w:after="30" w:line="274" w:lineRule="auto"/>
-              <w:ind w:left="144"/>
-            </w:pPr>
-            <w:r>
-              <w:rPr>
-                <w:b/>
-                <w:color w:val="0284C7"/>
-              </w:rPr>
-              <w:t>▸</w:t>
-            </w:r>
-            <w:r>
-              <w:rPr>
-                <w:b/>
-                <w:color w:val="0284C7"/>
-              </w:rPr>
-              <w:t xml:space="preserve">  </w:t>
-            </w:r>
-            <w:r>
-              <w:rPr>
-                <w:color w:val="334155"/>
-              </w:rPr>
-              <w:t>Structural calculations (BAEL 91), quantity surveying, and construction project management.</w:t>
-            </w:r>
-          </w:p>
-          <w:p>
-            <w:pPr>
-              <w:spacing w:before="120" w:after="10"/>
-            </w:pPr>
-            <w:r>
-              <w:rPr>
-                <w:b/>
-                <w:color w:val="0284C7"/>
-                <w:sz w:val="17"/>
-              </w:rPr>
-              <w:t xml:space="preserve">◈  </w:t>
-            </w:r>
-            <w:r>
-              <w:rPr>
-                <w:b/>
-                <w:color w:val="0A1128"/>
-                <w:sz w:val="20"/>
-              </w:rPr>
-              <w:t>HONORS &amp; APPLIED AI RECOGNITIONS</w:t>
-            </w:r>
-          </w:p>
-          <w:p>
-            <w:pPr>
-              <w:spacing w:after="60"/>
-            </w:pPr>
-            <w:r>
-              <w:rPr>
-                <w:color w:val="CBD5E1"/>
-                <w:sz w:val="10"/>
-              </w:rPr>
-              <w:t>────────────────────────────</w:t>
-            </w:r>
-            <w:r>
-              <w:rPr>
-                <w:color w:val="CBD5E1"/>
-                <w:sz w:val="10"/>
-              </w:rPr>
-              <w:t>────────────────────────────────</w:t>
-            </w:r>
-          </w:p>
-          <w:p>
-            <w:pPr>
-              <w:spacing w:after="0" w:line="283" w:lineRule="auto"/>
-            </w:pPr>
-            <w:r>
-              <w:rPr>
-                <w:b/>
-                <w:color w:val="0A1128"/>
-              </w:rPr>
-              <w:t xml:space="preserve">◈ Google Africa Applied AI Lab (Accra, 2026): </w:t>
-            </w:r>
-            <w:r>
-              <w:rPr>
-                <w:color w:val="334155"/>
-              </w:rPr>
-              <w:t>Official candidacy — Archi Cam AI platform.</w:t>
+              <w:t>AI platform.</w:t>
             </w:r>
             <w:r>
               <w:rPr>
@@ -14205,7 +14222,7 @@
 </file>
 
 <file path=customXml/itemProps1.xml><?xml version="1.0" encoding="utf-8"?>
-<ds:datastoreItem xmlns:ds="http://schemas.openxmlformats.org/officeDocument/2006/customXml" ds:itemID="{C2E89B4A-47C8-4CE4-AEAF-960F31CA28D5}">
+<ds:datastoreItem xmlns:ds="http://schemas.openxmlformats.org/officeDocument/2006/customXml" ds:itemID="{5B00DEF4-6F82-4488-98C9-B6D2D6A4DBC6}">
   <ds:schemaRefs>
     <ds:schemaRef ds:uri="http://schemas.openxmlformats.org/officeDocument/2006/bibliography"/>
   </ds:schemaRefs>

</xml_diff>

<commit_message>
cv: 21pt executive name, dual-tone blue dividers, verified single-page layout
</commit_message>
<xml_diff>
--- a/KOA_MARIE_GERVAIS_NELLY_CV_EN.docx
+++ b/KOA_MARIE_GERVAIS_NELLY_CV_EN.docx
@@ -790,7 +790,7 @@
               <w:rPr>
                 <w:b/>
                 <w:color w:val="0A1128"/>
-                <w:sz w:val="38"/>
+                <w:sz w:val="42"/>
               </w:rPr>
               <w:t>KOA MARIE GERVAIS NELLY</w:t>
             </w:r>
@@ -855,10 +855,17 @@
             </w:pPr>
             <w:r>
               <w:rPr>
-                <w:color w:val="CBD5E1"/>
-                <w:sz w:val="10"/>
-              </w:rPr>
-              <w:t>────────────────────────────────────────────────────────────</w:t>
+                <w:color w:val="0284C7"/>
+                <w:sz w:val="9"/>
+              </w:rPr>
+              <w:t>━━━━━━━━━━━━━━━━━━</w:t>
+            </w:r>
+            <w:r>
+              <w:rPr>
+                <w:color w:val="38BDF8"/>
+                <w:sz w:val="9"/>
+              </w:rPr>
+              <w:t>────────────────────────────────────────────</w:t>
             </w:r>
           </w:p>
           <w:p>
@@ -869,19 +876,19 @@
               <w:rPr>
                 <w:color w:val="334155"/>
               </w:rPr>
-              <w:t>Lead AI Engineer &amp; Data Architect (Google Developer Program Member), leveraging Google Antigravity to design neuro-symbolic autonomous multi-agent architectures, Neo4j GraphRAG, and sovereign</w:t>
+              <w:t xml:space="preserve">Lead AI Engineer &amp; Data Architect (Google Developer Program Member), leveraging Google Antigravity to design neuro-symbolic autonomous multi-agent architectures, Neo4j GraphRAG, and </w:t>
             </w:r>
             <w:r>
               <w:rPr>
                 <w:color w:val="334155"/>
               </w:rPr>
-              <w:t xml:space="preserve"> MLOps. Expert in AI ethics (transparency, SHAP explainability, EU AI Act compliance, and deterministic hallucination-free models). Founder of Archi Cam AI (official applicant for Google Africa Applied AI Lab), bridging civil engineering methodology, math </w:t>
+              <w:t>sovereign MLOps. Expert in AI ethics (transparency, SHAP explainability, EU AI Act compliance, and deterministic hallucination-free models). Founder of Archi Cam AI (official applicant for Google Africa Applied AI Lab), bridging civil engineering methodolo</w:t>
             </w:r>
             <w:r>
               <w:rPr>
                 <w:color w:val="334155"/>
               </w:rPr>
-              <w:t>rigor, and product vision.</w:t>
+              <w:t>gy, math rigor, and product vision.</w:t>
             </w:r>
           </w:p>
           <w:p>
@@ -911,10 +918,17 @@
             </w:pPr>
             <w:r>
               <w:rPr>
-                <w:color w:val="CBD5E1"/>
-                <w:sz w:val="10"/>
-              </w:rPr>
-              <w:t>────────────────────────────────────────────────────────────</w:t>
+                <w:color w:val="0284C7"/>
+                <w:sz w:val="9"/>
+              </w:rPr>
+              <w:t>━━━━━━━━━━━━━━━━━━</w:t>
+            </w:r>
+            <w:r>
+              <w:rPr>
+                <w:color w:val="38BDF8"/>
+                <w:sz w:val="9"/>
+              </w:rPr>
+              <w:t>────────────────────────────────────────────</w:t>
             </w:r>
           </w:p>
           <w:p>
@@ -939,7 +953,7 @@
           </w:p>
           <w:p>
             <w:pPr>
-              <w:spacing w:after="28" w:line="269" w:lineRule="auto"/>
+              <w:spacing w:after="26" w:line="269" w:lineRule="auto"/>
               <w:ind w:left="144"/>
             </w:pPr>
             <w:r>
@@ -960,18 +974,18 @@
               <w:rPr>
                 <w:color w:val="334155"/>
               </w:rPr>
-              <w:t>Official Applicant Google Africa Applied AI Lab. Built with Google Antigravity (Gemma 4 12B, Gemi</w:t>
+              <w:t xml:space="preserve">Official Applicant Google Africa Applied AI Lab. Built with Google Antigravity (Gemma </w:t>
             </w:r>
             <w:r>
               <w:rPr>
                 <w:color w:val="334155"/>
               </w:rPr>
-              <w:t>ni, BAEL 91).</w:t>
+              <w:t>4 12B, Gemini, BAEL 91).</w:t>
             </w:r>
           </w:p>
           <w:p>
             <w:pPr>
-              <w:spacing w:after="28" w:line="269" w:lineRule="auto"/>
+              <w:spacing w:after="26" w:line="269" w:lineRule="auto"/>
               <w:ind w:left="144"/>
             </w:pPr>
             <w:r>
@@ -1017,7 +1031,7 @@
           </w:p>
           <w:p>
             <w:pPr>
-              <w:spacing w:after="28" w:line="269" w:lineRule="auto"/>
+              <w:spacing w:after="26" w:line="269" w:lineRule="auto"/>
               <w:ind w:left="144"/>
             </w:pPr>
             <w:r>
@@ -1038,18 +1052,18 @@
               <w:rPr>
                 <w:color w:val="334155"/>
               </w:rPr>
-              <w:t>Sovereign DMI system (Univ. of Ngaoundéré): 470 t</w:t>
+              <w:t xml:space="preserve">Sovereign DMI system (Univ. of </w:t>
             </w:r>
             <w:r>
               <w:rPr>
                 <w:color w:val="334155"/>
               </w:rPr>
-              <w:t>heses, 19 M1 projects, 1,366 Neo4j nodes.</w:t>
+              <w:t>Ngaoundéré): 470 theses, 19 M1 projects, 1,366 Neo4j nodes.</w:t>
             </w:r>
           </w:p>
           <w:p>
             <w:pPr>
-              <w:spacing w:after="28" w:line="269" w:lineRule="auto"/>
+              <w:spacing w:after="26" w:line="269" w:lineRule="auto"/>
               <w:ind w:left="144"/>
             </w:pPr>
             <w:r>
@@ -1090,12 +1104,19 @@
                 <w:i/>
                 <w:color w:val="0284C7"/>
               </w:rPr>
-              <w:t xml:space="preserve">   —   Enterprise Security &amp; Agentic BI</w:t>
+              <w:t xml:space="preserve">   —   Enterprise Security &amp; Agentic B</w:t>
+            </w:r>
+            <w:r>
+              <w:rPr>
+                <w:i/>
+                <w:color w:val="0284C7"/>
+              </w:rPr>
+              <w:t>I</w:t>
             </w:r>
           </w:p>
           <w:p>
             <w:pPr>
-              <w:spacing w:after="28" w:line="269" w:lineRule="auto"/>
+              <w:spacing w:after="26" w:line="269" w:lineRule="auto"/>
               <w:ind w:left="144"/>
             </w:pPr>
             <w:r>
@@ -1141,7 +1162,7 @@
           </w:p>
           <w:p>
             <w:pPr>
-              <w:spacing w:after="28" w:line="269" w:lineRule="auto"/>
+              <w:spacing w:after="26" w:line="269" w:lineRule="auto"/>
               <w:ind w:left="144"/>
             </w:pPr>
             <w:r>
@@ -1162,18 +1183,18 @@
               <w:rPr>
                 <w:color w:val="334155"/>
               </w:rPr>
-              <w:t>Dataset Automator: Google Antigravity (Google Cloud Hackathon) — TabFM, B</w:t>
+              <w:t>Dataset Automator: Google Antigravity (Google Cloud Hackathon) — Tab</w:t>
             </w:r>
             <w:r>
               <w:rPr>
                 <w:color w:val="334155"/>
               </w:rPr>
-              <w:t>igQuery DataFrames, EU AI Act.</w:t>
+              <w:t>FM, BigQuery DataFrames, EU AI Act.</w:t>
             </w:r>
           </w:p>
           <w:p>
             <w:pPr>
-              <w:spacing w:after="28" w:line="269" w:lineRule="auto"/>
+              <w:spacing w:after="26" w:line="269" w:lineRule="auto"/>
               <w:ind w:left="144"/>
             </w:pPr>
             <w:r>
@@ -1224,10 +1245,17 @@
             </w:pPr>
             <w:r>
               <w:rPr>
-                <w:color w:val="CBD5E1"/>
-                <w:sz w:val="10"/>
-              </w:rPr>
-              <w:t>────────────────────────────────────────────────────────────</w:t>
+                <w:color w:val="0284C7"/>
+                <w:sz w:val="9"/>
+              </w:rPr>
+              <w:t>━━━━━━━━━━━━━━━━━━</w:t>
+            </w:r>
+            <w:r>
+              <w:rPr>
+                <w:color w:val="38BDF8"/>
+                <w:sz w:val="9"/>
+              </w:rPr>
+              <w:t>────────────────────────────────────────────</w:t>
             </w:r>
           </w:p>
           <w:p>
@@ -1247,14 +1275,14 @@
                 <w:i/>
                 <w:color w:val="0284C7"/>
               </w:rPr>
-              <w:t xml:space="preserve">   —   2025 – </w:t>
+              <w:t xml:space="preserve">   —   </w:t>
             </w:r>
             <w:r>
               <w:rPr>
                 <w:i/>
                 <w:color w:val="0284C7"/>
               </w:rPr>
-              <w:t>Present</w:t>
+              <w:t>2025 – Present</w:t>
             </w:r>
           </w:p>
           <w:p>
@@ -1271,7 +1299,7 @@
           </w:p>
           <w:p>
             <w:pPr>
-              <w:spacing w:after="28" w:line="269" w:lineRule="auto"/>
+              <w:spacing w:after="26" w:line="269" w:lineRule="auto"/>
               <w:ind w:left="144"/>
             </w:pPr>
             <w:r>
@@ -1324,19 +1352,19 @@
                 <w:b/>
                 <w:color w:val="64748B"/>
               </w:rPr>
-              <w:t xml:space="preserve">CCAA (Cameroon Civil Aviation </w:t>
+              <w:t>CCAA (Cameroon Civil Aviation</w:t>
             </w:r>
             <w:r>
               <w:rPr>
                 <w:b/>
                 <w:color w:val="64748B"/>
               </w:rPr>
-              <w:t>Authority)</w:t>
+              <w:t xml:space="preserve"> Authority)</w:t>
             </w:r>
           </w:p>
           <w:p>
             <w:pPr>
-              <w:spacing w:after="28" w:line="269" w:lineRule="auto"/>
+              <w:spacing w:after="26" w:line="269" w:lineRule="auto"/>
               <w:ind w:left="144"/>
             </w:pPr>
             <w:r>
@@ -1387,10 +1415,17 @@
             </w:pPr>
             <w:r>
               <w:rPr>
-                <w:color w:val="CBD5E1"/>
-                <w:sz w:val="10"/>
-              </w:rPr>
-              <w:t>────────────────────────────────────────────────────────────</w:t>
+                <w:color w:val="0284C7"/>
+                <w:sz w:val="9"/>
+              </w:rPr>
+              <w:t>━━━━━━━━━━━━━━━━━━</w:t>
+            </w:r>
+            <w:r>
+              <w:rPr>
+                <w:color w:val="38BDF8"/>
+                <w:sz w:val="9"/>
+              </w:rPr>
+              <w:t>────────────────────────────────────────────</w:t>
             </w:r>
           </w:p>
           <w:p>
@@ -1410,14 +1445,14 @@
                 <w:i/>
                 <w:color w:val="0284C7"/>
               </w:rPr>
-              <w:t xml:space="preserve">   —   2025 – 2027  [In</w:t>
+              <w:t xml:space="preserve">   —   2025 – 2027  </w:t>
             </w:r>
             <w:r>
               <w:rPr>
                 <w:i/>
                 <w:color w:val="0284C7"/>
               </w:rPr>
-              <w:t xml:space="preserve"> Progress]</w:t>
+              <w:t>[In Progress]</w:t>
             </w:r>
           </w:p>
           <w:p>
@@ -1434,7 +1469,7 @@
           </w:p>
           <w:p>
             <w:pPr>
-              <w:spacing w:after="28" w:line="269" w:lineRule="auto"/>
+              <w:spacing w:after="26" w:line="269" w:lineRule="auto"/>
               <w:ind w:left="144"/>
             </w:pPr>
             <w:r>
@@ -1492,7 +1527,7 @@
           </w:p>
           <w:p>
             <w:pPr>
-              <w:spacing w:after="28" w:line="269" w:lineRule="auto"/>
+              <w:spacing w:after="26" w:line="269" w:lineRule="auto"/>
               <w:ind w:left="144"/>
             </w:pPr>
             <w:r>
@@ -1513,13 +1548,13 @@
               <w:rPr>
                 <w:color w:val="334155"/>
               </w:rPr>
-              <w:t>Structural</w:t>
+              <w:t>Structu</w:t>
             </w:r>
             <w:r>
               <w:rPr>
                 <w:color w:val="334155"/>
               </w:rPr>
-              <w:t xml:space="preserve"> calculations (BAEL 91), quantity surveying, and construction project management.</w:t>
+              <w:t>ral calculations (BAEL 91), quantity surveying, and construction project management.</w:t>
             </w:r>
           </w:p>
           <w:p>
@@ -1549,15 +1584,22 @@
             </w:pPr>
             <w:r>
               <w:rPr>
-                <w:color w:val="CBD5E1"/>
-                <w:sz w:val="10"/>
-              </w:rPr>
-              <w:t>────────────────────────────────────────────────────────────</w:t>
+                <w:color w:val="0284C7"/>
+                <w:sz w:val="9"/>
+              </w:rPr>
+              <w:t>━━━━━━━━━━━━━━━━━━</w:t>
+            </w:r>
+            <w:r>
+              <w:rPr>
+                <w:color w:val="38BDF8"/>
+                <w:sz w:val="9"/>
+              </w:rPr>
+              <w:t>────────────────────────────────────────────</w:t>
             </w:r>
           </w:p>
           <w:p>
             <w:pPr>
-              <w:spacing w:after="0" w:line="278" w:lineRule="auto"/>
+              <w:spacing w:after="0" w:line="269" w:lineRule="auto"/>
             </w:pPr>
             <w:r>
               <w:rPr>
@@ -1570,13 +1612,13 @@
               <w:rPr>
                 <w:color w:val="334155"/>
               </w:rPr>
-              <w:t xml:space="preserve">Official candidacy — Archi Cam </w:t>
+              <w:t>Official candidacy — Archi</w:t>
             </w:r>
             <w:r>
               <w:rPr>
                 <w:color w:val="334155"/>
               </w:rPr>
-              <w:t>AI platform.</w:t>
+              <w:t xml:space="preserve"> Cam AI platform.</w:t>
             </w:r>
             <w:r>
               <w:rPr>
@@ -14222,7 +14264,7 @@
 </file>
 
 <file path=customXml/itemProps1.xml><?xml version="1.0" encoding="utf-8"?>
-<ds:datastoreItem xmlns:ds="http://schemas.openxmlformats.org/officeDocument/2006/customXml" ds:itemID="{5B00DEF4-6F82-4488-98C9-B6D2D6A4DBC6}">
+<ds:datastoreItem xmlns:ds="http://schemas.openxmlformats.org/officeDocument/2006/customXml" ds:itemID="{4833E79E-A202-4D1A-A9BE-F8AEC2FB4DFB}">
   <ds:schemaRefs>
     <ds:schemaRef ds:uri="http://schemas.openxmlformats.org/officeDocument/2006/bibliography"/>
   </ds:schemaRefs>

</xml_diff>

<commit_message>
cv: premium photo frame, enriched content fills right-side white space, 3rd bullet per project, richer experience & honors sections
</commit_message>
<xml_diff>
--- a/KOA_MARIE_GERVAIS_NELLY_CV_EN.docx
+++ b/KOA_MARIE_GERVAIS_NELLY_CV_EN.docx
@@ -46,67 +46,123 @@
               <w:tc>
                 <w:tcPr>
                   <w:tcW w:w="3744" w:type="dxa"/>
-                  <w:shd w:val="clear" w:color="auto" w:fill="1E3A5F"/>
+                  <w:shd w:val="clear" w:color="auto" w:fill="0284C7"/>
                   <w:tcMar>
-                    <w:top w:w="14" w:type="dxa"/>
-                    <w:left w:w="14" w:type="dxa"/>
-                    <w:bottom w:w="14" w:type="dxa"/>
-                    <w:right w:w="14" w:type="dxa"/>
+                    <w:top w:w="8" w:type="dxa"/>
+                    <w:left w:w="8" w:type="dxa"/>
+                    <w:bottom w:w="8" w:type="dxa"/>
+                    <w:right w:w="8" w:type="dxa"/>
                   </w:tcMar>
                 </w:tcPr>
-                <w:p>
-                  <w:pPr>
-                    <w:spacing w:after="0"/>
+                <w:p/>
+                <w:tbl>
+                  <w:tblPr>
+                    <w:tblW w:w="0" w:type="auto"/>
                     <w:jc w:val="center"/>
-                  </w:pPr>
-                  <w:r>
-                    <w:rPr>
-                      <w:noProof/>
-                      <w:lang w:val="fr-FR" w:eastAsia="fr-FR"/>
-                    </w:rPr>
-                    <w:drawing>
-                      <wp:inline distT="0" distB="0" distL="0" distR="0">
-                        <wp:extent cx="1371600" cy="1371600"/>
-                        <wp:effectExtent l="0" t="0" r="0" b="0"/>
-                        <wp:docPr id="1" name="Picture 1"/>
-                        <wp:cNvGraphicFramePr>
-                          <a:graphicFrameLocks xmlns:a="http://schemas.openxmlformats.org/drawingml/2006/main" noChangeAspect="1"/>
-                        </wp:cNvGraphicFramePr>
-                        <a:graphic xmlns:a="http://schemas.openxmlformats.org/drawingml/2006/main">
-                          <a:graphicData uri="http://schemas.openxmlformats.org/drawingml/2006/picture">
-                            <pic:pic xmlns:pic="http://schemas.openxmlformats.org/drawingml/2006/picture">
-                              <pic:nvPicPr>
-                                <pic:cNvPr id="0" name="profile_headshot_circular.jpeg"/>
-                                <pic:cNvPicPr/>
-                              </pic:nvPicPr>
-                              <pic:blipFill>
-                                <a:blip r:embed="rId6"/>
-                                <a:stretch>
-                                  <a:fillRect/>
-                                </a:stretch>
-                              </pic:blipFill>
-                              <pic:spPr>
-                                <a:xfrm>
-                                  <a:off x="0" y="0"/>
-                                  <a:ext cx="1371600" cy="1371600"/>
-                                </a:xfrm>
-                                <a:prstGeom prst="rect">
-                                  <a:avLst/>
-                                </a:prstGeom>
-                              </pic:spPr>
-                            </pic:pic>
-                          </a:graphicData>
-                        </a:graphic>
-                      </wp:inline>
-                    </w:drawing>
-                  </w:r>
-                </w:p>
+                    <w:tblLook w:val="04A0" w:firstRow="1" w:lastRow="0" w:firstColumn="1" w:lastColumn="0" w:noHBand="0" w:noVBand="1"/>
+                  </w:tblPr>
+                  <w:tblGrid>
+                    <w:gridCol w:w="2728"/>
+                  </w:tblGrid>
+                  <w:tr>
+                    <w:trPr>
+                      <w:jc w:val="center"/>
+                    </w:trPr>
+                    <w:tc>
+                      <w:tcPr>
+                        <w:tcW w:w="3744" w:type="dxa"/>
+                        <w:shd w:val="clear" w:color="auto" w:fill="0F172A"/>
+                        <w:tcMar>
+                          <w:top w:w="4" w:type="dxa"/>
+                          <w:left w:w="4" w:type="dxa"/>
+                          <w:bottom w:w="4" w:type="dxa"/>
+                          <w:right w:w="4" w:type="dxa"/>
+                        </w:tcMar>
+                      </w:tcPr>
+                      <w:p>
+                        <w:pPr>
+                          <w:spacing w:after="0"/>
+                          <w:jc w:val="center"/>
+                        </w:pPr>
+                        <w:r>
+                          <w:rPr>
+                            <w:noProof/>
+                            <w:lang w:val="fr-FR" w:eastAsia="fr-FR"/>
+                          </w:rPr>
+                          <w:drawing>
+                            <wp:inline distT="0" distB="0" distL="0" distR="0">
+                              <wp:extent cx="1316736" cy="1316736"/>
+                              <wp:effectExtent l="0" t="0" r="0" b="0"/>
+                              <wp:docPr id="1" name="Picture 1"/>
+                              <wp:cNvGraphicFramePr>
+                                <a:graphicFrameLocks xmlns:a="http://schemas.openxmlformats.org/drawingml/2006/main" noChangeAspect="1"/>
+                              </wp:cNvGraphicFramePr>
+                              <a:graphic xmlns:a="http://schemas.openxmlformats.org/drawingml/2006/main">
+                                <a:graphicData uri="http://schemas.openxmlformats.org/drawingml/2006/picture">
+                                  <pic:pic xmlns:pic="http://schemas.openxmlformats.org/drawingml/2006/picture">
+                                    <pic:nvPicPr>
+                                      <pic:cNvPr id="0" name="profile_headshot_circular.jpeg"/>
+                                      <pic:cNvPicPr/>
+                                    </pic:nvPicPr>
+                                    <pic:blipFill>
+                                      <a:blip r:embed="rId6"/>
+                                      <a:stretch>
+                                        <a:fillRect/>
+                                      </a:stretch>
+                                    </pic:blipFill>
+                                    <pic:spPr>
+                                      <a:xfrm>
+                                        <a:off x="0" y="0"/>
+                                        <a:ext cx="1316736" cy="1316736"/>
+                                      </a:xfrm>
+                                      <a:prstGeom prst="rect">
+                                        <a:avLst/>
+                                      </a:prstGeom>
+                                    </pic:spPr>
+                                  </pic:pic>
+                                </a:graphicData>
+                              </a:graphic>
+                            </wp:inline>
+                          </w:drawing>
+                        </w:r>
+                      </w:p>
+                    </w:tc>
+                  </w:tr>
+                </w:tbl>
+                <w:p/>
               </w:tc>
             </w:tr>
           </w:tbl>
           <w:p/>
           <w:p>
             <w:pPr>
+              <w:spacing w:before="80" w:after="20"/>
+              <w:jc w:val="center"/>
+            </w:pPr>
+            <w:r>
+              <w:rPr>
+                <w:b/>
+                <w:color w:val="38BDF8"/>
+                <w:sz w:val="14"/>
+              </w:rPr>
+              <w:t>◈  LEAD AI ENGINEER</w:t>
+            </w:r>
+          </w:p>
+          <w:p>
+            <w:pPr>
+              <w:spacing w:after="40"/>
+              <w:jc w:val="center"/>
+            </w:pPr>
+            <w:r>
+              <w:rPr>
+                <w:color w:val="64748B"/>
+                <w:sz w:val="13"/>
+              </w:rPr>
+              <w:t>Founder  ·  Archi Cam AI</w:t>
+            </w:r>
+          </w:p>
+          <w:p>
+            <w:pPr>
               <w:spacing w:before="110" w:after="0"/>
             </w:pPr>
             <w:r>
@@ -355,7 +411,14 @@
                 <w:color w:val="F8FAFC"/>
                 <w:sz w:val="15"/>
               </w:rPr>
-              <w:t>Firebase Genkit         ■ ■ ■ ■ ■</w:t>
+              <w:t xml:space="preserve">Firebase Genkit      </w:t>
+            </w:r>
+            <w:r>
+              <w:rPr>
+                <w:color w:val="F8FAFC"/>
+                <w:sz w:val="15"/>
+              </w:rPr>
+              <w:t xml:space="preserve">   ■ ■ ■ ■ ■</w:t>
             </w:r>
           </w:p>
           <w:p>
@@ -379,14 +442,7 @@
                 <w:b/>
                 <w:color w:val="38BDF8"/>
               </w:rPr>
-              <w:t xml:space="preserve">DATA </w:t>
-            </w:r>
-            <w:r>
-              <w:rPr>
-                <w:b/>
-                <w:color w:val="38BDF8"/>
-              </w:rPr>
-              <w:t>&amp; GRAPHS</w:t>
+              <w:t>DATA &amp; GRAPHS</w:t>
             </w:r>
           </w:p>
           <w:p>
@@ -494,14 +550,7 @@
                 <w:color w:val="F8FAFC"/>
                 <w:sz w:val="15"/>
               </w:rPr>
-              <w:t xml:space="preserve">Python 3.11+ / MLOps   </w:t>
-            </w:r>
-            <w:r>
-              <w:rPr>
-                <w:color w:val="F8FAFC"/>
-                <w:sz w:val="15"/>
-              </w:rPr>
-              <w:t xml:space="preserve"> ■ ■ ■ ■ ■</w:t>
+              <w:t>Python 3.11+ / MLOps    ■ ■ ■ ■ ■</w:t>
             </w:r>
           </w:p>
           <w:p>
@@ -585,7 +634,14 @@
                 <w:color w:val="0284C7"/>
                 <w:sz w:val="10"/>
               </w:rPr>
-              <w:t>━━━━━━━━━━━━━━━━━━━━</w:t>
+              <w:t>━━━━━━</w:t>
+            </w:r>
+            <w:r>
+              <w:rPr>
+                <w:color w:val="0284C7"/>
+                <w:sz w:val="10"/>
+              </w:rPr>
+              <w:t>━━━━━━━━━━━━━━</w:t>
             </w:r>
           </w:p>
           <w:p>
@@ -597,14 +653,7 @@
                 <w:color w:val="F8FAFC"/>
                 <w:sz w:val="15"/>
               </w:rPr>
-              <w:t>◈ AI Ethics &amp; Anti-Hallucinat</w:t>
-            </w:r>
-            <w:r>
-              <w:rPr>
-                <w:color w:val="F8FAFC"/>
-                <w:sz w:val="15"/>
-              </w:rPr>
-              <w:t>ion</w:t>
+              <w:t>◈ AI Ethics &amp; Anti-Hallucination</w:t>
             </w:r>
           </w:p>
           <w:p>
@@ -736,14 +785,7 @@
                 <w:color w:val="F8FAFC"/>
                 <w:sz w:val="15"/>
               </w:rPr>
-              <w:t xml:space="preserve">◈ Dual Competence: AI &amp; </w:t>
-            </w:r>
-            <w:r>
-              <w:rPr>
-                <w:color w:val="F8FAFC"/>
-                <w:sz w:val="15"/>
-              </w:rPr>
-              <w:t>Civil Eng.</w:t>
+              <w:t>◈ Dual Competence: AI &amp; Civil Eng.</w:t>
             </w:r>
           </w:p>
           <w:p>
@@ -822,7 +864,7 @@
           </w:p>
           <w:p>
             <w:pPr>
-              <w:spacing w:before="110" w:after="10"/>
+              <w:spacing w:before="100" w:after="10"/>
             </w:pPr>
             <w:r>
               <w:rPr>
@@ -838,15 +880,7 @@
                 <w:color w:val="0A1128"/>
                 <w:sz w:val="20"/>
               </w:rPr>
-              <w:t>EXECUTIVE SUMM</w:t>
-            </w:r>
-            <w:r>
-              <w:rPr>
-                <w:b/>
-                <w:color w:val="0A1128"/>
-                <w:sz w:val="20"/>
-              </w:rPr>
-              <w:t>ARY</w:t>
+              <w:t>EXECUTIVE SUMMARY</w:t>
             </w:r>
           </w:p>
           <w:p>
@@ -876,24 +910,24 @@
               <w:rPr>
                 <w:color w:val="334155"/>
               </w:rPr>
-              <w:t xml:space="preserve">Lead AI Engineer &amp; Data Architect (Google Developer Program Member), leveraging Google Antigravity to design neuro-symbolic autonomous multi-agent architectures, Neo4j GraphRAG, and </w:t>
+              <w:t>Lead AI Engineer &amp; Data Architect (Google Developer Program Member), leveraging Google Antigravity to</w:t>
             </w:r>
             <w:r>
               <w:rPr>
                 <w:color w:val="334155"/>
               </w:rPr>
-              <w:t>sovereign MLOps. Expert in AI ethics (transparency, SHAP explainability, EU AI Act compliance, and deterministic hallucination-free models). Founder of Archi Cam AI (official applicant for Google Africa Applied AI Lab), bridging civil engineering methodolo</w:t>
+              <w:t xml:space="preserve"> design neuro-symbolic autonomous multi-agent architectures, Neo4j GraphRAG, and sovereign MLOps pipelines. Expert in AI ethics (transparency, SHAP explainability, EU AI Act compliance, deterministic zero-hallucination models). Founder of Archi Cam AI (off</w:t>
             </w:r>
             <w:r>
               <w:rPr>
                 <w:color w:val="334155"/>
               </w:rPr>
-              <w:t>gy, math rigor, and product vision.</w:t>
+              <w:t>icial Google Africa Applied AI Lab applicant 2026), bridging civil engineering methodology, mathematical rigor, and bold product vision.</w:t>
             </w:r>
           </w:p>
           <w:p>
             <w:pPr>
-              <w:spacing w:before="110" w:after="10"/>
+              <w:spacing w:before="100" w:after="10"/>
             </w:pPr>
             <w:r>
               <w:rPr>
@@ -933,7 +967,7 @@
           </w:p>
           <w:p>
             <w:pPr>
-              <w:spacing w:before="70" w:after="12"/>
+              <w:spacing w:before="64" w:after="10"/>
             </w:pPr>
             <w:r>
               <w:rPr>
@@ -947,19 +981,29 @@
               <w:rPr>
                 <w:i/>
                 <w:color w:val="0284C7"/>
-              </w:rPr>
-              <w:t xml:space="preserve">   —   Agentic AI SaaS &amp; 5D BIM</w:t>
+                <w:sz w:val="15"/>
+              </w:rPr>
+              <w:t xml:space="preserve">   —   Agentic AI Sa</w:t>
+            </w:r>
+            <w:r>
+              <w:rPr>
+                <w:i/>
+                <w:color w:val="0284C7"/>
+                <w:sz w:val="15"/>
+              </w:rPr>
+              <w:t>aS &amp; 5D BIM</w:t>
             </w:r>
           </w:p>
           <w:p>
             <w:pPr>
-              <w:spacing w:after="26" w:line="269" w:lineRule="auto"/>
+              <w:spacing w:after="24" w:line="269" w:lineRule="auto"/>
               <w:ind w:left="144"/>
             </w:pPr>
             <w:r>
               <w:rPr>
                 <w:b/>
                 <w:color w:val="0284C7"/>
+                <w:sz w:val="15"/>
               </w:rPr>
               <w:t>▸</w:t>
             </w:r>
@@ -967,31 +1011,28 @@
               <w:rPr>
                 <w:b/>
                 <w:color w:val="0284C7"/>
+                <w:sz w:val="15"/>
               </w:rPr>
               <w:t xml:space="preserve">  </w:t>
             </w:r>
             <w:r>
               <w:rPr>
                 <w:color w:val="334155"/>
-              </w:rPr>
-              <w:t xml:space="preserve">Official Applicant Google Africa Applied AI Lab. Built with Google Antigravity (Gemma </w:t>
-            </w:r>
-            <w:r>
-              <w:rPr>
-                <w:color w:val="334155"/>
-              </w:rPr>
-              <w:t>4 12B, Gemini, BAEL 91).</w:t>
+                <w:sz w:val="15"/>
+              </w:rPr>
+              <w:t>Official Applicant Google Africa Applied AI Lab. Built with Google Antigravity (Gemma 4 12B, Gemini 2.5, BAEL 91).</w:t>
             </w:r>
           </w:p>
           <w:p>
             <w:pPr>
-              <w:spacing w:after="26" w:line="269" w:lineRule="auto"/>
+              <w:spacing w:after="24" w:line="269" w:lineRule="auto"/>
               <w:ind w:left="144"/>
             </w:pPr>
             <w:r>
               <w:rPr>
                 <w:b/>
                 <w:color w:val="0284C7"/>
+                <w:sz w:val="15"/>
               </w:rPr>
               <w:t>▸</w:t>
             </w:r>
@@ -999,19 +1040,57 @@
               <w:rPr>
                 <w:b/>
                 <w:color w:val="0284C7"/>
+                <w:sz w:val="15"/>
               </w:rPr>
               <w:t xml:space="preserve">  </w:t>
             </w:r>
             <w:r>
               <w:rPr>
                 <w:color w:val="334155"/>
+                <w:sz w:val="15"/>
               </w:rPr>
               <w:t>Automated Excel BOQs in &lt;45s (–99.2% time, MLflow R²=0.9872) and 3D renders via Imagen 3 + ControlNet.</w:t>
             </w:r>
           </w:p>
           <w:p>
             <w:pPr>
-              <w:spacing w:before="70" w:after="12"/>
+              <w:spacing w:after="24" w:line="269" w:lineRule="auto"/>
+              <w:ind w:left="144"/>
+            </w:pPr>
+            <w:r>
+              <w:rPr>
+                <w:b/>
+                <w:color w:val="0284C7"/>
+                <w:sz w:val="15"/>
+              </w:rPr>
+              <w:t>▸</w:t>
+            </w:r>
+            <w:r>
+              <w:rPr>
+                <w:b/>
+                <w:color w:val="0284C7"/>
+                <w:sz w:val="15"/>
+              </w:rPr>
+              <w:t xml:space="preserve">  </w:t>
+            </w:r>
+            <w:r>
+              <w:rPr>
+                <w:color w:val="334155"/>
+                <w:sz w:val="15"/>
+              </w:rPr>
+              <w:t xml:space="preserve">IfcOpenShell </w:t>
+            </w:r>
+            <w:r>
+              <w:rPr>
+                <w:color w:val="334155"/>
+                <w:sz w:val="15"/>
+              </w:rPr>
+              <w:t>integration for 5D BIM models: costs + schedules automated via LangGraph agents.</w:t>
+            </w:r>
+          </w:p>
+          <w:p>
+            <w:pPr>
+              <w:spacing w:before="64" w:after="10"/>
             </w:pPr>
             <w:r>
               <w:rPr>
@@ -1025,19 +1104,21 @@
               <w:rPr>
                 <w:i/>
                 <w:color w:val="0284C7"/>
+                <w:sz w:val="15"/>
               </w:rPr>
               <w:t xml:space="preserve">   —   Sovereign Multi-Agent AI, WikiSkills &amp; OKF Certification</w:t>
             </w:r>
           </w:p>
           <w:p>
             <w:pPr>
-              <w:spacing w:after="26" w:line="269" w:lineRule="auto"/>
+              <w:spacing w:after="24" w:line="269" w:lineRule="auto"/>
               <w:ind w:left="144"/>
             </w:pPr>
             <w:r>
               <w:rPr>
                 <w:b/>
                 <w:color w:val="0284C7"/>
+                <w:sz w:val="15"/>
               </w:rPr>
               <w:t>▸</w:t>
             </w:r>
@@ -1045,31 +1126,35 @@
               <w:rPr>
                 <w:b/>
                 <w:color w:val="0284C7"/>
+                <w:sz w:val="15"/>
               </w:rPr>
               <w:t xml:space="preserve">  </w:t>
             </w:r>
             <w:r>
               <w:rPr>
                 <w:color w:val="334155"/>
-              </w:rPr>
-              <w:t xml:space="preserve">Sovereign DMI system (Univ. of </w:t>
+                <w:sz w:val="15"/>
+              </w:rPr>
+              <w:t>Sovereign DMI system (Univ. of Ngaoundéré): 470 theses, 19 M1 projects, 1,366 Neo4j node</w:t>
             </w:r>
             <w:r>
               <w:rPr>
                 <w:color w:val="334155"/>
-              </w:rPr>
-              <w:t>Ngaoundéré): 470 theses, 19 M1 projects, 1,366 Neo4j nodes.</w:t>
+                <w:sz w:val="15"/>
+              </w:rPr>
+              <w:t>s.</w:t>
             </w:r>
           </w:p>
           <w:p>
             <w:pPr>
-              <w:spacing w:after="26" w:line="269" w:lineRule="auto"/>
+              <w:spacing w:after="24" w:line="269" w:lineRule="auto"/>
               <w:ind w:left="144"/>
             </w:pPr>
             <w:r>
               <w:rPr>
                 <w:b/>
                 <w:color w:val="0284C7"/>
+                <w:sz w:val="15"/>
               </w:rPr>
               <w:t>▸</w:t>
             </w:r>
@@ -1077,19 +1162,21 @@
               <w:rPr>
                 <w:b/>
                 <w:color w:val="0284C7"/>
+                <w:sz w:val="15"/>
               </w:rPr>
               <w:t xml:space="preserve">  </w:t>
             </w:r>
             <w:r>
               <w:rPr>
                 <w:color w:val="334155"/>
-              </w:rPr>
-              <w:t>6 LangGraph agents orchestrated via WikiSkills (skills: critic anti-hallucination, Cypher optimizer), RRF k=60, SHA-256 No-LLM (100%).</w:t>
+                <w:sz w:val="15"/>
+              </w:rPr>
+              <w:t>6 LangGraph agents orchestrated via WikiSkills (critic anti-hallucination, Cypher optimizer), RRF k=60, SHA-256 No-LLM (100%).</w:t>
             </w:r>
           </w:p>
           <w:p>
             <w:pPr>
-              <w:spacing w:before="70" w:after="12"/>
+              <w:spacing w:before="64" w:after="10"/>
             </w:pPr>
             <w:r>
               <w:rPr>
@@ -1103,26 +1190,21 @@
               <w:rPr>
                 <w:i/>
                 <w:color w:val="0284C7"/>
-              </w:rPr>
-              <w:t xml:space="preserve">   —   Enterprise Security &amp; Agentic B</w:t>
-            </w:r>
-            <w:r>
-              <w:rPr>
-                <w:i/>
-                <w:color w:val="0284C7"/>
-              </w:rPr>
-              <w:t>I</w:t>
+                <w:sz w:val="15"/>
+              </w:rPr>
+              <w:t xml:space="preserve">   —   Enterprise Security &amp; Agentic BI</w:t>
             </w:r>
           </w:p>
           <w:p>
             <w:pPr>
-              <w:spacing w:after="26" w:line="269" w:lineRule="auto"/>
+              <w:spacing w:after="24" w:line="269" w:lineRule="auto"/>
               <w:ind w:left="144"/>
             </w:pPr>
             <w:r>
               <w:rPr>
                 <w:b/>
                 <w:color w:val="0284C7"/>
+                <w:sz w:val="15"/>
               </w:rPr>
               <w:t>▸</w:t>
             </w:r>
@@ -1130,19 +1212,57 @@
               <w:rPr>
                 <w:b/>
                 <w:color w:val="0284C7"/>
+                <w:sz w:val="15"/>
               </w:rPr>
               <w:t xml:space="preserve">  </w:t>
             </w:r>
             <w:r>
               <w:rPr>
                 <w:color w:val="334155"/>
-              </w:rPr>
-              <w:t>NL-to-SQL/Graph engine (PostgreSQL pgvector, Neo4j N10S, &lt;5s latency) with ABAC guardrails + SHAP Sentinel.</w:t>
+                <w:sz w:val="15"/>
+              </w:rPr>
+              <w:t>NL-to-SQL/Graph engine (PostgreSQL pgvector, Neo4j N10S, &lt;5s</w:t>
+            </w:r>
+            <w:r>
+              <w:rPr>
+                <w:color w:val="334155"/>
+                <w:sz w:val="15"/>
+              </w:rPr>
+              <w:t xml:space="preserve"> latency) with ABAC guardrails + SHAP Sentinel.</w:t>
             </w:r>
           </w:p>
           <w:p>
             <w:pPr>
-              <w:spacing w:before="70" w:after="12"/>
+              <w:spacing w:after="24" w:line="269" w:lineRule="auto"/>
+              <w:ind w:left="144"/>
+            </w:pPr>
+            <w:r>
+              <w:rPr>
+                <w:b/>
+                <w:color w:val="0284C7"/>
+                <w:sz w:val="15"/>
+              </w:rPr>
+              <w:t>▸</w:t>
+            </w:r>
+            <w:r>
+              <w:rPr>
+                <w:b/>
+                <w:color w:val="0284C7"/>
+                <w:sz w:val="15"/>
+              </w:rPr>
+              <w:t xml:space="preserve">  </w:t>
+            </w:r>
+            <w:r>
+              <w:rPr>
+                <w:color w:val="334155"/>
+                <w:sz w:val="15"/>
+              </w:rPr>
+              <w:t>Executive dashboards via Streamlit &amp; FastAPI — deployed on sovereign cloud Docker infrastructure.</w:t>
+            </w:r>
+          </w:p>
+          <w:p>
+            <w:pPr>
+              <w:spacing w:before="64" w:after="10"/>
             </w:pPr>
             <w:r>
               <w:rPr>
@@ -1156,19 +1276,21 @@
               <w:rPr>
                 <w:i/>
                 <w:color w:val="0284C7"/>
+                <w:sz w:val="15"/>
               </w:rPr>
               <w:t xml:space="preserve">   —   MLOps Pipeline &amp; Climate AI Impact</w:t>
             </w:r>
           </w:p>
           <w:p>
             <w:pPr>
-              <w:spacing w:after="26" w:line="269" w:lineRule="auto"/>
+              <w:spacing w:after="24" w:line="269" w:lineRule="auto"/>
               <w:ind w:left="144"/>
             </w:pPr>
             <w:r>
               <w:rPr>
                 <w:b/>
                 <w:color w:val="0284C7"/>
+                <w:sz w:val="15"/>
               </w:rPr>
               <w:t>▸</w:t>
             </w:r>
@@ -1176,31 +1298,35 @@
               <w:rPr>
                 <w:b/>
                 <w:color w:val="0284C7"/>
+                <w:sz w:val="15"/>
               </w:rPr>
               <w:t xml:space="preserve">  </w:t>
             </w:r>
             <w:r>
               <w:rPr>
                 <w:color w:val="334155"/>
-              </w:rPr>
-              <w:t>Dataset Automator: Google Antigravity (Google Cloud Hackathon) — Tab</w:t>
+                <w:sz w:val="15"/>
+              </w:rPr>
+              <w:t xml:space="preserve">Dataset Automator: Google </w:t>
             </w:r>
             <w:r>
               <w:rPr>
                 <w:color w:val="334155"/>
-              </w:rPr>
-              <w:t>FM, BigQuery DataFrames, EU AI Act.</w:t>
+                <w:sz w:val="15"/>
+              </w:rPr>
+              <w:t>Antigravity (Google Cloud Hackathon) — TabFM, BigQuery DataFrames, EU AI Act.</w:t>
             </w:r>
           </w:p>
           <w:p>
             <w:pPr>
-              <w:spacing w:after="26" w:line="269" w:lineRule="auto"/>
+              <w:spacing w:after="24" w:line="269" w:lineRule="auto"/>
               <w:ind w:left="144"/>
             </w:pPr>
             <w:r>
               <w:rPr>
                 <w:b/>
                 <w:color w:val="0284C7"/>
+                <w:sz w:val="15"/>
               </w:rPr>
               <w:t>▸</w:t>
             </w:r>
@@ -1208,19 +1334,21 @@
               <w:rPr>
                 <w:b/>
                 <w:color w:val="0284C7"/>
+                <w:sz w:val="15"/>
               </w:rPr>
               <w:t xml:space="preserve">  </w:t>
             </w:r>
             <w:r>
               <w:rPr>
                 <w:color w:val="334155"/>
+                <w:sz w:val="15"/>
               </w:rPr>
               <w:t>VigieSahel: –35% crop loss, +14d epidemic forecast (XGBoost R²&gt;94%, Supabase, MLflow).</w:t>
             </w:r>
           </w:p>
           <w:p>
             <w:pPr>
-              <w:spacing w:before="110" w:after="10"/>
+              <w:spacing w:before="100" w:after="10"/>
             </w:pPr>
             <w:r>
               <w:rPr>
@@ -1255,12 +1383,19 @@
                 <w:color w:val="38BDF8"/>
                 <w:sz w:val="9"/>
               </w:rPr>
-              <w:t>────────────────────────────────────────────</w:t>
+              <w:t>───────────────────────────────────────────</w:t>
+            </w:r>
+            <w:r>
+              <w:rPr>
+                <w:color w:val="38BDF8"/>
+                <w:sz w:val="9"/>
+              </w:rPr>
+              <w:t>─</w:t>
             </w:r>
           </w:p>
           <w:p>
             <w:pPr>
-              <w:spacing w:before="70" w:after="12"/>
+              <w:spacing w:before="64" w:after="10"/>
             </w:pPr>
             <w:r>
               <w:rPr>
@@ -1274,38 +1409,34 @@
               <w:rPr>
                 <w:i/>
                 <w:color w:val="0284C7"/>
-              </w:rPr>
-              <w:t xml:space="preserve">   —   </w:t>
-            </w:r>
-            <w:r>
-              <w:rPr>
-                <w:i/>
-                <w:color w:val="0284C7"/>
-              </w:rPr>
-              <w:t>2025 – Present</w:t>
+                <w:sz w:val="15"/>
+              </w:rPr>
+              <w:t xml:space="preserve">   —   2025 – Present</w:t>
             </w:r>
           </w:p>
           <w:p>
             <w:pPr>
-              <w:spacing w:after="12"/>
+              <w:spacing w:after="10"/>
             </w:pPr>
             <w:r>
               <w:rPr>
                 <w:b/>
                 <w:color w:val="64748B"/>
+                <w:sz w:val="15"/>
               </w:rPr>
               <w:t>Independent Projects &amp; Enterprises  │  Douala, CM</w:t>
             </w:r>
           </w:p>
           <w:p>
             <w:pPr>
-              <w:spacing w:after="26" w:line="269" w:lineRule="auto"/>
+              <w:spacing w:after="24" w:line="269" w:lineRule="auto"/>
               <w:ind w:left="144"/>
             </w:pPr>
             <w:r>
               <w:rPr>
                 <w:b/>
                 <w:color w:val="0284C7"/>
+                <w:sz w:val="15"/>
               </w:rPr>
               <w:t>▸</w:t>
             </w:r>
@@ -1313,19 +1444,57 @@
               <w:rPr>
                 <w:b/>
                 <w:color w:val="0284C7"/>
+                <w:sz w:val="15"/>
               </w:rPr>
               <w:t xml:space="preserve">  </w:t>
             </w:r>
             <w:r>
               <w:rPr>
                 <w:color w:val="334155"/>
-              </w:rPr>
-              <w:t>Ethical sovereign AI, Neo4j GraphRAG pipelines, PostgreSQL, high-dimensional EDA, executive dashboards.</w:t>
+                <w:sz w:val="15"/>
+              </w:rPr>
+              <w:t>Ethical sovereign AI systems: GraphRAG Neo4j pipelines, high-dimensional EDA, multi-source RAG architectures.</w:t>
             </w:r>
           </w:p>
           <w:p>
             <w:pPr>
-              <w:spacing w:before="70" w:after="12"/>
+              <w:spacing w:after="24" w:line="269" w:lineRule="auto"/>
+              <w:ind w:left="144"/>
+            </w:pPr>
+            <w:r>
+              <w:rPr>
+                <w:b/>
+                <w:color w:val="0284C7"/>
+                <w:sz w:val="15"/>
+              </w:rPr>
+              <w:t>▸</w:t>
+            </w:r>
+            <w:r>
+              <w:rPr>
+                <w:b/>
+                <w:color w:val="0284C7"/>
+                <w:sz w:val="15"/>
+              </w:rPr>
+              <w:t xml:space="preserve">  </w:t>
+            </w:r>
+            <w:r>
+              <w:rPr>
+                <w:color w:val="334155"/>
+                <w:sz w:val="15"/>
+              </w:rPr>
+              <w:t>Executive KPI dashboards, automat</w:t>
+            </w:r>
+            <w:r>
+              <w:rPr>
+                <w:color w:val="334155"/>
+                <w:sz w:val="15"/>
+              </w:rPr>
+              <w:t>ed reporting, and SHAP explainability audit for Cameroonian SMEs.</w:t>
+            </w:r>
+          </w:p>
+          <w:p>
+            <w:pPr>
+              <w:spacing w:before="64" w:after="10"/>
             </w:pPr>
             <w:r>
               <w:rPr>
@@ -1339,38 +1508,34 @@
               <w:rPr>
                 <w:i/>
                 <w:color w:val="0284C7"/>
+                <w:sz w:val="15"/>
               </w:rPr>
               <w:t xml:space="preserve">   —   2018 – Present</w:t>
             </w:r>
           </w:p>
           <w:p>
             <w:pPr>
-              <w:spacing w:after="12"/>
+              <w:spacing w:after="10"/>
             </w:pPr>
             <w:r>
               <w:rPr>
                 <w:b/>
                 <w:color w:val="64748B"/>
-              </w:rPr>
-              <w:t>CCAA (Cameroon Civil Aviation</w:t>
-            </w:r>
-            <w:r>
-              <w:rPr>
-                <w:b/>
-                <w:color w:val="64748B"/>
-              </w:rPr>
-              <w:t xml:space="preserve"> Authority)</w:t>
+                <w:sz w:val="15"/>
+              </w:rPr>
+              <w:t>CCAA — Cameroon Civil Aviation Authority  │  Douala, CM</w:t>
             </w:r>
           </w:p>
           <w:p>
             <w:pPr>
-              <w:spacing w:after="26" w:line="269" w:lineRule="auto"/>
+              <w:spacing w:after="24" w:line="269" w:lineRule="auto"/>
               <w:ind w:left="144"/>
             </w:pPr>
             <w:r>
               <w:rPr>
                 <w:b/>
                 <w:color w:val="0284C7"/>
+                <w:sz w:val="15"/>
               </w:rPr>
               <w:t>▸</w:t>
             </w:r>
@@ -1378,19 +1543,57 @@
               <w:rPr>
                 <w:b/>
                 <w:color w:val="0284C7"/>
+                <w:sz w:val="15"/>
               </w:rPr>
               <w:t xml:space="preserve">  </w:t>
             </w:r>
             <w:r>
               <w:rPr>
                 <w:color w:val="334155"/>
-              </w:rPr>
-              <w:t>Threat assessment, secure access control, regulatory compliance audits (ICAO Annex 17).</w:t>
+                <w:sz w:val="15"/>
+              </w:rPr>
+              <w:t>Threat assessment, secure access control, and regulatory compliance audits (</w:t>
+            </w:r>
+            <w:r>
+              <w:rPr>
+                <w:color w:val="334155"/>
+                <w:sz w:val="15"/>
+              </w:rPr>
+              <w:t>ICAO Annex 17).</w:t>
             </w:r>
           </w:p>
           <w:p>
             <w:pPr>
-              <w:spacing w:before="110" w:after="10"/>
+              <w:spacing w:after="24" w:line="269" w:lineRule="auto"/>
+              <w:ind w:left="144"/>
+            </w:pPr>
+            <w:r>
+              <w:rPr>
+                <w:b/>
+                <w:color w:val="0284C7"/>
+                <w:sz w:val="15"/>
+              </w:rPr>
+              <w:t>▸</w:t>
+            </w:r>
+            <w:r>
+              <w:rPr>
+                <w:b/>
+                <w:color w:val="0284C7"/>
+                <w:sz w:val="15"/>
+              </w:rPr>
+              <w:t xml:space="preserve">  </w:t>
+            </w:r>
+            <w:r>
+              <w:rPr>
+                <w:color w:val="334155"/>
+                <w:sz w:val="15"/>
+              </w:rPr>
+              <w:t>Operational crisis management: team coordination in emergency situations, anti-intrusion protocols.</w:t>
+            </w:r>
+          </w:p>
+          <w:p>
+            <w:pPr>
+              <w:spacing w:before="100" w:after="10"/>
             </w:pPr>
             <w:r>
               <w:rPr>
@@ -1430,7 +1633,7 @@
           </w:p>
           <w:p>
             <w:pPr>
-              <w:spacing w:before="70" w:after="12"/>
+              <w:spacing w:before="64" w:after="10"/>
             </w:pPr>
             <w:r>
               <w:rPr>
@@ -1444,38 +1647,34 @@
               <w:rPr>
                 <w:i/>
                 <w:color w:val="0284C7"/>
-              </w:rPr>
-              <w:t xml:space="preserve">   —   2025 – 2027  </w:t>
-            </w:r>
-            <w:r>
-              <w:rPr>
-                <w:i/>
-                <w:color w:val="0284C7"/>
-              </w:rPr>
-              <w:t>[In Progress]</w:t>
+                <w:sz w:val="15"/>
+              </w:rPr>
+              <w:t xml:space="preserve">   —   2025 – 2027  [In Progress]</w:t>
             </w:r>
           </w:p>
           <w:p>
             <w:pPr>
-              <w:spacing w:after="12"/>
+              <w:spacing w:after="10"/>
             </w:pPr>
             <w:r>
               <w:rPr>
                 <w:b/>
                 <w:color w:val="64748B"/>
-              </w:rPr>
-              <w:t>University of Ngaoundéré</w:t>
+                <w:sz w:val="15"/>
+              </w:rPr>
+              <w:t>University of Ngaoundéré  │  Cameroon</w:t>
             </w:r>
           </w:p>
           <w:p>
             <w:pPr>
-              <w:spacing w:after="26" w:line="269" w:lineRule="auto"/>
+              <w:spacing w:after="24" w:line="269" w:lineRule="auto"/>
               <w:ind w:left="144"/>
             </w:pPr>
             <w:r>
               <w:rPr>
                 <w:b/>
                 <w:color w:val="0284C7"/>
+                <w:sz w:val="15"/>
               </w:rPr>
               <w:t>▸</w:t>
             </w:r>
@@ -1483,19 +1682,57 @@
               <w:rPr>
                 <w:b/>
                 <w:color w:val="0284C7"/>
+                <w:sz w:val="15"/>
               </w:rPr>
               <w:t xml:space="preserve">  </w:t>
             </w:r>
             <w:r>
               <w:rPr>
                 <w:color w:val="334155"/>
+                <w:sz w:val="15"/>
               </w:rPr>
               <w:t>ML &amp; Bayesian Statistics, Data Engineering &amp; Neo4j, Computer Vision &amp; Robotics, Ethics &amp; Cybersecurity, Production MLOps.</w:t>
             </w:r>
           </w:p>
           <w:p>
             <w:pPr>
-              <w:spacing w:before="70" w:after="12"/>
+              <w:spacing w:after="24" w:line="269" w:lineRule="auto"/>
+              <w:ind w:left="144"/>
+            </w:pPr>
+            <w:r>
+              <w:rPr>
+                <w:b/>
+                <w:color w:val="0284C7"/>
+                <w:sz w:val="15"/>
+              </w:rPr>
+              <w:t>▸</w:t>
+            </w:r>
+            <w:r>
+              <w:rPr>
+                <w:b/>
+                <w:color w:val="0284C7"/>
+                <w:sz w:val="15"/>
+              </w:rPr>
+              <w:t xml:space="preserve">  </w:t>
+            </w:r>
+            <w:r>
+              <w:rPr>
+                <w:color w:val="334155"/>
+                <w:sz w:val="15"/>
+              </w:rPr>
+              <w:t>Research project: K1-MATHINFO v3 — multi-source agent ce</w:t>
+            </w:r>
+            <w:r>
+              <w:rPr>
+                <w:color w:val="334155"/>
+                <w:sz w:val="15"/>
+              </w:rPr>
+              <w:t>rtified OKF v0.2 (SHA-256 No-LLM).</w:t>
+            </w:r>
+          </w:p>
+          <w:p>
+            <w:pPr>
+              <w:spacing w:before="64" w:after="10"/>
             </w:pPr>
             <w:r>
               <w:rPr>
@@ -1509,31 +1746,34 @@
               <w:rPr>
                 <w:i/>
                 <w:color w:val="0284C7"/>
+                <w:sz w:val="15"/>
               </w:rPr>
               <w:t xml:space="preserve">   —   2015 – 2016</w:t>
             </w:r>
           </w:p>
           <w:p>
             <w:pPr>
-              <w:spacing w:after="12"/>
+              <w:spacing w:after="10"/>
             </w:pPr>
             <w:r>
               <w:rPr>
                 <w:b/>
                 <w:color w:val="64748B"/>
-              </w:rPr>
-              <w:t>ISTDI / IUC Douala</w:t>
+                <w:sz w:val="15"/>
+              </w:rPr>
+              <w:t>ISTDI / IUC Douala  │  Cameroon</w:t>
             </w:r>
           </w:p>
           <w:p>
             <w:pPr>
-              <w:spacing w:after="26" w:line="269" w:lineRule="auto"/>
+              <w:spacing w:after="24" w:line="269" w:lineRule="auto"/>
               <w:ind w:left="144"/>
             </w:pPr>
             <w:r>
               <w:rPr>
                 <w:b/>
                 <w:color w:val="0284C7"/>
+                <w:sz w:val="15"/>
               </w:rPr>
               <w:t>▸</w:t>
             </w:r>
@@ -1541,25 +1781,21 @@
               <w:rPr>
                 <w:b/>
                 <w:color w:val="0284C7"/>
+                <w:sz w:val="15"/>
               </w:rPr>
               <w:t xml:space="preserve">  </w:t>
             </w:r>
             <w:r>
               <w:rPr>
                 <w:color w:val="334155"/>
-              </w:rPr>
-              <w:t>Structu</w:t>
-            </w:r>
-            <w:r>
-              <w:rPr>
-                <w:color w:val="334155"/>
-              </w:rPr>
-              <w:t>ral calculations (BAEL 91), quantity surveying, and construction project management.</w:t>
+                <w:sz w:val="15"/>
+              </w:rPr>
+              <w:t>Structural calculations (BAEL 91), quantity surveying, construction project management — AI-applied estimation base.</w:t>
             </w:r>
           </w:p>
           <w:p>
             <w:pPr>
-              <w:spacing w:before="110" w:after="10"/>
+              <w:spacing w:before="100" w:after="10"/>
             </w:pPr>
             <w:r>
               <w:rPr>
@@ -1575,7 +1811,7 @@
                 <w:color w:val="0A1128"/>
                 <w:sz w:val="20"/>
               </w:rPr>
-              <w:t>HONORS &amp; APPLIED AI RECOGNITIONS</w:t>
+              <w:t>HONORS &amp; APPLIED AI DISTINCTIONS</w:t>
             </w:r>
           </w:p>
           <w:p>
@@ -1599,45 +1835,86 @@
           </w:p>
           <w:p>
             <w:pPr>
-              <w:spacing w:after="0" w:line="269" w:lineRule="auto"/>
+              <w:spacing w:before="30" w:after="20" w:line="269" w:lineRule="auto"/>
+              <w:ind w:left="115"/>
             </w:pPr>
+            <w:r>
+              <w:rPr>
+                <w:b/>
+                <w:color w:val="0284C7"/>
+              </w:rPr>
+              <w:t xml:space="preserve">◈ </w:t>
+            </w:r>
             <w:r>
               <w:rPr>
                 <w:b/>
                 <w:color w:val="0A1128"/>
               </w:rPr>
-              <w:t xml:space="preserve">◈ Google Africa Applied AI Lab (Accra, 2026): </w:t>
+              <w:t>Google Africa Applied AI Lab — Accra 2026</w:t>
             </w:r>
             <w:r>
               <w:rPr>
                 <w:color w:val="334155"/>
               </w:rPr>
-              <w:t>Official candidacy — Archi</w:t>
-            </w:r>
-            <w:r>
-              <w:rPr>
-                <w:color w:val="334155"/>
-              </w:rPr>
-              <w:t xml:space="preserve"> Cam AI platform.</w:t>
-            </w:r>
-            <w:r>
-              <w:rPr>
-                <w:color w:val="334155"/>
-              </w:rPr>
-              <w:br/>
+              <w:t xml:space="preserve">  —  Official candidacy — Archi Cam AI platform (5D BIM + GenAI).</w:t>
+            </w:r>
+          </w:p>
+          <w:p>
+            <w:pPr>
+              <w:spacing w:before="30" w:after="20" w:line="269" w:lineRule="auto"/>
+              <w:ind w:left="115"/>
+            </w:pPr>
+            <w:r>
+              <w:rPr>
+                <w:b/>
+                <w:color w:val="0284C7"/>
+              </w:rPr>
+              <w:t xml:space="preserve">◈ </w:t>
             </w:r>
             <w:r>
               <w:rPr>
                 <w:b/>
                 <w:color w:val="0A1128"/>
               </w:rPr>
-              <w:t xml:space="preserve">◈ Google Cloud #AllThingsAgentic Hackathon: </w:t>
+              <w:t>Google Cloud #AllThingsAgentic Hackathon</w:t>
             </w:r>
             <w:r>
               <w:rPr>
                 <w:color w:val="334155"/>
               </w:rPr>
-              <w:t>Dataset Automator v4.0 (Google Antigravity, TabFM, WIT, bigframes, MCT).</w:t>
+              <w:t xml:space="preserve">  —  Data</w:t>
+            </w:r>
+            <w:r>
+              <w:rPr>
+                <w:color w:val="334155"/>
+              </w:rPr>
+              <w:t>set Automator v4.0 — Google Antigravity, TabFM, bigframes, WIT, MCT.</w:t>
+            </w:r>
+          </w:p>
+          <w:p>
+            <w:pPr>
+              <w:spacing w:before="30" w:after="20" w:line="269" w:lineRule="auto"/>
+              <w:ind w:left="115"/>
+            </w:pPr>
+            <w:r>
+              <w:rPr>
+                <w:b/>
+                <w:color w:val="0284C7"/>
+              </w:rPr>
+              <w:t xml:space="preserve">◈ </w:t>
+            </w:r>
+            <w:r>
+              <w:rPr>
+                <w:b/>
+                <w:color w:val="0A1128"/>
+              </w:rPr>
+              <w:t>Google Developer Program  ·  Devpost</w:t>
+            </w:r>
+            <w:r>
+              <w:rPr>
+                <w:color w:val="334155"/>
+              </w:rPr>
+              <w:t xml:space="preserve">  —  Active member — open-source AI contributions, hackathons &amp; ambassador program.</w:t>
             </w:r>
           </w:p>
         </w:tc>
@@ -14264,7 +14541,7 @@
 </file>
 
 <file path=customXml/itemProps1.xml><?xml version="1.0" encoding="utf-8"?>
-<ds:datastoreItem xmlns:ds="http://schemas.openxmlformats.org/officeDocument/2006/customXml" ds:itemID="{4833E79E-A202-4D1A-A9BE-F8AEC2FB4DFB}">
+<ds:datastoreItem xmlns:ds="http://schemas.openxmlformats.org/officeDocument/2006/customXml" ds:itemID="{1F09D20D-7AA9-4511-A955-3DDE03587E6E}">
   <ds:schemaRefs>
     <ds:schemaRef ds:uri="http://schemas.openxmlformats.org/officeDocument/2006/bibliography"/>
   </ds:schemaRefs>

</xml_diff>

<commit_message>
cv: fix gender (Fondateur/Expert), English level honest, photo frame XML border, 1-page validated
</commit_message>
<xml_diff>
--- a/KOA_MARIE_GERVAIS_NELLY_CV_EN.docx
+++ b/KOA_MARIE_GERVAIS_NELLY_CV_EN.docx
@@ -37,7 +37,7 @@
               <w:tblLook w:val="04A0" w:firstRow="1" w:lastRow="0" w:firstColumn="1" w:lastColumn="0" w:noHBand="0" w:noVBand="1"/>
             </w:tblPr>
             <w:tblGrid>
-              <w:gridCol w:w="2744"/>
+              <w:gridCol w:w="2698"/>
             </w:tblGrid>
             <w:tr>
               <w:trPr>
@@ -46,117 +46,94 @@
               <w:tc>
                 <w:tcPr>
                   <w:tcW w:w="3744" w:type="dxa"/>
-                  <w:shd w:val="clear" w:color="auto" w:fill="0284C7"/>
+                  <w:tcBorders>
+                    <w:top w:val="single" w:sz="18" w:space="0" w:color="0284C7"/>
+                    <w:left w:val="single" w:sz="18" w:space="0" w:color="0284C7"/>
+                    <w:bottom w:val="single" w:sz="18" w:space="0" w:color="0284C7"/>
+                    <w:right w:val="single" w:sz="18" w:space="0" w:color="0284C7"/>
+                  </w:tcBorders>
+                  <w:shd w:val="clear" w:color="auto" w:fill="0F172A"/>
                   <w:tcMar>
-                    <w:top w:w="8" w:type="dxa"/>
-                    <w:left w:w="8" w:type="dxa"/>
-                    <w:bottom w:w="8" w:type="dxa"/>
-                    <w:right w:w="8" w:type="dxa"/>
+                    <w:top w:w="10" w:type="dxa"/>
+                    <w:left w:w="10" w:type="dxa"/>
+                    <w:bottom w:w="10" w:type="dxa"/>
+                    <w:right w:w="10" w:type="dxa"/>
                   </w:tcMar>
                 </w:tcPr>
-                <w:p/>
-                <w:tbl>
-                  <w:tblPr>
-                    <w:tblW w:w="0" w:type="auto"/>
+                <w:p>
+                  <w:pPr>
+                    <w:spacing w:after="0"/>
                     <w:jc w:val="center"/>
-                    <w:tblLook w:val="04A0" w:firstRow="1" w:lastRow="0" w:firstColumn="1" w:lastColumn="0" w:noHBand="0" w:noVBand="1"/>
-                  </w:tblPr>
-                  <w:tblGrid>
-                    <w:gridCol w:w="2728"/>
-                  </w:tblGrid>
-                  <w:tr>
-                    <w:trPr>
-                      <w:jc w:val="center"/>
-                    </w:trPr>
-                    <w:tc>
-                      <w:tcPr>
-                        <w:tcW w:w="3744" w:type="dxa"/>
-                        <w:shd w:val="clear" w:color="auto" w:fill="0F172A"/>
-                        <w:tcMar>
-                          <w:top w:w="4" w:type="dxa"/>
-                          <w:left w:w="4" w:type="dxa"/>
-                          <w:bottom w:w="4" w:type="dxa"/>
-                          <w:right w:w="4" w:type="dxa"/>
-                        </w:tcMar>
-                      </w:tcPr>
-                      <w:p>
-                        <w:pPr>
-                          <w:spacing w:after="0"/>
-                          <w:jc w:val="center"/>
-                        </w:pPr>
-                        <w:r>
-                          <w:rPr>
-                            <w:noProof/>
-                            <w:lang w:val="fr-FR" w:eastAsia="fr-FR"/>
-                          </w:rPr>
-                          <w:drawing>
-                            <wp:inline distT="0" distB="0" distL="0" distR="0">
-                              <wp:extent cx="1316736" cy="1316736"/>
-                              <wp:effectExtent l="0" t="0" r="0" b="0"/>
-                              <wp:docPr id="1" name="Picture 1"/>
-                              <wp:cNvGraphicFramePr>
-                                <a:graphicFrameLocks xmlns:a="http://schemas.openxmlformats.org/drawingml/2006/main" noChangeAspect="1"/>
-                              </wp:cNvGraphicFramePr>
-                              <a:graphic xmlns:a="http://schemas.openxmlformats.org/drawingml/2006/main">
-                                <a:graphicData uri="http://schemas.openxmlformats.org/drawingml/2006/picture">
-                                  <pic:pic xmlns:pic="http://schemas.openxmlformats.org/drawingml/2006/picture">
-                                    <pic:nvPicPr>
-                                      <pic:cNvPr id="0" name="profile_headshot_circular.jpeg"/>
-                                      <pic:cNvPicPr/>
-                                    </pic:nvPicPr>
-                                    <pic:blipFill>
-                                      <a:blip r:embed="rId6"/>
-                                      <a:stretch>
-                                        <a:fillRect/>
-                                      </a:stretch>
-                                    </pic:blipFill>
-                                    <pic:spPr>
-                                      <a:xfrm>
-                                        <a:off x="0" y="0"/>
-                                        <a:ext cx="1316736" cy="1316736"/>
-                                      </a:xfrm>
-                                      <a:prstGeom prst="rect">
-                                        <a:avLst/>
-                                      </a:prstGeom>
-                                    </pic:spPr>
-                                  </pic:pic>
-                                </a:graphicData>
-                              </a:graphic>
-                            </wp:inline>
-                          </w:drawing>
-                        </w:r>
-                      </w:p>
-                    </w:tc>
-                  </w:tr>
-                </w:tbl>
-                <w:p/>
+                  </w:pPr>
+                  <w:r>
+                    <w:rPr>
+                      <w:noProof/>
+                      <w:lang w:val="fr-FR" w:eastAsia="fr-FR"/>
+                    </w:rPr>
+                    <w:drawing>
+                      <wp:inline distT="0" distB="0" distL="0" distR="0">
+                        <wp:extent cx="1353312" cy="1353312"/>
+                        <wp:effectExtent l="0" t="0" r="0" b="0"/>
+                        <wp:docPr id="1" name="Picture 1"/>
+                        <wp:cNvGraphicFramePr>
+                          <a:graphicFrameLocks xmlns:a="http://schemas.openxmlformats.org/drawingml/2006/main" noChangeAspect="1"/>
+                        </wp:cNvGraphicFramePr>
+                        <a:graphic xmlns:a="http://schemas.openxmlformats.org/drawingml/2006/main">
+                          <a:graphicData uri="http://schemas.openxmlformats.org/drawingml/2006/picture">
+                            <pic:pic xmlns:pic="http://schemas.openxmlformats.org/drawingml/2006/picture">
+                              <pic:nvPicPr>
+                                <pic:cNvPr id="0" name="profile_headshot_circular.jpeg"/>
+                                <pic:cNvPicPr/>
+                              </pic:nvPicPr>
+                              <pic:blipFill>
+                                <a:blip r:embed="rId6"/>
+                                <a:stretch>
+                                  <a:fillRect/>
+                                </a:stretch>
+                              </pic:blipFill>
+                              <pic:spPr>
+                                <a:xfrm>
+                                  <a:off x="0" y="0"/>
+                                  <a:ext cx="1353312" cy="1353312"/>
+                                </a:xfrm>
+                                <a:prstGeom prst="rect">
+                                  <a:avLst/>
+                                </a:prstGeom>
+                              </pic:spPr>
+                            </pic:pic>
+                          </a:graphicData>
+                        </a:graphic>
+                      </wp:inline>
+                    </w:drawing>
+                  </w:r>
+                </w:p>
               </w:tc>
             </w:tr>
           </w:tbl>
           <w:p/>
           <w:p>
             <w:pPr>
-              <w:spacing w:before="80" w:after="20"/>
+              <w:spacing w:before="60" w:after="0"/>
               <w:jc w:val="center"/>
             </w:pPr>
             <w:r>
               <w:rPr>
                 <w:b/>
                 <w:color w:val="38BDF8"/>
-                <w:sz w:val="14"/>
+                <w:sz w:val="13"/>
               </w:rPr>
               <w:t>◈  LEAD AI ENGINEER</w:t>
             </w:r>
           </w:p>
           <w:p>
             <w:pPr>
-              <w:spacing w:after="40"/>
+              <w:spacing w:after="30"/>
               <w:jc w:val="center"/>
             </w:pPr>
             <w:r>
               <w:rPr>
                 <w:color w:val="64748B"/>
-                <w:sz w:val="13"/>
+                <w:sz w:val="12"/>
               </w:rPr>
               <w:t>Founder  ·  Archi Cam AI</w:t>
             </w:r>
@@ -315,7 +292,14 @@
                 <w:color w:val="F8FAFC"/>
                 <w:sz w:val="15"/>
               </w:rPr>
-              <w:t xml:space="preserve">  Google Developer Program</w:t>
+              <w:t xml:space="preserve">  </w:t>
+            </w:r>
+            <w:r>
+              <w:rPr>
+                <w:color w:val="F8FAFC"/>
+                <w:sz w:val="15"/>
+              </w:rPr>
+              <w:t>Google Developer Program</w:t>
             </w:r>
           </w:p>
           <w:p>
@@ -411,14 +395,14 @@
                 <w:color w:val="F8FAFC"/>
                 <w:sz w:val="15"/>
               </w:rPr>
-              <w:t xml:space="preserve">Firebase Genkit      </w:t>
+              <w:t>Firebase Genkit         ■</w:t>
             </w:r>
             <w:r>
               <w:rPr>
                 <w:color w:val="F8FAFC"/>
                 <w:sz w:val="15"/>
               </w:rPr>
-              <w:t xml:space="preserve">   ■ ■ ■ ■ ■</w:t>
+              <w:t xml:space="preserve"> ■ ■ ■ ■</w:t>
             </w:r>
           </w:p>
           <w:p>
@@ -538,7 +522,14 @@
                 <w:color w:val="0284C7"/>
                 <w:sz w:val="10"/>
               </w:rPr>
-              <w:t>━━━━━━━━━━━━━━━━━━━━</w:t>
+              <w:t>━━━━</w:t>
+            </w:r>
+            <w:r>
+              <w:rPr>
+                <w:color w:val="0284C7"/>
+                <w:sz w:val="10"/>
+              </w:rPr>
+              <w:t>━━━━━━━━━━━━━━━━</w:t>
             </w:r>
           </w:p>
           <w:p>
@@ -634,14 +625,7 @@
                 <w:color w:val="0284C7"/>
                 <w:sz w:val="10"/>
               </w:rPr>
-              <w:t>━━━━━━</w:t>
-            </w:r>
-            <w:r>
-              <w:rPr>
-                <w:color w:val="0284C7"/>
-                <w:sz w:val="10"/>
-              </w:rPr>
-              <w:t>━━━━━━━━━━━━━━</w:t>
+              <w:t>━━━━━━━━━━━━━━━━━━━━</w:t>
             </w:r>
           </w:p>
           <w:p>
@@ -749,7 +733,14 @@
                 <w:color w:val="F8FAFC"/>
                 <w:sz w:val="15"/>
               </w:rPr>
-              <w:t>English  —  Technical / Pro</w:t>
+              <w:t xml:space="preserve">English  —  Functional basics </w:t>
+            </w:r>
+            <w:r>
+              <w:rPr>
+                <w:color w:val="F8FAFC"/>
+                <w:sz w:val="15"/>
+              </w:rPr>
+              <w:t>(tools &amp; doc.)</w:t>
             </w:r>
           </w:p>
           <w:p>
@@ -864,7 +855,7 @@
           </w:p>
           <w:p>
             <w:pPr>
-              <w:spacing w:before="100" w:after="10"/>
+              <w:spacing w:before="76" w:after="8"/>
             </w:pPr>
             <w:r>
               <w:rPr>
@@ -885,7 +876,7 @@
           </w:p>
           <w:p>
             <w:pPr>
-              <w:spacing w:after="50"/>
+              <w:spacing w:after="36"/>
             </w:pPr>
             <w:r>
               <w:rPr>
@@ -904,7 +895,7 @@
           </w:p>
           <w:p>
             <w:pPr>
-              <w:spacing w:after="50" w:line="278" w:lineRule="auto"/>
+              <w:spacing w:after="32" w:line="271" w:lineRule="auto"/>
             </w:pPr>
             <w:r>
               <w:rPr>
@@ -916,18 +907,18 @@
               <w:rPr>
                 <w:color w:val="334155"/>
               </w:rPr>
-              <w:t xml:space="preserve"> design neuro-symbolic autonomous multi-agent architectures, Neo4j GraphRAG, and sovereign MLOps pipelines. Expert in AI ethics (transparency, SHAP explainability, EU AI Act compliance, deterministic zero-hallucination models). Founder of Archi Cam AI (off</w:t>
+              <w:t xml:space="preserve"> design neuro-symbolic multi-agent architectures, Neo4j GraphRAG, and sovereign MLOps pipelines. Expert in AI ethics: SHAP transparency, EU AI Act compliance, and deterministic zero-hallucination models. Founder of Archi Cam AI (official Google Africa Appl</w:t>
             </w:r>
             <w:r>
               <w:rPr>
                 <w:color w:val="334155"/>
               </w:rPr>
-              <w:t>icial Google Africa Applied AI Lab applicant 2026), bridging civil engineering methodology, mathematical rigor, and bold product vision.</w:t>
+              <w:t>ied AI Lab applicant 2026), bridging civil engineering methodology, mathematical rigor, and product vision.</w:t>
             </w:r>
           </w:p>
           <w:p>
             <w:pPr>
-              <w:spacing w:before="100" w:after="10"/>
+              <w:spacing w:before="76" w:after="8"/>
             </w:pPr>
             <w:r>
               <w:rPr>
@@ -948,7 +939,7 @@
           </w:p>
           <w:p>
             <w:pPr>
-              <w:spacing w:after="50"/>
+              <w:spacing w:after="36"/>
             </w:pPr>
             <w:r>
               <w:rPr>
@@ -967,7 +958,7 @@
           </w:p>
           <w:p>
             <w:pPr>
-              <w:spacing w:before="64" w:after="10"/>
+              <w:spacing w:before="50" w:after="6"/>
             </w:pPr>
             <w:r>
               <w:rPr>
@@ -983,7 +974,85 @@
                 <w:color w:val="0284C7"/>
                 <w:sz w:val="15"/>
               </w:rPr>
-              <w:t xml:space="preserve">   —   Agentic AI Sa</w:t>
+              <w:t xml:space="preserve">   —   Agentic AI SaaS &amp; 5D BIM</w:t>
+            </w:r>
+          </w:p>
+          <w:p>
+            <w:pPr>
+              <w:spacing w:after="14" w:line="264" w:lineRule="auto"/>
+              <w:ind w:left="144"/>
+            </w:pPr>
+            <w:r>
+              <w:rPr>
+                <w:b/>
+                <w:color w:val="0284C7"/>
+                <w:sz w:val="15"/>
+              </w:rPr>
+              <w:t>▸</w:t>
+            </w:r>
+            <w:r>
+              <w:rPr>
+                <w:b/>
+                <w:color w:val="0284C7"/>
+                <w:sz w:val="15"/>
+              </w:rPr>
+              <w:t xml:space="preserve">  </w:t>
+            </w:r>
+            <w:r>
+              <w:rPr>
+                <w:color w:val="334155"/>
+                <w:sz w:val="15"/>
+              </w:rPr>
+              <w:t xml:space="preserve">Official </w:t>
+            </w:r>
+            <w:r>
+              <w:rPr>
+                <w:color w:val="334155"/>
+                <w:sz w:val="15"/>
+              </w:rPr>
+              <w:t>Applicant Google Africa Applied AI Lab. Built with Google Antigravity (Gemma 4 12B, Gemini 2.5, BAEL 91).</w:t>
+            </w:r>
+          </w:p>
+          <w:p>
+            <w:pPr>
+              <w:spacing w:after="14" w:line="264" w:lineRule="auto"/>
+              <w:ind w:left="144"/>
+            </w:pPr>
+            <w:r>
+              <w:rPr>
+                <w:b/>
+                <w:color w:val="0284C7"/>
+                <w:sz w:val="15"/>
+              </w:rPr>
+              <w:t>▸</w:t>
+            </w:r>
+            <w:r>
+              <w:rPr>
+                <w:b/>
+                <w:color w:val="0284C7"/>
+                <w:sz w:val="15"/>
+              </w:rPr>
+              <w:t xml:space="preserve">  </w:t>
+            </w:r>
+            <w:r>
+              <w:rPr>
+                <w:color w:val="334155"/>
+                <w:sz w:val="15"/>
+              </w:rPr>
+              <w:t>Automated Excel BOQs in &lt;45s (–99.2% time, MLflow R²=0.9872) and 3D renders via Imagen 3 + ControlNet.</w:t>
+            </w:r>
+          </w:p>
+          <w:p>
+            <w:pPr>
+              <w:spacing w:before="50" w:after="6"/>
+            </w:pPr>
+            <w:r>
+              <w:rPr>
+                <w:b/>
+                <w:color w:val="0A1128"/>
+                <w:sz w:val="18"/>
+              </w:rPr>
+              <w:t>K1-MATHINFO (v3.0.0)</w:t>
             </w:r>
             <w:r>
               <w:rPr>
@@ -991,12 +1060,20 @@
                 <w:color w:val="0284C7"/>
                 <w:sz w:val="15"/>
               </w:rPr>
-              <w:t>aS &amp; 5D BIM</w:t>
+              <w:t xml:space="preserve">   —   Sovereign Multi-A</w:t>
+            </w:r>
+            <w:r>
+              <w:rPr>
+                <w:i/>
+                <w:color w:val="0284C7"/>
+                <w:sz w:val="15"/>
+              </w:rPr>
+              <w:t>gent AI, WikiSkills &amp; OKF Certification</w:t>
             </w:r>
           </w:p>
           <w:p>
             <w:pPr>
-              <w:spacing w:after="24" w:line="269" w:lineRule="auto"/>
+              <w:spacing w:after="14" w:line="264" w:lineRule="auto"/>
               <w:ind w:left="144"/>
             </w:pPr>
             <w:r>
@@ -1020,12 +1097,12 @@
                 <w:color w:val="334155"/>
                 <w:sz w:val="15"/>
               </w:rPr>
-              <w:t>Official Applicant Google Africa Applied AI Lab. Built with Google Antigravity (Gemma 4 12B, Gemini 2.5, BAEL 91).</w:t>
+              <w:t>Sovereign DMI system (Univ. of Ngaoundéré): 470 theses, 19 M1 projects, 1,366 Neo4j nodes.</w:t>
             </w:r>
           </w:p>
           <w:p>
             <w:pPr>
-              <w:spacing w:after="24" w:line="269" w:lineRule="auto"/>
+              <w:spacing w:after="14" w:line="264" w:lineRule="auto"/>
               <w:ind w:left="144"/>
             </w:pPr>
             <w:r>
@@ -1049,12 +1126,40 @@
                 <w:color w:val="334155"/>
                 <w:sz w:val="15"/>
               </w:rPr>
-              <w:t>Automated Excel BOQs in &lt;45s (–99.2% time, MLflow R²=0.9872) and 3D renders via Imagen 3 + ControlNet.</w:t>
+              <w:t xml:space="preserve">6 LangGraph agents orchestrated via WikiSkills (critic anti-hallucination, Cypher optimizer), RRF k=60, SHA-256 No-LLM </w:t>
+            </w:r>
+            <w:r>
+              <w:rPr>
+                <w:color w:val="334155"/>
+                <w:sz w:val="15"/>
+              </w:rPr>
+              <w:t>(100%).</w:t>
             </w:r>
           </w:p>
           <w:p>
             <w:pPr>
-              <w:spacing w:after="24" w:line="269" w:lineRule="auto"/>
+              <w:spacing w:before="50" w:after="6"/>
+            </w:pPr>
+            <w:r>
+              <w:rPr>
+                <w:b/>
+                <w:color w:val="0A1128"/>
+                <w:sz w:val="18"/>
+              </w:rPr>
+              <w:t>Sovereign.BI Agentic</w:t>
+            </w:r>
+            <w:r>
+              <w:rPr>
+                <w:i/>
+                <w:color w:val="0284C7"/>
+                <w:sz w:val="15"/>
+              </w:rPr>
+              <w:t xml:space="preserve">   —   Enterprise Security &amp; Agentic BI</w:t>
+            </w:r>
+          </w:p>
+          <w:p>
+            <w:pPr>
+              <w:spacing w:after="14" w:line="264" w:lineRule="auto"/>
               <w:ind w:left="144"/>
             </w:pPr>
             <w:r>
@@ -1078,19 +1183,12 @@
                 <w:color w:val="334155"/>
                 <w:sz w:val="15"/>
               </w:rPr>
-              <w:t xml:space="preserve">IfcOpenShell </w:t>
-            </w:r>
-            <w:r>
-              <w:rPr>
-                <w:color w:val="334155"/>
-                <w:sz w:val="15"/>
-              </w:rPr>
-              <w:t>integration for 5D BIM models: costs + schedules automated via LangGraph agents.</w:t>
+              <w:t>NL-to-SQL/Graph engine (PostgreSQL pgvector, Neo4j N10S, &lt;5s latency) with ABAC guardrails + SHAP Sentinel.</w:t>
             </w:r>
           </w:p>
           <w:p>
             <w:pPr>
-              <w:spacing w:before="64" w:after="10"/>
+              <w:spacing w:before="50" w:after="6"/>
             </w:pPr>
             <w:r>
               <w:rPr>
@@ -1098,7 +1196,7 @@
                 <w:color w:val="0A1128"/>
                 <w:sz w:val="18"/>
               </w:rPr>
-              <w:t>K1-MATHINFO (v3.0.0)</w:t>
+              <w:t>Dataset Automator &amp; VigieSahel</w:t>
             </w:r>
             <w:r>
               <w:rPr>
@@ -1106,12 +1204,12 @@
                 <w:color w:val="0284C7"/>
                 <w:sz w:val="15"/>
               </w:rPr>
-              <w:t xml:space="preserve">   —   Sovereign Multi-Agent AI, WikiSkills &amp; OKF Certification</w:t>
+              <w:t xml:space="preserve">   —   MLOps Pipeline &amp; Climate AI Impact</w:t>
             </w:r>
           </w:p>
           <w:p>
             <w:pPr>
-              <w:spacing w:after="24" w:line="269" w:lineRule="auto"/>
+              <w:spacing w:after="14" w:line="264" w:lineRule="auto"/>
               <w:ind w:left="144"/>
             </w:pPr>
             <w:r>
@@ -1135,19 +1233,19 @@
                 <w:color w:val="334155"/>
                 <w:sz w:val="15"/>
               </w:rPr>
-              <w:t>Sovereign DMI system (Univ. of Ngaoundéré): 470 theses, 19 M1 projects, 1,366 Neo4j node</w:t>
+              <w:t>Da</w:t>
             </w:r>
             <w:r>
               <w:rPr>
                 <w:color w:val="334155"/>
                 <w:sz w:val="15"/>
               </w:rPr>
-              <w:t>s.</w:t>
+              <w:t>taset Automator: Google Antigravity (Google Cloud Hackathon) — TabFM, BigQuery DataFrames, EU AI Act.</w:t>
             </w:r>
           </w:p>
           <w:p>
             <w:pPr>
-              <w:spacing w:after="24" w:line="269" w:lineRule="auto"/>
+              <w:spacing w:after="14" w:line="264" w:lineRule="auto"/>
               <w:ind w:left="144"/>
             </w:pPr>
             <w:r>
@@ -1171,12 +1269,52 @@
                 <w:color w:val="334155"/>
                 <w:sz w:val="15"/>
               </w:rPr>
-              <w:t>6 LangGraph agents orchestrated via WikiSkills (critic anti-hallucination, Cypher optimizer), RRF k=60, SHA-256 No-LLM (100%).</w:t>
+              <w:t>VigieSahel: –35% crop loss, +14d epidemic forecast (XGBoost R²&gt;94%, Supabase, MLflow).</w:t>
             </w:r>
           </w:p>
           <w:p>
             <w:pPr>
-              <w:spacing w:before="64" w:after="10"/>
+              <w:spacing w:before="76" w:after="8"/>
+            </w:pPr>
+            <w:r>
+              <w:rPr>
+                <w:b/>
+                <w:color w:val="0284C7"/>
+                <w:sz w:val="17"/>
+              </w:rPr>
+              <w:t xml:space="preserve">◈  </w:t>
+            </w:r>
+            <w:r>
+              <w:rPr>
+                <w:b/>
+                <w:color w:val="0A1128"/>
+                <w:sz w:val="20"/>
+              </w:rPr>
+              <w:t>PROFESSIONAL EXPERIENCE</w:t>
+            </w:r>
+          </w:p>
+          <w:p>
+            <w:pPr>
+              <w:spacing w:after="36"/>
+            </w:pPr>
+            <w:r>
+              <w:rPr>
+                <w:color w:val="0284C7"/>
+                <w:sz w:val="9"/>
+              </w:rPr>
+              <w:t>━━━━━━━━━━━━━━━━━━</w:t>
+            </w:r>
+            <w:r>
+              <w:rPr>
+                <w:color w:val="38BDF8"/>
+                <w:sz w:val="9"/>
+              </w:rPr>
+              <w:t>────────────────────────────────────────────</w:t>
+            </w:r>
+          </w:p>
+          <w:p>
+            <w:pPr>
+              <w:spacing w:before="50" w:after="6"/>
             </w:pPr>
             <w:r>
               <w:rPr>
@@ -1184,7 +1322,7 @@
                 <w:color w:val="0A1128"/>
                 <w:sz w:val="18"/>
               </w:rPr>
-              <w:t>Sovereign.BI Agentic</w:t>
+              <w:t>AI Lead &amp; Data Science Consultant</w:t>
             </w:r>
             <w:r>
               <w:rPr>
@@ -1192,12 +1330,25 @@
                 <w:color w:val="0284C7"/>
                 <w:sz w:val="15"/>
               </w:rPr>
-              <w:t xml:space="preserve">   —   Enterprise Security &amp; Agentic BI</w:t>
+              <w:t xml:space="preserve">   —   2025 – Present</w:t>
             </w:r>
           </w:p>
           <w:p>
             <w:pPr>
-              <w:spacing w:after="24" w:line="269" w:lineRule="auto"/>
+              <w:spacing w:after="6"/>
+            </w:pPr>
+            <w:r>
+              <w:rPr>
+                <w:b/>
+                <w:color w:val="64748B"/>
+                <w:sz w:val="15"/>
+              </w:rPr>
+              <w:t>Independent Projects &amp; Enterprises  │  Douala, CM</w:t>
+            </w:r>
+          </w:p>
+          <w:p>
+            <w:pPr>
+              <w:spacing w:after="14" w:line="264" w:lineRule="auto"/>
               <w:ind w:left="144"/>
             </w:pPr>
             <w:r>
@@ -1221,19 +1372,53 @@
                 <w:color w:val="334155"/>
                 <w:sz w:val="15"/>
               </w:rPr>
-              <w:t>NL-to-SQL/Graph engine (PostgreSQL pgvector, Neo4j N10S, &lt;5s</w:t>
+              <w:t>Ethical sovereign AI systems: GraphRAG Neo4j pipelines, high-dimensional EDA, multi-source RAG architec</w:t>
             </w:r>
             <w:r>
               <w:rPr>
                 <w:color w:val="334155"/>
                 <w:sz w:val="15"/>
               </w:rPr>
-              <w:t xml:space="preserve"> latency) with ABAC guardrails + SHAP Sentinel.</w:t>
+              <w:t>tures and executive KPI dashboards.</w:t>
             </w:r>
           </w:p>
           <w:p>
             <w:pPr>
-              <w:spacing w:after="24" w:line="269" w:lineRule="auto"/>
+              <w:spacing w:before="50" w:after="6"/>
+            </w:pPr>
+            <w:r>
+              <w:rPr>
+                <w:b/>
+                <w:color w:val="0A1128"/>
+                <w:sz w:val="18"/>
+              </w:rPr>
+              <w:t>Aviation Security Officer (AVSEC)</w:t>
+            </w:r>
+            <w:r>
+              <w:rPr>
+                <w:i/>
+                <w:color w:val="0284C7"/>
+                <w:sz w:val="15"/>
+              </w:rPr>
+              <w:t xml:space="preserve">   —   2018 – Present</w:t>
+            </w:r>
+          </w:p>
+          <w:p>
+            <w:pPr>
+              <w:spacing w:after="6"/>
+            </w:pPr>
+            <w:r>
+              <w:rPr>
+                <w:b/>
+                <w:color w:val="64748B"/>
+                <w:sz w:val="15"/>
+              </w:rPr>
+              <w:t>CCAA — Cameroon Civil Aviation Authority  │  Douala, CM</w:t>
+            </w:r>
+          </w:p>
+          <w:p>
+            <w:pPr>
+              <w:spacing w:after="14" w:line="264" w:lineRule="auto"/>
               <w:ind w:left="144"/>
             </w:pPr>
             <w:r>
@@ -1257,12 +1442,60 @@
                 <w:color w:val="334155"/>
                 <w:sz w:val="15"/>
               </w:rPr>
-              <w:t>Executive dashboards via Streamlit &amp; FastAPI — deployed on sovereign cloud Docker infrastructure.</w:t>
+              <w:t>Threat assessment, secure access control, and regulatory compliance audits (ICAO Annex 17).</w:t>
             </w:r>
           </w:p>
           <w:p>
             <w:pPr>
-              <w:spacing w:before="64" w:after="10"/>
+              <w:spacing w:before="76" w:after="8"/>
+            </w:pPr>
+            <w:r>
+              <w:rPr>
+                <w:b/>
+                <w:color w:val="0284C7"/>
+                <w:sz w:val="17"/>
+              </w:rPr>
+              <w:t xml:space="preserve">◈  </w:t>
+            </w:r>
+            <w:r>
+              <w:rPr>
+                <w:b/>
+                <w:color w:val="0A1128"/>
+                <w:sz w:val="20"/>
+              </w:rPr>
+              <w:t>EDUCATION &amp;</w:t>
+            </w:r>
+            <w:r>
+              <w:rPr>
+                <w:b/>
+                <w:color w:val="0A1128"/>
+                <w:sz w:val="20"/>
+              </w:rPr>
+              <w:t xml:space="preserve"> CERTIFICATIONS</w:t>
+            </w:r>
+          </w:p>
+          <w:p>
+            <w:pPr>
+              <w:spacing w:after="36"/>
+            </w:pPr>
+            <w:r>
+              <w:rPr>
+                <w:color w:val="0284C7"/>
+                <w:sz w:val="9"/>
+              </w:rPr>
+              <w:t>━━━━━━━━━━━━━━━━━━</w:t>
+            </w:r>
+            <w:r>
+              <w:rPr>
+                <w:color w:val="38BDF8"/>
+                <w:sz w:val="9"/>
+              </w:rPr>
+              <w:t>────────────────────────────────────────────</w:t>
+            </w:r>
+          </w:p>
+          <w:p>
+            <w:pPr>
+              <w:spacing w:before="50" w:after="6"/>
             </w:pPr>
             <w:r>
               <w:rPr>
@@ -1270,7 +1503,7 @@
                 <w:color w:val="0A1128"/>
                 <w:sz w:val="18"/>
               </w:rPr>
-              <w:t>Dataset Automator &amp; VigieSahel</w:t>
+              <w:t>M.Sc. in Applied Artificial Intelligence</w:t>
             </w:r>
             <w:r>
               <w:rPr>
@@ -1278,12 +1511,25 @@
                 <w:color w:val="0284C7"/>
                 <w:sz w:val="15"/>
               </w:rPr>
-              <w:t xml:space="preserve">   —   MLOps Pipeline &amp; Climate AI Impact</w:t>
+              <w:t xml:space="preserve">   —   2025 – 2027  [In Progress]</w:t>
             </w:r>
           </w:p>
           <w:p>
             <w:pPr>
-              <w:spacing w:after="24" w:line="269" w:lineRule="auto"/>
+              <w:spacing w:after="6"/>
+            </w:pPr>
+            <w:r>
+              <w:rPr>
+                <w:b/>
+                <w:color w:val="64748B"/>
+                <w:sz w:val="15"/>
+              </w:rPr>
+              <w:t>University of Ngaoundéré  │  Cameroon</w:t>
+            </w:r>
+          </w:p>
+          <w:p>
+            <w:pPr>
+              <w:spacing w:after="14" w:line="264" w:lineRule="auto"/>
               <w:ind w:left="144"/>
             </w:pPr>
             <w:r>
@@ -1307,19 +1553,53 @@
                 <w:color w:val="334155"/>
                 <w:sz w:val="15"/>
               </w:rPr>
-              <w:t xml:space="preserve">Dataset Automator: Google </w:t>
+              <w:t>ML &amp; Bayesian Statistics, Data Engineering &amp; Neo4j, Computer V</w:t>
             </w:r>
             <w:r>
               <w:rPr>
                 <w:color w:val="334155"/>
                 <w:sz w:val="15"/>
               </w:rPr>
-              <w:t>Antigravity (Google Cloud Hackathon) — TabFM, BigQuery DataFrames, EU AI Act.</w:t>
+              <w:t>ision &amp; Robotics, Ethics &amp; Cybersecurity, Production MLOps.</w:t>
             </w:r>
           </w:p>
           <w:p>
             <w:pPr>
-              <w:spacing w:after="24" w:line="269" w:lineRule="auto"/>
+              <w:spacing w:before="50" w:after="6"/>
+            </w:pPr>
+            <w:r>
+              <w:rPr>
+                <w:b/>
+                <w:color w:val="0A1128"/>
+                <w:sz w:val="18"/>
+              </w:rPr>
+              <w:t>B.Sc. in Civil Engineering (Building Option)</w:t>
+            </w:r>
+            <w:r>
+              <w:rPr>
+                <w:i/>
+                <w:color w:val="0284C7"/>
+                <w:sz w:val="15"/>
+              </w:rPr>
+              <w:t xml:space="preserve">   —   2015 – 2016</w:t>
+            </w:r>
+          </w:p>
+          <w:p>
+            <w:pPr>
+              <w:spacing w:after="6"/>
+            </w:pPr>
+            <w:r>
+              <w:rPr>
+                <w:b/>
+                <w:color w:val="64748B"/>
+                <w:sz w:val="15"/>
+              </w:rPr>
+              <w:t>ISTDI / IUC Douala  │  Cameroon</w:t>
+            </w:r>
+          </w:p>
+          <w:p>
+            <w:pPr>
+              <w:spacing w:after="14" w:line="264" w:lineRule="auto"/>
               <w:ind w:left="144"/>
             </w:pPr>
             <w:r>
@@ -1343,12 +1623,19 @@
                 <w:color w:val="334155"/>
                 <w:sz w:val="15"/>
               </w:rPr>
-              <w:t>VigieSahel: –35% crop loss, +14d epidemic forecast (XGBoost R²&gt;94%, Supabase, MLflow).</w:t>
+              <w:t xml:space="preserve">Structural calculations (BAEL 91), quantity surveying, construction project management — </w:t>
+            </w:r>
+            <w:r>
+              <w:rPr>
+                <w:color w:val="334155"/>
+                <w:sz w:val="15"/>
+              </w:rPr>
+              <w:t>AI-applied estimation base.</w:t>
             </w:r>
           </w:p>
           <w:p>
             <w:pPr>
-              <w:spacing w:before="100" w:after="10"/>
+              <w:spacing w:before="76" w:after="8"/>
             </w:pPr>
             <w:r>
               <w:rPr>
@@ -1364,12 +1651,12 @@
                 <w:color w:val="0A1128"/>
                 <w:sz w:val="20"/>
               </w:rPr>
-              <w:t>PROFESSIONAL EXPERIENCE</w:t>
+              <w:t>HONORS &amp; APPLIED AI DISTINCTIONS</w:t>
             </w:r>
           </w:p>
           <w:p>
             <w:pPr>
-              <w:spacing w:after="50"/>
+              <w:spacing w:after="36"/>
             </w:pPr>
             <w:r>
               <w:rPr>
@@ -1383,538 +1670,51 @@
                 <w:color w:val="38BDF8"/>
                 <w:sz w:val="9"/>
               </w:rPr>
-              <w:t>───────────────────────────────────────────</w:t>
-            </w:r>
-            <w:r>
-              <w:rPr>
-                <w:color w:val="38BDF8"/>
-                <w:sz w:val="9"/>
-              </w:rPr>
-              <w:t>─</w:t>
+              <w:t>────────────────────────────────────────────</w:t>
             </w:r>
           </w:p>
           <w:p>
             <w:pPr>
-              <w:spacing w:before="64" w:after="10"/>
+              <w:spacing w:after="0" w:line="264" w:lineRule="auto"/>
             </w:pPr>
             <w:r>
               <w:rPr>
                 <w:b/>
                 <w:color w:val="0A1128"/>
-                <w:sz w:val="18"/>
-              </w:rPr>
-              <w:t>AI Lead &amp; Data Science Consultant</w:t>
-            </w:r>
-            <w:r>
-              <w:rPr>
-                <w:i/>
-                <w:color w:val="0284C7"/>
-                <w:sz w:val="15"/>
-              </w:rPr>
-              <w:t xml:space="preserve">   —   2025 – Present</w:t>
-            </w:r>
-          </w:p>
-          <w:p>
-            <w:pPr>
-              <w:spacing w:after="10"/>
-            </w:pPr>
-            <w:r>
-              <w:rPr>
-                <w:b/>
-                <w:color w:val="64748B"/>
-                <w:sz w:val="15"/>
-              </w:rPr>
-              <w:t>Independent Projects &amp; Enterprises  │  Douala, CM</w:t>
-            </w:r>
-          </w:p>
-          <w:p>
-            <w:pPr>
-              <w:spacing w:after="24" w:line="269" w:lineRule="auto"/>
-              <w:ind w:left="144"/>
-            </w:pPr>
-            <w:r>
-              <w:rPr>
-                <w:b/>
-                <w:color w:val="0284C7"/>
-                <w:sz w:val="15"/>
-              </w:rPr>
-              <w:t>▸</w:t>
-            </w:r>
-            <w:r>
-              <w:rPr>
-                <w:b/>
-                <w:color w:val="0284C7"/>
-                <w:sz w:val="15"/>
-              </w:rPr>
-              <w:t xml:space="preserve">  </w:t>
+              </w:rPr>
+              <w:t xml:space="preserve">◈ Google Africa Applied AI Lab (Accra, 2026): </w:t>
             </w:r>
             <w:r>
               <w:rPr>
                 <w:color w:val="334155"/>
-                <w:sz w:val="15"/>
-              </w:rPr>
-              <w:t>Ethical sovereign AI systems: GraphRAG Neo4j pipelines, high-dimensional EDA, multi-source RAG architectures.</w:t>
-            </w:r>
-          </w:p>
-          <w:p>
-            <w:pPr>
-              <w:spacing w:after="24" w:line="269" w:lineRule="auto"/>
-              <w:ind w:left="144"/>
-            </w:pPr>
-            <w:r>
-              <w:rPr>
-                <w:b/>
-                <w:color w:val="0284C7"/>
-                <w:sz w:val="15"/>
-              </w:rPr>
-              <w:t>▸</w:t>
-            </w:r>
-            <w:r>
-              <w:rPr>
-                <w:b/>
-                <w:color w:val="0284C7"/>
-                <w:sz w:val="15"/>
-              </w:rPr>
-              <w:t xml:space="preserve">  </w:t>
+              </w:rPr>
+              <w:t>Official candidacy — Archi Cam AI platform (5D BIM + GenAI).</w:t>
             </w:r>
             <w:r>
               <w:rPr>
                 <w:color w:val="334155"/>
-                <w:sz w:val="15"/>
-              </w:rPr>
-              <w:t>Executive KPI dashboards, automat</w:t>
-            </w:r>
-            <w:r>
-              <w:rPr>
-                <w:color w:val="334155"/>
-                <w:sz w:val="15"/>
-              </w:rPr>
-              <w:t>ed reporting, and SHAP explainability audit for Cameroonian SMEs.</w:t>
-            </w:r>
-          </w:p>
-          <w:p>
-            <w:pPr>
-              <w:spacing w:before="64" w:after="10"/>
-            </w:pPr>
+              </w:rPr>
+              <w:br/>
+            </w:r>
             <w:r>
               <w:rPr>
                 <w:b/>
                 <w:color w:val="0A1128"/>
-                <w:sz w:val="18"/>
-              </w:rPr>
-              <w:t>Aviation Security Officer (AVSEC)</w:t>
-            </w:r>
-            <w:r>
-              <w:rPr>
-                <w:i/>
-                <w:color w:val="0284C7"/>
-                <w:sz w:val="15"/>
-              </w:rPr>
-              <w:t xml:space="preserve">   —   2018 – Present</w:t>
-            </w:r>
-          </w:p>
-          <w:p>
-            <w:pPr>
-              <w:spacing w:after="10"/>
-            </w:pPr>
-            <w:r>
-              <w:rPr>
-                <w:b/>
-                <w:color w:val="64748B"/>
-                <w:sz w:val="15"/>
-              </w:rPr>
-              <w:t>CCAA — Cameroon Civil Aviation Authority  │  Douala, CM</w:t>
-            </w:r>
-          </w:p>
-          <w:p>
-            <w:pPr>
-              <w:spacing w:after="24" w:line="269" w:lineRule="auto"/>
-              <w:ind w:left="144"/>
-            </w:pPr>
-            <w:r>
-              <w:rPr>
-                <w:b/>
-                <w:color w:val="0284C7"/>
-                <w:sz w:val="15"/>
-              </w:rPr>
-              <w:t>▸</w:t>
-            </w:r>
-            <w:r>
-              <w:rPr>
-                <w:b/>
-                <w:color w:val="0284C7"/>
-                <w:sz w:val="15"/>
-              </w:rPr>
-              <w:t xml:space="preserve">  </w:t>
-            </w:r>
-            <w:r>
-              <w:rPr>
-                <w:color w:val="334155"/>
-                <w:sz w:val="15"/>
-              </w:rPr>
-              <w:t>Threat assessment, secure access control, and regulatory compliance audits (</w:t>
-            </w:r>
-            <w:r>
-              <w:rPr>
-                <w:color w:val="334155"/>
-                <w:sz w:val="15"/>
-              </w:rPr>
-              <w:t>ICAO Annex 17).</w:t>
-            </w:r>
-          </w:p>
-          <w:p>
-            <w:pPr>
-              <w:spacing w:after="24" w:line="269" w:lineRule="auto"/>
-              <w:ind w:left="144"/>
-            </w:pPr>
-            <w:r>
-              <w:rPr>
-                <w:b/>
-                <w:color w:val="0284C7"/>
-                <w:sz w:val="15"/>
-              </w:rPr>
-              <w:t>▸</w:t>
-            </w:r>
-            <w:r>
-              <w:rPr>
-                <w:b/>
-                <w:color w:val="0284C7"/>
-                <w:sz w:val="15"/>
-              </w:rPr>
-              <w:t xml:space="preserve">  </w:t>
-            </w:r>
-            <w:r>
-              <w:rPr>
-                <w:color w:val="334155"/>
-                <w:sz w:val="15"/>
-              </w:rPr>
-              <w:t>Operational crisis management: team coordination in emergency situations, anti-intrusion protocols.</w:t>
-            </w:r>
-          </w:p>
-          <w:p>
-            <w:pPr>
-              <w:spacing w:before="100" w:after="10"/>
-            </w:pPr>
-            <w:r>
-              <w:rPr>
-                <w:b/>
-                <w:color w:val="0284C7"/>
-                <w:sz w:val="17"/>
-              </w:rPr>
-              <w:t xml:space="preserve">◈  </w:t>
+              </w:rPr>
+              <w:t>◈ Google Cloud #AllThi</w:t>
             </w:r>
             <w:r>
               <w:rPr>
                 <w:b/>
                 <w:color w:val="0A1128"/>
-                <w:sz w:val="20"/>
-              </w:rPr>
-              <w:t>EDUCATION &amp; CERTIFICATIONS</w:t>
-            </w:r>
-          </w:p>
-          <w:p>
-            <w:pPr>
-              <w:spacing w:after="50"/>
-            </w:pPr>
-            <w:r>
-              <w:rPr>
-                <w:color w:val="0284C7"/>
-                <w:sz w:val="9"/>
-              </w:rPr>
-              <w:t>━━━━━━━━━━━━━━━━━━</w:t>
-            </w:r>
-            <w:r>
-              <w:rPr>
-                <w:color w:val="38BDF8"/>
-                <w:sz w:val="9"/>
-              </w:rPr>
-              <w:t>────────────────────────────────────────────</w:t>
-            </w:r>
-          </w:p>
-          <w:p>
-            <w:pPr>
-              <w:spacing w:before="64" w:after="10"/>
-            </w:pPr>
-            <w:r>
-              <w:rPr>
-                <w:b/>
-                <w:color w:val="0A1128"/>
-                <w:sz w:val="18"/>
-              </w:rPr>
-              <w:t>M.Sc. in Applied Artificial Intelligence</w:t>
-            </w:r>
-            <w:r>
-              <w:rPr>
-                <w:i/>
-                <w:color w:val="0284C7"/>
-                <w:sz w:val="15"/>
-              </w:rPr>
-              <w:t xml:space="preserve">   —   2025 – 2027  [In Progress]</w:t>
-            </w:r>
-          </w:p>
-          <w:p>
-            <w:pPr>
-              <w:spacing w:after="10"/>
-            </w:pPr>
-            <w:r>
-              <w:rPr>
-                <w:b/>
-                <w:color w:val="64748B"/>
-                <w:sz w:val="15"/>
-              </w:rPr>
-              <w:t>University of Ngaoundéré  │  Cameroon</w:t>
-            </w:r>
-          </w:p>
-          <w:p>
-            <w:pPr>
-              <w:spacing w:after="24" w:line="269" w:lineRule="auto"/>
-              <w:ind w:left="144"/>
-            </w:pPr>
-            <w:r>
-              <w:rPr>
-                <w:b/>
-                <w:color w:val="0284C7"/>
-                <w:sz w:val="15"/>
-              </w:rPr>
-              <w:t>▸</w:t>
-            </w:r>
-            <w:r>
-              <w:rPr>
-                <w:b/>
-                <w:color w:val="0284C7"/>
-                <w:sz w:val="15"/>
-              </w:rPr>
-              <w:t xml:space="preserve">  </w:t>
+              </w:rPr>
+              <w:t xml:space="preserve">ngsAgentic Hackathon: </w:t>
             </w:r>
             <w:r>
               <w:rPr>
                 <w:color w:val="334155"/>
-                <w:sz w:val="15"/>
-              </w:rPr>
-              <w:t>ML &amp; Bayesian Statistics, Data Engineering &amp; Neo4j, Computer Vision &amp; Robotics, Ethics &amp; Cybersecurity, Production MLOps.</w:t>
-            </w:r>
-          </w:p>
-          <w:p>
-            <w:pPr>
-              <w:spacing w:after="24" w:line="269" w:lineRule="auto"/>
-              <w:ind w:left="144"/>
-            </w:pPr>
-            <w:r>
-              <w:rPr>
-                <w:b/>
-                <w:color w:val="0284C7"/>
-                <w:sz w:val="15"/>
-              </w:rPr>
-              <w:t>▸</w:t>
-            </w:r>
-            <w:r>
-              <w:rPr>
-                <w:b/>
-                <w:color w:val="0284C7"/>
-                <w:sz w:val="15"/>
-              </w:rPr>
-              <w:t xml:space="preserve">  </w:t>
-            </w:r>
-            <w:r>
-              <w:rPr>
-                <w:color w:val="334155"/>
-                <w:sz w:val="15"/>
-              </w:rPr>
-              <w:t>Research project: K1-MATHINFO v3 — multi-source agent ce</w:t>
-            </w:r>
-            <w:r>
-              <w:rPr>
-                <w:color w:val="334155"/>
-                <w:sz w:val="15"/>
-              </w:rPr>
-              <w:t>rtified OKF v0.2 (SHA-256 No-LLM).</w:t>
-            </w:r>
-          </w:p>
-          <w:p>
-            <w:pPr>
-              <w:spacing w:before="64" w:after="10"/>
-            </w:pPr>
-            <w:r>
-              <w:rPr>
-                <w:b/>
-                <w:color w:val="0A1128"/>
-                <w:sz w:val="18"/>
-              </w:rPr>
-              <w:t>B.Sc. in Civil Engineering (Building Option)</w:t>
-            </w:r>
-            <w:r>
-              <w:rPr>
-                <w:i/>
-                <w:color w:val="0284C7"/>
-                <w:sz w:val="15"/>
-              </w:rPr>
-              <w:t xml:space="preserve">   —   2015 – 2016</w:t>
-            </w:r>
-          </w:p>
-          <w:p>
-            <w:pPr>
-              <w:spacing w:after="10"/>
-            </w:pPr>
-            <w:r>
-              <w:rPr>
-                <w:b/>
-                <w:color w:val="64748B"/>
-                <w:sz w:val="15"/>
-              </w:rPr>
-              <w:t>ISTDI / IUC Douala  │  Cameroon</w:t>
-            </w:r>
-          </w:p>
-          <w:p>
-            <w:pPr>
-              <w:spacing w:after="24" w:line="269" w:lineRule="auto"/>
-              <w:ind w:left="144"/>
-            </w:pPr>
-            <w:r>
-              <w:rPr>
-                <w:b/>
-                <w:color w:val="0284C7"/>
-                <w:sz w:val="15"/>
-              </w:rPr>
-              <w:t>▸</w:t>
-            </w:r>
-            <w:r>
-              <w:rPr>
-                <w:b/>
-                <w:color w:val="0284C7"/>
-                <w:sz w:val="15"/>
-              </w:rPr>
-              <w:t xml:space="preserve">  </w:t>
-            </w:r>
-            <w:r>
-              <w:rPr>
-                <w:color w:val="334155"/>
-                <w:sz w:val="15"/>
-              </w:rPr>
-              <w:t>Structural calculations (BAEL 91), quantity surveying, construction project management — AI-applied estimation base.</w:t>
-            </w:r>
-          </w:p>
-          <w:p>
-            <w:pPr>
-              <w:spacing w:before="100" w:after="10"/>
-            </w:pPr>
-            <w:r>
-              <w:rPr>
-                <w:b/>
-                <w:color w:val="0284C7"/>
-                <w:sz w:val="17"/>
-              </w:rPr>
-              <w:t xml:space="preserve">◈  </w:t>
-            </w:r>
-            <w:r>
-              <w:rPr>
-                <w:b/>
-                <w:color w:val="0A1128"/>
-                <w:sz w:val="20"/>
-              </w:rPr>
-              <w:t>HONORS &amp; APPLIED AI DISTINCTIONS</w:t>
-            </w:r>
-          </w:p>
-          <w:p>
-            <w:pPr>
-              <w:spacing w:after="50"/>
-            </w:pPr>
-            <w:r>
-              <w:rPr>
-                <w:color w:val="0284C7"/>
-                <w:sz w:val="9"/>
-              </w:rPr>
-              <w:t>━━━━━━━━━━━━━━━━━━</w:t>
-            </w:r>
-            <w:r>
-              <w:rPr>
-                <w:color w:val="38BDF8"/>
-                <w:sz w:val="9"/>
-              </w:rPr>
-              <w:t>────────────────────────────────────────────</w:t>
-            </w:r>
-          </w:p>
-          <w:p>
-            <w:pPr>
-              <w:spacing w:before="30" w:after="20" w:line="269" w:lineRule="auto"/>
-              <w:ind w:left="115"/>
-            </w:pPr>
-            <w:r>
-              <w:rPr>
-                <w:b/>
-                <w:color w:val="0284C7"/>
-              </w:rPr>
-              <w:t xml:space="preserve">◈ </w:t>
-            </w:r>
-            <w:r>
-              <w:rPr>
-                <w:b/>
-                <w:color w:val="0A1128"/>
-              </w:rPr>
-              <w:t>Google Africa Applied AI Lab — Accra 2026</w:t>
-            </w:r>
-            <w:r>
-              <w:rPr>
-                <w:color w:val="334155"/>
-              </w:rPr>
-              <w:t xml:space="preserve">  —  Official candidacy — Archi Cam AI platform (5D BIM + GenAI).</w:t>
-            </w:r>
-          </w:p>
-          <w:p>
-            <w:pPr>
-              <w:spacing w:before="30" w:after="20" w:line="269" w:lineRule="auto"/>
-              <w:ind w:left="115"/>
-            </w:pPr>
-            <w:r>
-              <w:rPr>
-                <w:b/>
-                <w:color w:val="0284C7"/>
-              </w:rPr>
-              <w:t xml:space="preserve">◈ </w:t>
-            </w:r>
-            <w:r>
-              <w:rPr>
-                <w:b/>
-                <w:color w:val="0A1128"/>
-              </w:rPr>
-              <w:t>Google Cloud #AllThingsAgentic Hackathon</w:t>
-            </w:r>
-            <w:r>
-              <w:rPr>
-                <w:color w:val="334155"/>
-              </w:rPr>
-              <w:t xml:space="preserve">  —  Data</w:t>
-            </w:r>
-            <w:r>
-              <w:rPr>
-                <w:color w:val="334155"/>
-              </w:rPr>
-              <w:t>set Automator v4.0 — Google Antigravity, TabFM, bigframes, WIT, MCT.</w:t>
-            </w:r>
-          </w:p>
-          <w:p>
-            <w:pPr>
-              <w:spacing w:before="30" w:after="20" w:line="269" w:lineRule="auto"/>
-              <w:ind w:left="115"/>
-            </w:pPr>
-            <w:r>
-              <w:rPr>
-                <w:b/>
-                <w:color w:val="0284C7"/>
-              </w:rPr>
-              <w:t xml:space="preserve">◈ </w:t>
-            </w:r>
-            <w:r>
-              <w:rPr>
-                <w:b/>
-                <w:color w:val="0A1128"/>
-              </w:rPr>
-              <w:t>Google Developer Program  ·  Devpost</w:t>
-            </w:r>
-            <w:r>
-              <w:rPr>
-                <w:color w:val="334155"/>
-              </w:rPr>
-              <w:t xml:space="preserve">  —  Active member — open-source AI contributions, hackathons &amp; ambassador program.</w:t>
+              </w:rPr>
+              <w:t>Dataset Automator v4.0 (Google Antigravity, TabFM, bigframes, WIT, MCT).</w:t>
             </w:r>
           </w:p>
         </w:tc>
@@ -14541,7 +14341,7 @@
 </file>
 
 <file path=customXml/itemProps1.xml><?xml version="1.0" encoding="utf-8"?>
-<ds:datastoreItem xmlns:ds="http://schemas.openxmlformats.org/officeDocument/2006/customXml" ds:itemID="{1F09D20D-7AA9-4511-A955-3DDE03587E6E}">
+<ds:datastoreItem xmlns:ds="http://schemas.openxmlformats.org/officeDocument/2006/customXml" ds:itemID="{9CEE48D7-0CF9-464E-87A4-0AFBAED36FF2}">
   <ds:schemaRefs>
     <ds:schemaRef ds:uri="http://schemas.openxmlformats.org/officeDocument/2006/bibliography"/>
   </ds:schemaRefs>

</xml_diff>

<commit_message>
cv: restore clean large circular photo aligned with name (no border, navy background) from 'aa' layout, 1-page validated
</commit_message>
<xml_diff>
--- a/KOA_MARIE_GERVAIS_NELLY_CV_EN.docx
+++ b/KOA_MARIE_GERVAIS_NELLY_CV_EN.docx
@@ -20,120 +20,84 @@
             <w:tcW w:w="3744" w:type="dxa"/>
             <w:shd w:val="clear" w:color="auto" w:fill="0F172A"/>
             <w:tcMar>
-              <w:top w:w="250" w:type="dxa"/>
-              <w:left w:w="560" w:type="dxa"/>
+              <w:top w:w="260" w:type="dxa"/>
+              <w:left w:w="500" w:type="dxa"/>
               <w:bottom w:w="230" w:type="dxa"/>
-              <w:right w:w="440" w:type="dxa"/>
+              <w:right w:w="420" w:type="dxa"/>
             </w:tcMar>
           </w:tcPr>
           <w:p>
+            <w:pPr>
+              <w:spacing w:after="0"/>
+              <w:jc w:val="center"/>
+            </w:pPr>
             <w:bookmarkStart w:id="0" w:name="_GoBack"/>
             <w:bookmarkEnd w:id="0"/>
-          </w:p>
-          <w:tbl>
-            <w:tblPr>
-              <w:tblW w:w="0" w:type="auto"/>
-              <w:jc w:val="center"/>
-              <w:tblLook w:val="04A0" w:firstRow="1" w:lastRow="0" w:firstColumn="1" w:lastColumn="0" w:noHBand="0" w:noVBand="1"/>
-            </w:tblPr>
-            <w:tblGrid>
-              <w:gridCol w:w="2698"/>
-            </w:tblGrid>
-            <w:tr>
-              <w:trPr>
-                <w:jc w:val="center"/>
-              </w:trPr>
-              <w:tc>
-                <w:tcPr>
-                  <w:tcW w:w="3744" w:type="dxa"/>
-                  <w:tcBorders>
-                    <w:top w:val="single" w:sz="18" w:space="0" w:color="0284C7"/>
-                    <w:left w:val="single" w:sz="18" w:space="0" w:color="0284C7"/>
-                    <w:bottom w:val="single" w:sz="18" w:space="0" w:color="0284C7"/>
-                    <w:right w:val="single" w:sz="18" w:space="0" w:color="0284C7"/>
-                  </w:tcBorders>
-                  <w:shd w:val="clear" w:color="auto" w:fill="0F172A"/>
-                  <w:tcMar>
-                    <w:top w:w="10" w:type="dxa"/>
-                    <w:left w:w="10" w:type="dxa"/>
-                    <w:bottom w:w="10" w:type="dxa"/>
-                    <w:right w:w="10" w:type="dxa"/>
-                  </w:tcMar>
-                </w:tcPr>
-                <w:p>
-                  <w:pPr>
-                    <w:spacing w:after="0"/>
-                    <w:jc w:val="center"/>
-                  </w:pPr>
-                  <w:r>
-                    <w:rPr>
-                      <w:noProof/>
-                      <w:lang w:val="fr-FR" w:eastAsia="fr-FR"/>
-                    </w:rPr>
-                    <w:drawing>
-                      <wp:inline distT="0" distB="0" distL="0" distR="0">
-                        <wp:extent cx="1353312" cy="1353312"/>
-                        <wp:effectExtent l="0" t="0" r="0" b="0"/>
-                        <wp:docPr id="1" name="Picture 1"/>
-                        <wp:cNvGraphicFramePr>
-                          <a:graphicFrameLocks xmlns:a="http://schemas.openxmlformats.org/drawingml/2006/main" noChangeAspect="1"/>
-                        </wp:cNvGraphicFramePr>
-                        <a:graphic xmlns:a="http://schemas.openxmlformats.org/drawingml/2006/main">
-                          <a:graphicData uri="http://schemas.openxmlformats.org/drawingml/2006/picture">
-                            <pic:pic xmlns:pic="http://schemas.openxmlformats.org/drawingml/2006/picture">
-                              <pic:nvPicPr>
-                                <pic:cNvPr id="0" name="profile_headshot_circular.jpeg"/>
-                                <pic:cNvPicPr/>
-                              </pic:nvPicPr>
-                              <pic:blipFill>
-                                <a:blip r:embed="rId6"/>
-                                <a:stretch>
-                                  <a:fillRect/>
-                                </a:stretch>
-                              </pic:blipFill>
-                              <pic:spPr>
-                                <a:xfrm>
-                                  <a:off x="0" y="0"/>
-                                  <a:ext cx="1353312" cy="1353312"/>
-                                </a:xfrm>
-                                <a:prstGeom prst="rect">
-                                  <a:avLst/>
-                                </a:prstGeom>
-                              </pic:spPr>
-                            </pic:pic>
-                          </a:graphicData>
-                        </a:graphic>
-                      </wp:inline>
-                    </w:drawing>
-                  </w:r>
-                </w:p>
-              </w:tc>
-            </w:tr>
-          </w:tbl>
-          <w:p/>
-          <w:p>
-            <w:pPr>
-              <w:spacing w:before="60" w:after="0"/>
-              <w:jc w:val="center"/>
-            </w:pPr>
-            <w:r>
-              <w:rPr>
-                <w:b/>
-                <w:color w:val="38BDF8"/>
-                <w:sz w:val="13"/>
-              </w:rPr>
-              <w:t>◈  LEAD AI ENGINEER</w:t>
+            <w:r>
+              <w:rPr>
+                <w:noProof/>
+                <w:lang w:val="fr-FR" w:eastAsia="fr-FR"/>
+              </w:rPr>
+              <w:drawing>
+                <wp:inline distT="0" distB="0" distL="0" distR="0">
+                  <wp:extent cx="1463040" cy="1463040"/>
+                  <wp:effectExtent l="0" t="0" r="0" b="0"/>
+                  <wp:docPr id="1" name="Picture 1"/>
+                  <wp:cNvGraphicFramePr>
+                    <a:graphicFrameLocks xmlns:a="http://schemas.openxmlformats.org/drawingml/2006/main" noChangeAspect="1"/>
+                  </wp:cNvGraphicFramePr>
+                  <a:graphic xmlns:a="http://schemas.openxmlformats.org/drawingml/2006/main">
+                    <a:graphicData uri="http://schemas.openxmlformats.org/drawingml/2006/picture">
+                      <pic:pic xmlns:pic="http://schemas.openxmlformats.org/drawingml/2006/picture">
+                        <pic:nvPicPr>
+                          <pic:cNvPr id="0" name="profile_headshot_circular.jpeg"/>
+                          <pic:cNvPicPr/>
+                        </pic:nvPicPr>
+                        <pic:blipFill>
+                          <a:blip r:embed="rId6"/>
+                          <a:stretch>
+                            <a:fillRect/>
+                          </a:stretch>
+                        </pic:blipFill>
+                        <pic:spPr>
+                          <a:xfrm>
+                            <a:off x="0" y="0"/>
+                            <a:ext cx="1463040" cy="1463040"/>
+                          </a:xfrm>
+                          <a:prstGeom prst="rect">
+                            <a:avLst/>
+                          </a:prstGeom>
+                        </pic:spPr>
+                      </pic:pic>
+                    </a:graphicData>
+                  </a:graphic>
+                </wp:inline>
+              </w:drawing>
             </w:r>
           </w:p>
           <w:p>
             <w:pPr>
-              <w:spacing w:after="30"/>
+              <w:spacing w:before="70" w:after="0"/>
               <w:jc w:val="center"/>
             </w:pPr>
             <w:r>
               <w:rPr>
+                <w:b/>
+                <w:color w:val="38BDF8"/>
+                <w:sz w:val="14"/>
+              </w:rPr>
+              <w:t>◈  LEAD AI ENGINEER</w:t>
+            </w:r>
+          </w:p>
+          <w:p>
+            <w:pPr>
+              <w:spacing w:after="40"/>
+              <w:jc w:val="center"/>
+            </w:pPr>
+            <w:r>
+              <w:rPr>
                 <w:color w:val="64748B"/>
-                <w:sz w:val="12"/>
+                <w:sz w:val="13"/>
               </w:rPr>
               <w:t>Founder  ·  Archi Cam AI</w:t>
             </w:r>
@@ -625,7 +589,14 @@
                 <w:color w:val="0284C7"/>
                 <w:sz w:val="10"/>
               </w:rPr>
-              <w:t>━━━━━━━━━━━━━━━━━━━━</w:t>
+              <w:t>━━━━━━━━━━</w:t>
+            </w:r>
+            <w:r>
+              <w:rPr>
+                <w:color w:val="0284C7"/>
+                <w:sz w:val="10"/>
+              </w:rPr>
+              <w:t>━━━━━━━━━━</w:t>
             </w:r>
           </w:p>
           <w:p>
@@ -733,14 +704,7 @@
                 <w:color w:val="F8FAFC"/>
                 <w:sz w:val="15"/>
               </w:rPr>
-              <w:t xml:space="preserve">English  —  Functional basics </w:t>
-            </w:r>
-            <w:r>
-              <w:rPr>
-                <w:color w:val="F8FAFC"/>
-                <w:sz w:val="15"/>
-              </w:rPr>
-              <w:t>(tools &amp; doc.)</w:t>
+              <w:t>English  —  Functional basics (tools &amp; doc.)</w:t>
             </w:r>
           </w:p>
           <w:p>
@@ -850,7 +814,14 @@
                 <w:color w:val="0284C7"/>
                 <w:sz w:val="11"/>
               </w:rPr>
-              <w:t>──────────────────────────────────────────────────────────────────────</w:t>
+              <w:t>───────────────────────────────</w:t>
+            </w:r>
+            <w:r>
+              <w:rPr>
+                <w:color w:val="0284C7"/>
+                <w:sz w:val="11"/>
+              </w:rPr>
+              <w:t>───────────────────────────────────────</w:t>
             </w:r>
           </w:p>
           <w:p>
@@ -901,19 +872,19 @@
               <w:rPr>
                 <w:color w:val="334155"/>
               </w:rPr>
-              <w:t>Lead AI Engineer &amp; Data Architect (Google Developer Program Member), leveraging Google Antigravity to</w:t>
+              <w:t>Lead AI Engineer &amp; Data Architect (Google Developer Program Member), leveraging Google Antigravity to design neuro-symbolic multi-ag</w:t>
             </w:r>
             <w:r>
               <w:rPr>
                 <w:color w:val="334155"/>
               </w:rPr>
-              <w:t xml:space="preserve"> design neuro-symbolic multi-agent architectures, Neo4j GraphRAG, and sovereign MLOps pipelines. Expert in AI ethics: SHAP transparency, EU AI Act compliance, and deterministic zero-hallucination models. Founder of Archi Cam AI (official Google Africa Appl</w:t>
+              <w:t>ent architectures, Neo4j GraphRAG, and sovereign MLOps pipelines. Expert in AI ethics: SHAP transparency, EU AI Act compliance, and deterministic zero-hallucination models. Founder of Archi Cam AI (official Google Africa Applied AI Lab applicant 2026), bri</w:t>
             </w:r>
             <w:r>
               <w:rPr>
                 <w:color w:val="334155"/>
               </w:rPr>
-              <w:t>ied AI Lab applicant 2026), bridging civil engineering methodology, mathematical rigor, and product vision.</w:t>
+              <w:t>dging civil engineering methodology, mathematical rigor, and product vision.</w:t>
             </w:r>
           </w:p>
           <w:p>
@@ -1003,14 +974,14 @@
                 <w:color w:val="334155"/>
                 <w:sz w:val="15"/>
               </w:rPr>
-              <w:t xml:space="preserve">Official </w:t>
+              <w:t xml:space="preserve">Official Applicant Google Africa Applied AI </w:t>
             </w:r>
             <w:r>
               <w:rPr>
                 <w:color w:val="334155"/>
                 <w:sz w:val="15"/>
               </w:rPr>
-              <w:t>Applicant Google Africa Applied AI Lab. Built with Google Antigravity (Gemma 4 12B, Gemini 2.5, BAEL 91).</w:t>
+              <w:t>Lab. Built with Google Antigravity (Gemma 4 12B, Gemini 2.5, BAEL 91).</w:t>
             </w:r>
           </w:p>
           <w:p>
@@ -1060,7 +1031,7 @@
                 <w:color w:val="0284C7"/>
                 <w:sz w:val="15"/>
               </w:rPr>
-              <w:t xml:space="preserve">   —   Sovereign Multi-A</w:t>
+              <w:t xml:space="preserve">   —   Sovereign Multi-Agent AI, WikiSkills &amp; OKF Certifica</w:t>
             </w:r>
             <w:r>
               <w:rPr>
@@ -1068,7 +1039,7 @@
                 <w:color w:val="0284C7"/>
                 <w:sz w:val="15"/>
               </w:rPr>
-              <w:t>gent AI, WikiSkills &amp; OKF Certification</w:t>
+              <w:t>tion</w:t>
             </w:r>
           </w:p>
           <w:p>
@@ -1126,14 +1097,7 @@
                 <w:color w:val="334155"/>
                 <w:sz w:val="15"/>
               </w:rPr>
-              <w:t xml:space="preserve">6 LangGraph agents orchestrated via WikiSkills (critic anti-hallucination, Cypher optimizer), RRF k=60, SHA-256 No-LLM </w:t>
-            </w:r>
-            <w:r>
-              <w:rPr>
-                <w:color w:val="334155"/>
-                <w:sz w:val="15"/>
-              </w:rPr>
-              <w:t>(100%).</w:t>
+              <w:t>6 LangGraph agents orchestrated via WikiSkills (critic anti-hallucination, Cypher optimizer), RRF k=60, SHA-256 No-LLM (100%).</w:t>
             </w:r>
           </w:p>
           <w:p>
@@ -1154,7 +1118,15 @@
                 <w:color w:val="0284C7"/>
                 <w:sz w:val="15"/>
               </w:rPr>
-              <w:t xml:space="preserve">   —   Enterprise Security &amp; Agentic BI</w:t>
+              <w:t xml:space="preserve">   —   </w:t>
+            </w:r>
+            <w:r>
+              <w:rPr>
+                <w:i/>
+                <w:color w:val="0284C7"/>
+                <w:sz w:val="15"/>
+              </w:rPr>
+              <w:t>Enterprise Security &amp; Agentic BI</w:t>
             </w:r>
           </w:p>
           <w:p>
@@ -1233,14 +1205,14 @@
                 <w:color w:val="334155"/>
                 <w:sz w:val="15"/>
               </w:rPr>
-              <w:t>Da</w:t>
+              <w:t>Dataset Automator: Google Antigravity</w:t>
             </w:r>
             <w:r>
               <w:rPr>
                 <w:color w:val="334155"/>
                 <w:sz w:val="15"/>
               </w:rPr>
-              <w:t>taset Automator: Google Antigravity (Google Cloud Hackathon) — TabFM, BigQuery DataFrames, EU AI Act.</w:t>
+              <w:t xml:space="preserve"> (Google Cloud Hackathon) — TabFM, BigQuery DataFrames, EU AI Act.</w:t>
             </w:r>
           </w:p>
           <w:p>
@@ -1322,7 +1294,15 @@
                 <w:color w:val="0A1128"/>
                 <w:sz w:val="18"/>
               </w:rPr>
-              <w:t>AI Lead &amp; Data Science Consultant</w:t>
+              <w:t>AI Lead &amp;</w:t>
+            </w:r>
+            <w:r>
+              <w:rPr>
+                <w:b/>
+                <w:color w:val="0A1128"/>
+                <w:sz w:val="18"/>
+              </w:rPr>
+              <w:t xml:space="preserve"> Data Science Consultant</w:t>
             </w:r>
             <w:r>
               <w:rPr>
@@ -1372,14 +1352,7 @@
                 <w:color w:val="334155"/>
                 <w:sz w:val="15"/>
               </w:rPr>
-              <w:t>Ethical sovereign AI systems: GraphRAG Neo4j pipelines, high-dimensional EDA, multi-source RAG architec</w:t>
-            </w:r>
-            <w:r>
-              <w:rPr>
-                <w:color w:val="334155"/>
-                <w:sz w:val="15"/>
-              </w:rPr>
-              <w:t>tures and executive KPI dashboards.</w:t>
+              <w:t>Ethical sovereign AI systems: GraphRAG Neo4j pipelines, high-dimensional EDA, multi-source RAG architectures and executive KPI dashboards.</w:t>
             </w:r>
           </w:p>
           <w:p>
@@ -1392,7 +1365,15 @@
                 <w:color w:val="0A1128"/>
                 <w:sz w:val="18"/>
               </w:rPr>
-              <w:t>Aviation Security Officer (AVSEC)</w:t>
+              <w:t xml:space="preserve">Aviation Security </w:t>
+            </w:r>
+            <w:r>
+              <w:rPr>
+                <w:b/>
+                <w:color w:val="0A1128"/>
+                <w:sz w:val="18"/>
+              </w:rPr>
+              <w:t>Officer (AVSEC)</w:t>
             </w:r>
             <w:r>
               <w:rPr>
@@ -1463,15 +1444,7 @@
                 <w:color w:val="0A1128"/>
                 <w:sz w:val="20"/>
               </w:rPr>
-              <w:t>EDUCATION &amp;</w:t>
-            </w:r>
-            <w:r>
-              <w:rPr>
-                <w:b/>
-                <w:color w:val="0A1128"/>
-                <w:sz w:val="20"/>
-              </w:rPr>
-              <w:t xml:space="preserve"> CERTIFICATIONS</w:t>
+              <w:t>EDUCATION &amp; CERTIFICATIONS</w:t>
             </w:r>
           </w:p>
           <w:p>
@@ -1553,14 +1526,14 @@
                 <w:color w:val="334155"/>
                 <w:sz w:val="15"/>
               </w:rPr>
-              <w:t>ML &amp; Bayesian Statistics, Data Engineering &amp; Neo4j, Computer V</w:t>
+              <w:t>ML &amp; Bayesian Statistics, Data Engineering &amp; Neo4j, Computer Vision &amp; Robotics, Ethics &amp; Cyberse</w:t>
             </w:r>
             <w:r>
               <w:rPr>
                 <w:color w:val="334155"/>
                 <w:sz w:val="15"/>
               </w:rPr>
-              <w:t>ision &amp; Robotics, Ethics &amp; Cybersecurity, Production MLOps.</w:t>
+              <w:t>curity, Production MLOps.</w:t>
             </w:r>
           </w:p>
           <w:p>
@@ -1623,14 +1596,7 @@
                 <w:color w:val="334155"/>
                 <w:sz w:val="15"/>
               </w:rPr>
-              <w:t xml:space="preserve">Structural calculations (BAEL 91), quantity surveying, construction project management — </w:t>
-            </w:r>
-            <w:r>
-              <w:rPr>
-                <w:color w:val="334155"/>
-                <w:sz w:val="15"/>
-              </w:rPr>
-              <w:t>AI-applied estimation base.</w:t>
+              <w:t>Structural calculations (BAEL 91), quantity surveying, construction project management — AI-applied estimation base.</w:t>
             </w:r>
           </w:p>
           <w:p>
@@ -1651,7 +1617,15 @@
                 <w:color w:val="0A1128"/>
                 <w:sz w:val="20"/>
               </w:rPr>
-              <w:t>HONORS &amp; APPLIED AI DISTINCTIONS</w:t>
+              <w:t xml:space="preserve">HONORS &amp; </w:t>
+            </w:r>
+            <w:r>
+              <w:rPr>
+                <w:b/>
+                <w:color w:val="0A1128"/>
+                <w:sz w:val="20"/>
+              </w:rPr>
+              <w:t>APPLIED AI DISTINCTIONS</w:t>
             </w:r>
           </w:p>
           <w:p>
@@ -1701,20 +1675,19 @@
                 <w:b/>
                 <w:color w:val="0A1128"/>
               </w:rPr>
-              <w:t>◈ Google Cloud #AllThi</w:t>
-            </w:r>
-            <w:r>
-              <w:rPr>
-                <w:b/>
-                <w:color w:val="0A1128"/>
-              </w:rPr>
-              <w:t xml:space="preserve">ngsAgentic Hackathon: </w:t>
+              <w:t xml:space="preserve">◈ Google Cloud #AllThingsAgentic Hackathon: </w:t>
             </w:r>
             <w:r>
               <w:rPr>
                 <w:color w:val="334155"/>
               </w:rPr>
-              <w:t>Dataset Automator v4.0 (Google Antigravity, TabFM, bigframes, WIT, MCT).</w:t>
+              <w:t xml:space="preserve">Dataset Automator </w:t>
+            </w:r>
+            <w:r>
+              <w:rPr>
+                <w:color w:val="334155"/>
+              </w:rPr>
+              <w:t>v4.0 (Google Antigravity, TabFM, bigframes, WIT, MCT).</w:t>
             </w:r>
           </w:p>
         </w:tc>
@@ -14341,7 +14314,7 @@
 </file>
 
 <file path=customXml/itemProps1.xml><?xml version="1.0" encoding="utf-8"?>
-<ds:datastoreItem xmlns:ds="http://schemas.openxmlformats.org/officeDocument/2006/customXml" ds:itemID="{9CEE48D7-0CF9-464E-87A4-0AFBAED36FF2}">
+<ds:datastoreItem xmlns:ds="http://schemas.openxmlformats.org/officeDocument/2006/customXml" ds:itemID="{C04AE1F9-7A2A-4435-9179-172D60E29E57}">
   <ds:schemaRefs>
     <ds:schemaRef ds:uri="http://schemas.openxmlformats.org/officeDocument/2006/bibliography"/>
   </ds:schemaRefs>

</xml_diff>

<commit_message>
cv: enlarge right column typography and enrich content to fill A4 bottom space, 1-page verified (FR & EN)
</commit_message>
<xml_diff>
--- a/KOA_MARIE_GERVAIS_NELLY_CV_EN.docx
+++ b/KOA_MARIE_GERVAIS_NELLY_CV_EN.docx
@@ -773,15 +773,15 @@
             <w:tcW w:w="8165" w:type="dxa"/>
             <w:shd w:val="clear" w:color="auto" w:fill="FFFFFF"/>
             <w:tcMar>
-              <w:top w:w="260" w:type="dxa"/>
-              <w:left w:w="280" w:type="dxa"/>
-              <w:bottom w:w="230" w:type="dxa"/>
-              <w:right w:w="300" w:type="dxa"/>
+              <w:top w:w="240" w:type="dxa"/>
+              <w:left w:w="260" w:type="dxa"/>
+              <w:bottom w:w="180" w:type="dxa"/>
+              <w:right w:w="280" w:type="dxa"/>
             </w:tcMar>
           </w:tcPr>
           <w:p>
             <w:pPr>
-              <w:spacing w:after="30"/>
+              <w:spacing w:after="20"/>
             </w:pPr>
             <w:r>
               <w:rPr>
@@ -794,7 +794,7 @@
           </w:p>
           <w:p>
             <w:pPr>
-              <w:spacing w:after="30"/>
+              <w:spacing w:after="20"/>
             </w:pPr>
             <w:r>
               <w:rPr>
@@ -807,7 +807,7 @@
           </w:p>
           <w:p>
             <w:pPr>
-              <w:spacing w:after="70"/>
+              <w:spacing w:after="50"/>
             </w:pPr>
             <w:r>
               <w:rPr>
@@ -826,7 +826,7 @@
           </w:p>
           <w:p>
             <w:pPr>
-              <w:spacing w:before="76" w:after="8"/>
+              <w:spacing w:before="64" w:after="4"/>
             </w:pPr>
             <w:r>
               <w:rPr>
@@ -847,7 +847,7 @@
           </w:p>
           <w:p>
             <w:pPr>
-              <w:spacing w:after="36"/>
+              <w:spacing w:after="28"/>
             </w:pPr>
             <w:r>
               <w:rPr>
@@ -866,7 +866,7 @@
           </w:p>
           <w:p>
             <w:pPr>
-              <w:spacing w:after="32" w:line="271" w:lineRule="auto"/>
+              <w:spacing w:after="30" w:line="264" w:lineRule="auto"/>
             </w:pPr>
             <w:r>
               <w:rPr>
@@ -889,7 +889,7 @@
           </w:p>
           <w:p>
             <w:pPr>
-              <w:spacing w:before="76" w:after="8"/>
+              <w:spacing w:before="64" w:after="4"/>
             </w:pPr>
             <w:r>
               <w:rPr>
@@ -910,7 +910,7 @@
           </w:p>
           <w:p>
             <w:pPr>
-              <w:spacing w:after="36"/>
+              <w:spacing w:after="28"/>
             </w:pPr>
             <w:r>
               <w:rPr>
@@ -929,7 +929,7 @@
           </w:p>
           <w:p>
             <w:pPr>
-              <w:spacing w:before="50" w:after="6"/>
+              <w:spacing w:before="44" w:after="4"/>
             </w:pPr>
             <w:r>
               <w:rPr>
@@ -943,21 +943,19 @@
               <w:rPr>
                 <w:i/>
                 <w:color w:val="0284C7"/>
-                <w:sz w:val="15"/>
               </w:rPr>
               <w:t xml:space="preserve">   —   Agentic AI SaaS &amp; 5D BIM</w:t>
             </w:r>
           </w:p>
           <w:p>
             <w:pPr>
-              <w:spacing w:after="14" w:line="264" w:lineRule="auto"/>
+              <w:spacing w:after="12" w:line="259" w:lineRule="auto"/>
               <w:ind w:left="144"/>
             </w:pPr>
             <w:r>
               <w:rPr>
                 <w:b/>
                 <w:color w:val="0284C7"/>
-                <w:sz w:val="15"/>
               </w:rPr>
               <w:t>▸</w:t>
             </w:r>
@@ -965,35 +963,31 @@
               <w:rPr>
                 <w:b/>
                 <w:color w:val="0284C7"/>
-                <w:sz w:val="15"/>
               </w:rPr>
               <w:t xml:space="preserve">  </w:t>
             </w:r>
             <w:r>
               <w:rPr>
                 <w:color w:val="334155"/>
-                <w:sz w:val="15"/>
               </w:rPr>
               <w:t xml:space="preserve">Official Applicant Google Africa Applied AI </w:t>
             </w:r>
             <w:r>
               <w:rPr>
                 <w:color w:val="334155"/>
-                <w:sz w:val="15"/>
               </w:rPr>
               <w:t>Lab. Built with Google Antigravity (Gemma 4 12B, Gemini 2.5, BAEL 91).</w:t>
             </w:r>
           </w:p>
           <w:p>
             <w:pPr>
-              <w:spacing w:after="14" w:line="264" w:lineRule="auto"/>
+              <w:spacing w:after="12" w:line="259" w:lineRule="auto"/>
               <w:ind w:left="144"/>
             </w:pPr>
             <w:r>
               <w:rPr>
                 <w:b/>
                 <w:color w:val="0284C7"/>
-                <w:sz w:val="15"/>
               </w:rPr>
               <w:t>▸</w:t>
             </w:r>
@@ -1001,21 +995,51 @@
               <w:rPr>
                 <w:b/>
                 <w:color w:val="0284C7"/>
-                <w:sz w:val="15"/>
               </w:rPr>
               <w:t xml:space="preserve">  </w:t>
             </w:r>
             <w:r>
               <w:rPr>
                 <w:color w:val="334155"/>
-                <w:sz w:val="15"/>
               </w:rPr>
               <w:t>Automated Excel BOQs in &lt;45s (–99.2% time, MLflow R²=0.9872) and 3D renders via Imagen 3 + ControlNet.</w:t>
             </w:r>
           </w:p>
           <w:p>
             <w:pPr>
-              <w:spacing w:before="50" w:after="6"/>
+              <w:spacing w:after="12" w:line="259" w:lineRule="auto"/>
+              <w:ind w:left="144"/>
+            </w:pPr>
+            <w:r>
+              <w:rPr>
+                <w:b/>
+                <w:color w:val="0284C7"/>
+              </w:rPr>
+              <w:t>▸</w:t>
+            </w:r>
+            <w:r>
+              <w:rPr>
+                <w:b/>
+                <w:color w:val="0284C7"/>
+              </w:rPr>
+              <w:t xml:space="preserve">  </w:t>
+            </w:r>
+            <w:r>
+              <w:rPr>
+                <w:color w:val="334155"/>
+              </w:rPr>
+              <w:t>IfcOpenShell integration for 5D BIM models: automated costing &amp; scheduling v</w:t>
+            </w:r>
+            <w:r>
+              <w:rPr>
+                <w:color w:val="334155"/>
+              </w:rPr>
+              <w:t>ia LangGraph agents.</w:t>
+            </w:r>
+          </w:p>
+          <w:p>
+            <w:pPr>
+              <w:spacing w:before="44" w:after="4"/>
             </w:pPr>
             <w:r>
               <w:rPr>
@@ -1029,29 +1053,19 @@
               <w:rPr>
                 <w:i/>
                 <w:color w:val="0284C7"/>
-                <w:sz w:val="15"/>
-              </w:rPr>
-              <w:t xml:space="preserve">   —   Sovereign Multi-Agent AI, WikiSkills &amp; OKF Certifica</w:t>
-            </w:r>
-            <w:r>
-              <w:rPr>
-                <w:i/>
-                <w:color w:val="0284C7"/>
-                <w:sz w:val="15"/>
-              </w:rPr>
-              <w:t>tion</w:t>
+              </w:rPr>
+              <w:t xml:space="preserve">   —   Sovereign Multi-Agent AI, WikiSkills &amp; OKF Certification</w:t>
             </w:r>
           </w:p>
           <w:p>
             <w:pPr>
-              <w:spacing w:after="14" w:line="264" w:lineRule="auto"/>
+              <w:spacing w:after="12" w:line="259" w:lineRule="auto"/>
               <w:ind w:left="144"/>
             </w:pPr>
             <w:r>
               <w:rPr>
                 <w:b/>
                 <w:color w:val="0284C7"/>
-                <w:sz w:val="15"/>
               </w:rPr>
               <w:t>▸</w:t>
             </w:r>
@@ -1059,28 +1073,25 @@
               <w:rPr>
                 <w:b/>
                 <w:color w:val="0284C7"/>
-                <w:sz w:val="15"/>
               </w:rPr>
               <w:t xml:space="preserve">  </w:t>
             </w:r>
             <w:r>
               <w:rPr>
                 <w:color w:val="334155"/>
-                <w:sz w:val="15"/>
               </w:rPr>
               <w:t>Sovereign DMI system (Univ. of Ngaoundéré): 470 theses, 19 M1 projects, 1,366 Neo4j nodes.</w:t>
             </w:r>
           </w:p>
           <w:p>
             <w:pPr>
-              <w:spacing w:after="14" w:line="264" w:lineRule="auto"/>
+              <w:spacing w:after="12" w:line="259" w:lineRule="auto"/>
               <w:ind w:left="144"/>
             </w:pPr>
             <w:r>
               <w:rPr>
                 <w:b/>
                 <w:color w:val="0284C7"/>
-                <w:sz w:val="15"/>
               </w:rPr>
               <w:t>▸</w:t>
             </w:r>
@@ -1088,21 +1099,25 @@
               <w:rPr>
                 <w:b/>
                 <w:color w:val="0284C7"/>
-                <w:sz w:val="15"/>
               </w:rPr>
               <w:t xml:space="preserve">  </w:t>
             </w:r>
             <w:r>
               <w:rPr>
                 <w:color w:val="334155"/>
-                <w:sz w:val="15"/>
-              </w:rPr>
-              <w:t>6 LangGraph agents orchestrated via WikiSkills (critic anti-hallucination, Cypher optimizer), RRF k=60, SHA-256 No-LLM (100%).</w:t>
+              </w:rPr>
+              <w:t>6 LangGraph agents orchestrated via WikiSkills (critic</w:t>
+            </w:r>
+            <w:r>
+              <w:rPr>
+                <w:color w:val="334155"/>
+              </w:rPr>
+              <w:t xml:space="preserve"> anti-hallucination, Cypher optimizer), RRF k=60, SHA-256 No-LLM (100%).</w:t>
             </w:r>
           </w:p>
           <w:p>
             <w:pPr>
-              <w:spacing w:before="50" w:after="6"/>
+              <w:spacing w:before="44" w:after="4"/>
             </w:pPr>
             <w:r>
               <w:rPr>
@@ -1116,29 +1131,19 @@
               <w:rPr>
                 <w:i/>
                 <w:color w:val="0284C7"/>
-                <w:sz w:val="15"/>
-              </w:rPr>
-              <w:t xml:space="preserve">   —   </w:t>
-            </w:r>
-            <w:r>
-              <w:rPr>
-                <w:i/>
-                <w:color w:val="0284C7"/>
-                <w:sz w:val="15"/>
-              </w:rPr>
-              <w:t>Enterprise Security &amp; Agentic BI</w:t>
+              </w:rPr>
+              <w:t xml:space="preserve">   —   Enterprise Security &amp; Agentic BI</w:t>
             </w:r>
           </w:p>
           <w:p>
             <w:pPr>
-              <w:spacing w:after="14" w:line="264" w:lineRule="auto"/>
+              <w:spacing w:after="12" w:line="259" w:lineRule="auto"/>
               <w:ind w:left="144"/>
             </w:pPr>
             <w:r>
               <w:rPr>
                 <w:b/>
                 <w:color w:val="0284C7"/>
-                <w:sz w:val="15"/>
               </w:rPr>
               <w:t>▸</w:t>
             </w:r>
@@ -1146,21 +1151,51 @@
               <w:rPr>
                 <w:b/>
                 <w:color w:val="0284C7"/>
-                <w:sz w:val="15"/>
               </w:rPr>
               <w:t xml:space="preserve">  </w:t>
             </w:r>
             <w:r>
               <w:rPr>
                 <w:color w:val="334155"/>
-                <w:sz w:val="15"/>
               </w:rPr>
               <w:t>NL-to-SQL/Graph engine (PostgreSQL pgvector, Neo4j N10S, &lt;5s latency) with ABAC guardrails + SHAP Sentinel.</w:t>
             </w:r>
           </w:p>
           <w:p>
             <w:pPr>
-              <w:spacing w:before="50" w:after="6"/>
+              <w:spacing w:after="12" w:line="259" w:lineRule="auto"/>
+              <w:ind w:left="144"/>
+            </w:pPr>
+            <w:r>
+              <w:rPr>
+                <w:b/>
+                <w:color w:val="0284C7"/>
+              </w:rPr>
+              <w:t>▸</w:t>
+            </w:r>
+            <w:r>
+              <w:rPr>
+                <w:b/>
+                <w:color w:val="0284C7"/>
+              </w:rPr>
+              <w:t xml:space="preserve">  </w:t>
+            </w:r>
+            <w:r>
+              <w:rPr>
+                <w:color w:val="334155"/>
+              </w:rPr>
+              <w:t>Interacti</w:t>
+            </w:r>
+            <w:r>
+              <w:rPr>
+                <w:color w:val="334155"/>
+              </w:rPr>
+              <w:t>ve executive dashboards via Streamlit &amp; FastAPI — deployed on sovereign Docker cloud.</w:t>
+            </w:r>
+          </w:p>
+          <w:p>
+            <w:pPr>
+              <w:spacing w:before="44" w:after="4"/>
             </w:pPr>
             <w:r>
               <w:rPr>
@@ -1174,21 +1209,19 @@
               <w:rPr>
                 <w:i/>
                 <w:color w:val="0284C7"/>
-                <w:sz w:val="15"/>
               </w:rPr>
               <w:t xml:space="preserve">   —   MLOps Pipeline &amp; Climate AI Impact</w:t>
             </w:r>
           </w:p>
           <w:p>
             <w:pPr>
-              <w:spacing w:after="14" w:line="264" w:lineRule="auto"/>
+              <w:spacing w:after="12" w:line="259" w:lineRule="auto"/>
               <w:ind w:left="144"/>
             </w:pPr>
             <w:r>
               <w:rPr>
                 <w:b/>
                 <w:color w:val="0284C7"/>
-                <w:sz w:val="15"/>
               </w:rPr>
               <w:t>▸</w:t>
             </w:r>
@@ -1196,35 +1229,31 @@
               <w:rPr>
                 <w:b/>
                 <w:color w:val="0284C7"/>
-                <w:sz w:val="15"/>
               </w:rPr>
               <w:t xml:space="preserve">  </w:t>
             </w:r>
             <w:r>
               <w:rPr>
                 <w:color w:val="334155"/>
-                <w:sz w:val="15"/>
-              </w:rPr>
-              <w:t>Dataset Automator: Google Antigravity</w:t>
+              </w:rPr>
+              <w:t>Dataset Automator: Google Antigravity (Google Cloud Hackathon) — TabFM, BigQuery DataFrames, EU</w:t>
             </w:r>
             <w:r>
               <w:rPr>
                 <w:color w:val="334155"/>
-                <w:sz w:val="15"/>
-              </w:rPr>
-              <w:t xml:space="preserve"> (Google Cloud Hackathon) — TabFM, BigQuery DataFrames, EU AI Act.</w:t>
+              </w:rPr>
+              <w:t xml:space="preserve"> AI Act.</w:t>
             </w:r>
           </w:p>
           <w:p>
             <w:pPr>
-              <w:spacing w:after="14" w:line="264" w:lineRule="auto"/>
+              <w:spacing w:after="12" w:line="259" w:lineRule="auto"/>
               <w:ind w:left="144"/>
             </w:pPr>
             <w:r>
               <w:rPr>
                 <w:b/>
                 <w:color w:val="0284C7"/>
-                <w:sz w:val="15"/>
               </w:rPr>
               <w:t>▸</w:t>
             </w:r>
@@ -1232,21 +1261,19 @@
               <w:rPr>
                 <w:b/>
                 <w:color w:val="0284C7"/>
-                <w:sz w:val="15"/>
               </w:rPr>
               <w:t xml:space="preserve">  </w:t>
             </w:r>
             <w:r>
               <w:rPr>
                 <w:color w:val="334155"/>
-                <w:sz w:val="15"/>
               </w:rPr>
               <w:t>VigieSahel: –35% crop loss, +14d epidemic forecast (XGBoost R²&gt;94%, Supabase, MLflow).</w:t>
             </w:r>
           </w:p>
           <w:p>
             <w:pPr>
-              <w:spacing w:before="76" w:after="8"/>
+              <w:spacing w:before="64" w:after="4"/>
             </w:pPr>
             <w:r>
               <w:rPr>
@@ -1267,7 +1294,7 @@
           </w:p>
           <w:p>
             <w:pPr>
-              <w:spacing w:after="36"/>
+              <w:spacing w:after="28"/>
             </w:pPr>
             <w:r>
               <w:rPr>
@@ -1286,7 +1313,7 @@
           </w:p>
           <w:p>
             <w:pPr>
-              <w:spacing w:before="50" w:after="6"/>
+              <w:spacing w:before="44" w:after="4"/>
             </w:pPr>
             <w:r>
               <w:rPr>
@@ -1294,48 +1321,134 @@
                 <w:color w:val="0A1128"/>
                 <w:sz w:val="18"/>
               </w:rPr>
-              <w:t>AI Lead &amp;</w:t>
-            </w:r>
+              <w:t>AI Lead &amp; Data Science Consultant</w:t>
+            </w:r>
+            <w:r>
+              <w:rPr>
+                <w:i/>
+                <w:color w:val="0284C7"/>
+              </w:rPr>
+              <w:t xml:space="preserve">   —   2025 – Present</w:t>
+            </w:r>
+          </w:p>
+          <w:p>
+            <w:pPr>
+              <w:spacing w:after="4"/>
+            </w:pPr>
+            <w:r>
+              <w:rPr>
+                <w:b/>
+                <w:color w:val="64748B"/>
+              </w:rPr>
+              <w:t xml:space="preserve">Independent </w:t>
+            </w:r>
+            <w:r>
+              <w:rPr>
+                <w:b/>
+                <w:color w:val="64748B"/>
+              </w:rPr>
+              <w:t>Projects &amp; Enterprises  │  Douala, CM</w:t>
+            </w:r>
+          </w:p>
+          <w:p>
+            <w:pPr>
+              <w:spacing w:after="12" w:line="259" w:lineRule="auto"/>
+              <w:ind w:left="144"/>
+            </w:pPr>
+            <w:r>
+              <w:rPr>
+                <w:b/>
+                <w:color w:val="0284C7"/>
+              </w:rPr>
+              <w:t>▸</w:t>
+            </w:r>
+            <w:r>
+              <w:rPr>
+                <w:b/>
+                <w:color w:val="0284C7"/>
+              </w:rPr>
+              <w:t xml:space="preserve">  </w:t>
+            </w:r>
+            <w:r>
+              <w:rPr>
+                <w:color w:val="334155"/>
+              </w:rPr>
+              <w:t>Ethical sovereign AI systems: GraphRAG Neo4j pipelines, high-dimensional EDA, multi-source RAG architectures.</w:t>
+            </w:r>
+          </w:p>
+          <w:p>
+            <w:pPr>
+              <w:spacing w:after="12" w:line="259" w:lineRule="auto"/>
+              <w:ind w:left="144"/>
+            </w:pPr>
+            <w:r>
+              <w:rPr>
+                <w:b/>
+                <w:color w:val="0284C7"/>
+              </w:rPr>
+              <w:t>▸</w:t>
+            </w:r>
+            <w:r>
+              <w:rPr>
+                <w:b/>
+                <w:color w:val="0284C7"/>
+              </w:rPr>
+              <w:t xml:space="preserve">  </w:t>
+            </w:r>
+            <w:r>
+              <w:rPr>
+                <w:color w:val="334155"/>
+              </w:rPr>
+              <w:t xml:space="preserve">Executive decision reporting, automated KPI dashboards, and SHAP explainability audits for African </w:t>
+            </w:r>
+            <w:r>
+              <w:rPr>
+                <w:color w:val="334155"/>
+              </w:rPr>
+              <w:t>SMEs.</w:t>
+            </w:r>
+          </w:p>
+          <w:p>
+            <w:pPr>
+              <w:spacing w:before="44" w:after="4"/>
+            </w:pPr>
             <w:r>
               <w:rPr>
                 <w:b/>
                 <w:color w:val="0A1128"/>
                 <w:sz w:val="18"/>
               </w:rPr>
-              <w:t xml:space="preserve"> Data Science Consultant</w:t>
+              <w:t>Aviation Security Officer (AVSEC)</w:t>
             </w:r>
             <w:r>
               <w:rPr>
                 <w:i/>
                 <w:color w:val="0284C7"/>
-                <w:sz w:val="15"/>
-              </w:rPr>
-              <w:t xml:space="preserve">   —   2025 – Present</w:t>
+              </w:rPr>
+              <w:t xml:space="preserve">   —   2018 – Present</w:t>
             </w:r>
           </w:p>
           <w:p>
             <w:pPr>
-              <w:spacing w:after="6"/>
+              <w:spacing w:after="4"/>
             </w:pPr>
             <w:r>
               <w:rPr>
                 <w:b/>
                 <w:color w:val="64748B"/>
-                <w:sz w:val="15"/>
-              </w:rPr>
-              <w:t>Independent Projects &amp; Enterprises  │  Douala, CM</w:t>
+              </w:rPr>
+              <w:t>CCAA — Cameroon Civil Aviation Authority  │  Douala, CM</w:t>
             </w:r>
           </w:p>
           <w:p>
             <w:pPr>
-              <w:spacing w:after="14" w:line="264" w:lineRule="auto"/>
+              <w:spacing w:after="12" w:line="259" w:lineRule="auto"/>
               <w:ind w:left="144"/>
             </w:pPr>
             <w:r>
               <w:rPr>
                 <w:b/>
                 <w:color w:val="0284C7"/>
-                <w:sz w:val="15"/>
               </w:rPr>
               <w:t>▸</w:t>
             </w:r>
@@ -1343,21 +1456,91 @@
               <w:rPr>
                 <w:b/>
                 <w:color w:val="0284C7"/>
-                <w:sz w:val="15"/>
               </w:rPr>
               <w:t xml:space="preserve">  </w:t>
             </w:r>
             <w:r>
               <w:rPr>
                 <w:color w:val="334155"/>
-                <w:sz w:val="15"/>
-              </w:rPr>
-              <w:t>Ethical sovereign AI systems: GraphRAG Neo4j pipelines, high-dimensional EDA, multi-source RAG architectures and executive KPI dashboards.</w:t>
+              </w:rPr>
+              <w:t>Threat assessment, secure access control, and regulatory compliance audits (ICAO Annex 17).</w:t>
             </w:r>
           </w:p>
           <w:p>
             <w:pPr>
-              <w:spacing w:before="50" w:after="6"/>
+              <w:spacing w:after="12" w:line="259" w:lineRule="auto"/>
+              <w:ind w:left="144"/>
+            </w:pPr>
+            <w:r>
+              <w:rPr>
+                <w:b/>
+                <w:color w:val="0284C7"/>
+              </w:rPr>
+              <w:t>▸</w:t>
+            </w:r>
+            <w:r>
+              <w:rPr>
+                <w:b/>
+                <w:color w:val="0284C7"/>
+              </w:rPr>
+              <w:t xml:space="preserve">  </w:t>
+            </w:r>
+            <w:r>
+              <w:rPr>
+                <w:color w:val="334155"/>
+              </w:rPr>
+              <w:t xml:space="preserve">Operational crisis management: emergency </w:t>
+            </w:r>
+            <w:r>
+              <w:rPr>
+                <w:color w:val="334155"/>
+              </w:rPr>
+              <w:t>team coordination, anti-intrusion protocols.</w:t>
+            </w:r>
+          </w:p>
+          <w:p>
+            <w:pPr>
+              <w:spacing w:before="64" w:after="4"/>
+            </w:pPr>
+            <w:r>
+              <w:rPr>
+                <w:b/>
+                <w:color w:val="0284C7"/>
+                <w:sz w:val="17"/>
+              </w:rPr>
+              <w:t xml:space="preserve">◈  </w:t>
+            </w:r>
+            <w:r>
+              <w:rPr>
+                <w:b/>
+                <w:color w:val="0A1128"/>
+                <w:sz w:val="20"/>
+              </w:rPr>
+              <w:t>EDUCATION &amp; CERTIFICATIONS</w:t>
+            </w:r>
+          </w:p>
+          <w:p>
+            <w:pPr>
+              <w:spacing w:after="28"/>
+            </w:pPr>
+            <w:r>
+              <w:rPr>
+                <w:color w:val="0284C7"/>
+                <w:sz w:val="9"/>
+              </w:rPr>
+              <w:t>━━━━━━━━━━━━━━━━━━</w:t>
+            </w:r>
+            <w:r>
+              <w:rPr>
+                <w:color w:val="38BDF8"/>
+                <w:sz w:val="9"/>
+              </w:rPr>
+              <w:t>────────────────────────────────────────────</w:t>
+            </w:r>
+          </w:p>
+          <w:p>
+            <w:pPr>
+              <w:spacing w:before="44" w:after="4"/>
             </w:pPr>
             <w:r>
               <w:rPr>
@@ -1365,48 +1548,135 @@
                 <w:color w:val="0A1128"/>
                 <w:sz w:val="18"/>
               </w:rPr>
-              <w:t xml:space="preserve">Aviation Security </w:t>
-            </w:r>
+              <w:t>M.Sc. in Applied Artificial Intelligence</w:t>
+            </w:r>
+            <w:r>
+              <w:rPr>
+                <w:i/>
+                <w:color w:val="0284C7"/>
+              </w:rPr>
+              <w:t xml:space="preserve">   —   2025 – 2027  [In Progress]</w:t>
+            </w:r>
+          </w:p>
+          <w:p>
+            <w:pPr>
+              <w:spacing w:after="4"/>
+            </w:pPr>
+            <w:r>
+              <w:rPr>
+                <w:b/>
+                <w:color w:val="64748B"/>
+              </w:rPr>
+              <w:t>University of Ngaoundéré  │  Cameroon</w:t>
+            </w:r>
+          </w:p>
+          <w:p>
+            <w:pPr>
+              <w:spacing w:after="12" w:line="259" w:lineRule="auto"/>
+              <w:ind w:left="144"/>
+            </w:pPr>
+            <w:r>
+              <w:rPr>
+                <w:b/>
+                <w:color w:val="0284C7"/>
+              </w:rPr>
+              <w:t>▸</w:t>
+            </w:r>
+            <w:r>
+              <w:rPr>
+                <w:b/>
+                <w:color w:val="0284C7"/>
+              </w:rPr>
+              <w:t xml:space="preserve">  </w:t>
+            </w:r>
+            <w:r>
+              <w:rPr>
+                <w:color w:val="334155"/>
+              </w:rPr>
+              <w:t xml:space="preserve">ML </w:t>
+            </w:r>
+            <w:r>
+              <w:rPr>
+                <w:color w:val="334155"/>
+              </w:rPr>
+              <w:t>&amp; Bayesian Statistics, Data Engineering &amp; Neo4j, Computer Vision &amp; Robotics, Ethics &amp; Cybersecurity, Production MLOps.</w:t>
+            </w:r>
+          </w:p>
+          <w:p>
+            <w:pPr>
+              <w:spacing w:after="12" w:line="259" w:lineRule="auto"/>
+              <w:ind w:left="144"/>
+            </w:pPr>
+            <w:r>
+              <w:rPr>
+                <w:b/>
+                <w:color w:val="0284C7"/>
+              </w:rPr>
+              <w:t>▸</w:t>
+            </w:r>
+            <w:r>
+              <w:rPr>
+                <w:b/>
+                <w:color w:val="0284C7"/>
+              </w:rPr>
+              <w:t xml:space="preserve">  </w:t>
+            </w:r>
+            <w:r>
+              <w:rPr>
+                <w:color w:val="334155"/>
+              </w:rPr>
+              <w:t>Research project: K1-MATHINFO v3 sovereign system — multi-source agent certified OKF v0.2 (SHA-256 No-LLM).</w:t>
+            </w:r>
+          </w:p>
+          <w:p>
+            <w:pPr>
+              <w:spacing w:before="44" w:after="4"/>
+            </w:pPr>
             <w:r>
               <w:rPr>
                 <w:b/>
                 <w:color w:val="0A1128"/>
                 <w:sz w:val="18"/>
               </w:rPr>
-              <w:t>Officer (AVSEC)</w:t>
+              <w:t>B.Sc. in Civil Engineering</w:t>
+            </w:r>
+            <w:r>
+              <w:rPr>
+                <w:b/>
+                <w:color w:val="0A1128"/>
+                <w:sz w:val="18"/>
+              </w:rPr>
+              <w:t xml:space="preserve"> (Building Option)</w:t>
             </w:r>
             <w:r>
               <w:rPr>
                 <w:i/>
                 <w:color w:val="0284C7"/>
-                <w:sz w:val="15"/>
-              </w:rPr>
-              <w:t xml:space="preserve">   —   2018 – Present</w:t>
+              </w:rPr>
+              <w:t xml:space="preserve">   —   2015 – 2016</w:t>
             </w:r>
           </w:p>
           <w:p>
             <w:pPr>
-              <w:spacing w:after="6"/>
+              <w:spacing w:after="4"/>
             </w:pPr>
             <w:r>
               <w:rPr>
                 <w:b/>
                 <w:color w:val="64748B"/>
-                <w:sz w:val="15"/>
-              </w:rPr>
-              <w:t>CCAA — Cameroon Civil Aviation Authority  │  Douala, CM</w:t>
+              </w:rPr>
+              <w:t>ISTDI / IUC Douala  │  Cameroon</w:t>
             </w:r>
           </w:p>
           <w:p>
             <w:pPr>
-              <w:spacing w:after="14" w:line="264" w:lineRule="auto"/>
+              <w:spacing w:after="12" w:line="259" w:lineRule="auto"/>
               <w:ind w:left="144"/>
             </w:pPr>
             <w:r>
               <w:rPr>
                 <w:b/>
                 <w:color w:val="0284C7"/>
-                <w:sz w:val="15"/>
               </w:rPr>
               <w:t>▸</w:t>
             </w:r>
@@ -1414,21 +1684,19 @@
               <w:rPr>
                 <w:b/>
                 <w:color w:val="0284C7"/>
-                <w:sz w:val="15"/>
               </w:rPr>
               <w:t xml:space="preserve">  </w:t>
             </w:r>
             <w:r>
               <w:rPr>
                 <w:color w:val="334155"/>
-                <w:sz w:val="15"/>
-              </w:rPr>
-              <w:t>Threat assessment, secure access control, and regulatory compliance audits (ICAO Annex 17).</w:t>
+              </w:rPr>
+              <w:t>Structural calculations (BAEL 91), quantity surveying, construction project management — AI-applied estimation base.</w:t>
             </w:r>
           </w:p>
           <w:p>
             <w:pPr>
-              <w:spacing w:before="76" w:after="8"/>
+              <w:spacing w:before="64" w:after="4"/>
             </w:pPr>
             <w:r>
               <w:rPr>
@@ -1444,12 +1712,12 @@
                 <w:color w:val="0A1128"/>
                 <w:sz w:val="20"/>
               </w:rPr>
-              <w:t>EDUCATION &amp; CERTIFICATIONS</w:t>
+              <w:t>HONORS &amp; APPLIED AI DISTINCTIONS</w:t>
             </w:r>
           </w:p>
           <w:p>
             <w:pPr>
-              <w:spacing w:after="36"/>
+              <w:spacing w:after="28"/>
             </w:pPr>
             <w:r>
               <w:rPr>
@@ -1463,231 +1731,98 @@
                 <w:color w:val="38BDF8"/>
                 <w:sz w:val="9"/>
               </w:rPr>
-              <w:t>────────────────────────────────────────────</w:t>
+              <w:t>─────────────</w:t>
+            </w:r>
+            <w:r>
+              <w:rPr>
+                <w:color w:val="38BDF8"/>
+                <w:sz w:val="9"/>
+              </w:rPr>
+              <w:t>───────────────────────────────</w:t>
             </w:r>
           </w:p>
           <w:p>
             <w:pPr>
-              <w:spacing w:before="50" w:after="6"/>
+              <w:spacing w:before="16" w:after="8" w:line="259" w:lineRule="auto"/>
+              <w:ind w:left="115"/>
             </w:pPr>
+            <w:r>
+              <w:rPr>
+                <w:b/>
+                <w:color w:val="0284C7"/>
+              </w:rPr>
+              <w:t xml:space="preserve">◈ </w:t>
+            </w:r>
             <w:r>
               <w:rPr>
                 <w:b/>
                 <w:color w:val="0A1128"/>
-                <w:sz w:val="18"/>
-              </w:rPr>
-              <w:t>M.Sc. in Applied Artificial Intelligence</w:t>
-            </w:r>
-            <w:r>
-              <w:rPr>
-                <w:i/>
-                <w:color w:val="0284C7"/>
-                <w:sz w:val="15"/>
-              </w:rPr>
-              <w:t xml:space="preserve">   —   2025 – 2027  [In Progress]</w:t>
+              </w:rPr>
+              <w:t>Google Africa Applied AI Lab (Accra, 2026)</w:t>
+            </w:r>
+            <w:r>
+              <w:rPr>
+                <w:color w:val="334155"/>
+              </w:rPr>
+              <w:t xml:space="preserve">  —  Official candidacy — Archi Cam AI platform (5D BIM + GenAI).</w:t>
             </w:r>
           </w:p>
           <w:p>
             <w:pPr>
-              <w:spacing w:after="6"/>
+              <w:spacing w:before="16" w:after="8" w:line="259" w:lineRule="auto"/>
+              <w:ind w:left="115"/>
             </w:pPr>
             <w:r>
               <w:rPr>
                 <w:b/>
-                <w:color w:val="64748B"/>
-                <w:sz w:val="15"/>
-              </w:rPr>
-              <w:t>University of Ngaoundéré  │  Cameroon</w:t>
+                <w:color w:val="0284C7"/>
+              </w:rPr>
+              <w:t xml:space="preserve">◈ </w:t>
+            </w:r>
+            <w:r>
+              <w:rPr>
+                <w:b/>
+                <w:color w:val="0A1128"/>
+              </w:rPr>
+              <w:t>Google Cloud #AllThingsAgentic Hackathon</w:t>
+            </w:r>
+            <w:r>
+              <w:rPr>
+                <w:color w:val="334155"/>
+              </w:rPr>
+              <w:t xml:space="preserve">  —  Dataset Automator v4.0 (Google Antigravity, TabFM, BigQuery DataFra</w:t>
+            </w:r>
+            <w:r>
+              <w:rPr>
+                <w:color w:val="334155"/>
+              </w:rPr>
+              <w:t>mes, WIT).</w:t>
             </w:r>
           </w:p>
           <w:p>
             <w:pPr>
-              <w:spacing w:after="14" w:line="264" w:lineRule="auto"/>
-              <w:ind w:left="144"/>
+              <w:spacing w:before="16" w:after="8" w:line="259" w:lineRule="auto"/>
+              <w:ind w:left="115"/>
             </w:pPr>
             <w:r>
               <w:rPr>
                 <w:b/>
                 <w:color w:val="0284C7"/>
-                <w:sz w:val="15"/>
-              </w:rPr>
-              <w:t>▸</w:t>
-            </w:r>
-            <w:r>
-              <w:rPr>
-                <w:b/>
-                <w:color w:val="0284C7"/>
-                <w:sz w:val="15"/>
-              </w:rPr>
-              <w:t xml:space="preserve">  </w:t>
-            </w:r>
-            <w:r>
-              <w:rPr>
-                <w:color w:val="334155"/>
-                <w:sz w:val="15"/>
-              </w:rPr>
-              <w:t>ML &amp; Bayesian Statistics, Data Engineering &amp; Neo4j, Computer Vision &amp; Robotics, Ethics &amp; Cyberse</w:t>
-            </w:r>
-            <w:r>
-              <w:rPr>
-                <w:color w:val="334155"/>
-                <w:sz w:val="15"/>
-              </w:rPr>
-              <w:t>curity, Production MLOps.</w:t>
-            </w:r>
-          </w:p>
-          <w:p>
-            <w:pPr>
-              <w:spacing w:before="50" w:after="6"/>
-            </w:pPr>
+              </w:rPr>
+              <w:t xml:space="preserve">◈ </w:t>
+            </w:r>
             <w:r>
               <w:rPr>
                 <w:b/>
                 <w:color w:val="0A1128"/>
-                <w:sz w:val="18"/>
-              </w:rPr>
-              <w:t>B.Sc. in Civil Engineering (Building Option)</w:t>
-            </w:r>
-            <w:r>
-              <w:rPr>
-                <w:i/>
-                <w:color w:val="0284C7"/>
-                <w:sz w:val="15"/>
-              </w:rPr>
-              <w:t xml:space="preserve">   —   2015 – 2016</w:t>
-            </w:r>
-          </w:p>
-          <w:p>
-            <w:pPr>
-              <w:spacing w:after="6"/>
-            </w:pPr>
-            <w:r>
-              <w:rPr>
-                <w:b/>
-                <w:color w:val="64748B"/>
-                <w:sz w:val="15"/>
-              </w:rPr>
-              <w:t>ISTDI / IUC Douala  │  Cameroon</w:t>
-            </w:r>
-          </w:p>
-          <w:p>
-            <w:pPr>
-              <w:spacing w:after="14" w:line="264" w:lineRule="auto"/>
-              <w:ind w:left="144"/>
-            </w:pPr>
-            <w:r>
-              <w:rPr>
-                <w:b/>
-                <w:color w:val="0284C7"/>
-                <w:sz w:val="15"/>
-              </w:rPr>
-              <w:t>▸</w:t>
-            </w:r>
-            <w:r>
-              <w:rPr>
-                <w:b/>
-                <w:color w:val="0284C7"/>
-                <w:sz w:val="15"/>
-              </w:rPr>
-              <w:t xml:space="preserve">  </w:t>
+              </w:rPr>
+              <w:t>Google Developer Program · Devpost</w:t>
             </w:r>
             <w:r>
               <w:rPr>
                 <w:color w:val="334155"/>
-                <w:sz w:val="15"/>
-              </w:rPr>
-              <w:t>Structural calculations (BAEL 91), quantity surveying, construction project management — AI-applied estimation base.</w:t>
-            </w:r>
-          </w:p>
-          <w:p>
-            <w:pPr>
-              <w:spacing w:before="76" w:after="8"/>
-            </w:pPr>
-            <w:r>
-              <w:rPr>
-                <w:b/>
-                <w:color w:val="0284C7"/>
-                <w:sz w:val="17"/>
-              </w:rPr>
-              <w:t xml:space="preserve">◈  </w:t>
-            </w:r>
-            <w:r>
-              <w:rPr>
-                <w:b/>
-                <w:color w:val="0A1128"/>
-                <w:sz w:val="20"/>
-              </w:rPr>
-              <w:t xml:space="preserve">HONORS &amp; </w:t>
-            </w:r>
-            <w:r>
-              <w:rPr>
-                <w:b/>
-                <w:color w:val="0A1128"/>
-                <w:sz w:val="20"/>
-              </w:rPr>
-              <w:t>APPLIED AI DISTINCTIONS</w:t>
-            </w:r>
-          </w:p>
-          <w:p>
-            <w:pPr>
-              <w:spacing w:after="36"/>
-            </w:pPr>
-            <w:r>
-              <w:rPr>
-                <w:color w:val="0284C7"/>
-                <w:sz w:val="9"/>
-              </w:rPr>
-              <w:t>━━━━━━━━━━━━━━━━━━</w:t>
-            </w:r>
-            <w:r>
-              <w:rPr>
-                <w:color w:val="38BDF8"/>
-                <w:sz w:val="9"/>
-              </w:rPr>
-              <w:t>────────────────────────────────────────────</w:t>
-            </w:r>
-          </w:p>
-          <w:p>
-            <w:pPr>
-              <w:spacing w:after="0" w:line="264" w:lineRule="auto"/>
-            </w:pPr>
-            <w:r>
-              <w:rPr>
-                <w:b/>
-                <w:color w:val="0A1128"/>
-              </w:rPr>
-              <w:t xml:space="preserve">◈ Google Africa Applied AI Lab (Accra, 2026): </w:t>
-            </w:r>
-            <w:r>
-              <w:rPr>
-                <w:color w:val="334155"/>
-              </w:rPr>
-              <w:t>Official candidacy — Archi Cam AI platform (5D BIM + GenAI).</w:t>
-            </w:r>
-            <w:r>
-              <w:rPr>
-                <w:color w:val="334155"/>
-              </w:rPr>
-              <w:br/>
-            </w:r>
-            <w:r>
-              <w:rPr>
-                <w:b/>
-                <w:color w:val="0A1128"/>
-              </w:rPr>
-              <w:t xml:space="preserve">◈ Google Cloud #AllThingsAgentic Hackathon: </w:t>
-            </w:r>
-            <w:r>
-              <w:rPr>
-                <w:color w:val="334155"/>
-              </w:rPr>
-              <w:t xml:space="preserve">Dataset Automator </w:t>
-            </w:r>
-            <w:r>
-              <w:rPr>
-                <w:color w:val="334155"/>
-              </w:rPr>
-              <w:t>v4.0 (Google Antigravity, TabFM, bigframes, WIT, MCT).</w:t>
+              </w:rPr>
+              <w:t xml:space="preserve">  —  Active member — AI open-source contributions, hackathons &amp; ambassador track.</w:t>
             </w:r>
           </w:p>
         </w:tc>
@@ -14314,7 +14449,7 @@
 </file>
 
 <file path=customXml/itemProps1.xml><?xml version="1.0" encoding="utf-8"?>
-<ds:datastoreItem xmlns:ds="http://schemas.openxmlformats.org/officeDocument/2006/customXml" ds:itemID="{C04AE1F9-7A2A-4435-9179-172D60E29E57}">
+<ds:datastoreItem xmlns:ds="http://schemas.openxmlformats.org/officeDocument/2006/customXml" ds:itemID="{052E3C10-8273-4BC6-98EB-675DDE7EE4B6}">
   <ds:schemaRefs>
     <ds:schemaRef ds:uri="http://schemas.openxmlformats.org/officeDocument/2006/bibliography"/>
   </ds:schemaRefs>

</xml_diff>

<commit_message>
feat: integrate official domain archicam-ai.com, pro email, and Google AICC honors across portfolio and 1-page CVs
</commit_message>
<xml_diff>
--- a/KOA_MARIE_GERVAIS_NELLY_CV_EN.docx
+++ b/KOA_MARIE_GERVAIS_NELLY_CV_EN.docx
@@ -142,7 +142,7 @@
                 <w:color w:val="F8FAFC"/>
                 <w:sz w:val="15"/>
               </w:rPr>
-              <w:t xml:space="preserve">  magenel85@gmail.com</w:t>
+              <w:t xml:space="preserve">  contact@archicam-ai.com</w:t>
             </w:r>
           </w:p>
           <w:p>
@@ -199,7 +199,7 @@
                 <w:color w:val="F8FAFC"/>
                 <w:sz w:val="15"/>
               </w:rPr>
-              <w:t xml:space="preserve">  github.com/gervais-afk</w:t>
+              <w:t xml:space="preserve">  archicam-ai.com</w:t>
             </w:r>
           </w:p>
           <w:p>
@@ -237,7 +237,7 @@
                 <w:color w:val="F8FAFC"/>
                 <w:sz w:val="15"/>
               </w:rPr>
-              <w:t xml:space="preserve">  devpost.com/magenel85</w:t>
+              <w:t xml:space="preserve">  github.com/gervais-afk</w:t>
             </w:r>
           </w:p>
           <w:p>
@@ -263,7 +263,7 @@
                 <w:color w:val="F8FAFC"/>
                 <w:sz w:val="15"/>
               </w:rPr>
-              <w:t>Google Developer Program</w:t>
+              <w:t>Google Dev &amp; AICC Member</w:t>
             </w:r>
           </w:p>
           <w:p>
@@ -1810,13 +1810,13 @@
                 <w:b/>
                 <w:color w:val="0A1128"/>
               </w:rPr>
-              <w:t>Google Developer Program · Devpost</w:t>
+              <w:t>Google Developer Program · AICC Accra</w:t>
             </w:r>
             <w:r>
               <w:rPr>
                 <w:color w:val="334155"/>
               </w:rPr>
-              <w:t xml:space="preserve">  —  Active member — AI open-source contributions, hackathons &amp; sovereign AI architect.</w:t>
+              <w:t xml:space="preserve">  —  Active member · Accra AI Community Centre &amp; Google for Startups Accelerator Network.</w:t>
             </w:r>
           </w:p>
         </w:tc>
@@ -14443,7 +14443,7 @@
 </file>
 
 <file path=customXml/itemProps1.xml><?xml version="1.0" encoding="utf-8"?>
-<ds:datastoreItem xmlns:ds="http://schemas.openxmlformats.org/officeDocument/2006/customXml" ds:itemID="{9D333847-F2B5-4C8B-95B8-AB1E60358EF1}">
+<ds:datastoreItem xmlns:ds="http://schemas.openxmlformats.org/officeDocument/2006/customXml" ds:itemID="{7583B61D-92CE-4D65-93D8-7F4752A0A1AE}">
   <ds:schemaRefs>
     <ds:schemaRef ds:uri="http://schemas.openxmlformats.org/officeDocument/2006/bibliography"/>
   </ds:schemaRefs>

</xml_diff>

<commit_message>
feat: complete integration of Archi Cam AI, Sovereign.BI, Dataset Automator, enriched tech stack, and CCAA Excellence award
</commit_message>
<xml_diff>
--- a/KOA_MARIE_GERVAIS_NELLY_CV_EN.docx
+++ b/KOA_MARIE_GERVAIS_NELLY_CV_EN.docx
@@ -311,7 +311,7 @@
                 <w:color w:val="F8FAFC"/>
                 <w:sz w:val="15"/>
               </w:rPr>
-              <w:t>LangGraph &amp; WikiSkills  ■ ■ ■ ■ ■</w:t>
+              <w:t>LangGraph &amp; CrewAI      ■ ■ ■ ■ ■</w:t>
             </w:r>
           </w:p>
           <w:p>
@@ -359,7 +359,7 @@
                 <w:color w:val="F8FAFC"/>
                 <w:sz w:val="15"/>
               </w:rPr>
-              <w:t>Firebase Genkit         ■</w:t>
+              <w:t>FastMCP &amp; Genkit        ■</w:t>
             </w:r>
             <w:r>
               <w:rPr>
@@ -438,7 +438,7 @@
                 <w:color w:val="F8FAFC"/>
                 <w:sz w:val="15"/>
               </w:rPr>
-              <w:t>Google BigQuery         ■ ■ ■ ■ □</w:t>
+              <w:t>Apache AGE &amp; DuckDB     ■ ■ ■ ■ □</w:t>
             </w:r>
           </w:p>
           <w:p>
@@ -450,7 +450,7 @@
                 <w:color w:val="F8FAFC"/>
                 <w:sz w:val="15"/>
               </w:rPr>
-              <w:t>Supabase Realtime       ■ ■ ■ ■ □</w:t>
+              <w:t>BigQuery DataFrames     ■ ■ ■ ■ □</w:t>
             </w:r>
           </w:p>
           <w:p>
@@ -553,7 +553,7 @@
                 <w:color w:val="F8FAFC"/>
                 <w:sz w:val="15"/>
               </w:rPr>
-              <w:t>Docker &amp; Streamlit      ■ ■ ■ ■ ■</w:t>
+              <w:t>IfcOpenShell &amp; Shapely  ■ ■ ■ ■ □</w:t>
             </w:r>
           </w:p>
           <w:p>
@@ -565,7 +565,7 @@
                 <w:color w:val="F8FAFC"/>
                 <w:sz w:val="15"/>
               </w:rPr>
-              <w:t>IfcOpenShell (5D BIM)   ■ ■ ■ ■ □</w:t>
+              <w:t>Docker &amp; Pytest         ■ ■ ■ ■ ■</w:t>
             </w:r>
           </w:p>
           <w:p>
@@ -608,7 +608,7 @@
                 <w:color w:val="F8FAFC"/>
                 <w:sz w:val="15"/>
               </w:rPr>
-              <w:t>◈ AI Ethics &amp; Anti-Hallucination</w:t>
+              <w:t>◈ CCAA Excellence Award (2023)</w:t>
             </w:r>
           </w:p>
           <w:p>
@@ -620,7 +620,7 @@
                 <w:color w:val="F8FAFC"/>
                 <w:sz w:val="15"/>
               </w:rPr>
-              <w:t>◈ Quorum 4-Eyes Governance</w:t>
+              <w:t>◈ AVSEC Officer (ICAO Annex 17)</w:t>
             </w:r>
           </w:p>
           <w:p>
@@ -632,7 +632,7 @@
                 <w:color w:val="F8FAFC"/>
                 <w:sz w:val="15"/>
               </w:rPr>
-              <w:t>◈ OKF v0.2 SHA-256 No-LLM</w:t>
+              <w:t>◈ AI Ethics &amp; Anti-Hallucination</w:t>
             </w:r>
           </w:p>
           <w:p>
@@ -644,7 +644,7 @@
                 <w:color w:val="F8FAFC"/>
                 <w:sz w:val="15"/>
               </w:rPr>
-              <w:t>◈ EU AI Act Compliance (RSASSA)</w:t>
+              <w:t>◈ OKF v0.2 SHA-256 No-LLM</w:t>
             </w:r>
           </w:p>
           <w:p>
@@ -656,7 +656,7 @@
                 <w:color w:val="F8FAFC"/>
                 <w:sz w:val="15"/>
               </w:rPr>
-              <w:t>◈ AVSEC (ICAO Annex 17)</w:t>
+              <w:t>◈ EU AI Act Compliance (RSASSA)</w:t>
             </w:r>
           </w:p>
           <w:p>
@@ -704,7 +704,14 @@
                 <w:color w:val="F8FAFC"/>
                 <w:sz w:val="15"/>
               </w:rPr>
-              <w:t>English  —  Functional basics (tools &amp; doc.)</w:t>
+              <w:t xml:space="preserve">English  —  Functional basics </w:t>
+            </w:r>
+            <w:r>
+              <w:rPr>
+                <w:color w:val="F8FAFC"/>
+                <w:sz w:val="15"/>
+              </w:rPr>
+              <w:t>(tools &amp; doc.)</w:t>
             </w:r>
           </w:p>
           <w:p>
@@ -814,14 +821,14 @@
                 <w:color w:val="0284C7"/>
                 <w:sz w:val="11"/>
               </w:rPr>
-              <w:t>───────────────────────────────</w:t>
+              <w:t>─────────────────</w:t>
             </w:r>
             <w:r>
               <w:rPr>
                 <w:color w:val="0284C7"/>
                 <w:sz w:val="11"/>
               </w:rPr>
-              <w:t>───────────────────────────────────────</w:t>
+              <w:t>─────────────────────────────────────────────────────</w:t>
             </w:r>
           </w:p>
           <w:p>
@@ -852,7 +859,7 @@
             <w:r>
               <w:rPr>
                 <w:color w:val="0284C7"/>
-                <w:sz w:val="9"/>
+                <w:sz w:val="10"/>
               </w:rPr>
               <w:t>━━━━━━━━━━━━━━━━━━</w:t>
             </w:r>
@@ -872,19 +879,19 @@
               <w:rPr>
                 <w:color w:val="334155"/>
               </w:rPr>
-              <w:t>Lead AI Engineer &amp; Data Architect (Google Developer Program Member), leveraging Google Antigravity to design neuro-symbolic multi-ag</w:t>
+              <w:t>Lead AI Engineer &amp; Data Architect (Google Developer Program Member), leveraging Google Antigravity to design neuro-sym</w:t>
             </w:r>
             <w:r>
               <w:rPr>
                 <w:color w:val="334155"/>
               </w:rPr>
-              <w:t>ent architectures, Neo4j GraphRAG, and sovereign MLOps pipelines. Expert in AI ethics: SHAP transparency, EU AI Act compliance, and deterministic zero-hallucination models. Founder &amp; Architect of Archi Cam AI (Agentic AI SaaS &amp; 5D BIM), bridging civil engi</w:t>
+              <w:t>bolic multi-agent architectures, Neo4j GraphRAG, and sovereign MLOps pipelines. Expert in AI ethics: SHAP transparency, EU AI Act compliance, and deterministic zero-hallucination models. Founder &amp; Architect of Archi Cam AI (Agentic AI SaaS &amp; 5D BIM), bridg</w:t>
             </w:r>
             <w:r>
               <w:rPr>
                 <w:color w:val="334155"/>
               </w:rPr>
-              <w:t>neering methodology, mathematical rigor, and product vision.</w:t>
+              <w:t>ing civil engineering methodology, mathematical rigor, and product vision.</w:t>
             </w:r>
           </w:p>
           <w:p>
@@ -915,7 +922,7 @@
             <w:r>
               <w:rPr>
                 <w:color w:val="0284C7"/>
-                <w:sz w:val="9"/>
+                <w:sz w:val="10"/>
               </w:rPr>
               <w:t>━━━━━━━━━━━━━━━━━━</w:t>
             </w:r>
@@ -970,13 +977,13 @@
               <w:rPr>
                 <w:color w:val="334155"/>
               </w:rPr>
-              <w:t xml:space="preserve">Sovereign 5D BIM &amp; BOQ estimation platform engineered with </w:t>
+              <w:t xml:space="preserve">Sovereign 5D BIM platform (YOLO, Shapely, </w:t>
             </w:r>
             <w:r>
               <w:rPr>
                 <w:color w:val="334155"/>
               </w:rPr>
-              <w:t>Google Antigravity (Gemma 4 12B, Gemini 2.5, BAEL 91).</w:t>
+              <w:t>IfcOpenShell, BAEL 91, Gemma 4, Gemini 2.5).</w:t>
             </w:r>
           </w:p>
           <w:p>
@@ -1002,7 +1009,7 @@
               <w:rPr>
                 <w:color w:val="334155"/>
               </w:rPr>
-              <w:t>Automated Excel BOQs in &lt;45s (–99.2% time, MLflow R²=0.9872) and 3D renders via Imagen 3 + ControlNet.</w:t>
+              <w:t>Automated Excel BOQs in &lt;45s (–99.2% time, MLflow R²=0.9872), 3D teasers via Veo 3 / Fal.ai.</w:t>
             </w:r>
           </w:p>
           <w:p>
@@ -1028,13 +1035,7 @@
               <w:rPr>
                 <w:color w:val="334155"/>
               </w:rPr>
-              <w:t>IfcOpenShell integration for 5D BIM models: automated costing &amp; scheduling via LangGraph age</w:t>
-            </w:r>
-            <w:r>
-              <w:rPr>
-                <w:color w:val="334155"/>
-              </w:rPr>
-              <w:t>nts.</w:t>
+              <w:t>5D IFC models: automated costing &amp; scheduling without hallucination risk (POS / ONAC standards).</w:t>
             </w:r>
           </w:p>
           <w:p>
@@ -1047,7 +1048,15 @@
                 <w:color w:val="0A1128"/>
                 <w:sz w:val="18"/>
               </w:rPr>
-              <w:t>K1-MATHINFO (v3.0.0)</w:t>
+              <w:t>K1-MATHINFO (v3</w:t>
+            </w:r>
+            <w:r>
+              <w:rPr>
+                <w:b/>
+                <w:color w:val="0A1128"/>
+                <w:sz w:val="18"/>
+              </w:rPr>
+              <w:t>.0.0)</w:t>
             </w:r>
             <w:r>
               <w:rPr>
@@ -1106,13 +1115,13 @@
               <w:rPr>
                 <w:color w:val="334155"/>
               </w:rPr>
-              <w:t>6 LangGraph agents orchestrated via WikiSkills (critic anti-hallucinat</w:t>
+              <w:t>6 LangGraph agents orchestrated via WikiSkills (critic anti-hallucination, Cypher optimize</w:t>
             </w:r>
             <w:r>
               <w:rPr>
                 <w:color w:val="334155"/>
               </w:rPr>
-              <w:t>ion, Cypher optimizer), RRF k=60, SHA-256 No-LLM (100%).</w:t>
+              <w:t>r), RRF k=60, SHA-256 No-LLM (100%).</w:t>
             </w:r>
           </w:p>
           <w:p>
@@ -1158,7 +1167,7 @@
               <w:rPr>
                 <w:color w:val="334155"/>
               </w:rPr>
-              <w:t>NL-to-SQL/Graph engine (PostgreSQL pgvector, Neo4j N10S, &lt;5s latency) with ABAC guardrails + SHAP Sentinel.</w:t>
+              <w:t>NL-to-SQL/Graph engine (PostgreSQL pgvector, Neo4j N10S, Apache AGE, latency &lt;5s).</w:t>
             </w:r>
           </w:p>
           <w:p>
@@ -1184,13 +1193,13 @@
               <w:rPr>
                 <w:color w:val="334155"/>
               </w:rPr>
-              <w:t>Interactive executive das</w:t>
+              <w:t>FastMCP Gateway, Zod schema guardrails, ABAC access control, CrewAI, a</w:t>
             </w:r>
             <w:r>
               <w:rPr>
                 <w:color w:val="334155"/>
               </w:rPr>
-              <w:t>hboards via Streamlit &amp; FastAPI — deployed on sovereign Docker cloud.</w:t>
+              <w:t>nd SHAP Sentinel.</w:t>
             </w:r>
           </w:p>
           <w:p>
@@ -1236,7 +1245,7 @@
               <w:rPr>
                 <w:color w:val="334155"/>
               </w:rPr>
-              <w:t>Dataset Automator: Google Antigravity (Google Cloud Hackathon) — TabFM, BigQuery DataFrames, EU AI Act.</w:t>
+              <w:t>Dataset Automator: TabFM, PAIR WIT, bigframes, 55-cell CRISP-ML(Q) and EU AI Act.</w:t>
             </w:r>
           </w:p>
           <w:p>
@@ -1262,13 +1271,13 @@
               <w:rPr>
                 <w:color w:val="334155"/>
               </w:rPr>
-              <w:t>Vigi</w:t>
+              <w:t xml:space="preserve">VigieSahel: –35% crop loss, +14d epidemic forecast (XGBoost R²&gt;94%, Supabase, </w:t>
             </w:r>
             <w:r>
               <w:rPr>
                 <w:color w:val="334155"/>
               </w:rPr>
-              <w:t>eSahel: –35% crop loss, +14d epidemic forecast (XGBoost R²&gt;94%, Supabase, MLflow).</w:t>
+              <w:t>MLflow).</w:t>
             </w:r>
           </w:p>
           <w:p>
@@ -1299,7 +1308,7 @@
             <w:r>
               <w:rPr>
                 <w:color w:val="0284C7"/>
-                <w:sz w:val="9"/>
+                <w:sz w:val="10"/>
               </w:rPr>
               <w:t>━━━━━━━━━━━━━━━━━━</w:t>
             </w:r>
@@ -1340,14 +1349,7 @@
                 <w:b/>
                 <w:color w:val="64748B"/>
               </w:rPr>
-              <w:t>Independent Projects &amp;</w:t>
-            </w:r>
-            <w:r>
-              <w:rPr>
-                <w:b/>
-                <w:color w:val="64748B"/>
-              </w:rPr>
-              <w:t xml:space="preserve"> Enterprises  │  Douala, CM</w:t>
+              <w:t>Independent Projects &amp; Enterprises  │  Douala, CM</w:t>
             </w:r>
           </w:p>
           <w:p>
@@ -1373,7 +1375,13 @@
               <w:rPr>
                 <w:color w:val="334155"/>
               </w:rPr>
-              <w:t>Ethical sovereign AI systems: GraphRAG Neo4j pipelines, high-dimensional EDA, multi-source RAG architectures.</w:t>
+              <w:t>Ethical sovereign AI systems: GraphRAG Neo4</w:t>
+            </w:r>
+            <w:r>
+              <w:rPr>
+                <w:color w:val="334155"/>
+              </w:rPr>
+              <w:t>j pipelines, high-dimensional EDA, multi-source RAG architectures.</w:t>
             </w:r>
           </w:p>
           <w:p>
@@ -1431,7 +1439,14 @@
                 <w:b/>
                 <w:color w:val="64748B"/>
               </w:rPr>
-              <w:t>CCAA — Cameroon Civil Aviation Authority  │  Douala, CM</w:t>
+              <w:t xml:space="preserve">CCAA — Cameroon Civil </w:t>
+            </w:r>
+            <w:r>
+              <w:rPr>
+                <w:b/>
+                <w:color w:val="64748B"/>
+              </w:rPr>
+              <w:t>Aviation Authority  │  Douala, CM</w:t>
             </w:r>
           </w:p>
           <w:p>
@@ -1483,13 +1498,7 @@
               <w:rPr>
                 <w:color w:val="334155"/>
               </w:rPr>
-              <w:t>Operational crisis management: emergency team c</w:t>
-            </w:r>
-            <w:r>
-              <w:rPr>
-                <w:color w:val="334155"/>
-              </w:rPr>
-              <w:t>oordination, anti-intrusion protocols.</w:t>
+              <w:t>Operational crisis management: emergency team coordination, anti-intrusion protocols.</w:t>
             </w:r>
           </w:p>
           <w:p>
@@ -1520,9 +1529,16 @@
             <w:r>
               <w:rPr>
                 <w:color w:val="0284C7"/>
-                <w:sz w:val="9"/>
-              </w:rPr>
-              <w:t>━━━━━━━━━━━━━━━━━━</w:t>
+                <w:sz w:val="10"/>
+              </w:rPr>
+              <w:t>━━━━━━━━</w:t>
+            </w:r>
+            <w:r>
+              <w:rPr>
+                <w:color w:val="0284C7"/>
+                <w:sz w:val="10"/>
+              </w:rPr>
+              <w:t>━━━━━━━━━━</w:t>
             </w:r>
             <w:r>
               <w:rPr>
@@ -1587,13 +1603,13 @@
               <w:rPr>
                 <w:color w:val="334155"/>
               </w:rPr>
-              <w:t>ML &amp;</w:t>
+              <w:t xml:space="preserve">ML &amp; Bayesian Statistics, Data Engineering &amp; Neo4j, Computer Vision &amp; Robotics, </w:t>
             </w:r>
             <w:r>
               <w:rPr>
                 <w:color w:val="334155"/>
               </w:rPr>
-              <w:t xml:space="preserve"> Bayesian Statistics, Data Engineering &amp; Neo4j, Computer Vision &amp; Robotics, Ethics &amp; Cybersecurity, Production MLOps.</w:t>
+              <w:t>Ethics &amp; Cybersecurity, Production MLOps.</w:t>
             </w:r>
           </w:p>
           <w:p>
@@ -1632,15 +1648,7 @@
                 <w:color w:val="0A1128"/>
                 <w:sz w:val="18"/>
               </w:rPr>
-              <w:t xml:space="preserve">B.Sc. in Civil Engineering </w:t>
-            </w:r>
-            <w:r>
-              <w:rPr>
-                <w:b/>
-                <w:color w:val="0A1128"/>
-                <w:sz w:val="18"/>
-              </w:rPr>
-              <w:t>(Building Option)</w:t>
+              <w:t>B.Sc. in Civil Engineering (Building Option)</w:t>
             </w:r>
             <w:r>
               <w:rPr>
@@ -1685,7 +1693,13 @@
               <w:rPr>
                 <w:color w:val="334155"/>
               </w:rPr>
-              <w:t>Structural calculations (BAEL 91), quantity surveying, construction project management — AI-applied estimation base.</w:t>
+              <w:t>Struc</w:t>
+            </w:r>
+            <w:r>
+              <w:rPr>
+                <w:color w:val="334155"/>
+              </w:rPr>
+              <w:t>tural calculations (BAEL 91), quantity surveying, construction project management — AI-applied estimation base.</w:t>
             </w:r>
           </w:p>
           <w:p>
@@ -1716,7 +1730,7 @@
             <w:r>
               <w:rPr>
                 <w:color w:val="0284C7"/>
-                <w:sz w:val="9"/>
+                <w:sz w:val="10"/>
               </w:rPr>
               <w:t>━━━━━━━━━━━━━━━━━━</w:t>
             </w:r>
@@ -1725,14 +1739,7 @@
                 <w:color w:val="38BDF8"/>
                 <w:sz w:val="9"/>
               </w:rPr>
-              <w:t>──────────────</w:t>
-            </w:r>
-            <w:r>
-              <w:rPr>
-                <w:color w:val="38BDF8"/>
-                <w:sz w:val="9"/>
-              </w:rPr>
-              <w:t>──────────────────────────────</w:t>
+              <w:t>────────────────────────────────────────────</w:t>
             </w:r>
           </w:p>
           <w:p>
@@ -1752,7 +1759,14 @@
                 <w:b/>
                 <w:color w:val="0A1128"/>
               </w:rPr>
-              <w:t>CCAA Certificate of Excellence &amp; Integrity (2023)</w:t>
+              <w:t xml:space="preserve">CCAA Certificate of Excellence &amp; Integrity </w:t>
+            </w:r>
+            <w:r>
+              <w:rPr>
+                <w:b/>
+                <w:color w:val="0A1128"/>
+              </w:rPr>
+              <w:t>(2023)</w:t>
             </w:r>
             <w:r>
               <w:rPr>
@@ -1784,13 +1798,7 @@
               <w:rPr>
                 <w:color w:val="334155"/>
               </w:rPr>
-              <w:t xml:space="preserve">  —  Dataset Automator v4.0 (Google Antigravi</w:t>
-            </w:r>
-            <w:r>
-              <w:rPr>
-                <w:color w:val="334155"/>
-              </w:rPr>
-              <w:t>ty, TabFM, BigQuery DataFrames, WIT).</w:t>
+              <w:t xml:space="preserve">  —  Dataset Automator v4.0 (Google Antigravity, TabFM, BigQuery DataFrames, WIT).</w:t>
             </w:r>
           </w:p>
           <w:p>
@@ -1810,7 +1818,14 @@
                 <w:b/>
                 <w:color w:val="0A1128"/>
               </w:rPr>
-              <w:t>Google Developer Program · AICC Accra</w:t>
+              <w:t xml:space="preserve">Google Developer Program · AICC </w:t>
+            </w:r>
+            <w:r>
+              <w:rPr>
+                <w:b/>
+                <w:color w:val="0A1128"/>
+              </w:rPr>
+              <w:t>Accra</w:t>
             </w:r>
             <w:r>
               <w:rPr>
@@ -14443,7 +14458,7 @@
 </file>
 
 <file path=customXml/itemProps1.xml><?xml version="1.0" encoding="utf-8"?>
-<ds:datastoreItem xmlns:ds="http://schemas.openxmlformats.org/officeDocument/2006/customXml" ds:itemID="{7583B61D-92CE-4D65-93D8-7F4752A0A1AE}">
+<ds:datastoreItem xmlns:ds="http://schemas.openxmlformats.org/officeDocument/2006/customXml" ds:itemID="{7B940981-5500-4890-94DD-2343994B014E}">
   <ds:schemaRefs>
     <ds:schemaRef ds:uri="http://schemas.openxmlformats.org/officeDocument/2006/bibliography"/>
   </ds:schemaRefs>

</xml_diff>

<commit_message>
feat: harmoniser les descriptions de projets ASU-Audit-Ready et VigieSahel et magnifier l'Attestation d'Excellence CCAA
</commit_message>
<xml_diff>
--- a/KOA_MARIE_GERVAIS_NELLY_CV_EN.docx
+++ b/KOA_MARIE_GERVAIS_NELLY_CV_EN.docx
@@ -1759,7 +1759,7 @@
                 <w:b/>
                 <w:color w:val="0A1128"/>
               </w:rPr>
-              <w:t xml:space="preserve">CCAA Certificate of Excellence &amp; Integrity </w:t>
+              <w:t xml:space="preserve">CCAA Attestation of Excellence &amp; Integrity </w:t>
             </w:r>
             <w:r>
               <w:rPr>
@@ -14458,7 +14458,7 @@
 </file>
 
 <file path=customXml/itemProps1.xml><?xml version="1.0" encoding="utf-8"?>
-<ds:datastoreItem xmlns:ds="http://schemas.openxmlformats.org/officeDocument/2006/customXml" ds:itemID="{7B940981-5500-4890-94DD-2343994B014E}">
+<ds:datastoreItem xmlns:ds="http://schemas.openxmlformats.org/officeDocument/2006/customXml" ds:itemID="{4F54315E-165E-444C-9BF5-3F53A43EFB8F}">
   <ds:schemaRefs>
     <ds:schemaRef ds:uri="http://schemas.openxmlformats.org/officeDocument/2006/bibliography"/>
   </ds:schemaRefs>

</xml_diff>

<commit_message>
feat: decrire les projets IA par leur finalite et ajuster la marge gauche du CV 1-page
</commit_message>
<xml_diff>
--- a/KOA_MARIE_GERVAIS_NELLY_CV_EN.docx
+++ b/KOA_MARIE_GERVAIS_NELLY_CV_EN.docx
@@ -8,22 +8,23 @@
         <w:tblLook w:val="04A0" w:firstRow="1" w:lastRow="0" w:firstColumn="1" w:lastColumn="0" w:noHBand="0" w:noVBand="1"/>
       </w:tblPr>
       <w:tblGrid>
-        <w:gridCol w:w="3744"/>
-        <w:gridCol w:w="8165"/>
+        <w:gridCol w:w="3715"/>
+        <w:gridCol w:w="8194"/>
       </w:tblGrid>
       <w:tr>
         <w:trPr>
-          <w:trHeight w:val="16300"/>
+          <w:cantSplit/>
+          <w:trHeight w:val="15400"/>
         </w:trPr>
         <w:tc>
           <w:tcPr>
-            <w:tcW w:w="3744" w:type="dxa"/>
+            <w:tcW w:w="3715" w:type="dxa"/>
             <w:shd w:val="clear" w:color="auto" w:fill="0F172A"/>
             <w:tcMar>
-              <w:top w:w="260" w:type="dxa"/>
-              <w:left w:w="500" w:type="dxa"/>
-              <w:bottom w:w="230" w:type="dxa"/>
-              <w:right w:w="420" w:type="dxa"/>
+              <w:top w:w="180" w:type="dxa"/>
+              <w:left w:w="440" w:type="dxa"/>
+              <w:bottom w:w="140" w:type="dxa"/>
+              <w:right w:w="180" w:type="dxa"/>
             </w:tcMar>
           </w:tcPr>
           <w:p>
@@ -40,7 +41,7 @@
               </w:rPr>
               <w:drawing>
                 <wp:inline distT="0" distB="0" distL="0" distR="0">
-                  <wp:extent cx="1463040" cy="1463040"/>
+                  <wp:extent cx="1298448" cy="1298448"/>
                   <wp:effectExtent l="0" t="0" r="0" b="0"/>
                   <wp:docPr id="1" name="Picture 1"/>
                   <wp:cNvGraphicFramePr>
@@ -62,7 +63,7 @@
                         <pic:spPr>
                           <a:xfrm>
                             <a:off x="0" y="0"/>
-                            <a:ext cx="1463040" cy="1463040"/>
+                            <a:ext cx="1298448" cy="1298448"/>
                           </a:xfrm>
                           <a:prstGeom prst="rect">
                             <a:avLst/>
@@ -77,726 +78,702 @@
           </w:p>
           <w:p>
             <w:pPr>
-              <w:spacing w:before="70" w:after="0"/>
+              <w:spacing w:before="60" w:after="0"/>
               <w:jc w:val="center"/>
             </w:pPr>
             <w:r>
               <w:rPr>
                 <w:b/>
                 <w:color w:val="38BDF8"/>
-                <w:sz w:val="14"/>
+                <w:sz w:val="13"/>
               </w:rPr>
               <w:t>◈  LEAD AI ENGINEER</w:t>
+            </w:r>
+          </w:p>
+          <w:p>
+            <w:pPr>
+              <w:spacing w:after="30"/>
+              <w:jc w:val="center"/>
+            </w:pPr>
+            <w:r>
+              <w:rPr>
+                <w:color w:val="64748B"/>
+                <w:sz w:val="12"/>
+              </w:rPr>
+              <w:t>Founder  ·  Archi Cam AI</w:t>
+            </w:r>
+          </w:p>
+          <w:p>
+            <w:pPr>
+              <w:spacing w:before="84" w:after="0"/>
+              <w:ind w:left="120"/>
+            </w:pPr>
+            <w:r>
+              <w:rPr>
+                <w:b/>
+                <w:color w:val="38BDF8"/>
+              </w:rPr>
+              <w:t>CONTACT &amp; PROFILES</w:t>
+            </w:r>
+          </w:p>
+          <w:p>
+            <w:pPr>
+              <w:spacing w:before="4" w:after="24"/>
+              <w:ind w:left="120"/>
+            </w:pPr>
+            <w:r>
+              <w:rPr>
+                <w:color w:val="0284C7"/>
+                <w:sz w:val="9"/>
+              </w:rPr>
+              <w:t>━━━━━━━━━━━━━━━━━</w:t>
+            </w:r>
+          </w:p>
+          <w:p>
+            <w:pPr>
+              <w:spacing w:after="20" w:line="252" w:lineRule="auto"/>
+              <w:ind w:left="120"/>
+            </w:pPr>
+            <w:r>
+              <w:rPr>
+                <w:color w:val="F8FAFC"/>
+                <w:sz w:val="15"/>
+              </w:rPr>
+              <w:t>✉</w:t>
+            </w:r>
+            <w:r>
+              <w:rPr>
+                <w:color w:val="F8FAFC"/>
+                <w:sz w:val="15"/>
+              </w:rPr>
+              <w:t xml:space="preserve">  contact@archicam-ai.com</w:t>
+            </w:r>
+          </w:p>
+          <w:p>
+            <w:pPr>
+              <w:spacing w:after="20" w:line="252" w:lineRule="auto"/>
+              <w:ind w:left="120"/>
+            </w:pPr>
+            <w:r>
+              <w:rPr>
+                <w:color w:val="F8FAFC"/>
+                <w:sz w:val="15"/>
+              </w:rPr>
+              <w:t>✆</w:t>
+            </w:r>
+            <w:r>
+              <w:rPr>
+                <w:color w:val="F8FAFC"/>
+                <w:sz w:val="15"/>
+              </w:rPr>
+              <w:t xml:space="preserve">  +237 695 35 34 02</w:t>
+            </w:r>
+          </w:p>
+          <w:p>
+            <w:pPr>
+              <w:spacing w:after="20" w:line="252" w:lineRule="auto"/>
+              <w:ind w:left="120"/>
+            </w:pPr>
+            <w:r>
+              <w:rPr>
+                <w:color w:val="F8FAFC"/>
+                <w:sz w:val="15"/>
+              </w:rPr>
+              <w:t>⌂</w:t>
+            </w:r>
+            <w:r>
+              <w:rPr>
+                <w:color w:val="F8FAFC"/>
+                <w:sz w:val="15"/>
+              </w:rPr>
+              <w:t xml:space="preserve">  Douala / Ngaoundéré, CM</w:t>
+            </w:r>
+          </w:p>
+          <w:p>
+            <w:pPr>
+              <w:spacing w:after="20" w:line="252" w:lineRule="auto"/>
+              <w:ind w:left="120"/>
+            </w:pPr>
+            <w:r>
+              <w:rPr>
+                <w:color w:val="F8FAFC"/>
+                <w:sz w:val="15"/>
+              </w:rPr>
+              <w:t>🌐</w:t>
+            </w:r>
+            <w:r>
+              <w:rPr>
+                <w:color w:val="F8FAFC"/>
+                <w:sz w:val="15"/>
+              </w:rPr>
+              <w:t xml:space="preserve">  archicam-ai.com</w:t>
+            </w:r>
+          </w:p>
+          <w:p>
+            <w:pPr>
+              <w:spacing w:after="20" w:line="252" w:lineRule="auto"/>
+              <w:ind w:left="120"/>
+            </w:pPr>
+            <w:r>
+              <w:rPr>
+                <w:color w:val="F8FAFC"/>
+                <w:sz w:val="15"/>
+              </w:rPr>
+              <w:t>💼</w:t>
+            </w:r>
+            <w:r>
+              <w:rPr>
+                <w:color w:val="F8FAFC"/>
+                <w:sz w:val="15"/>
+              </w:rPr>
+              <w:t xml:space="preserve">  linkedin.com/in/marie-gervais-koa</w:t>
+            </w:r>
+          </w:p>
+          <w:p>
+            <w:pPr>
+              <w:spacing w:before="84" w:after="0"/>
+              <w:ind w:left="120"/>
+            </w:pPr>
+            <w:r>
+              <w:rPr>
+                <w:b/>
+                <w:color w:val="38BDF8"/>
+              </w:rPr>
+              <w:t>AI &amp; LLM STACK</w:t>
+            </w:r>
+          </w:p>
+          <w:p>
+            <w:pPr>
+              <w:spacing w:before="4" w:after="24"/>
+              <w:ind w:left="120"/>
+            </w:pPr>
+            <w:r>
+              <w:rPr>
+                <w:color w:val="0284C7"/>
+                <w:sz w:val="9"/>
+              </w:rPr>
+              <w:t>━━━━━━━━━━━━━━━━━</w:t>
+            </w:r>
+          </w:p>
+          <w:p>
+            <w:pPr>
+              <w:spacing w:after="20" w:line="252" w:lineRule="auto"/>
+              <w:ind w:left="120"/>
+            </w:pPr>
+            <w:r>
+              <w:rPr>
+                <w:color w:val="F8FAFC"/>
+                <w:sz w:val="15"/>
+              </w:rPr>
+              <w:t>Google Antigravity IDE  ■ ■ ■ ■ ■</w:t>
+            </w:r>
+          </w:p>
+          <w:p>
+            <w:pPr>
+              <w:spacing w:after="20" w:line="252" w:lineRule="auto"/>
+              <w:ind w:left="120"/>
+            </w:pPr>
+            <w:r>
+              <w:rPr>
+                <w:color w:val="F8FAFC"/>
+                <w:sz w:val="15"/>
+              </w:rPr>
+              <w:t>LangGraph &amp; CrewAI      ■ ■ ■ ■ ■</w:t>
+            </w:r>
+          </w:p>
+          <w:p>
+            <w:pPr>
+              <w:spacing w:after="20" w:line="252" w:lineRule="auto"/>
+              <w:ind w:left="120"/>
+            </w:pPr>
+            <w:r>
+              <w:rPr>
+                <w:color w:val="F8FAFC"/>
+                <w:sz w:val="15"/>
+              </w:rPr>
+              <w:t>Google Gemma 4 (12B)    ■ ■ ■ ■ ■</w:t>
+            </w:r>
+          </w:p>
+          <w:p>
+            <w:pPr>
+              <w:spacing w:after="20" w:line="252" w:lineRule="auto"/>
+              <w:ind w:left="120"/>
+            </w:pPr>
+            <w:r>
+              <w:rPr>
+                <w:color w:val="F8FAFC"/>
+                <w:sz w:val="15"/>
+              </w:rPr>
+              <w:t>Gemini 2.5 / 1.5 Pro    ■ ■ ■ ■ ■</w:t>
+            </w:r>
+          </w:p>
+          <w:p>
+            <w:pPr>
+              <w:spacing w:after="20" w:line="252" w:lineRule="auto"/>
+              <w:ind w:left="120"/>
+            </w:pPr>
+            <w:r>
+              <w:rPr>
+                <w:color w:val="F8FAFC"/>
+                <w:sz w:val="15"/>
+              </w:rPr>
+              <w:t>Google TabFM (Tabular)  ■ ■ ■ ■ ■</w:t>
+            </w:r>
+          </w:p>
+          <w:p>
+            <w:pPr>
+              <w:spacing w:after="20" w:line="252" w:lineRule="auto"/>
+              <w:ind w:left="120"/>
+            </w:pPr>
+            <w:r>
+              <w:rPr>
+                <w:color w:val="F8FAFC"/>
+                <w:sz w:val="15"/>
+              </w:rPr>
+              <w:t>FastMCP &amp; Genkit        ■ ■ ■ ■ ■</w:t>
+            </w:r>
+          </w:p>
+          <w:p>
+            <w:pPr>
+              <w:spacing w:after="20" w:line="252" w:lineRule="auto"/>
+              <w:ind w:left="120"/>
+            </w:pPr>
+            <w:r>
+              <w:rPr>
+                <w:color w:val="F8FAFC"/>
+                <w:sz w:val="15"/>
+              </w:rPr>
+              <w:t>Neo4j GraphRAG — Agent K1</w:t>
+            </w:r>
+          </w:p>
+          <w:p>
+            <w:pPr>
+              <w:spacing w:before="84" w:after="0"/>
+              <w:ind w:left="120"/>
+            </w:pPr>
+            <w:r>
+              <w:rPr>
+                <w:b/>
+                <w:color w:val="38BDF8"/>
+              </w:rPr>
+              <w:t>DATA &amp; GRAPHS</w:t>
+            </w:r>
+          </w:p>
+          <w:p>
+            <w:pPr>
+              <w:spacing w:before="4" w:after="24"/>
+              <w:ind w:left="120"/>
+            </w:pPr>
+            <w:r>
+              <w:rPr>
+                <w:color w:val="0284C7"/>
+                <w:sz w:val="9"/>
+              </w:rPr>
+              <w:t>━━━━━━━━━━━━━━━━━</w:t>
+            </w:r>
+          </w:p>
+          <w:p>
+            <w:pPr>
+              <w:spacing w:after="20" w:line="252" w:lineRule="auto"/>
+              <w:ind w:left="120"/>
+            </w:pPr>
+            <w:r>
+              <w:rPr>
+                <w:color w:val="F8FAFC"/>
+                <w:sz w:val="15"/>
+              </w:rPr>
+              <w:t>Neo4j / Cypher Graph    ■ ■ ■ ■ ■</w:t>
+            </w:r>
+          </w:p>
+          <w:p>
+            <w:pPr>
+              <w:spacing w:after="20" w:line="252" w:lineRule="auto"/>
+              <w:ind w:left="120"/>
+            </w:pPr>
+            <w:r>
+              <w:rPr>
+                <w:color w:val="F8FAFC"/>
+                <w:sz w:val="15"/>
+              </w:rPr>
+              <w:t>PostgreSQL / pgvector   ■ ■ ■ ■ ■</w:t>
+            </w:r>
+          </w:p>
+          <w:p>
+            <w:pPr>
+              <w:spacing w:after="20" w:line="252" w:lineRule="auto"/>
+              <w:ind w:left="120"/>
+            </w:pPr>
+            <w:r>
+              <w:rPr>
+                <w:color w:val="F8FAFC"/>
+                <w:sz w:val="15"/>
+              </w:rPr>
+              <w:t>Apache AGE &amp; DuckDB     ■ ■ ■ ■ □</w:t>
+            </w:r>
+          </w:p>
+          <w:p>
+            <w:pPr>
+              <w:spacing w:after="20" w:line="252" w:lineRule="auto"/>
+              <w:ind w:left="120"/>
+            </w:pPr>
+            <w:r>
+              <w:rPr>
+                <w:color w:val="F8FAFC"/>
+                <w:sz w:val="15"/>
+              </w:rPr>
+              <w:t>BigQuery DataFrames     ■ ■ ■ ■ □</w:t>
+            </w:r>
+          </w:p>
+          <w:p>
+            <w:pPr>
+              <w:spacing w:after="20" w:line="252" w:lineRule="auto"/>
+              <w:ind w:left="120"/>
+            </w:pPr>
+            <w:r>
+              <w:rPr>
+                <w:color w:val="F8FAFC"/>
+                <w:sz w:val="15"/>
+              </w:rPr>
+              <w:t>Pandas / NumPy ETL      ■ ■ ■ ■ ■</w:t>
+            </w:r>
+          </w:p>
+          <w:p>
+            <w:pPr>
+              <w:spacing w:before="84" w:after="0"/>
+              <w:ind w:left="120"/>
+            </w:pPr>
+            <w:r>
+              <w:rPr>
+                <w:b/>
+                <w:color w:val="38BDF8"/>
+              </w:rPr>
+              <w:t>DEV &amp; MLOPS</w:t>
+            </w:r>
+          </w:p>
+          <w:p>
+            <w:pPr>
+              <w:spacing w:before="4" w:after="24"/>
+              <w:ind w:left="120"/>
+            </w:pPr>
+            <w:r>
+              <w:rPr>
+                <w:color w:val="0284C7"/>
+                <w:sz w:val="9"/>
+              </w:rPr>
+              <w:t>━━━━━━━━━━━━━━━━━</w:t>
+            </w:r>
+          </w:p>
+          <w:p>
+            <w:pPr>
+              <w:spacing w:after="20" w:line="252" w:lineRule="auto"/>
+              <w:ind w:left="120"/>
+            </w:pPr>
+            <w:r>
+              <w:rPr>
+                <w:color w:val="F8FAFC"/>
+                <w:sz w:val="15"/>
+              </w:rPr>
+              <w:t>Python 3.11+ / MLOps    ■ ■ ■ ■ ■</w:t>
+            </w:r>
+          </w:p>
+          <w:p>
+            <w:pPr>
+              <w:spacing w:after="20" w:line="252" w:lineRule="auto"/>
+              <w:ind w:left="120"/>
+            </w:pPr>
+            <w:r>
+              <w:rPr>
+                <w:color w:val="F8FAFC"/>
+                <w:sz w:val="15"/>
+              </w:rPr>
+              <w:t>Fast</w:t>
+            </w:r>
+            <w:r>
+              <w:rPr>
+                <w:color w:val="F8FAFC"/>
+                <w:sz w:val="15"/>
+              </w:rPr>
+              <w:t>API / Next.js 14    ■ ■ ■ ■ □</w:t>
+            </w:r>
+          </w:p>
+          <w:p>
+            <w:pPr>
+              <w:spacing w:after="20" w:line="252" w:lineRule="auto"/>
+              <w:ind w:left="120"/>
+            </w:pPr>
+            <w:r>
+              <w:rPr>
+                <w:color w:val="F8FAFC"/>
+                <w:sz w:val="15"/>
+              </w:rPr>
+              <w:t>MLflow &amp; Data Drift     ■ ■ ■ ■ □</w:t>
+            </w:r>
+          </w:p>
+          <w:p>
+            <w:pPr>
+              <w:spacing w:after="20" w:line="252" w:lineRule="auto"/>
+              <w:ind w:left="120"/>
+            </w:pPr>
+            <w:r>
+              <w:rPr>
+                <w:color w:val="F8FAFC"/>
+                <w:sz w:val="15"/>
+              </w:rPr>
+              <w:t>SHAP Sentinel Audit     ■ ■ ■ ■ ■</w:t>
+            </w:r>
+          </w:p>
+          <w:p>
+            <w:pPr>
+              <w:spacing w:after="20" w:line="252" w:lineRule="auto"/>
+              <w:ind w:left="120"/>
+            </w:pPr>
+            <w:r>
+              <w:rPr>
+                <w:color w:val="F8FAFC"/>
+                <w:sz w:val="15"/>
+              </w:rPr>
+              <w:t>IfcOpenShell &amp; Shapely  ■ ■ ■ ■ □</w:t>
+            </w:r>
+          </w:p>
+          <w:p>
+            <w:pPr>
+              <w:spacing w:after="20" w:line="252" w:lineRule="auto"/>
+              <w:ind w:left="120"/>
+            </w:pPr>
+            <w:r>
+              <w:rPr>
+                <w:color w:val="F8FAFC"/>
+                <w:sz w:val="15"/>
+              </w:rPr>
+              <w:t>Docker &amp; Pytest         ■ ■ ■ ■ ■</w:t>
+            </w:r>
+          </w:p>
+          <w:p>
+            <w:pPr>
+              <w:spacing w:before="84" w:after="0"/>
+              <w:ind w:left="120"/>
+            </w:pPr>
+            <w:r>
+              <w:rPr>
+                <w:b/>
+                <w:color w:val="38BDF8"/>
+              </w:rPr>
+              <w:t>ETHICS, SECURITY &amp; AUDIT</w:t>
+            </w:r>
+          </w:p>
+          <w:p>
+            <w:pPr>
+              <w:spacing w:before="4" w:after="24"/>
+              <w:ind w:left="120"/>
+            </w:pPr>
+            <w:r>
+              <w:rPr>
+                <w:color w:val="0284C7"/>
+                <w:sz w:val="9"/>
+              </w:rPr>
+              <w:t>━━━━━━━━━━━━━━━━━</w:t>
+            </w:r>
+          </w:p>
+          <w:p>
+            <w:pPr>
+              <w:spacing w:after="20" w:line="252" w:lineRule="auto"/>
+              <w:ind w:left="120"/>
+            </w:pPr>
+            <w:r>
+              <w:rPr>
+                <w:color w:val="F8FAFC"/>
+                <w:sz w:val="15"/>
+              </w:rPr>
+              <w:t>◈ CCAA Excellence Attestation '23</w:t>
+            </w:r>
+          </w:p>
+          <w:p>
+            <w:pPr>
+              <w:spacing w:after="20" w:line="252" w:lineRule="auto"/>
+              <w:ind w:left="120"/>
+            </w:pPr>
+            <w:r>
+              <w:rPr>
+                <w:color w:val="F8FAFC"/>
+                <w:sz w:val="15"/>
+              </w:rPr>
+              <w:t>◈ AVSEC Offic</w:t>
+            </w:r>
+            <w:r>
+              <w:rPr>
+                <w:color w:val="F8FAFC"/>
+                <w:sz w:val="15"/>
+              </w:rPr>
+              <w:t>er (ICAO Annex 17)</w:t>
+            </w:r>
+          </w:p>
+          <w:p>
+            <w:pPr>
+              <w:spacing w:after="20" w:line="252" w:lineRule="auto"/>
+              <w:ind w:left="120"/>
+            </w:pPr>
+            <w:r>
+              <w:rPr>
+                <w:color w:val="F8FAFC"/>
+                <w:sz w:val="15"/>
+              </w:rPr>
+              <w:t>◈ AI Ethics &amp; Anti-Hallucination</w:t>
+            </w:r>
+          </w:p>
+          <w:p>
+            <w:pPr>
+              <w:spacing w:after="20" w:line="252" w:lineRule="auto"/>
+              <w:ind w:left="120"/>
+            </w:pPr>
+            <w:r>
+              <w:rPr>
+                <w:color w:val="F8FAFC"/>
+                <w:sz w:val="15"/>
+              </w:rPr>
+              <w:t>◈ OKF v0.2 SHA-256 No-LLM</w:t>
+            </w:r>
+          </w:p>
+          <w:p>
+            <w:pPr>
+              <w:spacing w:after="20" w:line="252" w:lineRule="auto"/>
+              <w:ind w:left="120"/>
+            </w:pPr>
+            <w:r>
+              <w:rPr>
+                <w:color w:val="F8FAFC"/>
+                <w:sz w:val="15"/>
+              </w:rPr>
+              <w:t>◈ EU AI Act Compliance (RSASSA)</w:t>
+            </w:r>
+          </w:p>
+          <w:p>
+            <w:pPr>
+              <w:spacing w:before="84" w:after="0"/>
+              <w:ind w:left="120"/>
+            </w:pPr>
+            <w:r>
+              <w:rPr>
+                <w:b/>
+                <w:color w:val="38BDF8"/>
+              </w:rPr>
+              <w:t>LANGUAGES</w:t>
+            </w:r>
+          </w:p>
+          <w:p>
+            <w:pPr>
+              <w:spacing w:before="4" w:after="24"/>
+              <w:ind w:left="120"/>
+            </w:pPr>
+            <w:r>
+              <w:rPr>
+                <w:color w:val="0284C7"/>
+                <w:sz w:val="9"/>
+              </w:rPr>
+              <w:t>━━━━━━━━━━━━━━━━━</w:t>
+            </w:r>
+          </w:p>
+          <w:p>
+            <w:pPr>
+              <w:spacing w:after="20" w:line="252" w:lineRule="auto"/>
+              <w:ind w:left="120"/>
+            </w:pPr>
+            <w:r>
+              <w:rPr>
+                <w:color w:val="F8FAFC"/>
+                <w:sz w:val="15"/>
+              </w:rPr>
+              <w:t>French   —  Native / Fluent</w:t>
+            </w:r>
+          </w:p>
+          <w:p>
+            <w:pPr>
+              <w:spacing w:after="20" w:line="252" w:lineRule="auto"/>
+              <w:ind w:left="120"/>
+            </w:pPr>
+            <w:r>
+              <w:rPr>
+                <w:color w:val="F8FAFC"/>
+                <w:sz w:val="15"/>
+              </w:rPr>
+              <w:t>English  —  Professional / Tech.</w:t>
+            </w:r>
+          </w:p>
+        </w:tc>
+        <w:tc>
+          <w:tcPr>
+            <w:tcW w:w="8194" w:type="dxa"/>
+            <w:shd w:val="clear" w:color="auto" w:fill="FFFFFF"/>
+            <w:tcMar>
+              <w:top w:w="180" w:type="dxa"/>
+              <w:left w:w="200" w:type="dxa"/>
+              <w:bottom w:w="100" w:type="dxa"/>
+              <w:right w:w="220" w:type="dxa"/>
+            </w:tcMar>
+          </w:tcPr>
+          <w:p>
+            <w:pPr>
+              <w:spacing w:after="10"/>
+            </w:pPr>
+            <w:r>
+              <w:rPr>
+                <w:b/>
+                <w:color w:val="0A1128"/>
+                <w:sz w:val="40"/>
+              </w:rPr>
+              <w:t>KOA MARIE GERVAIS NELLY</w:t>
+            </w:r>
+          </w:p>
+          <w:p>
+            <w:pPr>
+              <w:spacing w:after="16"/>
+            </w:pPr>
+            <w:r>
+              <w:rPr>
+                <w:b/>
+                <w:color w:val="0284C7"/>
+                <w:sz w:val="18"/>
+              </w:rPr>
+              <w:t>Lead AI Engineer &amp; Data Architect</w:t>
+            </w:r>
+            <w:r>
+              <w:rPr>
+                <w:b/>
+                <w:color w:val="0284C7"/>
+                <w:sz w:val="18"/>
+              </w:rPr>
+              <w:t xml:space="preserve">   │   Founder @ Archi Cam AI</w:t>
             </w:r>
           </w:p>
           <w:p>
             <w:pPr>
               <w:spacing w:after="40"/>
-              <w:jc w:val="center"/>
             </w:pPr>
             <w:r>
               <w:rPr>
-                <w:color w:val="64748B"/>
-                <w:sz w:val="13"/>
-              </w:rPr>
-              <w:t>Founder  ·  Archi Cam AI</w:t>
+                <w:color w:val="0284C7"/>
+                <w:sz w:val="10"/>
+              </w:rPr>
+              <w:t>──────────────────────────────────────────────────────────────────────</w:t>
             </w:r>
           </w:p>
           <w:p>
             <w:pPr>
-              <w:spacing w:before="110" w:after="0"/>
+              <w:spacing w:before="52" w:after="2"/>
             </w:pPr>
             <w:r>
               <w:rPr>
                 <w:b/>
-                <w:color w:val="38BDF8"/>
-              </w:rPr>
-              <w:t>CONTACT &amp; PROFILES</w:t>
-            </w:r>
-          </w:p>
-          <w:p>
-            <w:pPr>
-              <w:spacing w:before="10" w:after="40"/>
-            </w:pPr>
-            <w:r>
-              <w:rPr>
                 <w:color w:val="0284C7"/>
-                <w:sz w:val="10"/>
-              </w:rPr>
-              <w:t>━━━━━━━━━━━━━━━━━━━━</w:t>
-            </w:r>
-          </w:p>
-          <w:p>
-            <w:pPr>
-              <w:spacing w:after="32" w:line="259" w:lineRule="auto"/>
-            </w:pPr>
-            <w:r>
-              <w:rPr>
-                <w:color w:val="F8FAFC"/>
-                <w:sz w:val="15"/>
-              </w:rPr>
-              <w:t>✉</w:t>
-            </w:r>
-            <w:r>
-              <w:rPr>
-                <w:color w:val="F8FAFC"/>
-                <w:sz w:val="15"/>
-              </w:rPr>
-              <w:t xml:space="preserve">  contact@archicam-ai.com</w:t>
-            </w:r>
-          </w:p>
-          <w:p>
-            <w:pPr>
-              <w:spacing w:after="32" w:line="259" w:lineRule="auto"/>
-            </w:pPr>
-            <w:r>
-              <w:rPr>
-                <w:color w:val="F8FAFC"/>
-                <w:sz w:val="15"/>
-              </w:rPr>
-              <w:t>✆</w:t>
-            </w:r>
-            <w:r>
-              <w:rPr>
-                <w:color w:val="F8FAFC"/>
-                <w:sz w:val="15"/>
-              </w:rPr>
-              <w:t xml:space="preserve">  +237 695 35 34 02</w:t>
-            </w:r>
-          </w:p>
-          <w:p>
-            <w:pPr>
-              <w:spacing w:after="32" w:line="259" w:lineRule="auto"/>
-            </w:pPr>
-            <w:r>
-              <w:rPr>
-                <w:color w:val="F8FAFC"/>
-                <w:sz w:val="15"/>
-              </w:rPr>
-              <w:t>⌂</w:t>
-            </w:r>
-            <w:r>
-              <w:rPr>
-                <w:color w:val="F8FAFC"/>
-                <w:sz w:val="15"/>
-              </w:rPr>
-              <w:t xml:space="preserve">  Douala / Ngaoundéré, CM</w:t>
-            </w:r>
-          </w:p>
-          <w:p>
-            <w:pPr>
-              <w:spacing w:after="32" w:line="259" w:lineRule="auto"/>
-            </w:pPr>
-            <w:r>
-              <w:rPr>
-                <w:color w:val="F8FAFC"/>
-                <w:sz w:val="15"/>
-              </w:rPr>
-              <w:t>🌐</w:t>
-            </w:r>
-            <w:r>
-              <w:rPr>
-                <w:color w:val="F8FAFC"/>
-                <w:sz w:val="15"/>
-              </w:rPr>
-              <w:t xml:space="preserve">  archicam-ai.com</w:t>
-            </w:r>
-          </w:p>
-          <w:p>
-            <w:pPr>
-              <w:spacing w:after="32" w:line="259" w:lineRule="auto"/>
-            </w:pPr>
-            <w:r>
-              <w:rPr>
-                <w:color w:val="F8FAFC"/>
-                <w:sz w:val="15"/>
-              </w:rPr>
-              <w:t>💼</w:t>
-            </w:r>
-            <w:r>
-              <w:rPr>
-                <w:color w:val="F8FAFC"/>
-                <w:sz w:val="15"/>
-              </w:rPr>
-              <w:t xml:space="preserve">  linkedin.com/in/marie-gervais-koa</w:t>
-            </w:r>
-          </w:p>
-          <w:p>
-            <w:pPr>
-              <w:spacing w:after="32" w:line="259" w:lineRule="auto"/>
-            </w:pPr>
-            <w:r>
-              <w:rPr>
-                <w:color w:val="F8FAFC"/>
-                <w:sz w:val="15"/>
-              </w:rPr>
-              <w:t>⚡</w:t>
-            </w:r>
-            <w:r>
-              <w:rPr>
-                <w:color w:val="F8FAFC"/>
-                <w:sz w:val="15"/>
-              </w:rPr>
-              <w:t xml:space="preserve">  github.com/gervais-afk</w:t>
-            </w:r>
-          </w:p>
-          <w:p>
-            <w:pPr>
-              <w:spacing w:after="32" w:line="259" w:lineRule="auto"/>
-            </w:pPr>
-            <w:r>
-              <w:rPr>
-                <w:color w:val="F8FAFC"/>
-                <w:sz w:val="15"/>
-              </w:rPr>
-              <w:t>🏅</w:t>
-            </w:r>
-            <w:r>
-              <w:rPr>
-                <w:color w:val="F8FAFC"/>
-                <w:sz w:val="15"/>
-              </w:rPr>
-              <w:t xml:space="preserve">  </w:t>
-            </w:r>
-            <w:r>
-              <w:rPr>
-                <w:color w:val="F8FAFC"/>
-                <w:sz w:val="15"/>
-              </w:rPr>
-              <w:t>Google Dev &amp; AICC Member</w:t>
-            </w:r>
-          </w:p>
-          <w:p>
-            <w:pPr>
-              <w:spacing w:before="110" w:after="0"/>
-            </w:pPr>
-            <w:r>
-              <w:rPr>
-                <w:b/>
-                <w:color w:val="38BDF8"/>
-              </w:rPr>
-              <w:t>AI &amp; LLM STACK</w:t>
-            </w:r>
-          </w:p>
-          <w:p>
-            <w:pPr>
-              <w:spacing w:before="10" w:after="40"/>
-            </w:pPr>
-            <w:r>
-              <w:rPr>
-                <w:color w:val="0284C7"/>
-                <w:sz w:val="10"/>
-              </w:rPr>
-              <w:t>━━━━━━━━━━━━━━━━━━━━</w:t>
-            </w:r>
-          </w:p>
-          <w:p>
-            <w:pPr>
-              <w:spacing w:after="32" w:line="259" w:lineRule="auto"/>
-            </w:pPr>
-            <w:r>
-              <w:rPr>
-                <w:color w:val="F8FAFC"/>
-                <w:sz w:val="15"/>
-              </w:rPr>
-              <w:t>Google Antigravity IDE  ■ ■ ■ ■ ■</w:t>
-            </w:r>
-          </w:p>
-          <w:p>
-            <w:pPr>
-              <w:spacing w:after="32" w:line="259" w:lineRule="auto"/>
-            </w:pPr>
-            <w:r>
-              <w:rPr>
-                <w:color w:val="F8FAFC"/>
-                <w:sz w:val="15"/>
-              </w:rPr>
-              <w:t>LangGraph &amp; CrewAI      ■ ■ ■ ■ ■</w:t>
-            </w:r>
-          </w:p>
-          <w:p>
-            <w:pPr>
-              <w:spacing w:after="32" w:line="259" w:lineRule="auto"/>
-            </w:pPr>
-            <w:r>
-              <w:rPr>
-                <w:color w:val="F8FAFC"/>
-                <w:sz w:val="15"/>
-              </w:rPr>
-              <w:t>Google Gemma 4 (12B)    ■ ■ ■ ■ ■</w:t>
-            </w:r>
-          </w:p>
-          <w:p>
-            <w:pPr>
-              <w:spacing w:after="32" w:line="259" w:lineRule="auto"/>
-            </w:pPr>
-            <w:r>
-              <w:rPr>
-                <w:color w:val="F8FAFC"/>
-                <w:sz w:val="15"/>
-              </w:rPr>
-              <w:t>Gemini 2.5 / 1.5 Pro    ■ ■ ■ ■ ■</w:t>
-            </w:r>
-          </w:p>
-          <w:p>
-            <w:pPr>
-              <w:spacing w:after="32" w:line="259" w:lineRule="auto"/>
-            </w:pPr>
-            <w:r>
-              <w:rPr>
-                <w:color w:val="F8FAFC"/>
-                <w:sz w:val="15"/>
-              </w:rPr>
-              <w:t>Google TabFM (Tabular)  ■ ■ ■ ■ ■</w:t>
-            </w:r>
-          </w:p>
-          <w:p>
-            <w:pPr>
-              <w:spacing w:after="32" w:line="259" w:lineRule="auto"/>
-            </w:pPr>
-            <w:r>
-              <w:rPr>
-                <w:color w:val="F8FAFC"/>
-                <w:sz w:val="15"/>
-              </w:rPr>
-              <w:t>FastMCP &amp; Genkit        ■</w:t>
-            </w:r>
-            <w:r>
-              <w:rPr>
-                <w:color w:val="F8FAFC"/>
-                <w:sz w:val="15"/>
-              </w:rPr>
-              <w:t xml:space="preserve"> ■ ■ ■ ■</w:t>
-            </w:r>
-          </w:p>
-          <w:p>
-            <w:pPr>
-              <w:spacing w:after="32" w:line="259" w:lineRule="auto"/>
-            </w:pPr>
-            <w:r>
-              <w:rPr>
-                <w:color w:val="F8FAFC"/>
-                <w:sz w:val="15"/>
-              </w:rPr>
-              <w:t>Neo4j GraphRAG — Agent K1</w:t>
-            </w:r>
-          </w:p>
-          <w:p>
-            <w:pPr>
-              <w:spacing w:before="110" w:after="0"/>
-            </w:pPr>
-            <w:r>
-              <w:rPr>
-                <w:b/>
-                <w:color w:val="38BDF8"/>
-              </w:rPr>
-              <w:t>DATA &amp; GRAPHS</w:t>
-            </w:r>
-          </w:p>
-          <w:p>
-            <w:pPr>
-              <w:spacing w:before="10" w:after="40"/>
-            </w:pPr>
-            <w:r>
-              <w:rPr>
-                <w:color w:val="0284C7"/>
-                <w:sz w:val="10"/>
-              </w:rPr>
-              <w:t>━━━━━━━━━━━━━━━━━━━━</w:t>
-            </w:r>
-          </w:p>
-          <w:p>
-            <w:pPr>
-              <w:spacing w:after="32" w:line="259" w:lineRule="auto"/>
-            </w:pPr>
-            <w:r>
-              <w:rPr>
-                <w:color w:val="F8FAFC"/>
-                <w:sz w:val="15"/>
-              </w:rPr>
-              <w:t>Neo4j / Cypher Graph    ■ ■ ■ ■ ■</w:t>
-            </w:r>
-          </w:p>
-          <w:p>
-            <w:pPr>
-              <w:spacing w:after="32" w:line="259" w:lineRule="auto"/>
-            </w:pPr>
-            <w:r>
-              <w:rPr>
-                <w:color w:val="F8FAFC"/>
-                <w:sz w:val="15"/>
-              </w:rPr>
-              <w:t>PostgreSQL / pgvector   ■ ■ ■ ■ ■</w:t>
-            </w:r>
-          </w:p>
-          <w:p>
-            <w:pPr>
-              <w:spacing w:after="32" w:line="259" w:lineRule="auto"/>
-            </w:pPr>
-            <w:r>
-              <w:rPr>
-                <w:color w:val="F8FAFC"/>
-                <w:sz w:val="15"/>
-              </w:rPr>
-              <w:t>Apache AGE &amp; DuckDB     ■ ■ ■ ■ □</w:t>
-            </w:r>
-          </w:p>
-          <w:p>
-            <w:pPr>
-              <w:spacing w:after="32" w:line="259" w:lineRule="auto"/>
-            </w:pPr>
-            <w:r>
-              <w:rPr>
-                <w:color w:val="F8FAFC"/>
-                <w:sz w:val="15"/>
-              </w:rPr>
-              <w:t>BigQuery DataFrames     ■ ■ ■ ■ □</w:t>
-            </w:r>
-          </w:p>
-          <w:p>
-            <w:pPr>
-              <w:spacing w:after="32" w:line="259" w:lineRule="auto"/>
-            </w:pPr>
-            <w:r>
-              <w:rPr>
-                <w:color w:val="F8FAFC"/>
-                <w:sz w:val="15"/>
-              </w:rPr>
-              <w:t>Pandas / NumPy ETL      ■ ■ ■ ■ ■</w:t>
-            </w:r>
-          </w:p>
-          <w:p>
-            <w:pPr>
-              <w:spacing w:before="110" w:after="0"/>
-            </w:pPr>
-            <w:r>
-              <w:rPr>
-                <w:b/>
-                <w:color w:val="38BDF8"/>
-              </w:rPr>
-              <w:t>DEV &amp; MLOPS</w:t>
-            </w:r>
-          </w:p>
-          <w:p>
-            <w:pPr>
-              <w:spacing w:before="10" w:after="40"/>
-            </w:pPr>
-            <w:r>
-              <w:rPr>
-                <w:color w:val="0284C7"/>
-                <w:sz w:val="10"/>
-              </w:rPr>
-              <w:t>━━━━</w:t>
-            </w:r>
-            <w:r>
-              <w:rPr>
-                <w:color w:val="0284C7"/>
-                <w:sz w:val="10"/>
-              </w:rPr>
-              <w:t>━━━━━━━━━━━━━━━━</w:t>
-            </w:r>
-          </w:p>
-          <w:p>
-            <w:pPr>
-              <w:spacing w:after="32" w:line="259" w:lineRule="auto"/>
-            </w:pPr>
-            <w:r>
-              <w:rPr>
-                <w:color w:val="F8FAFC"/>
-                <w:sz w:val="15"/>
-              </w:rPr>
-              <w:t>Python 3.11+ / MLOps    ■ ■ ■ ■ ■</w:t>
-            </w:r>
-          </w:p>
-          <w:p>
-            <w:pPr>
-              <w:spacing w:after="32" w:line="259" w:lineRule="auto"/>
-            </w:pPr>
-            <w:r>
-              <w:rPr>
-                <w:color w:val="F8FAFC"/>
-                <w:sz w:val="15"/>
-              </w:rPr>
-              <w:t>FastAPI / Next.js 14    ■ ■ ■ ■ □</w:t>
-            </w:r>
-          </w:p>
-          <w:p>
-            <w:pPr>
-              <w:spacing w:after="32" w:line="259" w:lineRule="auto"/>
-            </w:pPr>
-            <w:r>
-              <w:rPr>
-                <w:color w:val="F8FAFC"/>
-                <w:sz w:val="15"/>
-              </w:rPr>
-              <w:t>MLflow &amp; Data Drift     ■ ■ ■ ■ □</w:t>
-            </w:r>
-          </w:p>
-          <w:p>
-            <w:pPr>
-              <w:spacing w:after="32" w:line="259" w:lineRule="auto"/>
-            </w:pPr>
-            <w:r>
-              <w:rPr>
-                <w:color w:val="F8FAFC"/>
-                <w:sz w:val="15"/>
-              </w:rPr>
-              <w:t>SHAP Sentinel Audit     ■ ■ ■ ■ ■</w:t>
-            </w:r>
-          </w:p>
-          <w:p>
-            <w:pPr>
-              <w:spacing w:after="32" w:line="259" w:lineRule="auto"/>
-            </w:pPr>
-            <w:r>
-              <w:rPr>
-                <w:color w:val="F8FAFC"/>
-                <w:sz w:val="15"/>
-              </w:rPr>
-              <w:t>IfcOpenShell &amp; Shapely  ■ ■ ■ ■ □</w:t>
-            </w:r>
-          </w:p>
-          <w:p>
-            <w:pPr>
-              <w:spacing w:after="32" w:line="259" w:lineRule="auto"/>
-            </w:pPr>
-            <w:r>
-              <w:rPr>
-                <w:color w:val="F8FAFC"/>
-                <w:sz w:val="15"/>
-              </w:rPr>
-              <w:t>Docker &amp; Pytest         ■ ■ ■ ■ ■</w:t>
-            </w:r>
-          </w:p>
-          <w:p>
-            <w:pPr>
-              <w:spacing w:before="110" w:after="0"/>
-            </w:pPr>
-            <w:r>
-              <w:rPr>
-                <w:b/>
-                <w:color w:val="38BDF8"/>
-              </w:rPr>
-              <w:t>ETHICS, SECURITY &amp; AUDIT</w:t>
-            </w:r>
-          </w:p>
-          <w:p>
-            <w:pPr>
-              <w:spacing w:before="10" w:after="40"/>
-            </w:pPr>
-            <w:r>
-              <w:rPr>
-                <w:color w:val="0284C7"/>
-                <w:sz w:val="10"/>
-              </w:rPr>
-              <w:t>━━━━━━━━━━</w:t>
-            </w:r>
-            <w:r>
-              <w:rPr>
-                <w:color w:val="0284C7"/>
-                <w:sz w:val="10"/>
-              </w:rPr>
-              <w:t>━━━━━━━━━━</w:t>
-            </w:r>
-          </w:p>
-          <w:p>
-            <w:pPr>
-              <w:spacing w:after="32" w:line="259" w:lineRule="auto"/>
-            </w:pPr>
-            <w:r>
-              <w:rPr>
-                <w:color w:val="F8FAFC"/>
-                <w:sz w:val="15"/>
-              </w:rPr>
-              <w:t>◈ CCAA Excellence Award (2023)</w:t>
-            </w:r>
-          </w:p>
-          <w:p>
-            <w:pPr>
-              <w:spacing w:after="32" w:line="259" w:lineRule="auto"/>
-            </w:pPr>
-            <w:r>
-              <w:rPr>
-                <w:color w:val="F8FAFC"/>
-                <w:sz w:val="15"/>
-              </w:rPr>
-              <w:t>◈ AVSEC Officer (ICAO Annex 17)</w:t>
-            </w:r>
-          </w:p>
-          <w:p>
-            <w:pPr>
-              <w:spacing w:after="32" w:line="259" w:lineRule="auto"/>
-            </w:pPr>
-            <w:r>
-              <w:rPr>
-                <w:color w:val="F8FAFC"/>
-                <w:sz w:val="15"/>
-              </w:rPr>
-              <w:t>◈ AI Ethics &amp; Anti-Hallucination</w:t>
-            </w:r>
-          </w:p>
-          <w:p>
-            <w:pPr>
-              <w:spacing w:after="32" w:line="259" w:lineRule="auto"/>
-            </w:pPr>
-            <w:r>
-              <w:rPr>
-                <w:color w:val="F8FAFC"/>
-                <w:sz w:val="15"/>
-              </w:rPr>
-              <w:t>◈ OKF v0.2 SHA-256 No-LLM</w:t>
-            </w:r>
-          </w:p>
-          <w:p>
-            <w:pPr>
-              <w:spacing w:after="32" w:line="259" w:lineRule="auto"/>
-            </w:pPr>
-            <w:r>
-              <w:rPr>
-                <w:color w:val="F8FAFC"/>
-                <w:sz w:val="15"/>
-              </w:rPr>
-              <w:t>◈ EU AI Act Compliance (RSASSA)</w:t>
-            </w:r>
-          </w:p>
-          <w:p>
-            <w:pPr>
-              <w:spacing w:before="110" w:after="0"/>
-            </w:pPr>
-            <w:r>
-              <w:rPr>
-                <w:b/>
-                <w:color w:val="38BDF8"/>
-              </w:rPr>
-              <w:t>LANGUAGES</w:t>
-            </w:r>
-          </w:p>
-          <w:p>
-            <w:pPr>
-              <w:spacing w:before="10" w:after="40"/>
-            </w:pPr>
-            <w:r>
-              <w:rPr>
-                <w:color w:val="0284C7"/>
-                <w:sz w:val="10"/>
-              </w:rPr>
-              <w:t>━━━━━━━━━━━━━━━━━━━━</w:t>
-            </w:r>
-          </w:p>
-          <w:p>
-            <w:pPr>
-              <w:spacing w:after="32" w:line="259" w:lineRule="auto"/>
-            </w:pPr>
-            <w:r>
-              <w:rPr>
-                <w:color w:val="F8FAFC"/>
-                <w:sz w:val="15"/>
-              </w:rPr>
-              <w:t>French   —  Native / Fluent</w:t>
-            </w:r>
-          </w:p>
-          <w:p>
-            <w:pPr>
-              <w:spacing w:after="32" w:line="259" w:lineRule="auto"/>
-            </w:pPr>
-            <w:r>
-              <w:rPr>
-                <w:color w:val="F8FAFC"/>
-                <w:sz w:val="15"/>
-              </w:rPr>
-              <w:t xml:space="preserve">English  —  Functional basics </w:t>
-            </w:r>
-            <w:r>
-              <w:rPr>
-                <w:color w:val="F8FAFC"/>
-                <w:sz w:val="15"/>
-              </w:rPr>
-              <w:t>(tools &amp; doc.)</w:t>
-            </w:r>
-          </w:p>
-          <w:p>
-            <w:pPr>
-              <w:spacing w:before="110" w:after="0"/>
-            </w:pPr>
-            <w:r>
-              <w:rPr>
-                <w:b/>
-                <w:color w:val="38BDF8"/>
-              </w:rPr>
-              <w:t>KEY ASSETS</w:t>
-            </w:r>
-          </w:p>
-          <w:p>
-            <w:pPr>
-              <w:spacing w:before="10" w:after="40"/>
-            </w:pPr>
-            <w:r>
-              <w:rPr>
-                <w:color w:val="0284C7"/>
-                <w:sz w:val="10"/>
-              </w:rPr>
-              <w:t>━━━━━━━━━━━━━━━━━━━━</w:t>
-            </w:r>
-          </w:p>
-          <w:p>
-            <w:pPr>
-              <w:spacing w:after="32" w:line="259" w:lineRule="auto"/>
-            </w:pPr>
-            <w:r>
-              <w:rPr>
-                <w:color w:val="F8FAFC"/>
-                <w:sz w:val="15"/>
-              </w:rPr>
-              <w:t>◈ Dual Competence: AI &amp; Civil Eng.</w:t>
-            </w:r>
-          </w:p>
-          <w:p>
-            <w:pPr>
-              <w:spacing w:after="32" w:line="259" w:lineRule="auto"/>
-            </w:pPr>
-            <w:r>
-              <w:rPr>
-                <w:color w:val="F8FAFC"/>
-                <w:sz w:val="15"/>
-              </w:rPr>
-              <w:t>◈ Aviation Security &amp; Crisis (CCAA)</w:t>
-            </w:r>
-          </w:p>
-          <w:p>
-            <w:pPr>
-              <w:spacing w:after="32" w:line="259" w:lineRule="auto"/>
-            </w:pPr>
-            <w:r>
-              <w:rPr>
-                <w:color w:val="F8FAFC"/>
-                <w:sz w:val="15"/>
-              </w:rPr>
-              <w:t>◈ Mathematical Rigor &amp; Guardrails</w:t>
-            </w:r>
-          </w:p>
-        </w:tc>
-        <w:tc>
-          <w:tcPr>
-            <w:tcW w:w="8165" w:type="dxa"/>
-            <w:shd w:val="clear" w:color="auto" w:fill="FFFFFF"/>
-            <w:tcMar>
-              <w:top w:w="240" w:type="dxa"/>
-              <w:left w:w="260" w:type="dxa"/>
-              <w:bottom w:w="180" w:type="dxa"/>
-              <w:right w:w="280" w:type="dxa"/>
-            </w:tcMar>
-          </w:tcPr>
-          <w:p>
-            <w:pPr>
-              <w:spacing w:after="20"/>
-            </w:pPr>
+              </w:rPr>
+              <w:t xml:space="preserve">◈  </w:t>
+            </w:r>
             <w:r>
               <w:rPr>
                 <w:b/>
                 <w:color w:val="0A1128"/>
-                <w:sz w:val="42"/>
-              </w:rPr>
-              <w:t>KOA MARIE GERVAIS NELLY</w:t>
+                <w:sz w:val="19"/>
+              </w:rPr>
+              <w:t>EXECUTIVE SUMMARY</w:t>
             </w:r>
           </w:p>
           <w:p>
@@ -805,41 +782,50 @@
             </w:pPr>
             <w:r>
               <w:rPr>
-                <w:b/>
                 <w:color w:val="0284C7"/>
-                <w:sz w:val="19"/>
-              </w:rPr>
-              <w:t>Lead AI Engineer &amp; Data Architect   │   Founder @ Archi Cam AI</w:t>
+                <w:sz w:val="9"/>
+              </w:rPr>
+              <w:t>━━━━━━━━━━━━━━━━━━</w:t>
+            </w:r>
+            <w:r>
+              <w:rPr>
+                <w:color w:val="38BDF8"/>
+                <w:sz w:val="8"/>
+              </w:rPr>
+              <w:t>────────────────────────────────────────────</w:t>
             </w:r>
           </w:p>
           <w:p>
             <w:pPr>
-              <w:spacing w:after="50"/>
+              <w:spacing w:after="20" w:line="254" w:lineRule="auto"/>
             </w:pPr>
             <w:r>
               <w:rPr>
-                <w:color w:val="0284C7"/>
-                <w:sz w:val="11"/>
-              </w:rPr>
-              <w:t>─────────────────</w:t>
-            </w:r>
-            <w:r>
-              <w:rPr>
-                <w:color w:val="0284C7"/>
-                <w:sz w:val="11"/>
-              </w:rPr>
-              <w:t>─────────────────────────────────────────────────────</w:t>
+                <w:color w:val="334155"/>
+              </w:rPr>
+              <w:t>Lead AI Engineer &amp; Data Architect (Google Developer Program Member), le</w:t>
+            </w:r>
+            <w:r>
+              <w:rPr>
+                <w:color w:val="334155"/>
+              </w:rPr>
+              <w:t>veraging Google Antigravity to design neuro-symbolic multi-agent architectures, Neo4j GraphRAG, and sovereign MLOps pipelines. Expert in AI ethics: SHAP transparency, EU AI Act compliance, and deterministic zero-hallucination models. Founder &amp; Architect of</w:t>
+            </w:r>
+            <w:r>
+              <w:rPr>
+                <w:color w:val="334155"/>
+              </w:rPr>
+              <w:t xml:space="preserve"> Archi Cam AI (Agentic AI SaaS &amp; 5D BIM), bridging civil engineering methodology, mathematical rigor, and product vision.</w:t>
             </w:r>
           </w:p>
           <w:p>
             <w:pPr>
-              <w:spacing w:before="64" w:after="4"/>
+              <w:spacing w:before="52" w:after="2"/>
             </w:pPr>
             <w:r>
               <w:rPr>
                 <w:b/>
                 <w:color w:val="0284C7"/>
-                <w:sz w:val="17"/>
               </w:rPr>
               <w:t xml:space="preserve">◈  </w:t>
             </w:r>
@@ -847,96 +833,157 @@
               <w:rPr>
                 <w:b/>
                 <w:color w:val="0A1128"/>
-                <w:sz w:val="20"/>
-              </w:rPr>
-              <w:t>EXECUTIVE SUMMARY</w:t>
+                <w:sz w:val="19"/>
+              </w:rPr>
+              <w:t>FLAGSHIP AI PROJECTS</w:t>
             </w:r>
           </w:p>
           <w:p>
             <w:pPr>
-              <w:spacing w:after="28"/>
+              <w:spacing w:after="20"/>
             </w:pPr>
             <w:r>
               <w:rPr>
                 <w:color w:val="0284C7"/>
-                <w:sz w:val="10"/>
+                <w:sz w:val="9"/>
               </w:rPr>
               <w:t>━━━━━━━━━━━━━━━━━━</w:t>
             </w:r>
             <w:r>
               <w:rPr>
                 <w:color w:val="38BDF8"/>
-                <w:sz w:val="9"/>
+                <w:sz w:val="8"/>
               </w:rPr>
               <w:t>────────────────────────────────────────────</w:t>
             </w:r>
           </w:p>
           <w:p>
             <w:pPr>
-              <w:spacing w:after="30" w:line="264" w:lineRule="auto"/>
+              <w:spacing w:before="36" w:after="2"/>
             </w:pPr>
             <w:r>
               <w:rPr>
-                <w:color w:val="334155"/>
-              </w:rPr>
-              <w:t>Lead AI Engineer &amp; Data Architect (Google Developer Program Member), leveraging Google Antigravity to design neuro-sym</w:t>
-            </w:r>
-            <w:r>
-              <w:rPr>
-                <w:color w:val="334155"/>
-              </w:rPr>
-              <w:t>bolic multi-agent architectures, Neo4j GraphRAG, and sovereign MLOps pipelines. Expert in AI ethics: SHAP transparency, EU AI Act compliance, and deterministic zero-hallucination models. Founder &amp; Architect of Archi Cam AI (Agentic AI SaaS &amp; 5D BIM), bridg</w:t>
-            </w:r>
-            <w:r>
-              <w:rPr>
-                <w:color w:val="334155"/>
-              </w:rPr>
-              <w:t>ing civil engineering methodology, mathematical rigor, and product vision.</w:t>
+                <w:b/>
+                <w:color w:val="0A1128"/>
+                <w:sz w:val="18"/>
+              </w:rPr>
+              <w:t>Archi Cam AI</w:t>
+            </w:r>
+            <w:r>
+              <w:rPr>
+                <w:i/>
+                <w:color w:val="0284C7"/>
+                <w:sz w:val="15"/>
+              </w:rPr>
+              <w:t xml:space="preserve">   —   Agentic AI &amp;</w:t>
+            </w:r>
+            <w:r>
+              <w:rPr>
+                <w:i/>
+                <w:color w:val="0284C7"/>
+                <w:sz w:val="15"/>
+              </w:rPr>
+              <w:t xml:space="preserve"> 5D BIM Construction SaaS</w:t>
             </w:r>
           </w:p>
           <w:p>
             <w:pPr>
-              <w:spacing w:before="64" w:after="4"/>
+              <w:spacing w:after="8" w:line="252" w:lineRule="auto"/>
+              <w:ind w:left="115"/>
             </w:pPr>
             <w:r>
               <w:rPr>
                 <w:b/>
                 <w:color w:val="0284C7"/>
-                <w:sz w:val="17"/>
-              </w:rPr>
-              <w:t xml:space="preserve">◈  </w:t>
+                <w:sz w:val="15"/>
+              </w:rPr>
+              <w:t>▸</w:t>
             </w:r>
             <w:r>
               <w:rPr>
                 <w:b/>
-                <w:color w:val="0A1128"/>
-                <w:sz w:val="20"/>
-              </w:rPr>
-              <w:t>FLAGSHIP AI PROJECTS</w:t>
+                <w:color w:val="0284C7"/>
+                <w:sz w:val="15"/>
+              </w:rPr>
+              <w:t xml:space="preserve">  </w:t>
+            </w:r>
+            <w:r>
+              <w:rPr>
+                <w:color w:val="334155"/>
+                <w:sz w:val="15"/>
+              </w:rPr>
+              <w:t>Full automation of construction quantity takeoff and cost estimation: eliminating human error and material waste.</w:t>
             </w:r>
           </w:p>
           <w:p>
             <w:pPr>
-              <w:spacing w:after="28"/>
+              <w:spacing w:after="8" w:line="252" w:lineRule="auto"/>
+              <w:ind w:left="115"/>
             </w:pPr>
             <w:r>
               <w:rPr>
+                <w:b/>
                 <w:color w:val="0284C7"/>
-                <w:sz w:val="10"/>
-              </w:rPr>
-              <w:t>━━━━━━━━━━━━━━━━━━</w:t>
-            </w:r>
-            <w:r>
-              <w:rPr>
-                <w:color w:val="38BDF8"/>
-                <w:sz w:val="9"/>
-              </w:rPr>
-              <w:t>────────────────────────────────────────────</w:t>
+                <w:sz w:val="15"/>
+              </w:rPr>
+              <w:t>▸</w:t>
+            </w:r>
+            <w:r>
+              <w:rPr>
+                <w:b/>
+                <w:color w:val="0284C7"/>
+                <w:sz w:val="15"/>
+              </w:rPr>
+              <w:t xml:space="preserve">  </w:t>
+            </w:r>
+            <w:r>
+              <w:rPr>
+                <w:color w:val="334155"/>
+                <w:sz w:val="15"/>
+              </w:rPr>
+              <w:t>Instant generation of standardized BOQ estimates in &lt;45s (99.2% time savings) and 3D architectural renders.</w:t>
             </w:r>
           </w:p>
           <w:p>
             <w:pPr>
-              <w:spacing w:before="44" w:after="4"/>
+              <w:spacing w:after="8" w:line="252" w:lineRule="auto"/>
+              <w:ind w:left="115"/>
+            </w:pPr>
+            <w:r>
+              <w:rPr>
+                <w:b/>
+                <w:color w:val="0284C7"/>
+                <w:sz w:val="15"/>
+              </w:rPr>
+              <w:t>▸</w:t>
+            </w:r>
+            <w:r>
+              <w:rPr>
+                <w:b/>
+                <w:color w:val="0284C7"/>
+                <w:sz w:val="15"/>
+              </w:rPr>
+              <w:t xml:space="preserve"> </w:t>
+            </w:r>
+            <w:r>
+              <w:rPr>
+                <w:b/>
+                <w:color w:val="0284C7"/>
+                <w:sz w:val="15"/>
+              </w:rPr>
+              <w:t xml:space="preserve"> </w:t>
+            </w:r>
+            <w:r>
+              <w:rPr>
+                <w:color w:val="334155"/>
+                <w:sz w:val="15"/>
+              </w:rPr>
+              <w:t>Deterministic zero-hallucination structural concrete validation enforcing strict compliance with urban planning codes.</w:t>
+            </w:r>
+          </w:p>
+          <w:p>
+            <w:pPr>
+              <w:spacing w:before="36" w:after="2"/>
             </w:pPr>
             <w:r>
               <w:rPr>
@@ -944,25 +991,27 @@
                 <w:color w:val="0A1128"/>
                 <w:sz w:val="18"/>
               </w:rPr>
-              <w:t>Archi Cam AI</w:t>
+              <w:t>K1-MATHINFO (v3.0.0)</w:t>
             </w:r>
             <w:r>
               <w:rPr>
                 <w:i/>
                 <w:color w:val="0284C7"/>
-              </w:rPr>
-              <w:t xml:space="preserve">   —   Agentic AI SaaS &amp; 5D BIM</w:t>
+                <w:sz w:val="15"/>
+              </w:rPr>
+              <w:t xml:space="preserve">   —   Sovereign Academic Research &amp; Asset Platform</w:t>
             </w:r>
           </w:p>
           <w:p>
             <w:pPr>
-              <w:spacing w:after="12" w:line="259" w:lineRule="auto"/>
-              <w:ind w:left="144"/>
+              <w:spacing w:after="8" w:line="252" w:lineRule="auto"/>
+              <w:ind w:left="115"/>
             </w:pPr>
             <w:r>
               <w:rPr>
                 <w:b/>
                 <w:color w:val="0284C7"/>
+                <w:sz w:val="15"/>
               </w:rPr>
               <w:t>▸</w:t>
             </w:r>
@@ -970,31 +1019,35 @@
               <w:rPr>
                 <w:b/>
                 <w:color w:val="0284C7"/>
+                <w:sz w:val="15"/>
               </w:rPr>
               <w:t xml:space="preserve">  </w:t>
             </w:r>
             <w:r>
               <w:rPr>
                 <w:color w:val="334155"/>
-              </w:rPr>
-              <w:t xml:space="preserve">Sovereign 5D BIM platform (YOLO, Shapely, </w:t>
+                <w:sz w:val="15"/>
+              </w:rPr>
+              <w:t xml:space="preserve">Preservation, indexing, and semantic exploration across 28 </w:t>
             </w:r>
             <w:r>
               <w:rPr>
                 <w:color w:val="334155"/>
-              </w:rPr>
-              <w:t>IfcOpenShell, BAEL 91, Gemma 4, Gemini 2.5).</w:t>
+                <w:sz w:val="15"/>
+              </w:rPr>
+              <w:t>years of university scientific research (470 Ph.D. theses).</w:t>
             </w:r>
           </w:p>
           <w:p>
             <w:pPr>
-              <w:spacing w:after="12" w:line="259" w:lineRule="auto"/>
-              <w:ind w:left="144"/>
+              <w:spacing w:after="8" w:line="252" w:lineRule="auto"/>
+              <w:ind w:left="115"/>
             </w:pPr>
             <w:r>
               <w:rPr>
                 <w:b/>
                 <w:color w:val="0284C7"/>
+                <w:sz w:val="15"/>
               </w:rPr>
               <w:t>▸</w:t>
             </w:r>
@@ -1002,45 +1055,108 @@
               <w:rPr>
                 <w:b/>
                 <w:color w:val="0284C7"/>
+                <w:sz w:val="15"/>
               </w:rPr>
               <w:t xml:space="preserve">  </w:t>
             </w:r>
             <w:r>
               <w:rPr>
                 <w:color w:val="334155"/>
-              </w:rPr>
-              <w:t>Automated Excel BOQs in &lt;45s (–99.2% time, MLflow R²=0.9872), 3D teasers via Veo 3 / Fal.ai.</w:t>
+                <w:sz w:val="15"/>
+              </w:rPr>
+              <w:t>Intelligent student-to-advisor recommendation (Advisor Matcher) and cryptographic certification of research integrity.</w:t>
             </w:r>
           </w:p>
           <w:p>
             <w:pPr>
-              <w:spacing w:after="12" w:line="259" w:lineRule="auto"/>
-              <w:ind w:left="144"/>
+              <w:spacing w:before="36" w:after="2"/>
             </w:pPr>
             <w:r>
               <w:rPr>
                 <w:b/>
+                <w:color w:val="0A1128"/>
+                <w:sz w:val="18"/>
+              </w:rPr>
+              <w:t>Sovereign.BI Agentic</w:t>
+            </w:r>
+            <w:r>
+              <w:rPr>
+                <w:i/>
                 <w:color w:val="0284C7"/>
-              </w:rPr>
-              <w:t>▸</w:t>
-            </w:r>
-            <w:r>
-              <w:rPr>
-                <w:b/>
+                <w:sz w:val="15"/>
+              </w:rPr>
+              <w:t xml:space="preserve">   —   Enterprise Business Intelligence &amp; Strategic De</w:t>
+            </w:r>
+            <w:r>
+              <w:rPr>
+                <w:i/>
                 <w:color w:val="0284C7"/>
-              </w:rPr>
-              <w:t xml:space="preserve">  </w:t>
-            </w:r>
-            <w:r>
-              <w:rPr>
-                <w:color w:val="334155"/>
-              </w:rPr>
-              <w:t>5D IFC models: automated costing &amp; scheduling without hallucination risk (POS / ONAC standards).</w:t>
+                <w:sz w:val="15"/>
+              </w:rPr>
+              <w:t>cision Engine</w:t>
             </w:r>
           </w:p>
           <w:p>
             <w:pPr>
-              <w:spacing w:before="44" w:after="4"/>
+              <w:spacing w:after="8" w:line="252" w:lineRule="auto"/>
+              <w:ind w:left="115"/>
+            </w:pPr>
+            <w:r>
+              <w:rPr>
+                <w:b/>
+                <w:color w:val="0284C7"/>
+                <w:sz w:val="15"/>
+              </w:rPr>
+              <w:t>▸</w:t>
+            </w:r>
+            <w:r>
+              <w:rPr>
+                <w:b/>
+                <w:color w:val="0284C7"/>
+                <w:sz w:val="15"/>
+              </w:rPr>
+              <w:t xml:space="preserve">  </w:t>
+            </w:r>
+            <w:r>
+              <w:rPr>
+                <w:color w:val="334155"/>
+                <w:sz w:val="15"/>
+              </w:rPr>
+              <w:t>Executive decision enablement: querying complex corporate data warehouses directly in natural language in under 5 seconds.</w:t>
+            </w:r>
+          </w:p>
+          <w:p>
+            <w:pPr>
+              <w:spacing w:after="8" w:line="252" w:lineRule="auto"/>
+              <w:ind w:left="115"/>
+            </w:pPr>
+            <w:r>
+              <w:rPr>
+                <w:b/>
+                <w:color w:val="0284C7"/>
+                <w:sz w:val="15"/>
+              </w:rPr>
+              <w:t>▸</w:t>
+            </w:r>
+            <w:r>
+              <w:rPr>
+                <w:b/>
+                <w:color w:val="0284C7"/>
+                <w:sz w:val="15"/>
+              </w:rPr>
+              <w:t xml:space="preserve">  </w:t>
+            </w:r>
+            <w:r>
+              <w:rPr>
+                <w:color w:val="334155"/>
+                <w:sz w:val="15"/>
+              </w:rPr>
+              <w:t>Total sovereign enterprise privacy with air-gapped local execution and mathematical explainability for every KPI.</w:t>
+            </w:r>
+          </w:p>
+          <w:p>
+            <w:pPr>
+              <w:spacing w:before="36" w:after="2"/>
             </w:pPr>
             <w:r>
               <w:rPr>
@@ -1048,59 +1164,173 @@
                 <w:color w:val="0A1128"/>
                 <w:sz w:val="18"/>
               </w:rPr>
-              <w:t>K1-MATHINFO (v3</w:t>
-            </w:r>
+              <w:t>Dataset Automator &amp; VigieSahel</w:t>
+            </w:r>
+            <w:r>
+              <w:rPr>
+                <w:i/>
+                <w:color w:val="0284C7"/>
+                <w:sz w:val="15"/>
+              </w:rPr>
+              <w:t xml:space="preserve">   —   Climate Resilience &amp; Production MLOps Systems</w:t>
+            </w:r>
+          </w:p>
+          <w:p>
+            <w:pPr>
+              <w:spacing w:after="8" w:line="252" w:lineRule="auto"/>
+              <w:ind w:left="115"/>
+            </w:pPr>
+            <w:r>
+              <w:rPr>
+                <w:b/>
+                <w:color w:val="0284C7"/>
+                <w:sz w:val="15"/>
+              </w:rPr>
+              <w:t>▸</w:t>
+            </w:r>
+            <w:r>
+              <w:rPr>
+                <w:b/>
+                <w:color w:val="0284C7"/>
+                <w:sz w:val="15"/>
+              </w:rPr>
+              <w:t xml:space="preserve">  </w:t>
+            </w:r>
+            <w:r>
+              <w:rPr>
+                <w:color w:val="334155"/>
+                <w:sz w:val="15"/>
+              </w:rPr>
+              <w:t>Dataset Automator: Autonomous data engineering factory for reliable dataset preparation, fairness audits, and compliance.</w:t>
+            </w:r>
+          </w:p>
+          <w:p>
+            <w:pPr>
+              <w:spacing w:after="8" w:line="252" w:lineRule="auto"/>
+              <w:ind w:left="115"/>
+            </w:pPr>
+            <w:r>
+              <w:rPr>
+                <w:b/>
+                <w:color w:val="0284C7"/>
+                <w:sz w:val="15"/>
+              </w:rPr>
+              <w:t>▸</w:t>
+            </w:r>
+            <w:r>
+              <w:rPr>
+                <w:b/>
+                <w:color w:val="0284C7"/>
+                <w:sz w:val="15"/>
+              </w:rPr>
+              <w:t xml:space="preserve">  </w:t>
+            </w:r>
+            <w:r>
+              <w:rPr>
+                <w:color w:val="334155"/>
+                <w:sz w:val="15"/>
+              </w:rPr>
+              <w:t>VigieSahel: Sahelian resilience system cutti</w:t>
+            </w:r>
+            <w:r>
+              <w:rPr>
+                <w:color w:val="334155"/>
+                <w:sz w:val="15"/>
+              </w:rPr>
+              <w:t>ng crop sowing failures by 35% and forecasting meningitis epidemics 14 days ahead.</w:t>
+            </w:r>
+          </w:p>
+          <w:p>
+            <w:pPr>
+              <w:spacing w:before="52" w:after="2"/>
+            </w:pPr>
+            <w:r>
+              <w:rPr>
+                <w:b/>
+                <w:color w:val="0284C7"/>
+              </w:rPr>
+              <w:t xml:space="preserve">◈  </w:t>
+            </w:r>
+            <w:r>
+              <w:rPr>
+                <w:b/>
+                <w:color w:val="0A1128"/>
+                <w:sz w:val="19"/>
+              </w:rPr>
+              <w:t>PROFESSIONAL EXPERIENCE</w:t>
+            </w:r>
+          </w:p>
+          <w:p>
+            <w:pPr>
+              <w:spacing w:after="20"/>
+            </w:pPr>
+            <w:r>
+              <w:rPr>
+                <w:color w:val="0284C7"/>
+                <w:sz w:val="9"/>
+              </w:rPr>
+              <w:t>━━━━━━━━━━━━━━━━━━</w:t>
+            </w:r>
+            <w:r>
+              <w:rPr>
+                <w:color w:val="38BDF8"/>
+                <w:sz w:val="8"/>
+              </w:rPr>
+              <w:t>────────────────────────────────────────────</w:t>
+            </w:r>
+          </w:p>
+          <w:p>
+            <w:pPr>
+              <w:spacing w:before="36" w:after="2"/>
+            </w:pPr>
             <w:r>
               <w:rPr>
                 <w:b/>
                 <w:color w:val="0A1128"/>
                 <w:sz w:val="18"/>
               </w:rPr>
-              <w:t>.0.0)</w:t>
+              <w:t>AI Lead &amp; Data Science Consultant</w:t>
             </w:r>
             <w:r>
               <w:rPr>
                 <w:i/>
                 <w:color w:val="0284C7"/>
-              </w:rPr>
-              <w:t xml:space="preserve">   —   Sovereign Multi-Agent AI, WikiSkills &amp; OKF Certification</w:t>
+                <w:sz w:val="15"/>
+              </w:rPr>
+              <w:t xml:space="preserve">   —   March 2026 – Present</w:t>
             </w:r>
           </w:p>
           <w:p>
             <w:pPr>
-              <w:spacing w:after="12" w:line="259" w:lineRule="auto"/>
-              <w:ind w:left="144"/>
+              <w:spacing w:after="2"/>
             </w:pPr>
             <w:r>
               <w:rPr>
                 <w:b/>
-                <w:color w:val="0284C7"/>
-              </w:rPr>
-              <w:t>▸</w:t>
+                <w:color w:val="64748B"/>
+                <w:sz w:val="15"/>
+              </w:rPr>
+              <w:t>Independent Projects &amp;</w:t>
             </w:r>
             <w:r>
               <w:rPr>
                 <w:b/>
-                <w:color w:val="0284C7"/>
-              </w:rPr>
-              <w:t xml:space="preserve">  </w:t>
-            </w:r>
-            <w:r>
-              <w:rPr>
-                <w:color w:val="334155"/>
-              </w:rPr>
-              <w:t>Sovereign DMI system (Univ. of Ngaoundéré): 470 theses, 19 M1 projects, 1,366 Neo4j nodes.</w:t>
+                <w:color w:val="64748B"/>
+                <w:sz w:val="15"/>
+              </w:rPr>
+              <w:t xml:space="preserve"> Enterprises  │  Douala, CM</w:t>
             </w:r>
           </w:p>
           <w:p>
             <w:pPr>
-              <w:spacing w:after="12" w:line="259" w:lineRule="auto"/>
-              <w:ind w:left="144"/>
+              <w:spacing w:after="8" w:line="252" w:lineRule="auto"/>
+              <w:ind w:left="115"/>
             </w:pPr>
             <w:r>
               <w:rPr>
                 <w:b/>
                 <w:color w:val="0284C7"/>
+                <w:sz w:val="15"/>
               </w:rPr>
               <w:t>▸</w:t>
             </w:r>
@@ -1108,25 +1338,50 @@
               <w:rPr>
                 <w:b/>
                 <w:color w:val="0284C7"/>
+                <w:sz w:val="15"/>
               </w:rPr>
               <w:t xml:space="preserve">  </w:t>
             </w:r>
             <w:r>
               <w:rPr>
                 <w:color w:val="334155"/>
-              </w:rPr>
-              <w:t>6 LangGraph agents orchestrated via WikiSkills (critic anti-hallucination, Cypher optimize</w:t>
-            </w:r>
-            <w:r>
-              <w:rPr>
-                <w:color w:val="334155"/>
-              </w:rPr>
-              <w:t>r), RRF k=60, SHA-256 No-LLM (100%).</w:t>
+                <w:sz w:val="15"/>
+              </w:rPr>
+              <w:t>Ethical sovereign AI systems: GraphRAG Neo4j pipelines, high-dimensional EDA, multi-source RAG architectures.</w:t>
             </w:r>
           </w:p>
           <w:p>
             <w:pPr>
-              <w:spacing w:before="44" w:after="4"/>
+              <w:spacing w:after="8" w:line="252" w:lineRule="auto"/>
+              <w:ind w:left="115"/>
+            </w:pPr>
+            <w:r>
+              <w:rPr>
+                <w:b/>
+                <w:color w:val="0284C7"/>
+                <w:sz w:val="15"/>
+              </w:rPr>
+              <w:t>▸</w:t>
+            </w:r>
+            <w:r>
+              <w:rPr>
+                <w:b/>
+                <w:color w:val="0284C7"/>
+                <w:sz w:val="15"/>
+              </w:rPr>
+              <w:t xml:space="preserve">  </w:t>
+            </w:r>
+            <w:r>
+              <w:rPr>
+                <w:color w:val="334155"/>
+                <w:sz w:val="15"/>
+              </w:rPr>
+              <w:t>Executive decision reporting, automated KPI dashboards, and SHAP explainability audits for African SMEs.</w:t>
+            </w:r>
+          </w:p>
+          <w:p>
+            <w:pPr>
+              <w:spacing w:before="36" w:after="2"/>
             </w:pPr>
             <w:r>
               <w:rPr>
@@ -1134,51 +1389,40 @@
                 <w:color w:val="0A1128"/>
                 <w:sz w:val="18"/>
               </w:rPr>
-              <w:t>Sovereign.BI Agentic</w:t>
+              <w:t>Aviation Security Officer (AVSEC)</w:t>
             </w:r>
             <w:r>
               <w:rPr>
                 <w:i/>
                 <w:color w:val="0284C7"/>
-              </w:rPr>
-              <w:t xml:space="preserve">   —   Enterprise Security &amp; Agentic BI</w:t>
+                <w:sz w:val="15"/>
+              </w:rPr>
+              <w:t xml:space="preserve">   —   2018 – Present</w:t>
             </w:r>
           </w:p>
           <w:p>
             <w:pPr>
-              <w:spacing w:after="12" w:line="259" w:lineRule="auto"/>
-              <w:ind w:left="144"/>
+              <w:spacing w:after="2"/>
             </w:pPr>
             <w:r>
               <w:rPr>
                 <w:b/>
-                <w:color w:val="0284C7"/>
-              </w:rPr>
-              <w:t>▸</w:t>
-            </w:r>
-            <w:r>
-              <w:rPr>
-                <w:b/>
-                <w:color w:val="0284C7"/>
-              </w:rPr>
-              <w:t xml:space="preserve">  </w:t>
-            </w:r>
-            <w:r>
-              <w:rPr>
-                <w:color w:val="334155"/>
-              </w:rPr>
-              <w:t>NL-to-SQL/Graph engine (PostgreSQL pgvector, Neo4j N10S, Apache AGE, latency &lt;5s).</w:t>
+                <w:color w:val="64748B"/>
+                <w:sz w:val="15"/>
+              </w:rPr>
+              <w:t>CCAA — Cameroon Civil Aviation Authority  │  Douala, CM</w:t>
             </w:r>
           </w:p>
           <w:p>
             <w:pPr>
-              <w:spacing w:after="12" w:line="259" w:lineRule="auto"/>
-              <w:ind w:left="144"/>
+              <w:spacing w:after="8" w:line="252" w:lineRule="auto"/>
+              <w:ind w:left="115"/>
             </w:pPr>
             <w:r>
               <w:rPr>
                 <w:b/>
                 <w:color w:val="0284C7"/>
+                <w:sz w:val="15"/>
               </w:rPr>
               <w:t>▸</w:t>
             </w:r>
@@ -1186,25 +1430,96 @@
               <w:rPr>
                 <w:b/>
                 <w:color w:val="0284C7"/>
+                <w:sz w:val="15"/>
               </w:rPr>
               <w:t xml:space="preserve">  </w:t>
             </w:r>
             <w:r>
               <w:rPr>
                 <w:color w:val="334155"/>
-              </w:rPr>
-              <w:t>FastMCP Gateway, Zod schema guardrails, ABAC access control, CrewAI, a</w:t>
-            </w:r>
-            <w:r>
-              <w:rPr>
-                <w:color w:val="334155"/>
-              </w:rPr>
-              <w:t>nd SHAP Sentinel.</w:t>
+                <w:sz w:val="15"/>
+              </w:rPr>
+              <w:t>Threat assessment, secure access control, and regulatory compliance audits (ICAO Annex 17).</w:t>
             </w:r>
           </w:p>
           <w:p>
             <w:pPr>
-              <w:spacing w:before="44" w:after="4"/>
+              <w:spacing w:after="8" w:line="252" w:lineRule="auto"/>
+              <w:ind w:left="115"/>
+            </w:pPr>
+            <w:r>
+              <w:rPr>
+                <w:b/>
+                <w:color w:val="0284C7"/>
+                <w:sz w:val="15"/>
+              </w:rPr>
+              <w:t>▸</w:t>
+            </w:r>
+            <w:r>
+              <w:rPr>
+                <w:b/>
+                <w:color w:val="0284C7"/>
+                <w:sz w:val="15"/>
+              </w:rPr>
+              <w:t xml:space="preserve">  </w:t>
+            </w:r>
+            <w:r>
+              <w:rPr>
+                <w:color w:val="334155"/>
+                <w:sz w:val="15"/>
+              </w:rPr>
+              <w:t>Operational crisis management: emergency team c</w:t>
+            </w:r>
+            <w:r>
+              <w:rPr>
+                <w:color w:val="334155"/>
+                <w:sz w:val="15"/>
+              </w:rPr>
+              <w:t>oordination, anti-intrusion protocols.</w:t>
+            </w:r>
+          </w:p>
+          <w:p>
+            <w:pPr>
+              <w:spacing w:before="52" w:after="2"/>
+            </w:pPr>
+            <w:r>
+              <w:rPr>
+                <w:b/>
+                <w:color w:val="0284C7"/>
+              </w:rPr>
+              <w:t xml:space="preserve">◈  </w:t>
+            </w:r>
+            <w:r>
+              <w:rPr>
+                <w:b/>
+                <w:color w:val="0A1128"/>
+                <w:sz w:val="19"/>
+              </w:rPr>
+              <w:t>EDUCATION &amp; CERTIFICATIONS</w:t>
+            </w:r>
+          </w:p>
+          <w:p>
+            <w:pPr>
+              <w:spacing w:after="20"/>
+            </w:pPr>
+            <w:r>
+              <w:rPr>
+                <w:color w:val="0284C7"/>
+                <w:sz w:val="9"/>
+              </w:rPr>
+              <w:t>━━━━━━━━━━━━━━━━━━</w:t>
+            </w:r>
+            <w:r>
+              <w:rPr>
+                <w:color w:val="38BDF8"/>
+                <w:sz w:val="8"/>
+              </w:rPr>
+              <w:t>────────────────────────────────────────────</w:t>
+            </w:r>
+          </w:p>
+          <w:p>
+            <w:pPr>
+              <w:spacing w:before="36" w:after="2"/>
             </w:pPr>
             <w:r>
               <w:rPr>
@@ -1212,51 +1527,40 @@
                 <w:color w:val="0A1128"/>
                 <w:sz w:val="18"/>
               </w:rPr>
-              <w:t>Dataset Automator &amp; VigieSahel</w:t>
+              <w:t>M.Sc. in Applied Artificial Intelligence</w:t>
             </w:r>
             <w:r>
               <w:rPr>
                 <w:i/>
                 <w:color w:val="0284C7"/>
-              </w:rPr>
-              <w:t xml:space="preserve">   —   MLOps Pipeline &amp; Climate AI Impact</w:t>
+                <w:sz w:val="15"/>
+              </w:rPr>
+              <w:t xml:space="preserve">   —   Dec. 2025 – 2027  [In Progress]</w:t>
             </w:r>
           </w:p>
           <w:p>
             <w:pPr>
-              <w:spacing w:after="12" w:line="259" w:lineRule="auto"/>
-              <w:ind w:left="144"/>
+              <w:spacing w:after="2"/>
             </w:pPr>
             <w:r>
               <w:rPr>
                 <w:b/>
-                <w:color w:val="0284C7"/>
-              </w:rPr>
-              <w:t>▸</w:t>
-            </w:r>
-            <w:r>
-              <w:rPr>
-                <w:b/>
-                <w:color w:val="0284C7"/>
-              </w:rPr>
-              <w:t xml:space="preserve">  </w:t>
-            </w:r>
-            <w:r>
-              <w:rPr>
-                <w:color w:val="334155"/>
-              </w:rPr>
-              <w:t>Dataset Automator: TabFM, PAIR WIT, bigframes, 55-cell CRISP-ML(Q) and EU AI Act.</w:t>
+                <w:color w:val="64748B"/>
+                <w:sz w:val="15"/>
+              </w:rPr>
+              <w:t>University of Ngaoundéré  │  Cameroon</w:t>
             </w:r>
           </w:p>
           <w:p>
             <w:pPr>
-              <w:spacing w:after="12" w:line="259" w:lineRule="auto"/>
-              <w:ind w:left="144"/>
+              <w:spacing w:after="8" w:line="252" w:lineRule="auto"/>
+              <w:ind w:left="115"/>
             </w:pPr>
             <w:r>
               <w:rPr>
                 <w:b/>
                 <w:color w:val="0284C7"/>
+                <w:sz w:val="15"/>
               </w:rPr>
               <w:t>▸</w:t>
             </w:r>
@@ -1264,572 +1568,261 @@
               <w:rPr>
                 <w:b/>
                 <w:color w:val="0284C7"/>
+                <w:sz w:val="15"/>
               </w:rPr>
               <w:t xml:space="preserve">  </w:t>
             </w:r>
             <w:r>
               <w:rPr>
                 <w:color w:val="334155"/>
-              </w:rPr>
-              <w:t xml:space="preserve">VigieSahel: –35% crop loss, +14d epidemic forecast (XGBoost R²&gt;94%, Supabase, </w:t>
+                <w:sz w:val="15"/>
+              </w:rPr>
+              <w:t>ML &amp;</w:t>
             </w:r>
             <w:r>
               <w:rPr>
                 <w:color w:val="334155"/>
-              </w:rPr>
-              <w:t>MLflow).</w:t>
+                <w:sz w:val="15"/>
+              </w:rPr>
+              <w:t xml:space="preserve"> Bayesian Statistics, Data Engineering &amp; Neo4j, Computer Vision &amp; Robotics, Ethics &amp; Cybersecurity, Production MLOps.</w:t>
             </w:r>
           </w:p>
           <w:p>
             <w:pPr>
-              <w:spacing w:before="64" w:after="4"/>
+              <w:spacing w:after="8" w:line="252" w:lineRule="auto"/>
+              <w:ind w:left="115"/>
             </w:pPr>
             <w:r>
               <w:rPr>
                 <w:b/>
                 <w:color w:val="0284C7"/>
-                <w:sz w:val="17"/>
-              </w:rPr>
-              <w:t xml:space="preserve">◈  </w:t>
+                <w:sz w:val="15"/>
+              </w:rPr>
+              <w:t>▸</w:t>
             </w:r>
             <w:r>
               <w:rPr>
                 <w:b/>
-                <w:color w:val="0A1128"/>
-                <w:sz w:val="20"/>
-              </w:rPr>
-              <w:t>PROFESSIONAL EXPERIENCE</w:t>
+                <w:color w:val="0284C7"/>
+                <w:sz w:val="15"/>
+              </w:rPr>
+              <w:t xml:space="preserve">  </w:t>
+            </w:r>
+            <w:r>
+              <w:rPr>
+                <w:color w:val="334155"/>
+                <w:sz w:val="15"/>
+              </w:rPr>
+              <w:t>Research project: K1-MATHINFO v3 sovereign system — multi-source agent certified OKF v0.2 (SHA-256 No-LLM).</w:t>
             </w:r>
           </w:p>
           <w:p>
             <w:pPr>
-              <w:spacing w:after="28"/>
+              <w:spacing w:before="36" w:after="2"/>
             </w:pPr>
             <w:r>
               <w:rPr>
+                <w:b/>
+                <w:color w:val="0A1128"/>
+                <w:sz w:val="18"/>
+              </w:rPr>
+              <w:t xml:space="preserve">B.Sc. in Civil Engineering </w:t>
+            </w:r>
+            <w:r>
+              <w:rPr>
+                <w:b/>
+                <w:color w:val="0A1128"/>
+                <w:sz w:val="18"/>
+              </w:rPr>
+              <w:t>(Building Option)</w:t>
+            </w:r>
+            <w:r>
+              <w:rPr>
+                <w:i/>
                 <w:color w:val="0284C7"/>
-                <w:sz w:val="10"/>
-              </w:rPr>
-              <w:t>━━━━━━━━━━━━━━━━━━</w:t>
-            </w:r>
-            <w:r>
-              <w:rPr>
-                <w:color w:val="38BDF8"/>
-                <w:sz w:val="9"/>
-              </w:rPr>
-              <w:t>────────────────────────────────────────────</w:t>
+                <w:sz w:val="15"/>
+              </w:rPr>
+              <w:t xml:space="preserve">   —   2015 – 2016</w:t>
             </w:r>
           </w:p>
           <w:p>
             <w:pPr>
-              <w:spacing w:before="44" w:after="4"/>
+              <w:spacing w:after="2"/>
             </w:pPr>
             <w:r>
               <w:rPr>
                 <w:b/>
-                <w:color w:val="0A1128"/>
-                <w:sz w:val="18"/>
-              </w:rPr>
-              <w:t>AI Lead &amp; Data Science Consultant</w:t>
-            </w:r>
-            <w:r>
-              <w:rPr>
-                <w:i/>
-                <w:color w:val="0284C7"/>
-              </w:rPr>
-              <w:t xml:space="preserve">   —   March 2026 – Present</w:t>
+                <w:color w:val="64748B"/>
+                <w:sz w:val="15"/>
+              </w:rPr>
+              <w:t>ISTDI / IUC Douala  │  Cameroon</w:t>
             </w:r>
           </w:p>
           <w:p>
             <w:pPr>
-              <w:spacing w:after="4"/>
+              <w:spacing w:after="8" w:line="252" w:lineRule="auto"/>
+              <w:ind w:left="115"/>
             </w:pPr>
             <w:r>
               <w:rPr>
                 <w:b/>
-                <w:color w:val="64748B"/>
-              </w:rPr>
-              <w:t>Independent Projects &amp; Enterprises  │  Douala, CM</w:t>
+                <w:color w:val="0284C7"/>
+                <w:sz w:val="15"/>
+              </w:rPr>
+              <w:t>▸</w:t>
+            </w:r>
+            <w:r>
+              <w:rPr>
+                <w:b/>
+                <w:color w:val="0284C7"/>
+                <w:sz w:val="15"/>
+              </w:rPr>
+              <w:t xml:space="preserve">  </w:t>
+            </w:r>
+            <w:r>
+              <w:rPr>
+                <w:color w:val="334155"/>
+                <w:sz w:val="15"/>
+              </w:rPr>
+              <w:t>Structural calculations (BAEL 91), quantity surveying, construction project management — AI-applied estimation base.</w:t>
             </w:r>
           </w:p>
           <w:p>
             <w:pPr>
-              <w:spacing w:after="12" w:line="259" w:lineRule="auto"/>
-              <w:ind w:left="144"/>
+              <w:spacing w:before="52" w:after="2"/>
             </w:pPr>
             <w:r>
               <w:rPr>
                 <w:b/>
                 <w:color w:val="0284C7"/>
               </w:rPr>
-              <w:t>▸</w:t>
+              <w:t xml:space="preserve">◈  </w:t>
             </w:r>
             <w:r>
               <w:rPr>
                 <w:b/>
-                <w:color w:val="0284C7"/>
-              </w:rPr>
-              <w:t xml:space="preserve">  </w:t>
-            </w:r>
-            <w:r>
-              <w:rPr>
-                <w:color w:val="334155"/>
-              </w:rPr>
-              <w:t>Ethical sovereign AI systems: GraphRAG Neo4</w:t>
-            </w:r>
-            <w:r>
-              <w:rPr>
-                <w:color w:val="334155"/>
-              </w:rPr>
-              <w:t>j pipelines, high-dimensional EDA, multi-source RAG architectures.</w:t>
+                <w:color w:val="0A1128"/>
+                <w:sz w:val="19"/>
+              </w:rPr>
+              <w:t>HONORS &amp; APPLIED AI DISTINCTIONS</w:t>
             </w:r>
           </w:p>
           <w:p>
             <w:pPr>
-              <w:spacing w:after="12" w:line="259" w:lineRule="auto"/>
-              <w:ind w:left="144"/>
+              <w:spacing w:after="20"/>
             </w:pPr>
             <w:r>
               <w:rPr>
-                <w:b/>
                 <w:color w:val="0284C7"/>
-              </w:rPr>
-              <w:t>▸</w:t>
-            </w:r>
-            <w:r>
-              <w:rPr>
-                <w:b/>
-                <w:color w:val="0284C7"/>
-              </w:rPr>
-              <w:t xml:space="preserve">  </w:t>
-            </w:r>
-            <w:r>
-              <w:rPr>
-                <w:color w:val="334155"/>
-              </w:rPr>
-              <w:t>Executive decision reporting, automated KPI dashboards, and SHAP explainability audits for African SMEs.</w:t>
+                <w:sz w:val="9"/>
+              </w:rPr>
+              <w:t>━━━━━━━━━━━━━━━━━━</w:t>
+            </w:r>
+            <w:r>
+              <w:rPr>
+                <w:color w:val="38BDF8"/>
+                <w:sz w:val="8"/>
+              </w:rPr>
+              <w:t>──────────────</w:t>
+            </w:r>
+            <w:r>
+              <w:rPr>
+                <w:color w:val="38BDF8"/>
+                <w:sz w:val="8"/>
+              </w:rPr>
+              <w:t>──────────────────────────────</w:t>
             </w:r>
           </w:p>
           <w:p>
             <w:pPr>
-              <w:spacing w:before="44" w:after="4"/>
+              <w:spacing w:before="12" w:after="6" w:line="252" w:lineRule="auto"/>
+              <w:ind w:left="115"/>
             </w:pPr>
+            <w:r>
+              <w:rPr>
+                <w:b/>
+                <w:color w:val="0284C7"/>
+                <w:sz w:val="15"/>
+              </w:rPr>
+              <w:t xml:space="preserve">◈ </w:t>
+            </w:r>
             <w:r>
               <w:rPr>
                 <w:b/>
                 <w:color w:val="0A1128"/>
-                <w:sz w:val="18"/>
-              </w:rPr>
-              <w:t>Aviation Security Officer (AVSEC)</w:t>
-            </w:r>
-            <w:r>
-              <w:rPr>
-                <w:i/>
-                <w:color w:val="0284C7"/>
-              </w:rPr>
-              <w:t xml:space="preserve">   —   2018 – Present</w:t>
+                <w:sz w:val="15"/>
+              </w:rPr>
+              <w:t>CCAA Attestation of Excellence &amp; Integrity (2023)</w:t>
+            </w:r>
+            <w:r>
+              <w:rPr>
+                <w:color w:val="334155"/>
+                <w:sz w:val="15"/>
+              </w:rPr>
+              <w:t xml:space="preserve">  —  Awarded by the Director General for outstanding operational performance &amp; ethics.</w:t>
             </w:r>
           </w:p>
           <w:p>
             <w:pPr>
-              <w:spacing w:after="4"/>
+              <w:spacing w:before="12" w:after="6" w:line="252" w:lineRule="auto"/>
+              <w:ind w:left="115"/>
             </w:pPr>
             <w:r>
               <w:rPr>
                 <w:b/>
-                <w:color w:val="64748B"/>
-              </w:rPr>
-              <w:t xml:space="preserve">CCAA — Cameroon Civil </w:t>
+                <w:color w:val="0284C7"/>
+                <w:sz w:val="15"/>
+              </w:rPr>
+              <w:t xml:space="preserve">◈ </w:t>
             </w:r>
             <w:r>
               <w:rPr>
                 <w:b/>
-                <w:color w:val="64748B"/>
-              </w:rPr>
-              <w:t>Aviation Authority  │  Douala, CM</w:t>
+                <w:color w:val="0A1128"/>
+                <w:sz w:val="15"/>
+              </w:rPr>
+              <w:t>Google Cloud #AllThingsAgentic Hackathon</w:t>
+            </w:r>
+            <w:r>
+              <w:rPr>
+                <w:color w:val="334155"/>
+                <w:sz w:val="15"/>
+              </w:rPr>
+              <w:t xml:space="preserve">  —  Dataset Automator v4.0 (Google Antigravi</w:t>
+            </w:r>
+            <w:r>
+              <w:rPr>
+                <w:color w:val="334155"/>
+                <w:sz w:val="15"/>
+              </w:rPr>
+              <w:t>ty, TabFM, BigQuery DataFrames, WIT).</w:t>
             </w:r>
           </w:p>
           <w:p>
             <w:pPr>
-              <w:spacing w:after="12" w:line="259" w:lineRule="auto"/>
-              <w:ind w:left="144"/>
+              <w:spacing w:before="12" w:after="6" w:line="252" w:lineRule="auto"/>
+              <w:ind w:left="115"/>
             </w:pPr>
             <w:r>
               <w:rPr>
                 <w:b/>
                 <w:color w:val="0284C7"/>
-              </w:rPr>
-              <w:t>▸</w:t>
-            </w:r>
-            <w:r>
-              <w:rPr>
-                <w:b/>
-                <w:color w:val="0284C7"/>
-              </w:rPr>
-              <w:t xml:space="preserve">  </w:t>
-            </w:r>
-            <w:r>
-              <w:rPr>
-                <w:color w:val="334155"/>
-              </w:rPr>
-              <w:t>Threat assessment, secure access control, and regulatory compliance audits (ICAO Annex 17).</w:t>
-            </w:r>
-          </w:p>
-          <w:p>
-            <w:pPr>
-              <w:spacing w:after="12" w:line="259" w:lineRule="auto"/>
-              <w:ind w:left="144"/>
-            </w:pPr>
-            <w:r>
-              <w:rPr>
-                <w:b/>
-                <w:color w:val="0284C7"/>
-              </w:rPr>
-              <w:t>▸</w:t>
-            </w:r>
-            <w:r>
-              <w:rPr>
-                <w:b/>
-                <w:color w:val="0284C7"/>
-              </w:rPr>
-              <w:t xml:space="preserve">  </w:t>
-            </w:r>
-            <w:r>
-              <w:rPr>
-                <w:color w:val="334155"/>
-              </w:rPr>
-              <w:t>Operational crisis management: emergency team coordination, anti-intrusion protocols.</w:t>
-            </w:r>
-          </w:p>
-          <w:p>
-            <w:pPr>
-              <w:spacing w:before="64" w:after="4"/>
-            </w:pPr>
-            <w:r>
-              <w:rPr>
-                <w:b/>
-                <w:color w:val="0284C7"/>
-                <w:sz w:val="17"/>
-              </w:rPr>
-              <w:t xml:space="preserve">◈  </w:t>
+                <w:sz w:val="15"/>
+              </w:rPr>
+              <w:t xml:space="preserve">◈ </w:t>
             </w:r>
             <w:r>
               <w:rPr>
                 <w:b/>
                 <w:color w:val="0A1128"/>
-                <w:sz w:val="20"/>
-              </w:rPr>
-              <w:t>EDUCATION &amp; CERTIFICATIONS</w:t>
-            </w:r>
-          </w:p>
-          <w:p>
-            <w:pPr>
-              <w:spacing w:after="28"/>
-            </w:pPr>
-            <w:r>
-              <w:rPr>
-                <w:color w:val="0284C7"/>
-                <w:sz w:val="10"/>
-              </w:rPr>
-              <w:t>━━━━━━━━</w:t>
-            </w:r>
-            <w:r>
-              <w:rPr>
-                <w:color w:val="0284C7"/>
-                <w:sz w:val="10"/>
-              </w:rPr>
-              <w:t>━━━━━━━━━━</w:t>
-            </w:r>
-            <w:r>
-              <w:rPr>
-                <w:color w:val="38BDF8"/>
-                <w:sz w:val="9"/>
-              </w:rPr>
-              <w:t>────────────────────────────────────────────</w:t>
-            </w:r>
-          </w:p>
-          <w:p>
-            <w:pPr>
-              <w:spacing w:before="44" w:after="4"/>
-            </w:pPr>
-            <w:r>
-              <w:rPr>
-                <w:b/>
-                <w:color w:val="0A1128"/>
-                <w:sz w:val="18"/>
-              </w:rPr>
-              <w:t>M.Sc. in Applied Artificial Intelligence</w:t>
-            </w:r>
-            <w:r>
-              <w:rPr>
-                <w:i/>
-                <w:color w:val="0284C7"/>
-              </w:rPr>
-              <w:t xml:space="preserve">   —   Dec. 2025 – 2027  [In Progress]</w:t>
-            </w:r>
-          </w:p>
-          <w:p>
-            <w:pPr>
-              <w:spacing w:after="4"/>
-            </w:pPr>
-            <w:r>
-              <w:rPr>
-                <w:b/>
-                <w:color w:val="64748B"/>
-              </w:rPr>
-              <w:t>University of Ngaoundéré  │  Cameroon</w:t>
-            </w:r>
-          </w:p>
-          <w:p>
-            <w:pPr>
-              <w:spacing w:after="12" w:line="259" w:lineRule="auto"/>
-              <w:ind w:left="144"/>
-            </w:pPr>
-            <w:r>
-              <w:rPr>
-                <w:b/>
-                <w:color w:val="0284C7"/>
-              </w:rPr>
-              <w:t>▸</w:t>
-            </w:r>
-            <w:r>
-              <w:rPr>
-                <w:b/>
-                <w:color w:val="0284C7"/>
-              </w:rPr>
-              <w:t xml:space="preserve">  </w:t>
+                <w:sz w:val="15"/>
+              </w:rPr>
+              <w:t>Google Developer Program · AICC Accra</w:t>
             </w:r>
             <w:r>
               <w:rPr>
                 <w:color w:val="334155"/>
-              </w:rPr>
-              <w:t xml:space="preserve">ML &amp; Bayesian Statistics, Data Engineering &amp; Neo4j, Computer Vision &amp; Robotics, </w:t>
-            </w:r>
-            <w:r>
-              <w:rPr>
-                <w:color w:val="334155"/>
-              </w:rPr>
-              <w:t>Ethics &amp; Cybersecurity, Production MLOps.</w:t>
-            </w:r>
-          </w:p>
-          <w:p>
-            <w:pPr>
-              <w:spacing w:after="12" w:line="259" w:lineRule="auto"/>
-              <w:ind w:left="144"/>
-            </w:pPr>
-            <w:r>
-              <w:rPr>
-                <w:b/>
-                <w:color w:val="0284C7"/>
-              </w:rPr>
-              <w:t>▸</w:t>
-            </w:r>
-            <w:r>
-              <w:rPr>
-                <w:b/>
-                <w:color w:val="0284C7"/>
-              </w:rPr>
-              <w:t xml:space="preserve">  </w:t>
-            </w:r>
-            <w:r>
-              <w:rPr>
-                <w:color w:val="334155"/>
-              </w:rPr>
-              <w:t>Research project: K1-MATHINFO v3 sovereign system — multi-source agent certified OKF v0.2 (SHA-256 No-LLM).</w:t>
-            </w:r>
-          </w:p>
-          <w:p>
-            <w:pPr>
-              <w:spacing w:before="44" w:after="4"/>
-            </w:pPr>
-            <w:r>
-              <w:rPr>
-                <w:b/>
-                <w:color w:val="0A1128"/>
-                <w:sz w:val="18"/>
-              </w:rPr>
-              <w:t>B.Sc. in Civil Engineering (Building Option)</w:t>
-            </w:r>
-            <w:r>
-              <w:rPr>
-                <w:i/>
-                <w:color w:val="0284C7"/>
-              </w:rPr>
-              <w:t xml:space="preserve">   —   2015 – 2016</w:t>
-            </w:r>
-          </w:p>
-          <w:p>
-            <w:pPr>
-              <w:spacing w:after="4"/>
-            </w:pPr>
-            <w:r>
-              <w:rPr>
-                <w:b/>
-                <w:color w:val="64748B"/>
-              </w:rPr>
-              <w:t>ISTDI / IUC Douala  │  Cameroon</w:t>
-            </w:r>
-          </w:p>
-          <w:p>
-            <w:pPr>
-              <w:spacing w:after="12" w:line="259" w:lineRule="auto"/>
-              <w:ind w:left="144"/>
-            </w:pPr>
-            <w:r>
-              <w:rPr>
-                <w:b/>
-                <w:color w:val="0284C7"/>
-              </w:rPr>
-              <w:t>▸</w:t>
-            </w:r>
-            <w:r>
-              <w:rPr>
-                <w:b/>
-                <w:color w:val="0284C7"/>
-              </w:rPr>
-              <w:t xml:space="preserve">  </w:t>
-            </w:r>
-            <w:r>
-              <w:rPr>
-                <w:color w:val="334155"/>
-              </w:rPr>
-              <w:t>Struc</w:t>
-            </w:r>
-            <w:r>
-              <w:rPr>
-                <w:color w:val="334155"/>
-              </w:rPr>
-              <w:t>tural calculations (BAEL 91), quantity surveying, construction project management — AI-applied estimation base.</w:t>
-            </w:r>
-          </w:p>
-          <w:p>
-            <w:pPr>
-              <w:spacing w:before="64" w:after="4"/>
-            </w:pPr>
-            <w:r>
-              <w:rPr>
-                <w:b/>
-                <w:color w:val="0284C7"/>
-                <w:sz w:val="17"/>
-              </w:rPr>
-              <w:t xml:space="preserve">◈  </w:t>
-            </w:r>
-            <w:r>
-              <w:rPr>
-                <w:b/>
-                <w:color w:val="0A1128"/>
-                <w:sz w:val="20"/>
-              </w:rPr>
-              <w:t>HONORS &amp; APPLIED AI DISTINCTIONS</w:t>
-            </w:r>
-          </w:p>
-          <w:p>
-            <w:pPr>
-              <w:spacing w:after="28"/>
-            </w:pPr>
-            <w:r>
-              <w:rPr>
-                <w:color w:val="0284C7"/>
-                <w:sz w:val="10"/>
-              </w:rPr>
-              <w:t>━━━━━━━━━━━━━━━━━━</w:t>
-            </w:r>
-            <w:r>
-              <w:rPr>
-                <w:color w:val="38BDF8"/>
-                <w:sz w:val="9"/>
-              </w:rPr>
-              <w:t>────────────────────────────────────────────</w:t>
-            </w:r>
-          </w:p>
-          <w:p>
-            <w:pPr>
-              <w:spacing w:before="16" w:after="8" w:line="259" w:lineRule="auto"/>
-              <w:ind w:left="115"/>
-            </w:pPr>
-            <w:r>
-              <w:rPr>
-                <w:b/>
-                <w:color w:val="0284C7"/>
-              </w:rPr>
-              <w:t xml:space="preserve">◈ </w:t>
-            </w:r>
-            <w:r>
-              <w:rPr>
-                <w:b/>
-                <w:color w:val="0A1128"/>
-              </w:rPr>
-              <w:t xml:space="preserve">CCAA Attestation of Excellence &amp; Integrity </w:t>
-            </w:r>
-            <w:r>
-              <w:rPr>
-                <w:b/>
-                <w:color w:val="0A1128"/>
-              </w:rPr>
-              <w:t>(2023)</w:t>
-            </w:r>
-            <w:r>
-              <w:rPr>
-                <w:color w:val="334155"/>
-              </w:rPr>
-              <w:t xml:space="preserve">  —  Awarded by the Director General for outstanding operational performance &amp; ethics.</w:t>
-            </w:r>
-          </w:p>
-          <w:p>
-            <w:pPr>
-              <w:spacing w:before="16" w:after="8" w:line="259" w:lineRule="auto"/>
-              <w:ind w:left="115"/>
-            </w:pPr>
-            <w:r>
-              <w:rPr>
-                <w:b/>
-                <w:color w:val="0284C7"/>
-              </w:rPr>
-              <w:t xml:space="preserve">◈ </w:t>
-            </w:r>
-            <w:r>
-              <w:rPr>
-                <w:b/>
-                <w:color w:val="0A1128"/>
-              </w:rPr>
-              <w:t>Google Cloud #AllThingsAgentic Hackathon</w:t>
-            </w:r>
-            <w:r>
-              <w:rPr>
-                <w:color w:val="334155"/>
-              </w:rPr>
-              <w:t xml:space="preserve">  —  Dataset Automator v4.0 (Google Antigravity, TabFM, BigQuery DataFrames, WIT).</w:t>
-            </w:r>
-          </w:p>
-          <w:p>
-            <w:pPr>
-              <w:spacing w:before="16" w:after="8" w:line="259" w:lineRule="auto"/>
-              <w:ind w:left="115"/>
-            </w:pPr>
-            <w:r>
-              <w:rPr>
-                <w:b/>
-                <w:color w:val="0284C7"/>
-              </w:rPr>
-              <w:t xml:space="preserve">◈ </w:t>
-            </w:r>
-            <w:r>
-              <w:rPr>
-                <w:b/>
-                <w:color w:val="0A1128"/>
-              </w:rPr>
-              <w:t xml:space="preserve">Google Developer Program · AICC </w:t>
-            </w:r>
-            <w:r>
-              <w:rPr>
-                <w:b/>
-                <w:color w:val="0A1128"/>
-              </w:rPr>
-              <w:t>Accra</w:t>
-            </w:r>
-            <w:r>
-              <w:rPr>
-                <w:color w:val="334155"/>
+                <w:sz w:val="15"/>
               </w:rPr>
               <w:t xml:space="preserve">  —  Active member · Accra AI Community Centre &amp; Google for Startups Accelerator Network.</w:t>
             </w:r>
@@ -14458,7 +14451,7 @@
 </file>
 
 <file path=customXml/itemProps1.xml><?xml version="1.0" encoding="utf-8"?>
-<ds:datastoreItem xmlns:ds="http://schemas.openxmlformats.org/officeDocument/2006/customXml" ds:itemID="{4F54315E-165E-444C-9BF5-3F53A43EFB8F}">
+<ds:datastoreItem xmlns:ds="http://schemas.openxmlformats.org/officeDocument/2006/customXml" ds:itemID="{F9110C4C-4040-4A48-8BE0-84248443E816}">
   <ds:schemaRefs>
     <ds:schemaRef ds:uri="http://schemas.openxmlformats.org/officeDocument/2006/bibliography"/>
   </ds:schemaRefs>

</xml_diff>

<commit_message>
feat: mise a jour interface K1-MATHINFO et synchronisation du portfolio
</commit_message>
<xml_diff>
--- a/KOA_MARIE_GERVAIS_NELLY_CV_EN.docx
+++ b/KOA_MARIE_GERVAIS_NELLY_CV_EN.docx
@@ -14,7 +14,7 @@
       <w:tr>
         <w:trPr>
           <w:cantSplit/>
-          <w:trHeight w:val="15400"/>
+          <w:trHeight w:val="16547"/>
         </w:trPr>
         <w:tc>
           <w:tcPr>
@@ -32,8 +32,6 @@
               <w:spacing w:after="0"/>
               <w:jc w:val="center"/>
             </w:pPr>
-            <w:bookmarkStart w:id="0" w:name="_GoBack"/>
-            <w:bookmarkEnd w:id="0"/>
             <w:r>
               <w:rPr>
                 <w:noProof/>
@@ -78,7 +76,7 @@
           </w:p>
           <w:p>
             <w:pPr>
-              <w:spacing w:before="60" w:after="0"/>
+              <w:spacing w:before="60" w:after="30"/>
               <w:jc w:val="center"/>
             </w:pPr>
             <w:r>
@@ -86,19 +84,6 @@
                 <w:b/>
                 <w:color w:val="38BDF8"/>
                 <w:sz w:val="13"/>
-              </w:rPr>
-              <w:t>◈  LEAD AI ENGINEER</w:t>
-            </w:r>
-          </w:p>
-          <w:p>
-            <w:pPr>
-              <w:spacing w:after="30"/>
-              <w:jc w:val="center"/>
-            </w:pPr>
-            <w:r>
-              <w:rPr>
-                <w:color w:val="64748B"/>
-                <w:sz w:val="12"/>
               </w:rPr>
               <w:t>Founder  ·  Archi Cam AI</w:t>
             </w:r>
@@ -107,11 +92,17 @@
             <w:pPr>
               <w:spacing w:before="84" w:after="0"/>
               <w:ind w:left="120"/>
+              <w:rPr>
+                <w:sz w:val="18"/>
+                <w:szCs w:val="18"/>
+              </w:rPr>
             </w:pPr>
             <w:r>
               <w:rPr>
                 <w:b/>
                 <w:color w:val="38BDF8"/>
+                <w:sz w:val="18"/>
+                <w:szCs w:val="18"/>
               </w:rPr>
               <w:t>CONTACT &amp; PROFILES</w:t>
             </w:r>
@@ -120,13 +111,718 @@
             <w:pPr>
               <w:spacing w:before="4" w:after="24"/>
               <w:ind w:left="120"/>
+              <w:rPr>
+                <w:szCs w:val="16"/>
+              </w:rPr>
             </w:pPr>
             <w:r>
               <w:rPr>
                 <w:color w:val="0284C7"/>
-                <w:sz w:val="9"/>
+                <w:szCs w:val="16"/>
               </w:rPr>
               <w:t>━━━━━━━━━━━━━━━━━</w:t>
+            </w:r>
+          </w:p>
+          <w:p>
+            <w:pPr>
+              <w:spacing w:after="20" w:line="252" w:lineRule="auto"/>
+              <w:ind w:left="120"/>
+              <w:rPr>
+                <w:szCs w:val="16"/>
+              </w:rPr>
+            </w:pPr>
+            <w:r>
+              <w:rPr>
+                <w:color w:val="F8FAFC"/>
+                <w:szCs w:val="16"/>
+              </w:rPr>
+              <w:t>✉</w:t>
+            </w:r>
+            <w:r>
+              <w:rPr>
+                <w:color w:val="F8FAFC"/>
+                <w:szCs w:val="16"/>
+              </w:rPr>
+              <w:t xml:space="preserve">  contact@archicam-ai.com</w:t>
+            </w:r>
+          </w:p>
+          <w:p>
+            <w:pPr>
+              <w:spacing w:after="20" w:line="252" w:lineRule="auto"/>
+              <w:ind w:left="120"/>
+              <w:rPr>
+                <w:szCs w:val="16"/>
+              </w:rPr>
+            </w:pPr>
+            <w:r>
+              <w:rPr>
+                <w:color w:val="F8FAFC"/>
+                <w:szCs w:val="16"/>
+              </w:rPr>
+              <w:t>✆</w:t>
+            </w:r>
+            <w:r>
+              <w:rPr>
+                <w:color w:val="F8FAFC"/>
+                <w:szCs w:val="16"/>
+              </w:rPr>
+              <w:t xml:space="preserve">  +237 695 35 34 02</w:t>
+            </w:r>
+          </w:p>
+          <w:p>
+            <w:pPr>
+              <w:spacing w:after="20" w:line="252" w:lineRule="auto"/>
+              <w:ind w:left="120"/>
+              <w:rPr>
+                <w:szCs w:val="16"/>
+              </w:rPr>
+            </w:pPr>
+            <w:r>
+              <w:rPr>
+                <w:color w:val="F8FAFC"/>
+                <w:szCs w:val="16"/>
+              </w:rPr>
+              <w:t>⌂</w:t>
+            </w:r>
+            <w:r>
+              <w:rPr>
+                <w:color w:val="F8FAFC"/>
+                <w:szCs w:val="16"/>
+              </w:rPr>
+              <w:t xml:space="preserve">  Douala / Ngaoundéré, CM</w:t>
+            </w:r>
+          </w:p>
+          <w:p>
+            <w:pPr>
+              <w:spacing w:after="20" w:line="252" w:lineRule="auto"/>
+              <w:ind w:left="120"/>
+              <w:rPr>
+                <w:szCs w:val="16"/>
+              </w:rPr>
+            </w:pPr>
+            <w:r>
+              <w:rPr>
+                <w:color w:val="F8FAFC"/>
+                <w:szCs w:val="16"/>
+              </w:rPr>
+              <w:t>🐙</w:t>
+            </w:r>
+            <w:r>
+              <w:rPr>
+                <w:color w:val="F8FAFC"/>
+                <w:szCs w:val="16"/>
+              </w:rPr>
+              <w:t xml:space="preserve">  github.com/gervais-afk</w:t>
+            </w:r>
+          </w:p>
+          <w:p>
+            <w:pPr>
+              <w:spacing w:after="20" w:line="252" w:lineRule="auto"/>
+              <w:ind w:left="120"/>
+              <w:rPr>
+                <w:szCs w:val="16"/>
+              </w:rPr>
+            </w:pPr>
+            <w:r>
+              <w:rPr>
+                <w:color w:val="F8FAFC"/>
+                <w:szCs w:val="16"/>
+              </w:rPr>
+              <w:t>💼</w:t>
+            </w:r>
+            <w:r>
+              <w:rPr>
+                <w:color w:val="F8FAFC"/>
+                <w:szCs w:val="16"/>
+              </w:rPr>
+              <w:t xml:space="preserve">  linkedin.com/in/marie-gervais-koa</w:t>
+            </w:r>
+          </w:p>
+          <w:p>
+            <w:pPr>
+              <w:spacing w:before="84" w:after="0"/>
+              <w:ind w:left="120"/>
+              <w:rPr>
+                <w:sz w:val="18"/>
+                <w:szCs w:val="18"/>
+              </w:rPr>
+            </w:pPr>
+            <w:r>
+              <w:rPr>
+                <w:b/>
+                <w:color w:val="38BDF8"/>
+                <w:sz w:val="18"/>
+                <w:szCs w:val="18"/>
+              </w:rPr>
+              <w:t>AI &amp; LLM STACK</w:t>
+            </w:r>
+          </w:p>
+          <w:p>
+            <w:pPr>
+              <w:spacing w:before="4" w:after="24"/>
+              <w:ind w:left="120"/>
+              <w:rPr>
+                <w:szCs w:val="16"/>
+              </w:rPr>
+            </w:pPr>
+            <w:r>
+              <w:rPr>
+                <w:color w:val="0284C7"/>
+                <w:szCs w:val="16"/>
+              </w:rPr>
+              <w:t>━━━━━━━━━━━━━━━━━</w:t>
+            </w:r>
+          </w:p>
+          <w:p>
+            <w:pPr>
+              <w:spacing w:after="20" w:line="252" w:lineRule="auto"/>
+              <w:ind w:left="120"/>
+              <w:rPr>
+                <w:szCs w:val="16"/>
+              </w:rPr>
+            </w:pPr>
+            <w:r>
+              <w:rPr>
+                <w:color w:val="F8FAFC"/>
+                <w:szCs w:val="16"/>
+              </w:rPr>
+              <w:t>Google Antigravity</w:t>
+            </w:r>
+            <w:r>
+              <w:rPr>
+                <w:color w:val="F8FAFC"/>
+                <w:szCs w:val="16"/>
+              </w:rPr>
+              <w:t xml:space="preserve"> IDE  ■ ■ ■ ■ ■</w:t>
+            </w:r>
+          </w:p>
+          <w:p>
+            <w:pPr>
+              <w:spacing w:after="20" w:line="252" w:lineRule="auto"/>
+              <w:ind w:left="120"/>
+              <w:rPr>
+                <w:szCs w:val="16"/>
+              </w:rPr>
+            </w:pPr>
+            <w:r>
+              <w:rPr>
+                <w:color w:val="F8FAFC"/>
+                <w:szCs w:val="16"/>
+              </w:rPr>
+              <w:t>LangGraph &amp; CrewAI      ■ ■ ■ ■ ■</w:t>
+            </w:r>
+          </w:p>
+          <w:p>
+            <w:pPr>
+              <w:spacing w:after="20" w:line="252" w:lineRule="auto"/>
+              <w:ind w:left="120"/>
+              <w:rPr>
+                <w:szCs w:val="16"/>
+              </w:rPr>
+            </w:pPr>
+            <w:r>
+              <w:rPr>
+                <w:color w:val="F8FAFC"/>
+                <w:szCs w:val="16"/>
+              </w:rPr>
+              <w:t>Google Gemma 4 (12B)    ■ ■ ■ ■ ■</w:t>
+            </w:r>
+          </w:p>
+          <w:p>
+            <w:pPr>
+              <w:spacing w:after="20" w:line="252" w:lineRule="auto"/>
+              <w:ind w:left="120"/>
+              <w:rPr>
+                <w:szCs w:val="16"/>
+              </w:rPr>
+            </w:pPr>
+            <w:r>
+              <w:rPr>
+                <w:color w:val="F8FAFC"/>
+                <w:szCs w:val="16"/>
+              </w:rPr>
+              <w:t>Gemini 2.5 / 1.5 Pro    ■ ■ ■ ■ ■</w:t>
+            </w:r>
+          </w:p>
+          <w:p>
+            <w:pPr>
+              <w:spacing w:after="20" w:line="252" w:lineRule="auto"/>
+              <w:ind w:left="120"/>
+              <w:rPr>
+                <w:szCs w:val="16"/>
+              </w:rPr>
+            </w:pPr>
+            <w:r>
+              <w:rPr>
+                <w:color w:val="F8FAFC"/>
+                <w:szCs w:val="16"/>
+              </w:rPr>
+              <w:t>Google TabFM (Tabular)  ■ ■ ■ ■ ■</w:t>
+            </w:r>
+          </w:p>
+          <w:p>
+            <w:pPr>
+              <w:spacing w:after="20" w:line="252" w:lineRule="auto"/>
+              <w:ind w:left="120"/>
+              <w:rPr>
+                <w:szCs w:val="16"/>
+              </w:rPr>
+            </w:pPr>
+            <w:r>
+              <w:rPr>
+                <w:color w:val="F8FAFC"/>
+                <w:szCs w:val="16"/>
+              </w:rPr>
+              <w:t>FastMCP &amp; Genkit        ■ ■ ■ ■ ■</w:t>
+            </w:r>
+          </w:p>
+          <w:p>
+            <w:pPr>
+              <w:spacing w:after="20" w:line="252" w:lineRule="auto"/>
+              <w:ind w:left="120"/>
+              <w:rPr>
+                <w:szCs w:val="16"/>
+              </w:rPr>
+            </w:pPr>
+            <w:r>
+              <w:rPr>
+                <w:color w:val="F8FAFC"/>
+                <w:szCs w:val="16"/>
+              </w:rPr>
+              <w:t>Neo4j GraphRAG — Agent K1</w:t>
+            </w:r>
+          </w:p>
+          <w:p>
+            <w:pPr>
+              <w:spacing w:before="84" w:after="0"/>
+              <w:ind w:left="120"/>
+              <w:rPr>
+                <w:sz w:val="18"/>
+                <w:szCs w:val="18"/>
+              </w:rPr>
+            </w:pPr>
+            <w:r>
+              <w:rPr>
+                <w:b/>
+                <w:color w:val="38BDF8"/>
+                <w:sz w:val="18"/>
+                <w:szCs w:val="18"/>
+              </w:rPr>
+              <w:t>DATA &amp; GRAPHS</w:t>
+            </w:r>
+          </w:p>
+          <w:p>
+            <w:pPr>
+              <w:spacing w:before="4" w:after="24"/>
+              <w:ind w:left="120"/>
+              <w:rPr>
+                <w:szCs w:val="16"/>
+              </w:rPr>
+            </w:pPr>
+            <w:r>
+              <w:rPr>
+                <w:color w:val="0284C7"/>
+                <w:szCs w:val="16"/>
+              </w:rPr>
+              <w:t>━━━━━━━━━━━━━━━━━</w:t>
+            </w:r>
+          </w:p>
+          <w:p>
+            <w:pPr>
+              <w:spacing w:after="20" w:line="252" w:lineRule="auto"/>
+              <w:ind w:left="120"/>
+              <w:rPr>
+                <w:szCs w:val="16"/>
+              </w:rPr>
+            </w:pPr>
+            <w:r>
+              <w:rPr>
+                <w:color w:val="F8FAFC"/>
+                <w:szCs w:val="16"/>
+              </w:rPr>
+              <w:t xml:space="preserve">Neo4j / </w:t>
+            </w:r>
+            <w:r>
+              <w:rPr>
+                <w:color w:val="F8FAFC"/>
+                <w:szCs w:val="16"/>
+              </w:rPr>
+              <w:t>Cypher Graph    ■ ■ ■ ■ ■</w:t>
+            </w:r>
+          </w:p>
+          <w:p>
+            <w:pPr>
+              <w:spacing w:after="20" w:line="252" w:lineRule="auto"/>
+              <w:ind w:left="120"/>
+              <w:rPr>
+                <w:szCs w:val="16"/>
+              </w:rPr>
+            </w:pPr>
+            <w:r>
+              <w:rPr>
+                <w:color w:val="F8FAFC"/>
+                <w:szCs w:val="16"/>
+              </w:rPr>
+              <w:t>PostgreSQL / pgvector   ■ ■ ■ ■ ■</w:t>
+            </w:r>
+          </w:p>
+          <w:p>
+            <w:pPr>
+              <w:spacing w:after="20" w:line="252" w:lineRule="auto"/>
+              <w:ind w:left="120"/>
+              <w:rPr>
+                <w:szCs w:val="16"/>
+              </w:rPr>
+            </w:pPr>
+            <w:r>
+              <w:rPr>
+                <w:color w:val="F8FAFC"/>
+                <w:szCs w:val="16"/>
+              </w:rPr>
+              <w:t>Apache AGE &amp; DuckDB     ■ ■ ■ ■ □</w:t>
+            </w:r>
+          </w:p>
+          <w:p>
+            <w:pPr>
+              <w:spacing w:after="20" w:line="252" w:lineRule="auto"/>
+              <w:ind w:left="120"/>
+              <w:rPr>
+                <w:szCs w:val="16"/>
+              </w:rPr>
+            </w:pPr>
+            <w:r>
+              <w:rPr>
+                <w:color w:val="F8FAFC"/>
+                <w:szCs w:val="16"/>
+              </w:rPr>
+              <w:t>BigQuery DataFrames     ■ ■ ■ ■ □</w:t>
+            </w:r>
+          </w:p>
+          <w:p>
+            <w:pPr>
+              <w:spacing w:after="20" w:line="252" w:lineRule="auto"/>
+              <w:ind w:left="120"/>
+              <w:rPr>
+                <w:szCs w:val="16"/>
+              </w:rPr>
+            </w:pPr>
+            <w:r>
+              <w:rPr>
+                <w:color w:val="F8FAFC"/>
+                <w:szCs w:val="16"/>
+              </w:rPr>
+              <w:t>Pandas / NumPy ETL      ■ ■ ■ ■ ■</w:t>
+            </w:r>
+          </w:p>
+          <w:p>
+            <w:pPr>
+              <w:spacing w:before="84" w:after="0"/>
+              <w:ind w:left="120"/>
+              <w:rPr>
+                <w:sz w:val="18"/>
+                <w:szCs w:val="18"/>
+              </w:rPr>
+            </w:pPr>
+            <w:r>
+              <w:rPr>
+                <w:b/>
+                <w:color w:val="38BDF8"/>
+                <w:sz w:val="18"/>
+                <w:szCs w:val="18"/>
+              </w:rPr>
+              <w:t>DEV &amp; MLOPS</w:t>
+            </w:r>
+          </w:p>
+          <w:p>
+            <w:pPr>
+              <w:spacing w:before="4" w:after="24"/>
+              <w:ind w:left="120"/>
+              <w:rPr>
+                <w:szCs w:val="16"/>
+              </w:rPr>
+            </w:pPr>
+            <w:r>
+              <w:rPr>
+                <w:color w:val="0284C7"/>
+                <w:szCs w:val="16"/>
+              </w:rPr>
+              <w:t>━━━━━━━━━━━━━━━━━</w:t>
+            </w:r>
+          </w:p>
+          <w:p>
+            <w:pPr>
+              <w:spacing w:after="20" w:line="252" w:lineRule="auto"/>
+              <w:ind w:left="120"/>
+              <w:rPr>
+                <w:szCs w:val="16"/>
+              </w:rPr>
+            </w:pPr>
+            <w:r>
+              <w:rPr>
+                <w:color w:val="F8FAFC"/>
+                <w:szCs w:val="16"/>
+              </w:rPr>
+              <w:t>Python 3.11+ / MLOps    ■ ■ ■ ■ ■</w:t>
+            </w:r>
+          </w:p>
+          <w:p>
+            <w:pPr>
+              <w:spacing w:after="20" w:line="252" w:lineRule="auto"/>
+              <w:ind w:left="120"/>
+              <w:rPr>
+                <w:szCs w:val="16"/>
+              </w:rPr>
+            </w:pPr>
+            <w:r>
+              <w:rPr>
+                <w:color w:val="F8FAFC"/>
+                <w:szCs w:val="16"/>
+              </w:rPr>
+              <w:t xml:space="preserve">FastAPI / Next.js 14    ■ ■ ■ </w:t>
+            </w:r>
+            <w:r>
+              <w:rPr>
+                <w:color w:val="F8FAFC"/>
+                <w:szCs w:val="16"/>
+              </w:rPr>
+              <w:t>■ □</w:t>
+            </w:r>
+          </w:p>
+          <w:p>
+            <w:pPr>
+              <w:spacing w:after="20" w:line="252" w:lineRule="auto"/>
+              <w:ind w:left="120"/>
+              <w:rPr>
+                <w:szCs w:val="16"/>
+              </w:rPr>
+            </w:pPr>
+            <w:r>
+              <w:rPr>
+                <w:color w:val="F8FAFC"/>
+                <w:szCs w:val="16"/>
+              </w:rPr>
+              <w:t>MLflow &amp; Data Drift     ■ ■ ■ ■ □</w:t>
+            </w:r>
+          </w:p>
+          <w:p>
+            <w:pPr>
+              <w:spacing w:after="20" w:line="252" w:lineRule="auto"/>
+              <w:ind w:left="120"/>
+              <w:rPr>
+                <w:szCs w:val="16"/>
+              </w:rPr>
+            </w:pPr>
+            <w:r>
+              <w:rPr>
+                <w:color w:val="F8FAFC"/>
+                <w:szCs w:val="16"/>
+              </w:rPr>
+              <w:t>SHAP Sentinel Audit     ■ ■ ■ ■ ■</w:t>
+            </w:r>
+          </w:p>
+          <w:p>
+            <w:pPr>
+              <w:spacing w:after="20" w:line="252" w:lineRule="auto"/>
+              <w:ind w:left="120"/>
+              <w:rPr>
+                <w:szCs w:val="16"/>
+              </w:rPr>
+            </w:pPr>
+            <w:r>
+              <w:rPr>
+                <w:color w:val="F8FAFC"/>
+                <w:szCs w:val="16"/>
+              </w:rPr>
+              <w:t>IfcOpenShell &amp; Shapely  ■ ■ ■ ■ □</w:t>
+            </w:r>
+          </w:p>
+          <w:p>
+            <w:pPr>
+              <w:spacing w:after="20" w:line="252" w:lineRule="auto"/>
+              <w:ind w:left="120"/>
+              <w:rPr>
+                <w:szCs w:val="16"/>
+              </w:rPr>
+            </w:pPr>
+            <w:r>
+              <w:rPr>
+                <w:color w:val="F8FAFC"/>
+                <w:szCs w:val="16"/>
+              </w:rPr>
+              <w:t>Docker &amp; Pytest         ■ ■ ■ ■ ■</w:t>
+            </w:r>
+          </w:p>
+          <w:p>
+            <w:pPr>
+              <w:spacing w:before="84" w:after="0"/>
+              <w:ind w:left="120"/>
+              <w:rPr>
+                <w:sz w:val="18"/>
+                <w:szCs w:val="18"/>
+              </w:rPr>
+            </w:pPr>
+            <w:r>
+              <w:rPr>
+                <w:b/>
+                <w:color w:val="38BDF8"/>
+                <w:sz w:val="18"/>
+                <w:szCs w:val="18"/>
+              </w:rPr>
+              <w:t>ETHICS, SECURITY &amp; AUDIT</w:t>
+            </w:r>
+          </w:p>
+          <w:p>
+            <w:pPr>
+              <w:spacing w:before="4" w:after="24"/>
+              <w:ind w:left="120"/>
+              <w:rPr>
+                <w:szCs w:val="16"/>
+              </w:rPr>
+            </w:pPr>
+            <w:r>
+              <w:rPr>
+                <w:color w:val="0284C7"/>
+                <w:szCs w:val="16"/>
+              </w:rPr>
+              <w:t>━━━━━━━━━━━━━━━━━</w:t>
+            </w:r>
+          </w:p>
+          <w:p>
+            <w:pPr>
+              <w:spacing w:after="20" w:line="252" w:lineRule="auto"/>
+              <w:ind w:left="120"/>
+              <w:rPr>
+                <w:szCs w:val="16"/>
+              </w:rPr>
+            </w:pPr>
+            <w:r>
+              <w:rPr>
+                <w:color w:val="F8FAFC"/>
+                <w:szCs w:val="16"/>
+              </w:rPr>
+              <w:t>◈ CCAA Excellence Attestation '23</w:t>
+            </w:r>
+          </w:p>
+          <w:p>
+            <w:pPr>
+              <w:spacing w:after="20" w:line="252" w:lineRule="auto"/>
+              <w:ind w:left="120"/>
+              <w:rPr>
+                <w:szCs w:val="16"/>
+              </w:rPr>
+            </w:pPr>
+            <w:r>
+              <w:rPr>
+                <w:color w:val="F8FAFC"/>
+                <w:szCs w:val="16"/>
+              </w:rPr>
+              <w:t>◈ AVSEC Officer (ICAO Annex 17)</w:t>
+            </w:r>
+          </w:p>
+          <w:p>
+            <w:pPr>
+              <w:spacing w:after="20" w:line="252" w:lineRule="auto"/>
+              <w:ind w:left="120"/>
+              <w:rPr>
+                <w:szCs w:val="16"/>
+              </w:rPr>
+            </w:pPr>
+            <w:r>
+              <w:rPr>
+                <w:color w:val="F8FAFC"/>
+                <w:szCs w:val="16"/>
+              </w:rPr>
+              <w:t>◈ AI Et</w:t>
+            </w:r>
+            <w:r>
+              <w:rPr>
+                <w:color w:val="F8FAFC"/>
+                <w:szCs w:val="16"/>
+              </w:rPr>
+              <w:t>hics &amp; Anti-Hallucination</w:t>
+            </w:r>
+          </w:p>
+          <w:p>
+            <w:pPr>
+              <w:spacing w:after="20" w:line="252" w:lineRule="auto"/>
+              <w:ind w:left="120"/>
+              <w:rPr>
+                <w:szCs w:val="16"/>
+              </w:rPr>
+            </w:pPr>
+            <w:r>
+              <w:rPr>
+                <w:color w:val="F8FAFC"/>
+                <w:szCs w:val="16"/>
+              </w:rPr>
+              <w:t>◈ OKF v0.2 SHA-256 No-LLM</w:t>
+            </w:r>
+          </w:p>
+          <w:p>
+            <w:pPr>
+              <w:spacing w:after="20" w:line="252" w:lineRule="auto"/>
+              <w:ind w:left="120"/>
+              <w:rPr>
+                <w:szCs w:val="16"/>
+              </w:rPr>
+            </w:pPr>
+            <w:r>
+              <w:rPr>
+                <w:color w:val="F8FAFC"/>
+                <w:szCs w:val="16"/>
+              </w:rPr>
+              <w:t>◈ EU AI Act Compliance (RSASSA)</w:t>
+            </w:r>
+          </w:p>
+          <w:p>
+            <w:pPr>
+              <w:spacing w:before="84" w:after="0"/>
+              <w:ind w:left="120"/>
+              <w:rPr>
+                <w:sz w:val="18"/>
+                <w:szCs w:val="18"/>
+              </w:rPr>
+            </w:pPr>
+            <w:r>
+              <w:rPr>
+                <w:b/>
+                <w:color w:val="38BDF8"/>
+                <w:sz w:val="18"/>
+                <w:szCs w:val="18"/>
+              </w:rPr>
+              <w:t>LANGUAGES</w:t>
+            </w:r>
+          </w:p>
+          <w:p>
+            <w:pPr>
+              <w:spacing w:before="4" w:after="24"/>
+              <w:ind w:left="120"/>
+              <w:rPr>
+                <w:szCs w:val="16"/>
+              </w:rPr>
+            </w:pPr>
+            <w:r>
+              <w:rPr>
+                <w:color w:val="0284C7"/>
+                <w:szCs w:val="16"/>
+              </w:rPr>
+              <w:t>━━━━━━━━━━━━━━━━━</w:t>
+            </w:r>
+          </w:p>
+          <w:p>
+            <w:pPr>
+              <w:spacing w:after="20" w:line="252" w:lineRule="auto"/>
+              <w:ind w:left="120"/>
+              <w:rPr>
+                <w:szCs w:val="16"/>
+              </w:rPr>
+            </w:pPr>
+            <w:r>
+              <w:rPr>
+                <w:color w:val="F8FAFC"/>
+                <w:szCs w:val="16"/>
+              </w:rPr>
+              <w:t>French   —  Native / Fluent</w:t>
             </w:r>
           </w:p>
           <w:p>
@@ -137,563 +833,7 @@
             <w:r>
               <w:rPr>
                 <w:color w:val="F8FAFC"/>
-                <w:sz w:val="15"/>
-              </w:rPr>
-              <w:t>✉</w:t>
-            </w:r>
-            <w:r>
-              <w:rPr>
-                <w:color w:val="F8FAFC"/>
-                <w:sz w:val="15"/>
-              </w:rPr>
-              <w:t xml:space="preserve">  contact@archicam-ai.com</w:t>
-            </w:r>
-          </w:p>
-          <w:p>
-            <w:pPr>
-              <w:spacing w:after="20" w:line="252" w:lineRule="auto"/>
-              <w:ind w:left="120"/>
-            </w:pPr>
-            <w:r>
-              <w:rPr>
-                <w:color w:val="F8FAFC"/>
-                <w:sz w:val="15"/>
-              </w:rPr>
-              <w:t>✆</w:t>
-            </w:r>
-            <w:r>
-              <w:rPr>
-                <w:color w:val="F8FAFC"/>
-                <w:sz w:val="15"/>
-              </w:rPr>
-              <w:t xml:space="preserve">  +237 695 35 34 02</w:t>
-            </w:r>
-          </w:p>
-          <w:p>
-            <w:pPr>
-              <w:spacing w:after="20" w:line="252" w:lineRule="auto"/>
-              <w:ind w:left="120"/>
-            </w:pPr>
-            <w:r>
-              <w:rPr>
-                <w:color w:val="F8FAFC"/>
-                <w:sz w:val="15"/>
-              </w:rPr>
-              <w:t>⌂</w:t>
-            </w:r>
-            <w:r>
-              <w:rPr>
-                <w:color w:val="F8FAFC"/>
-                <w:sz w:val="15"/>
-              </w:rPr>
-              <w:t xml:space="preserve">  Douala / Ngaoundéré, CM</w:t>
-            </w:r>
-          </w:p>
-          <w:p>
-            <w:pPr>
-              <w:spacing w:after="20" w:line="252" w:lineRule="auto"/>
-              <w:ind w:left="120"/>
-            </w:pPr>
-            <w:r>
-              <w:rPr>
-                <w:color w:val="F8FAFC"/>
-                <w:sz w:val="15"/>
-              </w:rPr>
-              <w:t>🌐</w:t>
-            </w:r>
-            <w:r>
-              <w:rPr>
-                <w:color w:val="F8FAFC"/>
-                <w:sz w:val="15"/>
-              </w:rPr>
-              <w:t xml:space="preserve">  archicam-ai.com</w:t>
-            </w:r>
-          </w:p>
-          <w:p>
-            <w:pPr>
-              <w:spacing w:after="20" w:line="252" w:lineRule="auto"/>
-              <w:ind w:left="120"/>
-            </w:pPr>
-            <w:r>
-              <w:rPr>
-                <w:color w:val="F8FAFC"/>
-                <w:sz w:val="15"/>
-              </w:rPr>
-              <w:t>💼</w:t>
-            </w:r>
-            <w:r>
-              <w:rPr>
-                <w:color w:val="F8FAFC"/>
-                <w:sz w:val="15"/>
-              </w:rPr>
-              <w:t xml:space="preserve">  linkedin.com/in/marie-gervais-koa</w:t>
-            </w:r>
-          </w:p>
-          <w:p>
-            <w:pPr>
-              <w:spacing w:before="84" w:after="0"/>
-              <w:ind w:left="120"/>
-            </w:pPr>
-            <w:r>
-              <w:rPr>
-                <w:b/>
-                <w:color w:val="38BDF8"/>
-              </w:rPr>
-              <w:t>AI &amp; LLM STACK</w:t>
-            </w:r>
-          </w:p>
-          <w:p>
-            <w:pPr>
-              <w:spacing w:before="4" w:after="24"/>
-              <w:ind w:left="120"/>
-            </w:pPr>
-            <w:r>
-              <w:rPr>
-                <w:color w:val="0284C7"/>
-                <w:sz w:val="9"/>
-              </w:rPr>
-              <w:t>━━━━━━━━━━━━━━━━━</w:t>
-            </w:r>
-          </w:p>
-          <w:p>
-            <w:pPr>
-              <w:spacing w:after="20" w:line="252" w:lineRule="auto"/>
-              <w:ind w:left="120"/>
-            </w:pPr>
-            <w:r>
-              <w:rPr>
-                <w:color w:val="F8FAFC"/>
-                <w:sz w:val="15"/>
-              </w:rPr>
-              <w:t>Google Antigravity IDE  ■ ■ ■ ■ ■</w:t>
-            </w:r>
-          </w:p>
-          <w:p>
-            <w:pPr>
-              <w:spacing w:after="20" w:line="252" w:lineRule="auto"/>
-              <w:ind w:left="120"/>
-            </w:pPr>
-            <w:r>
-              <w:rPr>
-                <w:color w:val="F8FAFC"/>
-                <w:sz w:val="15"/>
-              </w:rPr>
-              <w:t>LangGraph &amp; CrewAI      ■ ■ ■ ■ ■</w:t>
-            </w:r>
-          </w:p>
-          <w:p>
-            <w:pPr>
-              <w:spacing w:after="20" w:line="252" w:lineRule="auto"/>
-              <w:ind w:left="120"/>
-            </w:pPr>
-            <w:r>
-              <w:rPr>
-                <w:color w:val="F8FAFC"/>
-                <w:sz w:val="15"/>
-              </w:rPr>
-              <w:t>Google Gemma 4 (12B)    ■ ■ ■ ■ ■</w:t>
-            </w:r>
-          </w:p>
-          <w:p>
-            <w:pPr>
-              <w:spacing w:after="20" w:line="252" w:lineRule="auto"/>
-              <w:ind w:left="120"/>
-            </w:pPr>
-            <w:r>
-              <w:rPr>
-                <w:color w:val="F8FAFC"/>
-                <w:sz w:val="15"/>
-              </w:rPr>
-              <w:t>Gemini 2.5 / 1.5 Pro    ■ ■ ■ ■ ■</w:t>
-            </w:r>
-          </w:p>
-          <w:p>
-            <w:pPr>
-              <w:spacing w:after="20" w:line="252" w:lineRule="auto"/>
-              <w:ind w:left="120"/>
-            </w:pPr>
-            <w:r>
-              <w:rPr>
-                <w:color w:val="F8FAFC"/>
-                <w:sz w:val="15"/>
-              </w:rPr>
-              <w:t>Google TabFM (Tabular)  ■ ■ ■ ■ ■</w:t>
-            </w:r>
-          </w:p>
-          <w:p>
-            <w:pPr>
-              <w:spacing w:after="20" w:line="252" w:lineRule="auto"/>
-              <w:ind w:left="120"/>
-            </w:pPr>
-            <w:r>
-              <w:rPr>
-                <w:color w:val="F8FAFC"/>
-                <w:sz w:val="15"/>
-              </w:rPr>
-              <w:t>FastMCP &amp; Genkit        ■ ■ ■ ■ ■</w:t>
-            </w:r>
-          </w:p>
-          <w:p>
-            <w:pPr>
-              <w:spacing w:after="20" w:line="252" w:lineRule="auto"/>
-              <w:ind w:left="120"/>
-            </w:pPr>
-            <w:r>
-              <w:rPr>
-                <w:color w:val="F8FAFC"/>
-                <w:sz w:val="15"/>
-              </w:rPr>
-              <w:t>Neo4j GraphRAG — Agent K1</w:t>
-            </w:r>
-          </w:p>
-          <w:p>
-            <w:pPr>
-              <w:spacing w:before="84" w:after="0"/>
-              <w:ind w:left="120"/>
-            </w:pPr>
-            <w:r>
-              <w:rPr>
-                <w:b/>
-                <w:color w:val="38BDF8"/>
-              </w:rPr>
-              <w:t>DATA &amp; GRAPHS</w:t>
-            </w:r>
-          </w:p>
-          <w:p>
-            <w:pPr>
-              <w:spacing w:before="4" w:after="24"/>
-              <w:ind w:left="120"/>
-            </w:pPr>
-            <w:r>
-              <w:rPr>
-                <w:color w:val="0284C7"/>
-                <w:sz w:val="9"/>
-              </w:rPr>
-              <w:t>━━━━━━━━━━━━━━━━━</w:t>
-            </w:r>
-          </w:p>
-          <w:p>
-            <w:pPr>
-              <w:spacing w:after="20" w:line="252" w:lineRule="auto"/>
-              <w:ind w:left="120"/>
-            </w:pPr>
-            <w:r>
-              <w:rPr>
-                <w:color w:val="F8FAFC"/>
-                <w:sz w:val="15"/>
-              </w:rPr>
-              <w:t>Neo4j / Cypher Graph    ■ ■ ■ ■ ■</w:t>
-            </w:r>
-          </w:p>
-          <w:p>
-            <w:pPr>
-              <w:spacing w:after="20" w:line="252" w:lineRule="auto"/>
-              <w:ind w:left="120"/>
-            </w:pPr>
-            <w:r>
-              <w:rPr>
-                <w:color w:val="F8FAFC"/>
-                <w:sz w:val="15"/>
-              </w:rPr>
-              <w:t>PostgreSQL / pgvector   ■ ■ ■ ■ ■</w:t>
-            </w:r>
-          </w:p>
-          <w:p>
-            <w:pPr>
-              <w:spacing w:after="20" w:line="252" w:lineRule="auto"/>
-              <w:ind w:left="120"/>
-            </w:pPr>
-            <w:r>
-              <w:rPr>
-                <w:color w:val="F8FAFC"/>
-                <w:sz w:val="15"/>
-              </w:rPr>
-              <w:t>Apache AGE &amp; DuckDB     ■ ■ ■ ■ □</w:t>
-            </w:r>
-          </w:p>
-          <w:p>
-            <w:pPr>
-              <w:spacing w:after="20" w:line="252" w:lineRule="auto"/>
-              <w:ind w:left="120"/>
-            </w:pPr>
-            <w:r>
-              <w:rPr>
-                <w:color w:val="F8FAFC"/>
-                <w:sz w:val="15"/>
-              </w:rPr>
-              <w:t>BigQuery DataFrames     ■ ■ ■ ■ □</w:t>
-            </w:r>
-          </w:p>
-          <w:p>
-            <w:pPr>
-              <w:spacing w:after="20" w:line="252" w:lineRule="auto"/>
-              <w:ind w:left="120"/>
-            </w:pPr>
-            <w:r>
-              <w:rPr>
-                <w:color w:val="F8FAFC"/>
-                <w:sz w:val="15"/>
-              </w:rPr>
-              <w:t>Pandas / NumPy ETL      ■ ■ ■ ■ ■</w:t>
-            </w:r>
-          </w:p>
-          <w:p>
-            <w:pPr>
-              <w:spacing w:before="84" w:after="0"/>
-              <w:ind w:left="120"/>
-            </w:pPr>
-            <w:r>
-              <w:rPr>
-                <w:b/>
-                <w:color w:val="38BDF8"/>
-              </w:rPr>
-              <w:t>DEV &amp; MLOPS</w:t>
-            </w:r>
-          </w:p>
-          <w:p>
-            <w:pPr>
-              <w:spacing w:before="4" w:after="24"/>
-              <w:ind w:left="120"/>
-            </w:pPr>
-            <w:r>
-              <w:rPr>
-                <w:color w:val="0284C7"/>
-                <w:sz w:val="9"/>
-              </w:rPr>
-              <w:t>━━━━━━━━━━━━━━━━━</w:t>
-            </w:r>
-          </w:p>
-          <w:p>
-            <w:pPr>
-              <w:spacing w:after="20" w:line="252" w:lineRule="auto"/>
-              <w:ind w:left="120"/>
-            </w:pPr>
-            <w:r>
-              <w:rPr>
-                <w:color w:val="F8FAFC"/>
-                <w:sz w:val="15"/>
-              </w:rPr>
-              <w:t>Python 3.11+ / MLOps    ■ ■ ■ ■ ■</w:t>
-            </w:r>
-          </w:p>
-          <w:p>
-            <w:pPr>
-              <w:spacing w:after="20" w:line="252" w:lineRule="auto"/>
-              <w:ind w:left="120"/>
-            </w:pPr>
-            <w:r>
-              <w:rPr>
-                <w:color w:val="F8FAFC"/>
-                <w:sz w:val="15"/>
-              </w:rPr>
-              <w:t>Fast</w:t>
-            </w:r>
-            <w:r>
-              <w:rPr>
-                <w:color w:val="F8FAFC"/>
-                <w:sz w:val="15"/>
-              </w:rPr>
-              <w:t>API / Next.js 14    ■ ■ ■ ■ □</w:t>
-            </w:r>
-          </w:p>
-          <w:p>
-            <w:pPr>
-              <w:spacing w:after="20" w:line="252" w:lineRule="auto"/>
-              <w:ind w:left="120"/>
-            </w:pPr>
-            <w:r>
-              <w:rPr>
-                <w:color w:val="F8FAFC"/>
-                <w:sz w:val="15"/>
-              </w:rPr>
-              <w:t>MLflow &amp; Data Drift     ■ ■ ■ ■ □</w:t>
-            </w:r>
-          </w:p>
-          <w:p>
-            <w:pPr>
-              <w:spacing w:after="20" w:line="252" w:lineRule="auto"/>
-              <w:ind w:left="120"/>
-            </w:pPr>
-            <w:r>
-              <w:rPr>
-                <w:color w:val="F8FAFC"/>
-                <w:sz w:val="15"/>
-              </w:rPr>
-              <w:t>SHAP Sentinel Audit     ■ ■ ■ ■ ■</w:t>
-            </w:r>
-          </w:p>
-          <w:p>
-            <w:pPr>
-              <w:spacing w:after="20" w:line="252" w:lineRule="auto"/>
-              <w:ind w:left="120"/>
-            </w:pPr>
-            <w:r>
-              <w:rPr>
-                <w:color w:val="F8FAFC"/>
-                <w:sz w:val="15"/>
-              </w:rPr>
-              <w:t>IfcOpenShell &amp; Shapely  ■ ■ ■ ■ □</w:t>
-            </w:r>
-          </w:p>
-          <w:p>
-            <w:pPr>
-              <w:spacing w:after="20" w:line="252" w:lineRule="auto"/>
-              <w:ind w:left="120"/>
-            </w:pPr>
-            <w:r>
-              <w:rPr>
-                <w:color w:val="F8FAFC"/>
-                <w:sz w:val="15"/>
-              </w:rPr>
-              <w:t>Docker &amp; Pytest         ■ ■ ■ ■ ■</w:t>
-            </w:r>
-          </w:p>
-          <w:p>
-            <w:pPr>
-              <w:spacing w:before="84" w:after="0"/>
-              <w:ind w:left="120"/>
-            </w:pPr>
-            <w:r>
-              <w:rPr>
-                <w:b/>
-                <w:color w:val="38BDF8"/>
-              </w:rPr>
-              <w:t>ETHICS, SECURITY &amp; AUDIT</w:t>
-            </w:r>
-          </w:p>
-          <w:p>
-            <w:pPr>
-              <w:spacing w:before="4" w:after="24"/>
-              <w:ind w:left="120"/>
-            </w:pPr>
-            <w:r>
-              <w:rPr>
-                <w:color w:val="0284C7"/>
-                <w:sz w:val="9"/>
-              </w:rPr>
-              <w:t>━━━━━━━━━━━━━━━━━</w:t>
-            </w:r>
-          </w:p>
-          <w:p>
-            <w:pPr>
-              <w:spacing w:after="20" w:line="252" w:lineRule="auto"/>
-              <w:ind w:left="120"/>
-            </w:pPr>
-            <w:r>
-              <w:rPr>
-                <w:color w:val="F8FAFC"/>
-                <w:sz w:val="15"/>
-              </w:rPr>
-              <w:t>◈ CCAA Excellence Attestation '23</w:t>
-            </w:r>
-          </w:p>
-          <w:p>
-            <w:pPr>
-              <w:spacing w:after="20" w:line="252" w:lineRule="auto"/>
-              <w:ind w:left="120"/>
-            </w:pPr>
-            <w:r>
-              <w:rPr>
-                <w:color w:val="F8FAFC"/>
-                <w:sz w:val="15"/>
-              </w:rPr>
-              <w:t>◈ AVSEC Offic</w:t>
-            </w:r>
-            <w:r>
-              <w:rPr>
-                <w:color w:val="F8FAFC"/>
-                <w:sz w:val="15"/>
-              </w:rPr>
-              <w:t>er (ICAO Annex 17)</w:t>
-            </w:r>
-          </w:p>
-          <w:p>
-            <w:pPr>
-              <w:spacing w:after="20" w:line="252" w:lineRule="auto"/>
-              <w:ind w:left="120"/>
-            </w:pPr>
-            <w:r>
-              <w:rPr>
-                <w:color w:val="F8FAFC"/>
-                <w:sz w:val="15"/>
-              </w:rPr>
-              <w:t>◈ AI Ethics &amp; Anti-Hallucination</w:t>
-            </w:r>
-          </w:p>
-          <w:p>
-            <w:pPr>
-              <w:spacing w:after="20" w:line="252" w:lineRule="auto"/>
-              <w:ind w:left="120"/>
-            </w:pPr>
-            <w:r>
-              <w:rPr>
-                <w:color w:val="F8FAFC"/>
-                <w:sz w:val="15"/>
-              </w:rPr>
-              <w:t>◈ OKF v0.2 SHA-256 No-LLM</w:t>
-            </w:r>
-          </w:p>
-          <w:p>
-            <w:pPr>
-              <w:spacing w:after="20" w:line="252" w:lineRule="auto"/>
-              <w:ind w:left="120"/>
-            </w:pPr>
-            <w:r>
-              <w:rPr>
-                <w:color w:val="F8FAFC"/>
-                <w:sz w:val="15"/>
-              </w:rPr>
-              <w:t>◈ EU AI Act Compliance (RSASSA)</w:t>
-            </w:r>
-          </w:p>
-          <w:p>
-            <w:pPr>
-              <w:spacing w:before="84" w:after="0"/>
-              <w:ind w:left="120"/>
-            </w:pPr>
-            <w:r>
-              <w:rPr>
-                <w:b/>
-                <w:color w:val="38BDF8"/>
-              </w:rPr>
-              <w:t>LANGUAGES</w:t>
-            </w:r>
-          </w:p>
-          <w:p>
-            <w:pPr>
-              <w:spacing w:before="4" w:after="24"/>
-              <w:ind w:left="120"/>
-            </w:pPr>
-            <w:r>
-              <w:rPr>
-                <w:color w:val="0284C7"/>
-                <w:sz w:val="9"/>
-              </w:rPr>
-              <w:t>━━━━━━━━━━━━━━━━━</w:t>
-            </w:r>
-          </w:p>
-          <w:p>
-            <w:pPr>
-              <w:spacing w:after="20" w:line="252" w:lineRule="auto"/>
-              <w:ind w:left="120"/>
-            </w:pPr>
-            <w:r>
-              <w:rPr>
-                <w:color w:val="F8FAFC"/>
-                <w:sz w:val="15"/>
-              </w:rPr>
-              <w:t>French   —  Native / Fluent</w:t>
-            </w:r>
-          </w:p>
-          <w:p>
-            <w:pPr>
-              <w:spacing w:after="20" w:line="252" w:lineRule="auto"/>
-              <w:ind w:left="120"/>
-            </w:pPr>
-            <w:r>
-              <w:rPr>
-                <w:color w:val="F8FAFC"/>
-                <w:sz w:val="15"/>
+                <w:szCs w:val="16"/>
               </w:rPr>
               <w:t>English  —  Professional / Tech.</w:t>
             </w:r>
@@ -733,7 +873,7 @@
                 <w:color w:val="0284C7"/>
                 <w:sz w:val="18"/>
               </w:rPr>
-              <w:t>Lead AI Engineer &amp; Data Architect</w:t>
+              <w:t>Lead AI Engineer &amp; Data Architect   │   Founder @ Archi Cam</w:t>
             </w:r>
             <w:r>
               <w:rPr>
@@ -741,7 +881,7 @@
                 <w:color w:val="0284C7"/>
                 <w:sz w:val="18"/>
               </w:rPr>
-              <w:t xml:space="preserve">   │   Founder @ Archi Cam AI</w:t>
+              <w:t xml:space="preserve"> AI</w:t>
             </w:r>
           </w:p>
           <w:p>
@@ -803,19 +943,19 @@
               <w:rPr>
                 <w:color w:val="334155"/>
               </w:rPr>
-              <w:t>Lead AI Engineer &amp; Data Architect (Google Developer Program Member), le</w:t>
+              <w:t>Applied AI Engineer &amp; Specialist, I design zero-hallucination autonomous agent systems — sovereig</w:t>
             </w:r>
             <w:r>
               <w:rPr>
                 <w:color w:val="334155"/>
               </w:rPr>
-              <w:t>veraging Google Antigravity to design neuro-symbolic multi-agent architectures, Neo4j GraphRAG, and sovereign MLOps pipelines. Expert in AI ethics: SHAP transparency, EU AI Act compliance, and deterministic zero-hallucination models. Founder &amp; Architect of</w:t>
+              <w:t>n, deterministic, and fully explainable. Member of the Google Developer Program and the AICC Accra community, I transform complex data into reliable decisions by leveraging my dual background in civil engineering and data science to build high-impact opera</w:t>
             </w:r>
             <w:r>
               <w:rPr>
                 <w:color w:val="334155"/>
               </w:rPr>
-              <w:t xml:space="preserve"> Archi Cam AI (Agentic AI SaaS &amp; 5D BIM), bridging civil engineering methodology, mathematical rigor, and product vision.</w:t>
+              <w:t>tional solutions. Founder of Archi Cam AI (Sovereign AI SaaS &amp; 5D BIM), I embody a rigorous, auditable, and results-driven African AI.</w:t>
             </w:r>
           </w:p>
           <w:p>
@@ -1028,14 +1168,14 @@
                 <w:color w:val="334155"/>
                 <w:sz w:val="15"/>
               </w:rPr>
-              <w:t xml:space="preserve">Preservation, indexing, and semantic exploration across 28 </w:t>
+              <w:t>Preservation, indexing, and semantic exploration across 28 ye</w:t>
             </w:r>
             <w:r>
               <w:rPr>
                 <w:color w:val="334155"/>
                 <w:sz w:val="15"/>
               </w:rPr>
-              <w:t>years of university scientific research (470 Ph.D. theses).</w:t>
+              <w:t>ars of university scientific research (470 Ph.D. theses).</w:t>
             </w:r>
           </w:p>
           <w:p>
@@ -1085,7 +1225,7 @@
                 <w:color w:val="0284C7"/>
                 <w:sz w:val="15"/>
               </w:rPr>
-              <w:t xml:space="preserve">   —   Enterprise Business Intelligence &amp; Strategic De</w:t>
+              <w:t xml:space="preserve">   —   Enterprise Business Intelligence &amp;</w:t>
             </w:r>
             <w:r>
               <w:rPr>
@@ -1093,7 +1233,7 @@
                 <w:color w:val="0284C7"/>
                 <w:sz w:val="15"/>
               </w:rPr>
-              <w:t>cision Engine</w:t>
+              <w:t xml:space="preserve"> Strategic Decision Engine</w:t>
             </w:r>
           </w:p>
           <w:p>
@@ -1151,7 +1291,14 @@
                 <w:color w:val="334155"/>
                 <w:sz w:val="15"/>
               </w:rPr>
-              <w:t>Total sovereign enterprise privacy with air-gapped local execution and mathematical explainability for every KPI.</w:t>
+              <w:t>Total sovereign enterprise privacy with air-gapped local execution and mathematical explainability f</w:t>
+            </w:r>
+            <w:r>
+              <w:rPr>
+                <w:color w:val="334155"/>
+                <w:sz w:val="15"/>
+              </w:rPr>
+              <w:t>or every KPI.</w:t>
             </w:r>
           </w:p>
           <w:p>
@@ -1230,14 +1377,14 @@
                 <w:color w:val="334155"/>
                 <w:sz w:val="15"/>
               </w:rPr>
-              <w:t>VigieSahel: Sahelian resilience system cutti</w:t>
+              <w:t>VigieSahel: Sahelian resilience</w:t>
             </w:r>
             <w:r>
               <w:rPr>
                 <w:color w:val="334155"/>
                 <w:sz w:val="15"/>
               </w:rPr>
-              <w:t>ng crop sowing failures by 35% and forecasting meningitis epidemics 14 days ahead.</w:t>
+              <w:t xml:space="preserve"> system cutting crop sowing failures by 35% and forecasting meningitis epidemics 14 days ahead.</w:t>
             </w:r>
           </w:p>
           <w:p>
@@ -1310,7 +1457,7 @@
                 <w:color w:val="64748B"/>
                 <w:sz w:val="15"/>
               </w:rPr>
-              <w:t>Independent Projects &amp;</w:t>
+              <w:t>Independe</w:t>
             </w:r>
             <w:r>
               <w:rPr>
@@ -1318,7 +1465,7 @@
                 <w:color w:val="64748B"/>
                 <w:sz w:val="15"/>
               </w:rPr>
-              <w:t xml:space="preserve"> Enterprises  │  Douala, CM</w:t>
+              <w:t>nt Projects &amp; Enterprises  │  Douala, CM</w:t>
             </w:r>
           </w:p>
           <w:p>
@@ -1376,7 +1523,14 @@
                 <w:color w:val="334155"/>
                 <w:sz w:val="15"/>
               </w:rPr>
-              <w:t>Executive decision reporting, automated KPI dashboards, and SHAP explainability audits for African SMEs.</w:t>
+              <w:t xml:space="preserve">Executive decision reporting, automated KPI dashboards, and SHAP explainability audits for African </w:t>
+            </w:r>
+            <w:r>
+              <w:rPr>
+                <w:color w:val="334155"/>
+                <w:sz w:val="15"/>
+              </w:rPr>
+              <w:t>SMEs.</w:t>
             </w:r>
           </w:p>
           <w:p>
@@ -1468,14 +1622,14 @@
                 <w:color w:val="334155"/>
                 <w:sz w:val="15"/>
               </w:rPr>
-              <w:t>Operational crisis management: emergency team c</w:t>
+              <w:t xml:space="preserve">Operational crisis management: emergency </w:t>
             </w:r>
             <w:r>
               <w:rPr>
                 <w:color w:val="334155"/>
                 <w:sz w:val="15"/>
               </w:rPr>
-              <w:t>oordination, anti-intrusion protocols.</w:t>
+              <w:t>team coordination, anti-intrusion protocols.</w:t>
             </w:r>
           </w:p>
           <w:p>
@@ -1577,14 +1731,7 @@
                 <w:color w:val="334155"/>
                 <w:sz w:val="15"/>
               </w:rPr>
-              <w:t>ML &amp;</w:t>
-            </w:r>
-            <w:r>
-              <w:rPr>
-                <w:color w:val="334155"/>
-                <w:sz w:val="15"/>
-              </w:rPr>
-              <w:t xml:space="preserve"> Bayesian Statistics, Data Engineering &amp; Neo4j, Computer Vision &amp; Robotics, Ethics &amp; Cybersecurity, Production MLOps.</w:t>
+              <w:t>ML &amp; Bayesian Statistics, Data Engineering &amp; Neo4j, Computer Vision &amp; Robotics, Ethics &amp; Cybersecurity, Production MLOps.</w:t>
             </w:r>
           </w:p>
           <w:p>
@@ -1626,7 +1773,7 @@
                 <w:color w:val="0A1128"/>
                 <w:sz w:val="18"/>
               </w:rPr>
-              <w:t xml:space="preserve">B.Sc. in Civil Engineering </w:t>
+              <w:t>B.Sc. in Civil Engine</w:t>
             </w:r>
             <w:r>
               <w:rPr>
@@ -1634,7 +1781,7 @@
                 <w:color w:val="0A1128"/>
                 <w:sz w:val="18"/>
               </w:rPr>
-              <w:t>(Building Option)</w:t>
+              <w:t>ering (Building Option)</w:t>
             </w:r>
             <w:r>
               <w:rPr>
@@ -1704,7 +1851,17 @@
                 <w:color w:val="0A1128"/>
                 <w:sz w:val="19"/>
               </w:rPr>
-              <w:t>HONORS &amp; APPLIED AI DISTINCTIONS</w:t>
+              <w:t>HONORS &amp; APP</w:t>
+            </w:r>
+            <w:bookmarkStart w:id="0" w:name="_GoBack"/>
+            <w:bookmarkEnd w:id="0"/>
+            <w:r>
+              <w:rPr>
+                <w:b/>
+                <w:color w:val="0A1128"/>
+                <w:sz w:val="19"/>
+              </w:rPr>
+              <w:t>LIED AI DISTINCTIONS</w:t>
             </w:r>
           </w:p>
           <w:p>
@@ -1723,14 +1880,7 @@
                 <w:color w:val="38BDF8"/>
                 <w:sz w:val="8"/>
               </w:rPr>
-              <w:t>──────────────</w:t>
-            </w:r>
-            <w:r>
-              <w:rPr>
-                <w:color w:val="38BDF8"/>
-                <w:sz w:val="8"/>
-              </w:rPr>
-              <w:t>──────────────────────────────</w:t>
+              <w:t>────────────────────────────────────────────</w:t>
             </w:r>
           </w:p>
           <w:p>
@@ -1788,14 +1938,14 @@
                 <w:color w:val="334155"/>
                 <w:sz w:val="15"/>
               </w:rPr>
-              <w:t xml:space="preserve">  —  Dataset Automator v4.0 (Google Antigravi</w:t>
+              <w:t xml:space="preserve">  —  Dataset Automator v4.0 (Go</w:t>
             </w:r>
             <w:r>
               <w:rPr>
                 <w:color w:val="334155"/>
                 <w:sz w:val="15"/>
               </w:rPr>
-              <w:t>ty, TabFM, BigQuery DataFrames, WIT).</w:t>
+              <w:t>ogle Antigravity, TabFM, BigQuery DataFrames, WIT).</w:t>
             </w:r>
           </w:p>
           <w:p>
@@ -14123,6 +14273,36 @@
       </w:tcPr>
     </w:tblStylePr>
   </w:style>
+  <w:style w:type="paragraph" w:styleId="Textedebulles">
+    <w:name w:val="Balloon Text"/>
+    <w:basedOn w:val="Normal"/>
+    <w:link w:val="TextedebullesCar"/>
+    <w:uiPriority w:val="99"/>
+    <w:semiHidden/>
+    <w:unhideWhenUsed/>
+    <w:rsid w:val="00E845BD"/>
+    <w:pPr>
+      <w:spacing w:after="0" w:line="240" w:lineRule="auto"/>
+    </w:pPr>
+    <w:rPr>
+      <w:rFonts w:cs="Segoe UI"/>
+      <w:sz w:val="18"/>
+      <w:szCs w:val="18"/>
+    </w:rPr>
+  </w:style>
+  <w:style w:type="character" w:customStyle="1" w:styleId="TextedebullesCar">
+    <w:name w:val="Texte de bulles Car"/>
+    <w:basedOn w:val="Policepardfaut"/>
+    <w:link w:val="Textedebulles"/>
+    <w:uiPriority w:val="99"/>
+    <w:semiHidden/>
+    <w:rsid w:val="00E845BD"/>
+    <w:rPr>
+      <w:rFonts w:ascii="Segoe UI" w:hAnsi="Segoe UI" w:cs="Segoe UI"/>
+      <w:sz w:val="18"/>
+      <w:szCs w:val="18"/>
+    </w:rPr>
+  </w:style>
 </w:styles>
 </file>
 
@@ -14451,7 +14631,7 @@
 </file>
 
 <file path=customXml/itemProps1.xml><?xml version="1.0" encoding="utf-8"?>
-<ds:datastoreItem xmlns:ds="http://schemas.openxmlformats.org/officeDocument/2006/customXml" ds:itemID="{F9110C4C-4040-4A48-8BE0-84248443E816}">
+<ds:datastoreItem xmlns:ds="http://schemas.openxmlformats.org/officeDocument/2006/customXml" ds:itemID="{603FCB8A-1BEA-4770-A6A5-17A708BBD7EA}">
   <ds:schemaRefs>
     <ds:schemaRef ds:uri="http://schemas.openxmlformats.org/officeDocument/2006/bibliography"/>
   </ds:schemaRefs>

</xml_diff>